<commit_message>
Adding ADMIN/connections_status request description
</commit_message>
<xml_diff>
--- a/misc/PSG Server.docx
+++ b/misc/PSG Server.docx
@@ -341,7 +341,14 @@
                     <w:b/>
                     <w:bCs/>
                   </w:rPr>
-                  <w:t>03</w:t>
+                  <w:t>0</w:t>
+                </w:r>
+                <w:r>
+                  <w:rPr>
+                    <w:b/>
+                    <w:bCs/>
+                  </w:rPr>
+                  <w:t>4</w:t>
                 </w:r>
                 <w:r>
                   <w:rPr>
@@ -355,7 +362,14 @@
                     <w:b/>
                     <w:bCs/>
                   </w:rPr>
-                  <w:t>12</w:t>
+                  <w:t>1</w:t>
+                </w:r>
+                <w:r>
+                  <w:rPr>
+                    <w:b/>
+                    <w:bCs/>
+                  </w:rPr>
+                  <w:t>6</w:t>
                 </w:r>
                 <w:r>
                   <w:rPr>
@@ -414,7 +428,7 @@
                       <w:t>7</w:t>
                     </w:r>
                     <w:r>
-                      <w:t>7</w:t>
+                      <w:t>8</w:t>
                     </w:r>
                   </w:p>
                 </w:tc>
@@ -4392,6 +4406,48 @@
           <w:p>
             <w:r>
               <w:t>Adding a new request description; adding new config parameters</w:t>
+            </w:r>
+          </w:p>
+        </w:tc>
+      </w:tr>
+      <w:tr>
+        <w:tc>
+          <w:tcPr>
+            <w:tcW w:w="1001" w:type="dxa"/>
+          </w:tcPr>
+          <w:p>
+            <w:r>
+              <w:t>2.78</w:t>
+            </w:r>
+          </w:p>
+        </w:tc>
+        <w:tc>
+          <w:tcPr>
+            <w:tcW w:w="1678" w:type="dxa"/>
+          </w:tcPr>
+          <w:p>
+            <w:r>
+              <w:t>Apr 16, 2025</w:t>
+            </w:r>
+          </w:p>
+        </w:tc>
+        <w:tc>
+          <w:tcPr>
+            <w:tcW w:w="2182" w:type="dxa"/>
+          </w:tcPr>
+          <w:p>
+            <w:r>
+              <w:t>Sergey Satskiy</w:t>
+            </w:r>
+          </w:p>
+        </w:tc>
+        <w:tc>
+          <w:tcPr>
+            <w:tcW w:w="4489" w:type="dxa"/>
+          </w:tcPr>
+          <w:p>
+            <w:r>
+              <w:t>Adding ADMIN/connections_status request description</w:t>
             </w:r>
           </w:p>
         </w:tc>
@@ -4458,7 +4514,7 @@
           <w:r>
             <w:fldChar w:fldCharType="separate"/>
           </w:r>
-          <w:hyperlink w:anchor="_Toc192688497" w:history="1">
+          <w:hyperlink w:anchor="_Toc195699785" w:history="1">
             <w:r>
               <w:rPr>
                 <w:rStyle w:val="Hyperlink"/>
@@ -4485,7 +4541,7 @@
                 <w:noProof/>
                 <w:webHidden/>
               </w:rPr>
-              <w:instrText xml:space="preserve"> PAGEREF _Toc192688497 \h </w:instrText>
+              <w:instrText xml:space="preserve"> PAGEREF _Toc195699785 \h </w:instrText>
             </w:r>
             <w:r>
               <w:rPr>
@@ -4531,7 +4587,7 @@
               <w14:ligatures w14:val="standardContextual"/>
             </w:rPr>
           </w:pPr>
-          <w:hyperlink w:anchor="_Toc192688498" w:history="1">
+          <w:hyperlink w:anchor="_Toc195699786" w:history="1">
             <w:r>
               <w:rPr>
                 <w:rStyle w:val="Hyperlink"/>
@@ -4558,7 +4614,7 @@
                 <w:noProof/>
                 <w:webHidden/>
               </w:rPr>
-              <w:instrText xml:space="preserve"> PAGEREF _Toc192688498 \h </w:instrText>
+              <w:instrText xml:space="preserve"> PAGEREF _Toc195699786 \h </w:instrText>
             </w:r>
             <w:r>
               <w:rPr>
@@ -4604,7 +4660,7 @@
               <w14:ligatures w14:val="standardContextual"/>
             </w:rPr>
           </w:pPr>
-          <w:hyperlink w:anchor="_Toc192688499" w:history="1">
+          <w:hyperlink w:anchor="_Toc195699787" w:history="1">
             <w:r>
               <w:rPr>
                 <w:rStyle w:val="Hyperlink"/>
@@ -4631,7 +4687,7 @@
                 <w:noProof/>
                 <w:webHidden/>
               </w:rPr>
-              <w:instrText xml:space="preserve"> PAGEREF _Toc192688499 \h </w:instrText>
+              <w:instrText xml:space="preserve"> PAGEREF _Toc195699787 \h </w:instrText>
             </w:r>
             <w:r>
               <w:rPr>
@@ -4677,7 +4733,7 @@
               <w14:ligatures w14:val="standardContextual"/>
             </w:rPr>
           </w:pPr>
-          <w:hyperlink w:anchor="_Toc192688500" w:history="1">
+          <w:hyperlink w:anchor="_Toc195699788" w:history="1">
             <w:r>
               <w:rPr>
                 <w:rStyle w:val="Hyperlink"/>
@@ -4704,7 +4760,7 @@
                 <w:noProof/>
                 <w:webHidden/>
               </w:rPr>
-              <w:instrText xml:space="preserve"> PAGEREF _Toc192688500 \h </w:instrText>
+              <w:instrText xml:space="preserve"> PAGEREF _Toc195699788 \h </w:instrText>
             </w:r>
             <w:r>
               <w:rPr>
@@ -4750,7 +4806,7 @@
               <w14:ligatures w14:val="standardContextual"/>
             </w:rPr>
           </w:pPr>
-          <w:hyperlink w:anchor="_Toc192688501" w:history="1">
+          <w:hyperlink w:anchor="_Toc195699789" w:history="1">
             <w:r>
               <w:rPr>
                 <w:rStyle w:val="Hyperlink"/>
@@ -4777,7 +4833,7 @@
                 <w:noProof/>
                 <w:webHidden/>
               </w:rPr>
-              <w:instrText xml:space="preserve"> PAGEREF _Toc192688501 \h </w:instrText>
+              <w:instrText xml:space="preserve"> PAGEREF _Toc195699789 \h </w:instrText>
             </w:r>
             <w:r>
               <w:rPr>
@@ -4823,7 +4879,7 @@
               <w14:ligatures w14:val="standardContextual"/>
             </w:rPr>
           </w:pPr>
-          <w:hyperlink w:anchor="_Toc192688502" w:history="1">
+          <w:hyperlink w:anchor="_Toc195699790" w:history="1">
             <w:r>
               <w:rPr>
                 <w:rStyle w:val="Hyperlink"/>
@@ -4850,7 +4906,7 @@
                 <w:noProof/>
                 <w:webHidden/>
               </w:rPr>
-              <w:instrText xml:space="preserve"> PAGEREF _Toc192688502 \h </w:instrText>
+              <w:instrText xml:space="preserve"> PAGEREF _Toc195699790 \h </w:instrText>
             </w:r>
             <w:r>
               <w:rPr>
@@ -4896,7 +4952,7 @@
               <w14:ligatures w14:val="standardContextual"/>
             </w:rPr>
           </w:pPr>
-          <w:hyperlink w:anchor="_Toc192688503" w:history="1">
+          <w:hyperlink w:anchor="_Toc195699791" w:history="1">
             <w:r>
               <w:rPr>
                 <w:rStyle w:val="Hyperlink"/>
@@ -4923,7 +4979,7 @@
                 <w:noProof/>
                 <w:webHidden/>
               </w:rPr>
-              <w:instrText xml:space="preserve"> PAGEREF _Toc192688503 \h </w:instrText>
+              <w:instrText xml:space="preserve"> PAGEREF _Toc195699791 \h </w:instrText>
             </w:r>
             <w:r>
               <w:rPr>
@@ -4969,7 +5025,7 @@
               <w14:ligatures w14:val="standardContextual"/>
             </w:rPr>
           </w:pPr>
-          <w:hyperlink w:anchor="_Toc192688504" w:history="1">
+          <w:hyperlink w:anchor="_Toc195699792" w:history="1">
             <w:r>
               <w:rPr>
                 <w:rStyle w:val="Hyperlink"/>
@@ -4996,7 +5052,7 @@
                 <w:noProof/>
                 <w:webHidden/>
               </w:rPr>
-              <w:instrText xml:space="preserve"> PAGEREF _Toc192688504 \h </w:instrText>
+              <w:instrText xml:space="preserve"> PAGEREF _Toc195699792 \h </w:instrText>
             </w:r>
             <w:r>
               <w:rPr>
@@ -5042,7 +5098,7 @@
               <w14:ligatures w14:val="standardContextual"/>
             </w:rPr>
           </w:pPr>
-          <w:hyperlink w:anchor="_Toc192688505" w:history="1">
+          <w:hyperlink w:anchor="_Toc195699793" w:history="1">
             <w:r>
               <w:rPr>
                 <w:rStyle w:val="Hyperlink"/>
@@ -5069,7 +5125,7 @@
                 <w:noProof/>
                 <w:webHidden/>
               </w:rPr>
-              <w:instrText xml:space="preserve"> PAGEREF _Toc192688505 \h </w:instrText>
+              <w:instrText xml:space="preserve"> PAGEREF _Toc195699793 \h </w:instrText>
             </w:r>
             <w:r>
               <w:rPr>
@@ -5115,7 +5171,7 @@
               <w14:ligatures w14:val="standardContextual"/>
             </w:rPr>
           </w:pPr>
-          <w:hyperlink w:anchor="_Toc192688506" w:history="1">
+          <w:hyperlink w:anchor="_Toc195699794" w:history="1">
             <w:r>
               <w:rPr>
                 <w:rStyle w:val="Hyperlink"/>
@@ -5142,7 +5198,7 @@
                 <w:noProof/>
                 <w:webHidden/>
               </w:rPr>
-              <w:instrText xml:space="preserve"> PAGEREF _Toc192688506 \h </w:instrText>
+              <w:instrText xml:space="preserve"> PAGEREF _Toc195699794 \h </w:instrText>
             </w:r>
             <w:r>
               <w:rPr>
@@ -5188,7 +5244,7 @@
               <w14:ligatures w14:val="standardContextual"/>
             </w:rPr>
           </w:pPr>
-          <w:hyperlink w:anchor="_Toc192688507" w:history="1">
+          <w:hyperlink w:anchor="_Toc195699795" w:history="1">
             <w:r>
               <w:rPr>
                 <w:rStyle w:val="Hyperlink"/>
@@ -5215,7 +5271,7 @@
                 <w:noProof/>
                 <w:webHidden/>
               </w:rPr>
-              <w:instrText xml:space="preserve"> PAGEREF _Toc192688507 \h </w:instrText>
+              <w:instrText xml:space="preserve"> PAGEREF _Toc195699795 \h </w:instrText>
             </w:r>
             <w:r>
               <w:rPr>
@@ -5261,7 +5317,7 @@
               <w14:ligatures w14:val="standardContextual"/>
             </w:rPr>
           </w:pPr>
-          <w:hyperlink w:anchor="_Toc192688508" w:history="1">
+          <w:hyperlink w:anchor="_Toc195699796" w:history="1">
             <w:r>
               <w:rPr>
                 <w:rStyle w:val="Hyperlink"/>
@@ -5288,7 +5344,7 @@
                 <w:noProof/>
                 <w:webHidden/>
               </w:rPr>
-              <w:instrText xml:space="preserve"> PAGEREF _Toc192688508 \h </w:instrText>
+              <w:instrText xml:space="preserve"> PAGEREF _Toc195699796 \h </w:instrText>
             </w:r>
             <w:r>
               <w:rPr>
@@ -5334,7 +5390,7 @@
               <w14:ligatures w14:val="standardContextual"/>
             </w:rPr>
           </w:pPr>
-          <w:hyperlink w:anchor="_Toc192688509" w:history="1">
+          <w:hyperlink w:anchor="_Toc195699797" w:history="1">
             <w:r>
               <w:rPr>
                 <w:rStyle w:val="Hyperlink"/>
@@ -5361,7 +5417,7 @@
                 <w:noProof/>
                 <w:webHidden/>
               </w:rPr>
-              <w:instrText xml:space="preserve"> PAGEREF _Toc192688509 \h </w:instrText>
+              <w:instrText xml:space="preserve"> PAGEREF _Toc195699797 \h </w:instrText>
             </w:r>
             <w:r>
               <w:rPr>
@@ -5407,7 +5463,7 @@
               <w14:ligatures w14:val="standardContextual"/>
             </w:rPr>
           </w:pPr>
-          <w:hyperlink w:anchor="_Toc192688510" w:history="1">
+          <w:hyperlink w:anchor="_Toc195699798" w:history="1">
             <w:r>
               <w:rPr>
                 <w:rStyle w:val="Hyperlink"/>
@@ -5434,7 +5490,7 @@
                 <w:noProof/>
                 <w:webHidden/>
               </w:rPr>
-              <w:instrText xml:space="preserve"> PAGEREF _Toc192688510 \h </w:instrText>
+              <w:instrText xml:space="preserve"> PAGEREF _Toc195699798 \h </w:instrText>
             </w:r>
             <w:r>
               <w:rPr>
@@ -5480,7 +5536,7 @@
               <w14:ligatures w14:val="standardContextual"/>
             </w:rPr>
           </w:pPr>
-          <w:hyperlink w:anchor="_Toc192688511" w:history="1">
+          <w:hyperlink w:anchor="_Toc195699799" w:history="1">
             <w:r>
               <w:rPr>
                 <w:rStyle w:val="Hyperlink"/>
@@ -5507,7 +5563,7 @@
                 <w:noProof/>
                 <w:webHidden/>
               </w:rPr>
-              <w:instrText xml:space="preserve"> PAGEREF _Toc192688511 \h </w:instrText>
+              <w:instrText xml:space="preserve"> PAGEREF _Toc195699799 \h </w:instrText>
             </w:r>
             <w:r>
               <w:rPr>
@@ -5553,7 +5609,7 @@
               <w14:ligatures w14:val="standardContextual"/>
             </w:rPr>
           </w:pPr>
-          <w:hyperlink w:anchor="_Toc192688512" w:history="1">
+          <w:hyperlink w:anchor="_Toc195699800" w:history="1">
             <w:r>
               <w:rPr>
                 <w:rStyle w:val="Hyperlink"/>
@@ -5580,7 +5636,7 @@
                 <w:noProof/>
                 <w:webHidden/>
               </w:rPr>
-              <w:instrText xml:space="preserve"> PAGEREF _Toc192688512 \h </w:instrText>
+              <w:instrText xml:space="preserve"> PAGEREF _Toc195699800 \h </w:instrText>
             </w:r>
             <w:r>
               <w:rPr>
@@ -5626,7 +5682,7 @@
               <w14:ligatures w14:val="standardContextual"/>
             </w:rPr>
           </w:pPr>
-          <w:hyperlink w:anchor="_Toc192688513" w:history="1">
+          <w:hyperlink w:anchor="_Toc195699801" w:history="1">
             <w:r>
               <w:rPr>
                 <w:rStyle w:val="Hyperlink"/>
@@ -5653,7 +5709,7 @@
                 <w:noProof/>
                 <w:webHidden/>
               </w:rPr>
-              <w:instrText xml:space="preserve"> PAGEREF _Toc192688513 \h </w:instrText>
+              <w:instrText xml:space="preserve"> PAGEREF _Toc195699801 \h </w:instrText>
             </w:r>
             <w:r>
               <w:rPr>
@@ -5699,7 +5755,7 @@
               <w14:ligatures w14:val="standardContextual"/>
             </w:rPr>
           </w:pPr>
-          <w:hyperlink w:anchor="_Toc192688514" w:history="1">
+          <w:hyperlink w:anchor="_Toc195699802" w:history="1">
             <w:r>
               <w:rPr>
                 <w:rStyle w:val="Hyperlink"/>
@@ -5726,7 +5782,7 @@
                 <w:noProof/>
                 <w:webHidden/>
               </w:rPr>
-              <w:instrText xml:space="preserve"> PAGEREF _Toc192688514 \h </w:instrText>
+              <w:instrText xml:space="preserve"> PAGEREF _Toc195699802 \h </w:instrText>
             </w:r>
             <w:r>
               <w:rPr>
@@ -5772,7 +5828,7 @@
               <w14:ligatures w14:val="standardContextual"/>
             </w:rPr>
           </w:pPr>
-          <w:hyperlink w:anchor="_Toc192688515" w:history="1">
+          <w:hyperlink w:anchor="_Toc195699803" w:history="1">
             <w:r>
               <w:rPr>
                 <w:rStyle w:val="Hyperlink"/>
@@ -5799,7 +5855,7 @@
                 <w:noProof/>
                 <w:webHidden/>
               </w:rPr>
-              <w:instrText xml:space="preserve"> PAGEREF _Toc192688515 \h </w:instrText>
+              <w:instrText xml:space="preserve"> PAGEREF _Toc195699803 \h </w:instrText>
             </w:r>
             <w:r>
               <w:rPr>
@@ -5845,7 +5901,7 @@
               <w14:ligatures w14:val="standardContextual"/>
             </w:rPr>
           </w:pPr>
-          <w:hyperlink w:anchor="_Toc192688516" w:history="1">
+          <w:hyperlink w:anchor="_Toc195699804" w:history="1">
             <w:r>
               <w:rPr>
                 <w:rStyle w:val="Hyperlink"/>
@@ -5872,7 +5928,7 @@
                 <w:noProof/>
                 <w:webHidden/>
               </w:rPr>
-              <w:instrText xml:space="preserve"> PAGEREF _Toc192688516 \h </w:instrText>
+              <w:instrText xml:space="preserve"> PAGEREF _Toc195699804 \h </w:instrText>
             </w:r>
             <w:r>
               <w:rPr>
@@ -5918,7 +5974,7 @@
               <w14:ligatures w14:val="standardContextual"/>
             </w:rPr>
           </w:pPr>
-          <w:hyperlink w:anchor="_Toc192688517" w:history="1">
+          <w:hyperlink w:anchor="_Toc195699805" w:history="1">
             <w:r>
               <w:rPr>
                 <w:rStyle w:val="Hyperlink"/>
@@ -5945,7 +6001,7 @@
                 <w:noProof/>
                 <w:webHidden/>
               </w:rPr>
-              <w:instrText xml:space="preserve"> PAGEREF _Toc192688517 \h </w:instrText>
+              <w:instrText xml:space="preserve"> PAGEREF _Toc195699805 \h </w:instrText>
             </w:r>
             <w:r>
               <w:rPr>
@@ -5991,7 +6047,7 @@
               <w14:ligatures w14:val="standardContextual"/>
             </w:rPr>
           </w:pPr>
-          <w:hyperlink w:anchor="_Toc192688518" w:history="1">
+          <w:hyperlink w:anchor="_Toc195699806" w:history="1">
             <w:r>
               <w:rPr>
                 <w:rStyle w:val="Hyperlink"/>
@@ -6018,7 +6074,7 @@
                 <w:noProof/>
                 <w:webHidden/>
               </w:rPr>
-              <w:instrText xml:space="preserve"> PAGEREF _Toc192688518 \h </w:instrText>
+              <w:instrText xml:space="preserve"> PAGEREF _Toc195699806 \h </w:instrText>
             </w:r>
             <w:r>
               <w:rPr>
@@ -6064,13 +6120,13 @@
               <w14:ligatures w14:val="standardContextual"/>
             </w:rPr>
           </w:pPr>
-          <w:hyperlink w:anchor="_Toc192688519" w:history="1">
+          <w:hyperlink w:anchor="_Toc195699807" w:history="1">
             <w:r>
               <w:rPr>
                 <w:rStyle w:val="Hyperlink"/>
                 <w:noProof/>
               </w:rPr>
-              <w:t>TEST/io Request</w:t>
+              <w:t>ADMIN/dispatcher_status Request</w:t>
             </w:r>
             <w:r>
               <w:rPr>
@@ -6091,7 +6147,7 @@
                 <w:noProof/>
                 <w:webHidden/>
               </w:rPr>
-              <w:instrText xml:space="preserve"> PAGEREF _Toc192688519 \h </w:instrText>
+              <w:instrText xml:space="preserve"> PAGEREF _Toc195699807 \h </w:instrText>
             </w:r>
             <w:r>
               <w:rPr>
@@ -6137,13 +6193,13 @@
               <w14:ligatures w14:val="standardContextual"/>
             </w:rPr>
           </w:pPr>
-          <w:hyperlink w:anchor="_Toc192688520" w:history="1">
+          <w:hyperlink w:anchor="_Toc195699808" w:history="1">
             <w:r>
               <w:rPr>
                 <w:rStyle w:val="Hyperlink"/>
                 <w:noProof/>
               </w:rPr>
-              <w:t>Health Request</w:t>
+              <w:t>ADMIN/connections_status Request</w:t>
             </w:r>
             <w:r>
               <w:rPr>
@@ -6164,7 +6220,7 @@
                 <w:noProof/>
                 <w:webHidden/>
               </w:rPr>
-              <w:instrText xml:space="preserve"> PAGEREF _Toc192688520 \h </w:instrText>
+              <w:instrText xml:space="preserve"> PAGEREF _Toc195699808 \h </w:instrText>
             </w:r>
             <w:r>
               <w:rPr>
@@ -6210,13 +6266,13 @@
               <w14:ligatures w14:val="standardContextual"/>
             </w:rPr>
           </w:pPr>
-          <w:hyperlink w:anchor="_Toc192688521" w:history="1">
+          <w:hyperlink w:anchor="_Toc195699809" w:history="1">
             <w:r>
               <w:rPr>
                 <w:rStyle w:val="Hyperlink"/>
                 <w:noProof/>
               </w:rPr>
-              <w:t>Deep-health Request</w:t>
+              <w:t>TEST/io Request</w:t>
             </w:r>
             <w:r>
               <w:rPr>
@@ -6237,7 +6293,7 @@
                 <w:noProof/>
                 <w:webHidden/>
               </w:rPr>
-              <w:instrText xml:space="preserve"> PAGEREF _Toc192688521 \h </w:instrText>
+              <w:instrText xml:space="preserve"> PAGEREF _Toc195699809 \h </w:instrText>
             </w:r>
             <w:r>
               <w:rPr>
@@ -6257,7 +6313,7 @@
                 <w:noProof/>
                 <w:webHidden/>
               </w:rPr>
-              <w:t>50</w:t>
+              <w:t>49</w:t>
             </w:r>
             <w:r>
               <w:rPr>
@@ -6283,13 +6339,13 @@
               <w14:ligatures w14:val="standardContextual"/>
             </w:rPr>
           </w:pPr>
-          <w:hyperlink w:anchor="_Toc192688522" w:history="1">
+          <w:hyperlink w:anchor="_Toc195699810" w:history="1">
             <w:r>
               <w:rPr>
                 <w:rStyle w:val="Hyperlink"/>
                 <w:noProof/>
               </w:rPr>
-              <w:t>ReadyZ Request</w:t>
+              <w:t>Health Request</w:t>
             </w:r>
             <w:r>
               <w:rPr>
@@ -6310,7 +6366,7 @@
                 <w:noProof/>
                 <w:webHidden/>
               </w:rPr>
-              <w:instrText xml:space="preserve"> PAGEREF _Toc192688522 \h </w:instrText>
+              <w:instrText xml:space="preserve"> PAGEREF _Toc195699810 \h </w:instrText>
             </w:r>
             <w:r>
               <w:rPr>
@@ -6356,13 +6412,13 @@
               <w14:ligatures w14:val="standardContextual"/>
             </w:rPr>
           </w:pPr>
-          <w:hyperlink w:anchor="_Toc192688523" w:history="1">
+          <w:hyperlink w:anchor="_Toc195699811" w:history="1">
             <w:r>
               <w:rPr>
                 <w:rStyle w:val="Hyperlink"/>
                 <w:noProof/>
               </w:rPr>
-              <w:t>ReadyZCassandra Request</w:t>
+              <w:t>Deep-health Request</w:t>
             </w:r>
             <w:r>
               <w:rPr>
@@ -6383,7 +6439,7 @@
                 <w:noProof/>
                 <w:webHidden/>
               </w:rPr>
-              <w:instrText xml:space="preserve"> PAGEREF _Toc192688523 \h </w:instrText>
+              <w:instrText xml:space="preserve"> PAGEREF _Toc195699811 \h </w:instrText>
             </w:r>
             <w:r>
               <w:rPr>
@@ -6403,7 +6459,7 @@
                 <w:noProof/>
                 <w:webHidden/>
               </w:rPr>
-              <w:t>51</w:t>
+              <w:t>50</w:t>
             </w:r>
             <w:r>
               <w:rPr>
@@ -6429,13 +6485,13 @@
               <w14:ligatures w14:val="standardContextual"/>
             </w:rPr>
           </w:pPr>
-          <w:hyperlink w:anchor="_Toc192688524" w:history="1">
+          <w:hyperlink w:anchor="_Toc195699812" w:history="1">
             <w:r>
               <w:rPr>
                 <w:rStyle w:val="Hyperlink"/>
                 <w:noProof/>
               </w:rPr>
-              <w:t>ReadyZLMDB Request</w:t>
+              <w:t>ReadyZ Request</w:t>
             </w:r>
             <w:r>
               <w:rPr>
@@ -6456,7 +6512,7 @@
                 <w:noProof/>
                 <w:webHidden/>
               </w:rPr>
-              <w:instrText xml:space="preserve"> PAGEREF _Toc192688524 \h </w:instrText>
+              <w:instrText xml:space="preserve"> PAGEREF _Toc195699812 \h </w:instrText>
             </w:r>
             <w:r>
               <w:rPr>
@@ -6502,13 +6558,13 @@
               <w14:ligatures w14:val="standardContextual"/>
             </w:rPr>
           </w:pPr>
-          <w:hyperlink w:anchor="_Toc192688525" w:history="1">
+          <w:hyperlink w:anchor="_Toc195699813" w:history="1">
             <w:r>
               <w:rPr>
                 <w:rStyle w:val="Hyperlink"/>
                 <w:noProof/>
               </w:rPr>
-              <w:t>ReadyZWGS Request</w:t>
+              <w:t>ReadyZCassandra Request</w:t>
             </w:r>
             <w:r>
               <w:rPr>
@@ -6529,7 +6585,7 @@
                 <w:noProof/>
                 <w:webHidden/>
               </w:rPr>
-              <w:instrText xml:space="preserve"> PAGEREF _Toc192688525 \h </w:instrText>
+              <w:instrText xml:space="preserve"> PAGEREF _Toc195699813 \h </w:instrText>
             </w:r>
             <w:r>
               <w:rPr>
@@ -6549,7 +6605,7 @@
                 <w:noProof/>
                 <w:webHidden/>
               </w:rPr>
-              <w:t>52</w:t>
+              <w:t>51</w:t>
             </w:r>
             <w:r>
               <w:rPr>
@@ -6575,13 +6631,13 @@
               <w14:ligatures w14:val="standardContextual"/>
             </w:rPr>
           </w:pPr>
-          <w:hyperlink w:anchor="_Toc192688526" w:history="1">
+          <w:hyperlink w:anchor="_Toc195699814" w:history="1">
             <w:r>
               <w:rPr>
                 <w:rStyle w:val="Hyperlink"/>
                 <w:noProof/>
               </w:rPr>
-              <w:t>ReadyZCDD Request</w:t>
+              <w:t>ReadyZLMDB Request</w:t>
             </w:r>
             <w:r>
               <w:rPr>
@@ -6602,7 +6658,7 @@
                 <w:noProof/>
                 <w:webHidden/>
               </w:rPr>
-              <w:instrText xml:space="preserve"> PAGEREF _Toc192688526 \h </w:instrText>
+              <w:instrText xml:space="preserve"> PAGEREF _Toc195699814 \h </w:instrText>
             </w:r>
             <w:r>
               <w:rPr>
@@ -6622,7 +6678,7 @@
                 <w:noProof/>
                 <w:webHidden/>
               </w:rPr>
-              <w:t>53</w:t>
+              <w:t>52</w:t>
             </w:r>
             <w:r>
               <w:rPr>
@@ -6648,13 +6704,13 @@
               <w14:ligatures w14:val="standardContextual"/>
             </w:rPr>
           </w:pPr>
-          <w:hyperlink w:anchor="_Toc192688527" w:history="1">
+          <w:hyperlink w:anchor="_Toc195699815" w:history="1">
             <w:r>
               <w:rPr>
                 <w:rStyle w:val="Hyperlink"/>
                 <w:noProof/>
               </w:rPr>
-              <w:t>ReadyZSNP Request</w:t>
+              <w:t>ReadyZWGS Request</w:t>
             </w:r>
             <w:r>
               <w:rPr>
@@ -6675,7 +6731,7 @@
                 <w:noProof/>
                 <w:webHidden/>
               </w:rPr>
-              <w:instrText xml:space="preserve"> PAGEREF _Toc192688527 \h </w:instrText>
+              <w:instrText xml:space="preserve"> PAGEREF _Toc195699815 \h </w:instrText>
             </w:r>
             <w:r>
               <w:rPr>
@@ -6695,7 +6751,7 @@
                 <w:noProof/>
                 <w:webHidden/>
               </w:rPr>
-              <w:t>54</w:t>
+              <w:t>53</w:t>
             </w:r>
             <w:r>
               <w:rPr>
@@ -6721,13 +6777,13 @@
               <w14:ligatures w14:val="standardContextual"/>
             </w:rPr>
           </w:pPr>
-          <w:hyperlink w:anchor="_Toc192688528" w:history="1">
+          <w:hyperlink w:anchor="_Toc195699816" w:history="1">
             <w:r>
               <w:rPr>
                 <w:rStyle w:val="Hyperlink"/>
                 <w:noProof/>
               </w:rPr>
-              <w:t>HealthZ Request</w:t>
+              <w:t>ReadyZCDD Request</w:t>
             </w:r>
             <w:r>
               <w:rPr>
@@ -6748,7 +6804,7 @@
                 <w:noProof/>
                 <w:webHidden/>
               </w:rPr>
-              <w:instrText xml:space="preserve"> PAGEREF _Toc192688528 \h </w:instrText>
+              <w:instrText xml:space="preserve"> PAGEREF _Toc195699816 \h </w:instrText>
             </w:r>
             <w:r>
               <w:rPr>
@@ -6794,13 +6850,13 @@
               <w14:ligatures w14:val="standardContextual"/>
             </w:rPr>
           </w:pPr>
-          <w:hyperlink w:anchor="_Toc192688529" w:history="1">
+          <w:hyperlink w:anchor="_Toc195699817" w:history="1">
             <w:r>
               <w:rPr>
                 <w:rStyle w:val="Hyperlink"/>
                 <w:noProof/>
               </w:rPr>
-              <w:t>LivezZ Request</w:t>
+              <w:t>ReadyZSNP Request</w:t>
             </w:r>
             <w:r>
               <w:rPr>
@@ -6821,7 +6877,7 @@
                 <w:noProof/>
                 <w:webHidden/>
               </w:rPr>
-              <w:instrText xml:space="preserve"> PAGEREF _Toc192688529 \h </w:instrText>
+              <w:instrText xml:space="preserve"> PAGEREF _Toc195699817 \h </w:instrText>
             </w:r>
             <w:r>
               <w:rPr>
@@ -6841,7 +6897,7 @@
                 <w:noProof/>
                 <w:webHidden/>
               </w:rPr>
-              <w:t>55</w:t>
+              <w:t>54</w:t>
             </w:r>
             <w:r>
               <w:rPr>
@@ -6867,13 +6923,13 @@
               <w14:ligatures w14:val="standardContextual"/>
             </w:rPr>
           </w:pPr>
-          <w:hyperlink w:anchor="_Toc192688530" w:history="1">
+          <w:hyperlink w:anchor="_Toc195699818" w:history="1">
             <w:r>
               <w:rPr>
                 <w:rStyle w:val="Hyperlink"/>
                 <w:noProof/>
               </w:rPr>
-              <w:t>Favicon.ico Request</w:t>
+              <w:t>HealthZ Request</w:t>
             </w:r>
             <w:r>
               <w:rPr>
@@ -6894,7 +6950,7 @@
                 <w:noProof/>
                 <w:webHidden/>
               </w:rPr>
-              <w:instrText xml:space="preserve"> PAGEREF _Toc192688530 \h </w:instrText>
+              <w:instrText xml:space="preserve"> PAGEREF _Toc195699818 \h </w:instrText>
             </w:r>
             <w:r>
               <w:rPr>
@@ -6914,7 +6970,7 @@
                 <w:noProof/>
                 <w:webHidden/>
               </w:rPr>
-              <w:t>56</w:t>
+              <w:t>55</w:t>
             </w:r>
             <w:r>
               <w:rPr>
@@ -6940,12 +6996,158 @@
               <w14:ligatures w14:val="standardContextual"/>
             </w:rPr>
           </w:pPr>
-          <w:hyperlink w:anchor="_Toc192688531" w:history="1">
+          <w:hyperlink w:anchor="_Toc195699819" w:history="1">
             <w:r>
               <w:rPr>
                 <w:rStyle w:val="Hyperlink"/>
                 <w:noProof/>
               </w:rPr>
+              <w:t>LivezZ Request</w:t>
+            </w:r>
+            <w:r>
+              <w:rPr>
+                <w:noProof/>
+                <w:webHidden/>
+              </w:rPr>
+              <w:tab/>
+            </w:r>
+            <w:r>
+              <w:rPr>
+                <w:noProof/>
+                <w:webHidden/>
+              </w:rPr>
+              <w:fldChar w:fldCharType="begin"/>
+            </w:r>
+            <w:r>
+              <w:rPr>
+                <w:noProof/>
+                <w:webHidden/>
+              </w:rPr>
+              <w:instrText xml:space="preserve"> PAGEREF _Toc195699819 \h </w:instrText>
+            </w:r>
+            <w:r>
+              <w:rPr>
+                <w:noProof/>
+                <w:webHidden/>
+              </w:rPr>
+            </w:r>
+            <w:r>
+              <w:rPr>
+                <w:noProof/>
+                <w:webHidden/>
+              </w:rPr>
+              <w:fldChar w:fldCharType="separate"/>
+            </w:r>
+            <w:r>
+              <w:rPr>
+                <w:noProof/>
+                <w:webHidden/>
+              </w:rPr>
+              <w:t>56</w:t>
+            </w:r>
+            <w:r>
+              <w:rPr>
+                <w:noProof/>
+                <w:webHidden/>
+              </w:rPr>
+              <w:fldChar w:fldCharType="end"/>
+            </w:r>
+          </w:hyperlink>
+        </w:p>
+        <w:p>
+          <w:pPr>
+            <w:pStyle w:val="TOC2"/>
+            <w:tabs>
+              <w:tab w:val="right" w:leader="dot" w:pos="9350"/>
+            </w:tabs>
+            <w:rPr>
+              <w:rFonts w:eastAsiaTheme="minorEastAsia"/>
+              <w:noProof/>
+              <w:kern w:val="2"/>
+              <w:sz w:val="24"/>
+              <w:szCs w:val="24"/>
+              <w14:ligatures w14:val="standardContextual"/>
+            </w:rPr>
+          </w:pPr>
+          <w:hyperlink w:anchor="_Toc195699820" w:history="1">
+            <w:r>
+              <w:rPr>
+                <w:rStyle w:val="Hyperlink"/>
+                <w:noProof/>
+              </w:rPr>
+              <w:t>Favicon.ico Request</w:t>
+            </w:r>
+            <w:r>
+              <w:rPr>
+                <w:noProof/>
+                <w:webHidden/>
+              </w:rPr>
+              <w:tab/>
+            </w:r>
+            <w:r>
+              <w:rPr>
+                <w:noProof/>
+                <w:webHidden/>
+              </w:rPr>
+              <w:fldChar w:fldCharType="begin"/>
+            </w:r>
+            <w:r>
+              <w:rPr>
+                <w:noProof/>
+                <w:webHidden/>
+              </w:rPr>
+              <w:instrText xml:space="preserve"> PAGEREF _Toc195699820 \h </w:instrText>
+            </w:r>
+            <w:r>
+              <w:rPr>
+                <w:noProof/>
+                <w:webHidden/>
+              </w:rPr>
+            </w:r>
+            <w:r>
+              <w:rPr>
+                <w:noProof/>
+                <w:webHidden/>
+              </w:rPr>
+              <w:fldChar w:fldCharType="separate"/>
+            </w:r>
+            <w:r>
+              <w:rPr>
+                <w:noProof/>
+                <w:webHidden/>
+              </w:rPr>
+              <w:t>56</w:t>
+            </w:r>
+            <w:r>
+              <w:rPr>
+                <w:noProof/>
+                <w:webHidden/>
+              </w:rPr>
+              <w:fldChar w:fldCharType="end"/>
+            </w:r>
+          </w:hyperlink>
+        </w:p>
+        <w:p>
+          <w:pPr>
+            <w:pStyle w:val="TOC2"/>
+            <w:tabs>
+              <w:tab w:val="right" w:leader="dot" w:pos="9350"/>
+            </w:tabs>
+            <w:rPr>
+              <w:rFonts w:eastAsiaTheme="minorEastAsia"/>
+              <w:noProof/>
+              <w:kern w:val="2"/>
+              <w:sz w:val="24"/>
+              <w:szCs w:val="24"/>
+              <w14:ligatures w14:val="standardContextual"/>
+            </w:rPr>
+          </w:pPr>
+          <w:hyperlink w:anchor="_Toc195699821" w:history="1">
+            <w:r>
+              <w:rPr>
+                <w:rStyle w:val="Hyperlink"/>
+                <w:noProof/>
+              </w:rPr>
               <w:t>Unknown URL Request</w:t>
             </w:r>
             <w:r>
@@ -6967,7 +7169,7 @@
                 <w:noProof/>
                 <w:webHidden/>
               </w:rPr>
-              <w:instrText xml:space="preserve"> PAGEREF _Toc192688531 \h </w:instrText>
+              <w:instrText xml:space="preserve"> PAGEREF _Toc195699821 \h </w:instrText>
             </w:r>
             <w:r>
               <w:rPr>
@@ -6987,7 +7189,7 @@
                 <w:noProof/>
                 <w:webHidden/>
               </w:rPr>
-              <w:t>56</w:t>
+              <w:t>57</w:t>
             </w:r>
             <w:r>
               <w:rPr>
@@ -7013,7 +7215,7 @@
               <w14:ligatures w14:val="standardContextual"/>
             </w:rPr>
           </w:pPr>
-          <w:hyperlink w:anchor="_Toc192688532" w:history="1">
+          <w:hyperlink w:anchor="_Toc195699822" w:history="1">
             <w:r>
               <w:rPr>
                 <w:rStyle w:val="Hyperlink"/>
@@ -7040,7 +7242,7 @@
                 <w:noProof/>
                 <w:webHidden/>
               </w:rPr>
-              <w:instrText xml:space="preserve"> PAGEREF _Toc192688532 \h </w:instrText>
+              <w:instrText xml:space="preserve"> PAGEREF _Toc195699822 \h </w:instrText>
             </w:r>
             <w:r>
               <w:rPr>
@@ -7060,7 +7262,7 @@
                 <w:noProof/>
                 <w:webHidden/>
               </w:rPr>
-              <w:t>56</w:t>
+              <w:t>57</w:t>
             </w:r>
             <w:r>
               <w:rPr>
@@ -7086,7 +7288,7 @@
               <w14:ligatures w14:val="standardContextual"/>
             </w:rPr>
           </w:pPr>
-          <w:hyperlink w:anchor="_Toc192688533" w:history="1">
+          <w:hyperlink w:anchor="_Toc195699823" w:history="1">
             <w:r>
               <w:rPr>
                 <w:rStyle w:val="Hyperlink"/>
@@ -7113,7 +7315,7 @@
                 <w:noProof/>
                 <w:webHidden/>
               </w:rPr>
-              <w:instrText xml:space="preserve"> PAGEREF _Toc192688533 \h </w:instrText>
+              <w:instrText xml:space="preserve"> PAGEREF _Toc195699823 \h </w:instrText>
             </w:r>
             <w:r>
               <w:rPr>
@@ -7159,7 +7361,7 @@
               <w14:ligatures w14:val="standardContextual"/>
             </w:rPr>
           </w:pPr>
-          <w:hyperlink w:anchor="_Toc192688534" w:history="1">
+          <w:hyperlink w:anchor="_Toc195699824" w:history="1">
             <w:r>
               <w:rPr>
                 <w:rStyle w:val="Hyperlink"/>
@@ -7186,7 +7388,7 @@
                 <w:noProof/>
                 <w:webHidden/>
               </w:rPr>
-              <w:instrText xml:space="preserve"> PAGEREF _Toc192688534 \h </w:instrText>
+              <w:instrText xml:space="preserve"> PAGEREF _Toc195699824 \h </w:instrText>
             </w:r>
             <w:r>
               <w:rPr>
@@ -7206,7 +7408,7 @@
                 <w:noProof/>
                 <w:webHidden/>
               </w:rPr>
-              <w:t>57</w:t>
+              <w:t>58</w:t>
             </w:r>
             <w:r>
               <w:rPr>
@@ -7232,7 +7434,7 @@
               <w14:ligatures w14:val="standardContextual"/>
             </w:rPr>
           </w:pPr>
-          <w:hyperlink w:anchor="_Toc192688535" w:history="1">
+          <w:hyperlink w:anchor="_Toc195699825" w:history="1">
             <w:r>
               <w:rPr>
                 <w:rStyle w:val="Hyperlink"/>
@@ -7259,7 +7461,7 @@
                 <w:noProof/>
                 <w:webHidden/>
               </w:rPr>
-              <w:instrText xml:space="preserve"> PAGEREF _Toc192688535 \h </w:instrText>
+              <w:instrText xml:space="preserve"> PAGEREF _Toc195699825 \h </w:instrText>
             </w:r>
             <w:r>
               <w:rPr>
@@ -7279,7 +7481,7 @@
                 <w:noProof/>
                 <w:webHidden/>
               </w:rPr>
-              <w:t>57</w:t>
+              <w:t>58</w:t>
             </w:r>
             <w:r>
               <w:rPr>
@@ -7305,7 +7507,7 @@
               <w14:ligatures w14:val="standardContextual"/>
             </w:rPr>
           </w:pPr>
-          <w:hyperlink w:anchor="_Toc192688536" w:history="1">
+          <w:hyperlink w:anchor="_Toc195699826" w:history="1">
             <w:r>
               <w:rPr>
                 <w:rStyle w:val="Hyperlink"/>
@@ -7332,7 +7534,7 @@
                 <w:noProof/>
                 <w:webHidden/>
               </w:rPr>
-              <w:instrText xml:space="preserve"> PAGEREF _Toc192688536 \h </w:instrText>
+              <w:instrText xml:space="preserve"> PAGEREF _Toc195699826 \h </w:instrText>
             </w:r>
             <w:r>
               <w:rPr>
@@ -7378,7 +7580,7 @@
               <w14:ligatures w14:val="standardContextual"/>
             </w:rPr>
           </w:pPr>
-          <w:hyperlink w:anchor="_Toc192688537" w:history="1">
+          <w:hyperlink w:anchor="_Toc195699827" w:history="1">
             <w:r>
               <w:rPr>
                 <w:rStyle w:val="Hyperlink"/>
@@ -7405,7 +7607,7 @@
                 <w:noProof/>
                 <w:webHidden/>
               </w:rPr>
-              <w:instrText xml:space="preserve"> PAGEREF _Toc192688537 \h </w:instrText>
+              <w:instrText xml:space="preserve"> PAGEREF _Toc195699827 \h </w:instrText>
             </w:r>
             <w:r>
               <w:rPr>
@@ -7425,7 +7627,7 @@
                 <w:noProof/>
                 <w:webHidden/>
               </w:rPr>
-              <w:t>58</w:t>
+              <w:t>59</w:t>
             </w:r>
             <w:r>
               <w:rPr>
@@ -7451,7 +7653,7 @@
               <w14:ligatures w14:val="standardContextual"/>
             </w:rPr>
           </w:pPr>
-          <w:hyperlink w:anchor="_Toc192688538" w:history="1">
+          <w:hyperlink w:anchor="_Toc195699828" w:history="1">
             <w:r>
               <w:rPr>
                 <w:rStyle w:val="Hyperlink"/>
@@ -7478,7 +7680,7 @@
                 <w:noProof/>
                 <w:webHidden/>
               </w:rPr>
-              <w:instrText xml:space="preserve"> PAGEREF _Toc192688538 \h </w:instrText>
+              <w:instrText xml:space="preserve"> PAGEREF _Toc195699828 \h </w:instrText>
             </w:r>
             <w:r>
               <w:rPr>
@@ -7498,7 +7700,7 @@
                 <w:noProof/>
                 <w:webHidden/>
               </w:rPr>
-              <w:t>58</w:t>
+              <w:t>59</w:t>
             </w:r>
             <w:r>
               <w:rPr>
@@ -7524,7 +7726,7 @@
               <w14:ligatures w14:val="standardContextual"/>
             </w:rPr>
           </w:pPr>
-          <w:hyperlink w:anchor="_Toc192688539" w:history="1">
+          <w:hyperlink w:anchor="_Toc195699829" w:history="1">
             <w:r>
               <w:rPr>
                 <w:rStyle w:val="Hyperlink"/>
@@ -7551,7 +7753,7 @@
                 <w:noProof/>
                 <w:webHidden/>
               </w:rPr>
-              <w:instrText xml:space="preserve"> PAGEREF _Toc192688539 \h </w:instrText>
+              <w:instrText xml:space="preserve"> PAGEREF _Toc195699829 \h </w:instrText>
             </w:r>
             <w:r>
               <w:rPr>
@@ -7597,7 +7799,7 @@
               <w14:ligatures w14:val="standardContextual"/>
             </w:rPr>
           </w:pPr>
-          <w:hyperlink w:anchor="_Toc192688540" w:history="1">
+          <w:hyperlink w:anchor="_Toc195699830" w:history="1">
             <w:r>
               <w:rPr>
                 <w:rStyle w:val="Hyperlink"/>
@@ -7624,7 +7826,7 @@
                 <w:noProof/>
                 <w:webHidden/>
               </w:rPr>
-              <w:instrText xml:space="preserve"> PAGEREF _Toc192688540 \h </w:instrText>
+              <w:instrText xml:space="preserve"> PAGEREF _Toc195699830 \h </w:instrText>
             </w:r>
             <w:r>
               <w:rPr>
@@ -7644,7 +7846,7 @@
                 <w:noProof/>
                 <w:webHidden/>
               </w:rPr>
-              <w:t>59</w:t>
+              <w:t>60</w:t>
             </w:r>
             <w:r>
               <w:rPr>
@@ -7670,7 +7872,7 @@
               <w14:ligatures w14:val="standardContextual"/>
             </w:rPr>
           </w:pPr>
-          <w:hyperlink w:anchor="_Toc192688541" w:history="1">
+          <w:hyperlink w:anchor="_Toc195699831" w:history="1">
             <w:r>
               <w:rPr>
                 <w:rStyle w:val="Hyperlink"/>
@@ -7697,7 +7899,7 @@
                 <w:noProof/>
                 <w:webHidden/>
               </w:rPr>
-              <w:instrText xml:space="preserve"> PAGEREF _Toc192688541 \h </w:instrText>
+              <w:instrText xml:space="preserve"> PAGEREF _Toc195699831 \h </w:instrText>
             </w:r>
             <w:r>
               <w:rPr>
@@ -7717,7 +7919,7 @@
                 <w:noProof/>
                 <w:webHidden/>
               </w:rPr>
-              <w:t>61</w:t>
+              <w:t>62</w:t>
             </w:r>
             <w:r>
               <w:rPr>
@@ -7743,7 +7945,7 @@
               <w14:ligatures w14:val="standardContextual"/>
             </w:rPr>
           </w:pPr>
-          <w:hyperlink w:anchor="_Toc192688542" w:history="1">
+          <w:hyperlink w:anchor="_Toc195699832" w:history="1">
             <w:r>
               <w:rPr>
                 <w:rStyle w:val="Hyperlink"/>
@@ -7770,7 +7972,7 @@
                 <w:noProof/>
                 <w:webHidden/>
               </w:rPr>
-              <w:instrText xml:space="preserve"> PAGEREF _Toc192688542 \h </w:instrText>
+              <w:instrText xml:space="preserve"> PAGEREF _Toc195699832 \h </w:instrText>
             </w:r>
             <w:r>
               <w:rPr>
@@ -7816,7 +8018,7 @@
               <w14:ligatures w14:val="standardContextual"/>
             </w:rPr>
           </w:pPr>
-          <w:hyperlink w:anchor="_Toc192688543" w:history="1">
+          <w:hyperlink w:anchor="_Toc195699833" w:history="1">
             <w:r>
               <w:rPr>
                 <w:rStyle w:val="Hyperlink"/>
@@ -7843,7 +8045,7 @@
                 <w:noProof/>
                 <w:webHidden/>
               </w:rPr>
-              <w:instrText xml:space="preserve"> PAGEREF _Toc192688543 \h </w:instrText>
+              <w:instrText xml:space="preserve"> PAGEREF _Toc195699833 \h </w:instrText>
             </w:r>
             <w:r>
               <w:rPr>
@@ -7863,7 +8065,7 @@
                 <w:noProof/>
                 <w:webHidden/>
               </w:rPr>
-              <w:t>62</w:t>
+              <w:t>63</w:t>
             </w:r>
             <w:r>
               <w:rPr>
@@ -7889,7 +8091,7 @@
               <w14:ligatures w14:val="standardContextual"/>
             </w:rPr>
           </w:pPr>
-          <w:hyperlink w:anchor="_Toc192688544" w:history="1">
+          <w:hyperlink w:anchor="_Toc195699834" w:history="1">
             <w:r>
               <w:rPr>
                 <w:rStyle w:val="Hyperlink"/>
@@ -7916,7 +8118,7 @@
                 <w:noProof/>
                 <w:webHidden/>
               </w:rPr>
-              <w:instrText xml:space="preserve"> PAGEREF _Toc192688544 \h </w:instrText>
+              <w:instrText xml:space="preserve"> PAGEREF _Toc195699834 \h </w:instrText>
             </w:r>
             <w:r>
               <w:rPr>
@@ -7962,7 +8164,7 @@
               <w14:ligatures w14:val="standardContextual"/>
             </w:rPr>
           </w:pPr>
-          <w:hyperlink w:anchor="_Toc192688545" w:history="1">
+          <w:hyperlink w:anchor="_Toc195699835" w:history="1">
             <w:r>
               <w:rPr>
                 <w:rStyle w:val="Hyperlink"/>
@@ -7989,7 +8191,7 @@
                 <w:noProof/>
                 <w:webHidden/>
               </w:rPr>
-              <w:instrText xml:space="preserve"> PAGEREF _Toc192688545 \h </w:instrText>
+              <w:instrText xml:space="preserve"> PAGEREF _Toc195699835 \h </w:instrText>
             </w:r>
             <w:r>
               <w:rPr>
@@ -8009,7 +8211,7 @@
                 <w:noProof/>
                 <w:webHidden/>
               </w:rPr>
-              <w:t>63</w:t>
+              <w:t>64</w:t>
             </w:r>
             <w:r>
               <w:rPr>
@@ -8035,7 +8237,7 @@
               <w14:ligatures w14:val="standardContextual"/>
             </w:rPr>
           </w:pPr>
-          <w:hyperlink w:anchor="_Toc192688546" w:history="1">
+          <w:hyperlink w:anchor="_Toc195699836" w:history="1">
             <w:r>
               <w:rPr>
                 <w:rStyle w:val="Hyperlink"/>
@@ -8062,7 +8264,7 @@
                 <w:noProof/>
                 <w:webHidden/>
               </w:rPr>
-              <w:instrText xml:space="preserve"> PAGEREF _Toc192688546 \h </w:instrText>
+              <w:instrText xml:space="preserve"> PAGEREF _Toc195699836 \h </w:instrText>
             </w:r>
             <w:r>
               <w:rPr>
@@ -8082,7 +8284,7 @@
                 <w:noProof/>
                 <w:webHidden/>
               </w:rPr>
-              <w:t>63</w:t>
+              <w:t>64</w:t>
             </w:r>
             <w:r>
               <w:rPr>
@@ -8108,7 +8310,7 @@
               <w14:ligatures w14:val="standardContextual"/>
             </w:rPr>
           </w:pPr>
-          <w:hyperlink w:anchor="_Toc192688547" w:history="1">
+          <w:hyperlink w:anchor="_Toc195699837" w:history="1">
             <w:r>
               <w:rPr>
                 <w:rStyle w:val="Hyperlink"/>
@@ -8135,7 +8337,7 @@
                 <w:noProof/>
                 <w:webHidden/>
               </w:rPr>
-              <w:instrText xml:space="preserve"> PAGEREF _Toc192688547 \h </w:instrText>
+              <w:instrText xml:space="preserve"> PAGEREF _Toc195699837 \h </w:instrText>
             </w:r>
             <w:r>
               <w:rPr>
@@ -8155,7 +8357,7 @@
                 <w:noProof/>
                 <w:webHidden/>
               </w:rPr>
-              <w:t>64</w:t>
+              <w:t>65</w:t>
             </w:r>
             <w:r>
               <w:rPr>
@@ -8181,7 +8383,7 @@
               <w14:ligatures w14:val="standardContextual"/>
             </w:rPr>
           </w:pPr>
-          <w:hyperlink w:anchor="_Toc192688548" w:history="1">
+          <w:hyperlink w:anchor="_Toc195699838" w:history="1">
             <w:r>
               <w:rPr>
                 <w:rStyle w:val="Hyperlink"/>
@@ -8208,7 +8410,7 @@
                 <w:noProof/>
                 <w:webHidden/>
               </w:rPr>
-              <w:instrText xml:space="preserve"> PAGEREF _Toc192688548 \h </w:instrText>
+              <w:instrText xml:space="preserve"> PAGEREF _Toc195699838 \h </w:instrText>
             </w:r>
             <w:r>
               <w:rPr>
@@ -8228,7 +8430,7 @@
                 <w:noProof/>
                 <w:webHidden/>
               </w:rPr>
-              <w:t>65</w:t>
+              <w:t>66</w:t>
             </w:r>
             <w:r>
               <w:rPr>
@@ -8254,7 +8456,7 @@
               <w14:ligatures w14:val="standardContextual"/>
             </w:rPr>
           </w:pPr>
-          <w:hyperlink w:anchor="_Toc192688549" w:history="1">
+          <w:hyperlink w:anchor="_Toc195699839" w:history="1">
             <w:r>
               <w:rPr>
                 <w:rStyle w:val="Hyperlink"/>
@@ -8281,7 +8483,7 @@
                 <w:noProof/>
                 <w:webHidden/>
               </w:rPr>
-              <w:instrText xml:space="preserve"> PAGEREF _Toc192688549 \h </w:instrText>
+              <w:instrText xml:space="preserve"> PAGEREF _Toc195699839 \h </w:instrText>
             </w:r>
             <w:r>
               <w:rPr>
@@ -8327,7 +8529,7 @@
               <w14:ligatures w14:val="standardContextual"/>
             </w:rPr>
           </w:pPr>
-          <w:hyperlink w:anchor="_Toc192688550" w:history="1">
+          <w:hyperlink w:anchor="_Toc195699840" w:history="1">
             <w:r>
               <w:rPr>
                 <w:rStyle w:val="Hyperlink"/>
@@ -8354,7 +8556,7 @@
                 <w:noProof/>
                 <w:webHidden/>
               </w:rPr>
-              <w:instrText xml:space="preserve"> PAGEREF _Toc192688550 \h </w:instrText>
+              <w:instrText xml:space="preserve"> PAGEREF _Toc195699840 \h </w:instrText>
             </w:r>
             <w:r>
               <w:rPr>
@@ -8374,7 +8576,7 @@
                 <w:noProof/>
                 <w:webHidden/>
               </w:rPr>
-              <w:t>66</w:t>
+              <w:t>67</w:t>
             </w:r>
             <w:r>
               <w:rPr>
@@ -8400,7 +8602,7 @@
               <w14:ligatures w14:val="standardContextual"/>
             </w:rPr>
           </w:pPr>
-          <w:hyperlink w:anchor="_Toc192688551" w:history="1">
+          <w:hyperlink w:anchor="_Toc195699841" w:history="1">
             <w:r>
               <w:rPr>
                 <w:rStyle w:val="Hyperlink"/>
@@ -8427,7 +8629,7 @@
                 <w:noProof/>
                 <w:webHidden/>
               </w:rPr>
-              <w:instrText xml:space="preserve"> PAGEREF _Toc192688551 \h </w:instrText>
+              <w:instrText xml:space="preserve"> PAGEREF _Toc195699841 \h </w:instrText>
             </w:r>
             <w:r>
               <w:rPr>
@@ -8447,7 +8649,7 @@
                 <w:noProof/>
                 <w:webHidden/>
               </w:rPr>
-              <w:t>66</w:t>
+              <w:t>67</w:t>
             </w:r>
             <w:r>
               <w:rPr>
@@ -8473,7 +8675,7 @@
               <w14:ligatures w14:val="standardContextual"/>
             </w:rPr>
           </w:pPr>
-          <w:hyperlink w:anchor="_Toc192688552" w:history="1">
+          <w:hyperlink w:anchor="_Toc195699842" w:history="1">
             <w:r>
               <w:rPr>
                 <w:rStyle w:val="Hyperlink"/>
@@ -8500,7 +8702,7 @@
                 <w:noProof/>
                 <w:webHidden/>
               </w:rPr>
-              <w:instrText xml:space="preserve"> PAGEREF _Toc192688552 \h </w:instrText>
+              <w:instrText xml:space="preserve"> PAGEREF _Toc195699842 \h </w:instrText>
             </w:r>
             <w:r>
               <w:rPr>
@@ -8520,7 +8722,7 @@
                 <w:noProof/>
                 <w:webHidden/>
               </w:rPr>
-              <w:t>67</w:t>
+              <w:t>68</w:t>
             </w:r>
             <w:r>
               <w:rPr>
@@ -8546,7 +8748,7 @@
               <w14:ligatures w14:val="standardContextual"/>
             </w:rPr>
           </w:pPr>
-          <w:hyperlink w:anchor="_Toc192688553" w:history="1">
+          <w:hyperlink w:anchor="_Toc195699843" w:history="1">
             <w:r>
               <w:rPr>
                 <w:rStyle w:val="Hyperlink"/>
@@ -8573,7 +8775,7 @@
                 <w:noProof/>
                 <w:webHidden/>
               </w:rPr>
-              <w:instrText xml:space="preserve"> PAGEREF _Toc192688553 \h </w:instrText>
+              <w:instrText xml:space="preserve"> PAGEREF _Toc195699843 \h </w:instrText>
             </w:r>
             <w:r>
               <w:rPr>
@@ -8593,7 +8795,7 @@
                 <w:noProof/>
                 <w:webHidden/>
               </w:rPr>
-              <w:t>67</w:t>
+              <w:t>68</w:t>
             </w:r>
             <w:r>
               <w:rPr>
@@ -8619,7 +8821,7 @@
               <w14:ligatures w14:val="standardContextual"/>
             </w:rPr>
           </w:pPr>
-          <w:hyperlink w:anchor="_Toc192688554" w:history="1">
+          <w:hyperlink w:anchor="_Toc195699844" w:history="1">
             <w:r>
               <w:rPr>
                 <w:rStyle w:val="Hyperlink"/>
@@ -8646,7 +8848,7 @@
                 <w:noProof/>
                 <w:webHidden/>
               </w:rPr>
-              <w:instrText xml:space="preserve"> PAGEREF _Toc192688554 \h </w:instrText>
+              <w:instrText xml:space="preserve"> PAGEREF _Toc195699844 \h </w:instrText>
             </w:r>
             <w:r>
               <w:rPr>
@@ -8666,7 +8868,7 @@
                 <w:noProof/>
                 <w:webHidden/>
               </w:rPr>
-              <w:t>68</w:t>
+              <w:t>69</w:t>
             </w:r>
             <w:r>
               <w:rPr>
@@ -8692,7 +8894,7 @@
               <w14:ligatures w14:val="standardContextual"/>
             </w:rPr>
           </w:pPr>
-          <w:hyperlink w:anchor="_Toc192688555" w:history="1">
+          <w:hyperlink w:anchor="_Toc195699845" w:history="1">
             <w:r>
               <w:rPr>
                 <w:rStyle w:val="Hyperlink"/>
@@ -8719,7 +8921,7 @@
                 <w:noProof/>
                 <w:webHidden/>
               </w:rPr>
-              <w:instrText xml:space="preserve"> PAGEREF _Toc192688555 \h </w:instrText>
+              <w:instrText xml:space="preserve"> PAGEREF _Toc195699845 \h </w:instrText>
             </w:r>
             <w:r>
               <w:rPr>
@@ -8739,7 +8941,7 @@
                 <w:noProof/>
                 <w:webHidden/>
               </w:rPr>
-              <w:t>68</w:t>
+              <w:t>69</w:t>
             </w:r>
             <w:r>
               <w:rPr>
@@ -8765,7 +8967,7 @@
               <w14:ligatures w14:val="standardContextual"/>
             </w:rPr>
           </w:pPr>
-          <w:hyperlink w:anchor="_Toc192688556" w:history="1">
+          <w:hyperlink w:anchor="_Toc195699846" w:history="1">
             <w:r>
               <w:rPr>
                 <w:rStyle w:val="Hyperlink"/>
@@ -8792,7 +8994,7 @@
                 <w:noProof/>
                 <w:webHidden/>
               </w:rPr>
-              <w:instrText xml:space="preserve"> PAGEREF _Toc192688556 \h </w:instrText>
+              <w:instrText xml:space="preserve"> PAGEREF _Toc195699846 \h </w:instrText>
             </w:r>
             <w:r>
               <w:rPr>
@@ -8812,7 +9014,7 @@
                 <w:noProof/>
                 <w:webHidden/>
               </w:rPr>
-              <w:t>69</w:t>
+              <w:t>70</w:t>
             </w:r>
             <w:r>
               <w:rPr>
@@ -8838,7 +9040,7 @@
               <w14:ligatures w14:val="standardContextual"/>
             </w:rPr>
           </w:pPr>
-          <w:hyperlink w:anchor="_Toc192688557" w:history="1">
+          <w:hyperlink w:anchor="_Toc195699847" w:history="1">
             <w:r>
               <w:rPr>
                 <w:rStyle w:val="Hyperlink"/>
@@ -8865,7 +9067,7 @@
                 <w:noProof/>
                 <w:webHidden/>
               </w:rPr>
-              <w:instrText xml:space="preserve"> PAGEREF _Toc192688557 \h </w:instrText>
+              <w:instrText xml:space="preserve"> PAGEREF _Toc195699847 \h </w:instrText>
             </w:r>
             <w:r>
               <w:rPr>
@@ -8885,7 +9087,7 @@
                 <w:noProof/>
                 <w:webHidden/>
               </w:rPr>
-              <w:t>69</w:t>
+              <w:t>70</w:t>
             </w:r>
             <w:r>
               <w:rPr>
@@ -8911,7 +9113,7 @@
               <w14:ligatures w14:val="standardContextual"/>
             </w:rPr>
           </w:pPr>
-          <w:hyperlink w:anchor="_Toc192688558" w:history="1">
+          <w:hyperlink w:anchor="_Toc195699848" w:history="1">
             <w:r>
               <w:rPr>
                 <w:rStyle w:val="Hyperlink"/>
@@ -8938,7 +9140,7 @@
                 <w:noProof/>
                 <w:webHidden/>
               </w:rPr>
-              <w:instrText xml:space="preserve"> PAGEREF _Toc192688558 \h </w:instrText>
+              <w:instrText xml:space="preserve"> PAGEREF _Toc195699848 \h </w:instrText>
             </w:r>
             <w:r>
               <w:rPr>
@@ -8958,7 +9160,7 @@
                 <w:noProof/>
                 <w:webHidden/>
               </w:rPr>
-              <w:t>71</w:t>
+              <w:t>72</w:t>
             </w:r>
             <w:r>
               <w:rPr>
@@ -8984,7 +9186,7 @@
               <w14:ligatures w14:val="standardContextual"/>
             </w:rPr>
           </w:pPr>
-          <w:hyperlink w:anchor="_Toc192688559" w:history="1">
+          <w:hyperlink w:anchor="_Toc195699849" w:history="1">
             <w:r>
               <w:rPr>
                 <w:rStyle w:val="Hyperlink"/>
@@ -9011,7 +9213,7 @@
                 <w:noProof/>
                 <w:webHidden/>
               </w:rPr>
-              <w:instrText xml:space="preserve"> PAGEREF _Toc192688559 \h </w:instrText>
+              <w:instrText xml:space="preserve"> PAGEREF _Toc195699849 \h </w:instrText>
             </w:r>
             <w:r>
               <w:rPr>
@@ -9031,7 +9233,7 @@
                 <w:noProof/>
                 <w:webHidden/>
               </w:rPr>
-              <w:t>72</w:t>
+              <w:t>73</w:t>
             </w:r>
             <w:r>
               <w:rPr>
@@ -9057,7 +9259,7 @@
               <w14:ligatures w14:val="standardContextual"/>
             </w:rPr>
           </w:pPr>
-          <w:hyperlink w:anchor="_Toc192688560" w:history="1">
+          <w:hyperlink w:anchor="_Toc195699850" w:history="1">
             <w:r>
               <w:rPr>
                 <w:rStyle w:val="Hyperlink"/>
@@ -9084,7 +9286,7 @@
                 <w:noProof/>
                 <w:webHidden/>
               </w:rPr>
-              <w:instrText xml:space="preserve"> PAGEREF _Toc192688560 \h </w:instrText>
+              <w:instrText xml:space="preserve"> PAGEREF _Toc195699850 \h </w:instrText>
             </w:r>
             <w:r>
               <w:rPr>
@@ -9104,7 +9306,7 @@
                 <w:noProof/>
                 <w:webHidden/>
               </w:rPr>
-              <w:t>72</w:t>
+              <w:t>73</w:t>
             </w:r>
             <w:r>
               <w:rPr>
@@ -9130,7 +9332,7 @@
               <w14:ligatures w14:val="standardContextual"/>
             </w:rPr>
           </w:pPr>
-          <w:hyperlink w:anchor="_Toc192688561" w:history="1">
+          <w:hyperlink w:anchor="_Toc195699851" w:history="1">
             <w:r>
               <w:rPr>
                 <w:rStyle w:val="Hyperlink"/>
@@ -9157,7 +9359,7 @@
                 <w:noProof/>
                 <w:webHidden/>
               </w:rPr>
-              <w:instrText xml:space="preserve"> PAGEREF _Toc192688561 \h </w:instrText>
+              <w:instrText xml:space="preserve"> PAGEREF _Toc195699851 \h </w:instrText>
             </w:r>
             <w:r>
               <w:rPr>
@@ -9177,7 +9379,7 @@
                 <w:noProof/>
                 <w:webHidden/>
               </w:rPr>
-              <w:t>74</w:t>
+              <w:t>75</w:t>
             </w:r>
             <w:r>
               <w:rPr>
@@ -9203,7 +9405,7 @@
               <w14:ligatures w14:val="standardContextual"/>
             </w:rPr>
           </w:pPr>
-          <w:hyperlink w:anchor="_Toc192688562" w:history="1">
+          <w:hyperlink w:anchor="_Toc195699852" w:history="1">
             <w:r>
               <w:rPr>
                 <w:rStyle w:val="Hyperlink"/>
@@ -9230,7 +9432,7 @@
                 <w:noProof/>
                 <w:webHidden/>
               </w:rPr>
-              <w:instrText xml:space="preserve"> PAGEREF _Toc192688562 \h </w:instrText>
+              <w:instrText xml:space="preserve"> PAGEREF _Toc195699852 \h </w:instrText>
             </w:r>
             <w:r>
               <w:rPr>
@@ -9250,7 +9452,7 @@
                 <w:noProof/>
                 <w:webHidden/>
               </w:rPr>
-              <w:t>75</w:t>
+              <w:t>76</w:t>
             </w:r>
             <w:r>
               <w:rPr>
@@ -9276,7 +9478,7 @@
               <w14:ligatures w14:val="standardContextual"/>
             </w:rPr>
           </w:pPr>
-          <w:hyperlink w:anchor="_Toc192688563" w:history="1">
+          <w:hyperlink w:anchor="_Toc195699853" w:history="1">
             <w:r>
               <w:rPr>
                 <w:rStyle w:val="Hyperlink"/>
@@ -9303,7 +9505,7 @@
                 <w:noProof/>
                 <w:webHidden/>
               </w:rPr>
-              <w:instrText xml:space="preserve"> PAGEREF _Toc192688563 \h </w:instrText>
+              <w:instrText xml:space="preserve"> PAGEREF _Toc195699853 \h </w:instrText>
             </w:r>
             <w:r>
               <w:rPr>
@@ -9323,7 +9525,7 @@
                 <w:noProof/>
                 <w:webHidden/>
               </w:rPr>
-              <w:t>77</w:t>
+              <w:t>78</w:t>
             </w:r>
             <w:r>
               <w:rPr>
@@ -9349,7 +9551,7 @@
               <w14:ligatures w14:val="standardContextual"/>
             </w:rPr>
           </w:pPr>
-          <w:hyperlink w:anchor="_Toc192688564" w:history="1">
+          <w:hyperlink w:anchor="_Toc195699854" w:history="1">
             <w:r>
               <w:rPr>
                 <w:rStyle w:val="Hyperlink"/>
@@ -9376,7 +9578,7 @@
                 <w:noProof/>
                 <w:webHidden/>
               </w:rPr>
-              <w:instrText xml:space="preserve"> PAGEREF _Toc192688564 \h </w:instrText>
+              <w:instrText xml:space="preserve"> PAGEREF _Toc195699854 \h </w:instrText>
             </w:r>
             <w:r>
               <w:rPr>
@@ -9396,7 +9598,7 @@
                 <w:noProof/>
                 <w:webHidden/>
               </w:rPr>
-              <w:t>78</w:t>
+              <w:t>79</w:t>
             </w:r>
             <w:r>
               <w:rPr>
@@ -9422,7 +9624,7 @@
               <w14:ligatures w14:val="standardContextual"/>
             </w:rPr>
           </w:pPr>
-          <w:hyperlink w:anchor="_Toc192688565" w:history="1">
+          <w:hyperlink w:anchor="_Toc195699855" w:history="1">
             <w:r>
               <w:rPr>
                 <w:rStyle w:val="Hyperlink"/>
@@ -9449,7 +9651,7 @@
                 <w:noProof/>
                 <w:webHidden/>
               </w:rPr>
-              <w:instrText xml:space="preserve"> PAGEREF _Toc192688565 \h </w:instrText>
+              <w:instrText xml:space="preserve"> PAGEREF _Toc195699855 \h </w:instrText>
             </w:r>
             <w:r>
               <w:rPr>
@@ -9469,7 +9671,7 @@
                 <w:noProof/>
                 <w:webHidden/>
               </w:rPr>
-              <w:t>78</w:t>
+              <w:t>79</w:t>
             </w:r>
             <w:r>
               <w:rPr>
@@ -9495,7 +9697,7 @@
               <w14:ligatures w14:val="standardContextual"/>
             </w:rPr>
           </w:pPr>
-          <w:hyperlink w:anchor="_Toc192688566" w:history="1">
+          <w:hyperlink w:anchor="_Toc195699856" w:history="1">
             <w:r>
               <w:rPr>
                 <w:rStyle w:val="Hyperlink"/>
@@ -9522,7 +9724,7 @@
                 <w:noProof/>
                 <w:webHidden/>
               </w:rPr>
-              <w:instrText xml:space="preserve"> PAGEREF _Toc192688566 \h </w:instrText>
+              <w:instrText xml:space="preserve"> PAGEREF _Toc195699856 \h </w:instrText>
             </w:r>
             <w:r>
               <w:rPr>
@@ -9542,7 +9744,7 @@
                 <w:noProof/>
                 <w:webHidden/>
               </w:rPr>
-              <w:t>79</w:t>
+              <w:t>80</w:t>
             </w:r>
             <w:r>
               <w:rPr>
@@ -9568,7 +9770,7 @@
               <w14:ligatures w14:val="standardContextual"/>
             </w:rPr>
           </w:pPr>
-          <w:hyperlink w:anchor="_Toc192688567" w:history="1">
+          <w:hyperlink w:anchor="_Toc195699857" w:history="1">
             <w:r>
               <w:rPr>
                 <w:rStyle w:val="Hyperlink"/>
@@ -9595,7 +9797,7 @@
                 <w:noProof/>
                 <w:webHidden/>
               </w:rPr>
-              <w:instrText xml:space="preserve"> PAGEREF _Toc192688567 \h </w:instrText>
+              <w:instrText xml:space="preserve"> PAGEREF _Toc195699857 \h </w:instrText>
             </w:r>
             <w:r>
               <w:rPr>
@@ -9615,7 +9817,7 @@
                 <w:noProof/>
                 <w:webHidden/>
               </w:rPr>
-              <w:t>80</w:t>
+              <w:t>81</w:t>
             </w:r>
             <w:r>
               <w:rPr>
@@ -9641,7 +9843,7 @@
               <w14:ligatures w14:val="standardContextual"/>
             </w:rPr>
           </w:pPr>
-          <w:hyperlink w:anchor="_Toc192688568" w:history="1">
+          <w:hyperlink w:anchor="_Toc195699858" w:history="1">
             <w:r>
               <w:rPr>
                 <w:rStyle w:val="Hyperlink"/>
@@ -9668,7 +9870,7 @@
                 <w:noProof/>
                 <w:webHidden/>
               </w:rPr>
-              <w:instrText xml:space="preserve"> PAGEREF _Toc192688568 \h </w:instrText>
+              <w:instrText xml:space="preserve"> PAGEREF _Toc195699858 \h </w:instrText>
             </w:r>
             <w:r>
               <w:rPr>
@@ -9688,7 +9890,7 @@
                 <w:noProof/>
                 <w:webHidden/>
               </w:rPr>
-              <w:t>83</w:t>
+              <w:t>84</w:t>
             </w:r>
             <w:r>
               <w:rPr>
@@ -9714,7 +9916,7 @@
               <w14:ligatures w14:val="standardContextual"/>
             </w:rPr>
           </w:pPr>
-          <w:hyperlink w:anchor="_Toc192688569" w:history="1">
+          <w:hyperlink w:anchor="_Toc195699859" w:history="1">
             <w:r>
               <w:rPr>
                 <w:rStyle w:val="Hyperlink"/>
@@ -9741,7 +9943,7 @@
                 <w:noProof/>
                 <w:webHidden/>
               </w:rPr>
-              <w:instrText xml:space="preserve"> PAGEREF _Toc192688569 \h </w:instrText>
+              <w:instrText xml:space="preserve"> PAGEREF _Toc195699859 \h </w:instrText>
             </w:r>
             <w:r>
               <w:rPr>
@@ -9761,7 +9963,7 @@
                 <w:noProof/>
                 <w:webHidden/>
               </w:rPr>
-              <w:t>86</w:t>
+              <w:t>87</w:t>
             </w:r>
             <w:r>
               <w:rPr>
@@ -9787,7 +9989,7 @@
               <w14:ligatures w14:val="standardContextual"/>
             </w:rPr>
           </w:pPr>
-          <w:hyperlink w:anchor="_Toc192688570" w:history="1">
+          <w:hyperlink w:anchor="_Toc195699860" w:history="1">
             <w:r>
               <w:rPr>
                 <w:rStyle w:val="Hyperlink"/>
@@ -9814,7 +10016,7 @@
                 <w:noProof/>
                 <w:webHidden/>
               </w:rPr>
-              <w:instrText xml:space="preserve"> PAGEREF _Toc192688570 \h </w:instrText>
+              <w:instrText xml:space="preserve"> PAGEREF _Toc195699860 \h </w:instrText>
             </w:r>
             <w:r>
               <w:rPr>
@@ -9834,7 +10036,7 @@
                 <w:noProof/>
                 <w:webHidden/>
               </w:rPr>
-              <w:t>87</w:t>
+              <w:t>88</w:t>
             </w:r>
             <w:r>
               <w:rPr>
@@ -9860,7 +10062,7 @@
               <w14:ligatures w14:val="standardContextual"/>
             </w:rPr>
           </w:pPr>
-          <w:hyperlink w:anchor="_Toc192688571" w:history="1">
+          <w:hyperlink w:anchor="_Toc195699861" w:history="1">
             <w:r>
               <w:rPr>
                 <w:rStyle w:val="Hyperlink"/>
@@ -9887,7 +10089,7 @@
                 <w:noProof/>
                 <w:webHidden/>
               </w:rPr>
-              <w:instrText xml:space="preserve"> PAGEREF _Toc192688571 \h </w:instrText>
+              <w:instrText xml:space="preserve"> PAGEREF _Toc195699861 \h </w:instrText>
             </w:r>
             <w:r>
               <w:rPr>
@@ -9907,7 +10109,7 @@
                 <w:noProof/>
                 <w:webHidden/>
               </w:rPr>
-              <w:t>87</w:t>
+              <w:t>88</w:t>
             </w:r>
             <w:r>
               <w:rPr>
@@ -9933,7 +10135,7 @@
               <w14:ligatures w14:val="standardContextual"/>
             </w:rPr>
           </w:pPr>
-          <w:hyperlink w:anchor="_Toc192688572" w:history="1">
+          <w:hyperlink w:anchor="_Toc195699862" w:history="1">
             <w:r>
               <w:rPr>
                 <w:rStyle w:val="Hyperlink"/>
@@ -9960,7 +10162,7 @@
                 <w:noProof/>
                 <w:webHidden/>
               </w:rPr>
-              <w:instrText xml:space="preserve"> PAGEREF _Toc192688572 \h </w:instrText>
+              <w:instrText xml:space="preserve"> PAGEREF _Toc195699862 \h </w:instrText>
             </w:r>
             <w:r>
               <w:rPr>
@@ -9980,7 +10182,7 @@
                 <w:noProof/>
                 <w:webHidden/>
               </w:rPr>
-              <w:t>87</w:t>
+              <w:t>88</w:t>
             </w:r>
             <w:r>
               <w:rPr>
@@ -10006,7 +10208,7 @@
               <w14:ligatures w14:val="standardContextual"/>
             </w:rPr>
           </w:pPr>
-          <w:hyperlink w:anchor="_Toc192688573" w:history="1">
+          <w:hyperlink w:anchor="_Toc195699863" w:history="1">
             <w:r>
               <w:rPr>
                 <w:rStyle w:val="Hyperlink"/>
@@ -10033,7 +10235,7 @@
                 <w:noProof/>
                 <w:webHidden/>
               </w:rPr>
-              <w:instrText xml:space="preserve"> PAGEREF _Toc192688573 \h </w:instrText>
+              <w:instrText xml:space="preserve"> PAGEREF _Toc195699863 \h </w:instrText>
             </w:r>
             <w:r>
               <w:rPr>
@@ -10053,7 +10255,7 @@
                 <w:noProof/>
                 <w:webHidden/>
               </w:rPr>
-              <w:t>87</w:t>
+              <w:t>88</w:t>
             </w:r>
             <w:r>
               <w:rPr>
@@ -10079,7 +10281,7 @@
               <w14:ligatures w14:val="standardContextual"/>
             </w:rPr>
           </w:pPr>
-          <w:hyperlink w:anchor="_Toc192688574" w:history="1">
+          <w:hyperlink w:anchor="_Toc195699864" w:history="1">
             <w:r>
               <w:rPr>
                 <w:rStyle w:val="Hyperlink"/>
@@ -10106,7 +10308,7 @@
                 <w:noProof/>
                 <w:webHidden/>
               </w:rPr>
-              <w:instrText xml:space="preserve"> PAGEREF _Toc192688574 \h </w:instrText>
+              <w:instrText xml:space="preserve"> PAGEREF _Toc195699864 \h </w:instrText>
             </w:r>
             <w:r>
               <w:rPr>
@@ -10126,7 +10328,7 @@
                 <w:noProof/>
                 <w:webHidden/>
               </w:rPr>
-              <w:t>87</w:t>
+              <w:t>88</w:t>
             </w:r>
             <w:r>
               <w:rPr>
@@ -10152,7 +10354,7 @@
               <w14:ligatures w14:val="standardContextual"/>
             </w:rPr>
           </w:pPr>
-          <w:hyperlink w:anchor="_Toc192688575" w:history="1">
+          <w:hyperlink w:anchor="_Toc195699865" w:history="1">
             <w:r>
               <w:rPr>
                 <w:rStyle w:val="Hyperlink"/>
@@ -10179,7 +10381,7 @@
                 <w:noProof/>
                 <w:webHidden/>
               </w:rPr>
-              <w:instrText xml:space="preserve"> PAGEREF _Toc192688575 \h </w:instrText>
+              <w:instrText xml:space="preserve"> PAGEREF _Toc195699865 \h </w:instrText>
             </w:r>
             <w:r>
               <w:rPr>
@@ -10199,7 +10401,7 @@
                 <w:noProof/>
                 <w:webHidden/>
               </w:rPr>
-              <w:t>88</w:t>
+              <w:t>89</w:t>
             </w:r>
             <w:r>
               <w:rPr>
@@ -10225,7 +10427,7 @@
               <w14:ligatures w14:val="standardContextual"/>
             </w:rPr>
           </w:pPr>
-          <w:hyperlink w:anchor="_Toc192688576" w:history="1">
+          <w:hyperlink w:anchor="_Toc195699866" w:history="1">
             <w:r>
               <w:rPr>
                 <w:rStyle w:val="Hyperlink"/>
@@ -10252,7 +10454,7 @@
                 <w:noProof/>
                 <w:webHidden/>
               </w:rPr>
-              <w:instrText xml:space="preserve"> PAGEREF _Toc192688576 \h </w:instrText>
+              <w:instrText xml:space="preserve"> PAGEREF _Toc195699866 \h </w:instrText>
             </w:r>
             <w:r>
               <w:rPr>
@@ -10272,7 +10474,7 @@
                 <w:noProof/>
                 <w:webHidden/>
               </w:rPr>
-              <w:t>88</w:t>
+              <w:t>89</w:t>
             </w:r>
             <w:r>
               <w:rPr>
@@ -10298,7 +10500,7 @@
               <w14:ligatures w14:val="standardContextual"/>
             </w:rPr>
           </w:pPr>
-          <w:hyperlink w:anchor="_Toc192688577" w:history="1">
+          <w:hyperlink w:anchor="_Toc195699867" w:history="1">
             <w:r>
               <w:rPr>
                 <w:rStyle w:val="Hyperlink"/>
@@ -10325,7 +10527,7 @@
                 <w:noProof/>
                 <w:webHidden/>
               </w:rPr>
-              <w:instrText xml:space="preserve"> PAGEREF _Toc192688577 \h </w:instrText>
+              <w:instrText xml:space="preserve"> PAGEREF _Toc195699867 \h </w:instrText>
             </w:r>
             <w:r>
               <w:rPr>
@@ -10345,7 +10547,7 @@
                 <w:noProof/>
                 <w:webHidden/>
               </w:rPr>
-              <w:t>88</w:t>
+              <w:t>89</w:t>
             </w:r>
             <w:r>
               <w:rPr>
@@ -10371,7 +10573,7 @@
               <w14:ligatures w14:val="standardContextual"/>
             </w:rPr>
           </w:pPr>
-          <w:hyperlink w:anchor="_Toc192688578" w:history="1">
+          <w:hyperlink w:anchor="_Toc195699868" w:history="1">
             <w:r>
               <w:rPr>
                 <w:rStyle w:val="Hyperlink"/>
@@ -10398,7 +10600,7 @@
                 <w:noProof/>
                 <w:webHidden/>
               </w:rPr>
-              <w:instrText xml:space="preserve"> PAGEREF _Toc192688578 \h </w:instrText>
+              <w:instrText xml:space="preserve"> PAGEREF _Toc195699868 \h </w:instrText>
             </w:r>
             <w:r>
               <w:rPr>
@@ -10418,7 +10620,7 @@
                 <w:noProof/>
                 <w:webHidden/>
               </w:rPr>
-              <w:t>88</w:t>
+              <w:t>89</w:t>
             </w:r>
             <w:r>
               <w:rPr>
@@ -10444,7 +10646,7 @@
               <w14:ligatures w14:val="standardContextual"/>
             </w:rPr>
           </w:pPr>
-          <w:hyperlink w:anchor="_Toc192688579" w:history="1">
+          <w:hyperlink w:anchor="_Toc195699869" w:history="1">
             <w:r>
               <w:rPr>
                 <w:rStyle w:val="Hyperlink"/>
@@ -10471,7 +10673,7 @@
                 <w:noProof/>
                 <w:webHidden/>
               </w:rPr>
-              <w:instrText xml:space="preserve"> PAGEREF _Toc192688579 \h </w:instrText>
+              <w:instrText xml:space="preserve"> PAGEREF _Toc195699869 \h </w:instrText>
             </w:r>
             <w:r>
               <w:rPr>
@@ -10491,7 +10693,7 @@
                 <w:noProof/>
                 <w:webHidden/>
               </w:rPr>
-              <w:t>88</w:t>
+              <w:t>89</w:t>
             </w:r>
             <w:r>
               <w:rPr>
@@ -10517,7 +10719,7 @@
               <w14:ligatures w14:val="standardContextual"/>
             </w:rPr>
           </w:pPr>
-          <w:hyperlink w:anchor="_Toc192688580" w:history="1">
+          <w:hyperlink w:anchor="_Toc195699870" w:history="1">
             <w:r>
               <w:rPr>
                 <w:rStyle w:val="Hyperlink"/>
@@ -10544,7 +10746,7 @@
                 <w:noProof/>
                 <w:webHidden/>
               </w:rPr>
-              <w:instrText xml:space="preserve"> PAGEREF _Toc192688580 \h </w:instrText>
+              <w:instrText xml:space="preserve"> PAGEREF _Toc195699870 \h </w:instrText>
             </w:r>
             <w:r>
               <w:rPr>
@@ -10564,7 +10766,7 @@
                 <w:noProof/>
                 <w:webHidden/>
               </w:rPr>
-              <w:t>88</w:t>
+              <w:t>89</w:t>
             </w:r>
             <w:r>
               <w:rPr>
@@ -10590,7 +10792,7 @@
               <w14:ligatures w14:val="standardContextual"/>
             </w:rPr>
           </w:pPr>
-          <w:hyperlink w:anchor="_Toc192688581" w:history="1">
+          <w:hyperlink w:anchor="_Toc195699871" w:history="1">
             <w:r>
               <w:rPr>
                 <w:rStyle w:val="Hyperlink"/>
@@ -10617,7 +10819,7 @@
                 <w:noProof/>
                 <w:webHidden/>
               </w:rPr>
-              <w:instrText xml:space="preserve"> PAGEREF _Toc192688581 \h </w:instrText>
+              <w:instrText xml:space="preserve"> PAGEREF _Toc195699871 \h </w:instrText>
             </w:r>
             <w:r>
               <w:rPr>
@@ -10637,7 +10839,7 @@
                 <w:noProof/>
                 <w:webHidden/>
               </w:rPr>
-              <w:t>88</w:t>
+              <w:t>89</w:t>
             </w:r>
             <w:r>
               <w:rPr>
@@ -10663,7 +10865,7 @@
               <w14:ligatures w14:val="standardContextual"/>
             </w:rPr>
           </w:pPr>
-          <w:hyperlink w:anchor="_Toc192688582" w:history="1">
+          <w:hyperlink w:anchor="_Toc195699872" w:history="1">
             <w:r>
               <w:rPr>
                 <w:rStyle w:val="Hyperlink"/>
@@ -10690,7 +10892,7 @@
                 <w:noProof/>
                 <w:webHidden/>
               </w:rPr>
-              <w:instrText xml:space="preserve"> PAGEREF _Toc192688582 \h </w:instrText>
+              <w:instrText xml:space="preserve"> PAGEREF _Toc195699872 \h </w:instrText>
             </w:r>
             <w:r>
               <w:rPr>
@@ -10710,7 +10912,7 @@
                 <w:noProof/>
                 <w:webHidden/>
               </w:rPr>
-              <w:t>89</w:t>
+              <w:t>90</w:t>
             </w:r>
             <w:r>
               <w:rPr>
@@ -10736,7 +10938,7 @@
               <w14:ligatures w14:val="standardContextual"/>
             </w:rPr>
           </w:pPr>
-          <w:hyperlink w:anchor="_Toc192688583" w:history="1">
+          <w:hyperlink w:anchor="_Toc195699873" w:history="1">
             <w:r>
               <w:rPr>
                 <w:rStyle w:val="Hyperlink"/>
@@ -10763,7 +10965,7 @@
                 <w:noProof/>
                 <w:webHidden/>
               </w:rPr>
-              <w:instrText xml:space="preserve"> PAGEREF _Toc192688583 \h </w:instrText>
+              <w:instrText xml:space="preserve"> PAGEREF _Toc195699873 \h </w:instrText>
             </w:r>
             <w:r>
               <w:rPr>
@@ -10783,7 +10985,7 @@
                 <w:noProof/>
                 <w:webHidden/>
               </w:rPr>
-              <w:t>89</w:t>
+              <w:t>90</w:t>
             </w:r>
             <w:r>
               <w:rPr>
@@ -10809,7 +11011,7 @@
               <w14:ligatures w14:val="standardContextual"/>
             </w:rPr>
           </w:pPr>
-          <w:hyperlink w:anchor="_Toc192688584" w:history="1">
+          <w:hyperlink w:anchor="_Toc195699874" w:history="1">
             <w:r>
               <w:rPr>
                 <w:rStyle w:val="Hyperlink"/>
@@ -10836,7 +11038,7 @@
                 <w:noProof/>
                 <w:webHidden/>
               </w:rPr>
-              <w:instrText xml:space="preserve"> PAGEREF _Toc192688584 \h </w:instrText>
+              <w:instrText xml:space="preserve"> PAGEREF _Toc195699874 \h </w:instrText>
             </w:r>
             <w:r>
               <w:rPr>
@@ -10856,7 +11058,7 @@
                 <w:noProof/>
                 <w:webHidden/>
               </w:rPr>
-              <w:t>89</w:t>
+              <w:t>90</w:t>
             </w:r>
             <w:r>
               <w:rPr>
@@ -10882,7 +11084,7 @@
               <w14:ligatures w14:val="standardContextual"/>
             </w:rPr>
           </w:pPr>
-          <w:hyperlink w:anchor="_Toc192688585" w:history="1">
+          <w:hyperlink w:anchor="_Toc195699875" w:history="1">
             <w:r>
               <w:rPr>
                 <w:rStyle w:val="Hyperlink"/>
@@ -10909,7 +11111,7 @@
                 <w:noProof/>
                 <w:webHidden/>
               </w:rPr>
-              <w:instrText xml:space="preserve"> PAGEREF _Toc192688585 \h </w:instrText>
+              <w:instrText xml:space="preserve"> PAGEREF _Toc195699875 \h </w:instrText>
             </w:r>
             <w:r>
               <w:rPr>
@@ -10929,7 +11131,7 @@
                 <w:noProof/>
                 <w:webHidden/>
               </w:rPr>
-              <w:t>90</w:t>
+              <w:t>91</w:t>
             </w:r>
             <w:r>
               <w:rPr>
@@ -10955,7 +11157,7 @@
               <w14:ligatures w14:val="standardContextual"/>
             </w:rPr>
           </w:pPr>
-          <w:hyperlink w:anchor="_Toc192688586" w:history="1">
+          <w:hyperlink w:anchor="_Toc195699876" w:history="1">
             <w:r>
               <w:rPr>
                 <w:rStyle w:val="Hyperlink"/>
@@ -10982,7 +11184,7 @@
                 <w:noProof/>
                 <w:webHidden/>
               </w:rPr>
-              <w:instrText xml:space="preserve"> PAGEREF _Toc192688586 \h </w:instrText>
+              <w:instrText xml:space="preserve"> PAGEREF _Toc195699876 \h </w:instrText>
             </w:r>
             <w:r>
               <w:rPr>
@@ -11002,7 +11204,7 @@
                 <w:noProof/>
                 <w:webHidden/>
               </w:rPr>
-              <w:t>91</w:t>
+              <w:t>92</w:t>
             </w:r>
             <w:r>
               <w:rPr>
@@ -11028,7 +11230,7 @@
               <w14:ligatures w14:val="standardContextual"/>
             </w:rPr>
           </w:pPr>
-          <w:hyperlink w:anchor="_Toc192688587" w:history="1">
+          <w:hyperlink w:anchor="_Toc195699877" w:history="1">
             <w:r>
               <w:rPr>
                 <w:rStyle w:val="Hyperlink"/>
@@ -11055,7 +11257,7 @@
                 <w:noProof/>
                 <w:webHidden/>
               </w:rPr>
-              <w:instrText xml:space="preserve"> PAGEREF _Toc192688587 \h </w:instrText>
+              <w:instrText xml:space="preserve"> PAGEREF _Toc195699877 \h </w:instrText>
             </w:r>
             <w:r>
               <w:rPr>
@@ -11075,7 +11277,7 @@
                 <w:noProof/>
                 <w:webHidden/>
               </w:rPr>
-              <w:t>92</w:t>
+              <w:t>93</w:t>
             </w:r>
             <w:r>
               <w:rPr>
@@ -11093,6 +11295,7 @@
             </w:rPr>
           </w:pPr>
           <w:r>
+            <w:lastRenderedPageBreak/>
             <w:fldChar w:fldCharType="end"/>
           </w:r>
         </w:p>
@@ -11100,7 +11303,6 @@
     </w:sdt>
     <w:p>
       <w:r>
-        <w:lastRenderedPageBreak/>
         <w:br w:type="page"/>
       </w:r>
     </w:p>
@@ -11108,7 +11310,7 @@
       <w:pPr>
         <w:pStyle w:val="Heading1"/>
       </w:pPr>
-      <w:bookmarkStart w:id="0" w:name="_Toc192688497"/>
+      <w:bookmarkStart w:id="0" w:name="_Toc195699785"/>
       <w:r>
         <w:lastRenderedPageBreak/>
         <w:t xml:space="preserve">Pubseq Gateway </w:t>
@@ -11431,7 +11633,7 @@
       <w:pPr>
         <w:pStyle w:val="Heading1"/>
       </w:pPr>
-      <w:bookmarkStart w:id="1" w:name="_Toc192688498"/>
+      <w:bookmarkStart w:id="1" w:name="_Toc195699786"/>
       <w:r>
         <w:lastRenderedPageBreak/>
         <w:t>Overview</w:t>
@@ -11480,10 +11682,10 @@
             <v:path o:extrusionok="f" gradientshapeok="t" o:connecttype="rect"/>
             <o:lock v:ext="edit" aspectratio="t"/>
           </v:shapetype>
-          <v:shape id="_x0000_i1025" type="#_x0000_t75" style="width:467pt;height:232pt" o:ole="">
+          <v:shape id="_x0000_i1025" type="#_x0000_t75" style="width:467.1pt;height:231.95pt" o:ole="">
             <v:imagedata r:id="rId11" o:title=""/>
           </v:shape>
-          <o:OLEObject Type="Embed" ProgID="Visio.Drawing.15" ShapeID="_x0000_i1025" DrawAspect="Content" ObjectID="_1803301257" r:id="rId12"/>
+          <o:OLEObject Type="Embed" ProgID="Visio.Drawing.15" ShapeID="_x0000_i1025" DrawAspect="Content" ObjectID="_1806312549" r:id="rId12"/>
         </w:object>
       </w:r>
     </w:p>
@@ -11623,7 +11825,7 @@
       <w:pPr>
         <w:pStyle w:val="Heading1"/>
       </w:pPr>
-      <w:bookmarkStart w:id="2" w:name="_Toc192688499"/>
+      <w:bookmarkStart w:id="2" w:name="_Toc195699787"/>
       <w:r>
         <w:lastRenderedPageBreak/>
         <w:t>Communication Protocol</w:t>
@@ -11694,7 +11896,7 @@
       <w:pPr>
         <w:pStyle w:val="Heading2"/>
       </w:pPr>
-      <w:bookmarkStart w:id="3" w:name="_Toc192688500"/>
+      <w:bookmarkStart w:id="3" w:name="_Toc195699788"/>
       <w:r>
         <w:t>PSG Protocol</w:t>
       </w:r>
@@ -12240,7 +12442,6 @@
         <w:rPr>
           <w:noProof/>
         </w:rPr>
-        <w:lastRenderedPageBreak/>
         <w:drawing>
           <wp:inline distT="0" distB="0" distL="0" distR="0" wp14:anchorId="048FC899" wp14:editId="355DA0E0">
             <wp:extent cx="5943600" cy="995045"/>
@@ -13239,7 +13440,7 @@
         <w:pStyle w:val="Heading1"/>
       </w:pPr>
       <w:bookmarkStart w:id="4" w:name="_Exclude_Blob_Cache"/>
-      <w:bookmarkStart w:id="5" w:name="_Toc192688501"/>
+      <w:bookmarkStart w:id="5" w:name="_Toc195699789"/>
       <w:bookmarkEnd w:id="4"/>
       <w:r>
         <w:t>Exclude Blob Cache</w:t>
@@ -13341,7 +13542,7 @@
       <w:pPr>
         <w:pStyle w:val="Heading1"/>
       </w:pPr>
-      <w:bookmarkStart w:id="6" w:name="_Toc192688502"/>
+      <w:bookmarkStart w:id="6" w:name="_Toc195699790"/>
       <w:r>
         <w:t>Requests</w:t>
       </w:r>
@@ -13426,7 +13627,7 @@
         <w:pStyle w:val="Heading2"/>
       </w:pPr>
       <w:bookmarkStart w:id="7" w:name="_Common_ID/..._Request"/>
-      <w:bookmarkStart w:id="8" w:name="_Toc192688503"/>
+      <w:bookmarkStart w:id="8" w:name="_Toc195699791"/>
       <w:bookmarkEnd w:id="7"/>
       <w:r>
         <w:t>Common ID/</w:t>
@@ -13775,7 +13976,7 @@
       <w:pPr>
         <w:pStyle w:val="Heading2"/>
       </w:pPr>
-      <w:bookmarkStart w:id="10" w:name="_Toc192688504"/>
+      <w:bookmarkStart w:id="10" w:name="_Toc195699792"/>
       <w:r>
         <w:t>ID/</w:t>
       </w:r>
@@ -14899,7 +15100,7 @@
       <w:pPr>
         <w:pStyle w:val="Heading2"/>
       </w:pPr>
-      <w:bookmarkStart w:id="11" w:name="_Toc192688505"/>
+      <w:bookmarkStart w:id="11" w:name="_Toc195699793"/>
       <w:r>
         <w:t>ID/</w:t>
       </w:r>
@@ -16265,7 +16466,7 @@
       <w:pPr>
         <w:pStyle w:val="Heading2"/>
       </w:pPr>
-      <w:bookmarkStart w:id="12" w:name="_Toc192688506"/>
+      <w:bookmarkStart w:id="12" w:name="_Toc195699794"/>
       <w:r>
         <w:t>ID/get_tse_chunk Request</w:t>
       </w:r>
@@ -16837,7 +17038,7 @@
       <w:pPr>
         <w:pStyle w:val="Heading2"/>
       </w:pPr>
-      <w:bookmarkStart w:id="14" w:name="_Toc192688507"/>
+      <w:bookmarkStart w:id="14" w:name="_Toc195699795"/>
       <w:r>
         <w:t>ID/</w:t>
       </w:r>
@@ -17521,7 +17722,7 @@
       <w:pPr>
         <w:pStyle w:val="Heading2"/>
       </w:pPr>
-      <w:bookmarkStart w:id="15" w:name="_Toc192688508"/>
+      <w:bookmarkStart w:id="15" w:name="_Toc195699796"/>
       <w:r>
         <w:t>ID/</w:t>
       </w:r>
@@ -18797,7 +18998,7 @@
       <w:pPr>
         <w:pStyle w:val="Heading2"/>
       </w:pPr>
-      <w:bookmarkStart w:id="19" w:name="_Toc192688509"/>
+      <w:bookmarkStart w:id="19" w:name="_Toc195699797"/>
       <w:r>
         <w:t>ID/</w:t>
       </w:r>
@@ -19123,12 +19324,9 @@
       <w:pPr>
         <w:pStyle w:val="Heading2"/>
       </w:pPr>
-      <w:bookmarkStart w:id="20" w:name="_Toc192688510"/>
-      <w:r>
-        <w:t>ID/get_sat_mapping</w:t>
-      </w:r>
-      <w:r>
-        <w:t xml:space="preserve"> Request</w:t>
+      <w:bookmarkStart w:id="20" w:name="_Toc195699798"/>
+      <w:r>
+        <w:t>ID/get_sat_mapping Request</w:t>
       </w:r>
       <w:bookmarkEnd w:id="20"/>
     </w:p>
@@ -19147,13 +19345,7 @@
           <w:rPr>
             <w:rStyle w:val="Hyperlink"/>
           </w:rPr>
-          <w:t>http://&lt;host:port&gt;/</w:t>
-        </w:r>
-        <w:r>
-          <w:rPr>
-            <w:rStyle w:val="Hyperlink"/>
-          </w:rPr>
-          <w:t>ID/get_sat_mapping</w:t>
+          <w:t>http://&lt;host:port&gt;/ID/get_sat_mapping</w:t>
         </w:r>
       </w:hyperlink>
     </w:p>
@@ -19184,13 +19376,7 @@
         <w:t xml:space="preserve">HTTP </w:t>
       </w:r>
       <w:r>
-        <w:t xml:space="preserve">1.1 </w:t>
-      </w:r>
-      <w:r>
-        <w:t xml:space="preserve">or HTTP/2 protocol is used and </w:t>
-      </w:r>
-      <w:r>
-        <w:t xml:space="preserve">the </w:t>
+        <w:t xml:space="preserve">1.1 or HTTP/2 protocol is used and the </w:t>
       </w:r>
       <w:r>
         <w:t>body is a JSON dictionary with the cassandra sat to keyspace mapping information.</w:t>
@@ -19201,7 +19387,7 @@
       <w:pPr>
         <w:pStyle w:val="Heading2"/>
       </w:pPr>
-      <w:bookmarkStart w:id="21" w:name="_Toc192688511"/>
+      <w:bookmarkStart w:id="21" w:name="_Toc195699799"/>
       <w:r>
         <w:lastRenderedPageBreak/>
         <w:t>IPG/resolve Request</w:t>
@@ -19743,7 +19929,7 @@
       <w:pPr>
         <w:pStyle w:val="Heading2"/>
       </w:pPr>
-      <w:bookmarkStart w:id="22" w:name="_Toc192688512"/>
+      <w:bookmarkStart w:id="22" w:name="_Toc195699800"/>
       <w:r>
         <w:lastRenderedPageBreak/>
         <w:t>ADMIN/</w:t>
@@ -20061,7 +20247,7 @@
       <w:pPr>
         <w:pStyle w:val="Heading2"/>
       </w:pPr>
-      <w:bookmarkStart w:id="23" w:name="_Toc192688513"/>
+      <w:bookmarkStart w:id="23" w:name="_Toc195699801"/>
       <w:r>
         <w:t>ADMIN/</w:t>
       </w:r>
@@ -21267,7 +21453,7 @@
       <w:pPr>
         <w:pStyle w:val="Heading2"/>
       </w:pPr>
-      <w:bookmarkStart w:id="24" w:name="_Toc192688514"/>
+      <w:bookmarkStart w:id="24" w:name="_Toc195699802"/>
       <w:r>
         <w:t>ADMIN/</w:t>
       </w:r>
@@ -22796,7 +22982,7 @@
       <w:pPr>
         <w:pStyle w:val="Heading2"/>
       </w:pPr>
-      <w:bookmarkStart w:id="25" w:name="_Toc192688515"/>
+      <w:bookmarkStart w:id="25" w:name="_Toc195699803"/>
       <w:r>
         <w:t>ADMIN/</w:t>
       </w:r>
@@ -23265,7 +23451,7 @@
       <w:pPr>
         <w:pStyle w:val="Heading2"/>
       </w:pPr>
-      <w:bookmarkStart w:id="26" w:name="_Toc192688516"/>
+      <w:bookmarkStart w:id="26" w:name="_Toc195699804"/>
       <w:r>
         <w:t>ADMIN/</w:t>
       </w:r>
@@ -23455,7 +23641,7 @@
       <w:pPr>
         <w:pStyle w:val="Heading2"/>
       </w:pPr>
-      <w:bookmarkStart w:id="27" w:name="_Toc192688517"/>
+      <w:bookmarkStart w:id="27" w:name="_Toc195699805"/>
       <w:r>
         <w:t>ADMIN/ack_alert Request</w:t>
       </w:r>
@@ -23719,7 +23905,7 @@
       <w:pPr>
         <w:pStyle w:val="Heading2"/>
       </w:pPr>
-      <w:bookmarkStart w:id="28" w:name="_Toc192688518"/>
+      <w:bookmarkStart w:id="28" w:name="_Toc195699806"/>
       <w:r>
         <w:t>ADMIN/statistics Request</w:t>
       </w:r>
@@ -24120,19 +24306,216 @@
         <w:t>The content has a JSON dictionary which stores all the collected statistics since the server restart or the last reset.</w:t>
       </w:r>
     </w:p>
+    <w:p>
+      <w:pPr>
+        <w:pStyle w:val="Heading2"/>
+      </w:pPr>
+      <w:bookmarkStart w:id="29" w:name="_Toc195699807"/>
+      <w:r>
+        <w:t>ADMIN/</w:t>
+      </w:r>
+      <w:r>
+        <w:t>dispatcher_status</w:t>
+      </w:r>
+      <w:r>
+        <w:t xml:space="preserve"> Request</w:t>
+      </w:r>
+      <w:bookmarkEnd w:id="29"/>
+    </w:p>
     <w:p/>
     <w:p>
+      <w:r>
+        <w:t>The format of the request:</w:t>
+      </w:r>
+    </w:p>
+    <w:p>
+      <w:pPr>
+        <w:jc w:val="center"/>
+      </w:pPr>
+      <w:hyperlink w:history="1">
+        <w:r>
+          <w:rPr>
+            <w:rStyle w:val="Hyperlink"/>
+          </w:rPr>
+          <w:t>http://&lt;host:port&gt;/ADMIN/</w:t>
+        </w:r>
+        <w:r>
+          <w:rPr>
+            <w:rStyle w:val="Hyperlink"/>
+          </w:rPr>
+          <w:t>dispatcher_status</w:t>
+        </w:r>
+      </w:hyperlink>
+    </w:p>
+    <w:p>
+      <w:r>
+        <w:t>In case of errors a PSG protocol reply is sent otherwise the standard HTTP 1.1 or HTTP/2 protocol is used.</w:t>
+      </w:r>
+    </w:p>
+    <w:p>
+      <w:r>
+        <w:t>If it is a non-error reply then:</w:t>
+      </w:r>
+    </w:p>
+    <w:p>
+      <w:pPr>
+        <w:pStyle w:val="ListParagraph"/>
+        <w:numPr>
+          <w:ilvl w:val="0"/>
+          <w:numId w:val="13"/>
+        </w:numPr>
+      </w:pPr>
+      <w:r>
+        <w:t>The HTTP header Content-Type is set to “application/json”.</w:t>
+      </w:r>
+    </w:p>
+    <w:p>
+      <w:pPr>
+        <w:pStyle w:val="ListParagraph"/>
+        <w:numPr>
+          <w:ilvl w:val="0"/>
+          <w:numId w:val="13"/>
+        </w:numPr>
+      </w:pPr>
+      <w:r>
+        <w:lastRenderedPageBreak/>
+        <w:t>The HTTP header Content-Length is set approprietly.</w:t>
+      </w:r>
+    </w:p>
+    <w:p>
+      <w:pPr>
+        <w:pStyle w:val="ListParagraph"/>
+        <w:numPr>
+          <w:ilvl w:val="0"/>
+          <w:numId w:val="13"/>
+        </w:numPr>
+      </w:pPr>
+      <w:r>
+        <w:t xml:space="preserve">The content has a JSON dictionary which </w:t>
+      </w:r>
+      <w:r>
+        <w:t>provides the request dispatcher detailed information.</w:t>
+      </w:r>
+    </w:p>
+    <w:p/>
+    <w:p>
       <w:pPr>
         <w:pStyle w:val="Heading2"/>
       </w:pPr>
-      <w:bookmarkStart w:id="29" w:name="_Toc192688519"/>
+      <w:bookmarkStart w:id="30" w:name="_Toc195699808"/>
+      <w:r>
+        <w:t>ADMIN/</w:t>
+      </w:r>
+      <w:r>
+        <w:t>connections</w:t>
+      </w:r>
+      <w:r>
+        <w:t>_status Request</w:t>
+      </w:r>
+      <w:bookmarkEnd w:id="30"/>
+    </w:p>
+    <w:p/>
+    <w:p>
+      <w:r>
+        <w:t>The format of the request:</w:t>
+      </w:r>
+    </w:p>
+    <w:p>
+      <w:pPr>
+        <w:jc w:val="center"/>
+      </w:pPr>
+      <w:hyperlink w:history="1">
+        <w:r>
+          <w:rPr>
+            <w:rStyle w:val="Hyperlink"/>
+          </w:rPr>
+          <w:t>http://&lt;host:port&gt;/ADMIN/</w:t>
+        </w:r>
+        <w:r>
+          <w:rPr>
+            <w:rStyle w:val="Hyperlink"/>
+          </w:rPr>
+          <w:t>connections</w:t>
+        </w:r>
+        <w:r>
+          <w:rPr>
+            <w:rStyle w:val="Hyperlink"/>
+          </w:rPr>
+          <w:t>_status</w:t>
+        </w:r>
+      </w:hyperlink>
+    </w:p>
+    <w:p>
+      <w:r>
+        <w:t>In case of errors a PSG protocol reply is sent otherwise the standard HTTP 1.1 or HTTP/2 protocol is used.</w:t>
+      </w:r>
+    </w:p>
+    <w:p>
+      <w:r>
+        <w:t>If it is a non-error reply then:</w:t>
+      </w:r>
+    </w:p>
+    <w:p>
+      <w:pPr>
+        <w:pStyle w:val="ListParagraph"/>
+        <w:numPr>
+          <w:ilvl w:val="0"/>
+          <w:numId w:val="13"/>
+        </w:numPr>
+      </w:pPr>
+      <w:r>
+        <w:t>The HTTP header Content-Type is set to “application/json”.</w:t>
+      </w:r>
+    </w:p>
+    <w:p>
+      <w:pPr>
+        <w:pStyle w:val="ListParagraph"/>
+        <w:numPr>
+          <w:ilvl w:val="0"/>
+          <w:numId w:val="13"/>
+        </w:numPr>
+      </w:pPr>
+      <w:r>
+        <w:t>The HTTP header Content-Length is set approprietly.</w:t>
+      </w:r>
+    </w:p>
+    <w:p>
+      <w:pPr>
+        <w:pStyle w:val="ListParagraph"/>
+        <w:numPr>
+          <w:ilvl w:val="0"/>
+          <w:numId w:val="13"/>
+        </w:numPr>
+      </w:pPr>
+      <w:r>
+        <w:t xml:space="preserve">The content has a JSON </w:t>
+      </w:r>
+      <w:r>
+        <w:t xml:space="preserve">list </w:t>
+      </w:r>
+      <w:r>
+        <w:t xml:space="preserve">which provides the </w:t>
+      </w:r>
+      <w:r>
+        <w:t xml:space="preserve">client connections </w:t>
+      </w:r>
+      <w:r>
+        <w:t>detailed information.</w:t>
+      </w:r>
+    </w:p>
+    <w:p/>
+    <w:p>
+      <w:pPr>
+        <w:pStyle w:val="Heading2"/>
+      </w:pPr>
+      <w:bookmarkStart w:id="31" w:name="_Toc195699809"/>
       <w:r>
         <w:t>TEST/</w:t>
       </w:r>
       <w:r>
         <w:t>io Request</w:t>
       </w:r>
-      <w:bookmarkEnd w:id="29"/>
+      <w:bookmarkEnd w:id="31"/>
     </w:p>
     <w:p/>
     <w:p>
@@ -24165,7 +24548,7 @@
       </w:r>
     </w:p>
     <w:p>
-      <w:bookmarkStart w:id="30" w:name="OLE_LINK9"/>
+      <w:bookmarkStart w:id="32" w:name="OLE_LINK9"/>
       <w:r>
         <w:t>W</w:t>
       </w:r>
@@ -24193,7 +24576,6 @@
               <w:jc w:val="center"/>
             </w:pPr>
             <w:r>
-              <w:lastRenderedPageBreak/>
               <w:t>Parameter</w:t>
             </w:r>
           </w:p>
@@ -24303,7 +24685,7 @@
           </w:p>
         </w:tc>
       </w:tr>
-      <w:bookmarkEnd w:id="30"/>
+      <w:bookmarkEnd w:id="32"/>
     </w:tbl>
     <w:p/>
     <w:p>
@@ -24313,6 +24695,7 @@
     </w:p>
     <w:p>
       <w:r>
+        <w:lastRenderedPageBreak/>
         <w:t>In case of errors a PSG protocol reply is sent otherwise t</w:t>
       </w:r>
       <w:r>
@@ -24365,14 +24748,14 @@
       <w:pPr>
         <w:pStyle w:val="Heading2"/>
       </w:pPr>
-      <w:bookmarkStart w:id="31" w:name="_Toc192688520"/>
+      <w:bookmarkStart w:id="33" w:name="_Toc195699810"/>
       <w:r>
         <w:t>H</w:t>
       </w:r>
       <w:r>
         <w:t>ealth Request</w:t>
       </w:r>
-      <w:bookmarkEnd w:id="31"/>
+      <w:bookmarkEnd w:id="33"/>
     </w:p>
     <w:p/>
     <w:p>
@@ -24469,7 +24852,6 @@
         </w:numPr>
       </w:pPr>
       <w:r>
-        <w:lastRenderedPageBreak/>
         <w:t>Checks if the cache files are configured. If not then the server sends a</w:t>
       </w:r>
       <w:r>
@@ -24556,18 +24938,19 @@
       <w:pPr>
         <w:pStyle w:val="Heading2"/>
       </w:pPr>
-      <w:bookmarkStart w:id="32" w:name="_Toc192688521"/>
+      <w:bookmarkStart w:id="34" w:name="_Toc195699811"/>
       <w:r>
         <w:t>D</w:t>
       </w:r>
       <w:r>
         <w:t>eep-health Request</w:t>
       </w:r>
-      <w:bookmarkEnd w:id="32"/>
+      <w:bookmarkEnd w:id="34"/>
     </w:p>
     <w:p/>
     <w:p>
       <w:r>
+        <w:lastRenderedPageBreak/>
         <w:t>At the moment the deep-health request is an equivalent of the health request (see description above).</w:t>
       </w:r>
     </w:p>
@@ -24576,11 +24959,11 @@
       <w:pPr>
         <w:pStyle w:val="Heading2"/>
       </w:pPr>
-      <w:bookmarkStart w:id="33" w:name="_Toc192688522"/>
+      <w:bookmarkStart w:id="35" w:name="_Toc195699812"/>
       <w:r>
         <w:t>ReadyZ Request</w:t>
       </w:r>
-      <w:bookmarkEnd w:id="33"/>
+      <w:bookmarkEnd w:id="35"/>
     </w:p>
     <w:p/>
     <w:p>
@@ -24726,7 +25109,6 @@
     </w:p>
     <w:p>
       <w:r>
-        <w:lastRenderedPageBreak/>
         <w:t>If a verbose parameter is supplied then the server reply HTTP body will have a JSON dictionary with a list of checks and the detailed information of how they completed. Otherwise the serer reply HTTP body will be empty.</w:t>
       </w:r>
     </w:p>
@@ -24748,11 +25130,11 @@
       <w:pPr>
         <w:pStyle w:val="Heading2"/>
       </w:pPr>
-      <w:bookmarkStart w:id="34" w:name="_Toc192688523"/>
+      <w:bookmarkStart w:id="36" w:name="_Toc195699813"/>
       <w:r>
         <w:t>ReadyZCassandra Request</w:t>
       </w:r>
-      <w:bookmarkEnd w:id="34"/>
+      <w:bookmarkEnd w:id="36"/>
     </w:p>
     <w:p/>
     <w:p>
@@ -24913,7 +25295,7 @@
       <w:pPr>
         <w:pStyle w:val="Heading2"/>
       </w:pPr>
-      <w:bookmarkStart w:id="35" w:name="_Toc192688524"/>
+      <w:bookmarkStart w:id="37" w:name="_Toc195699814"/>
       <w:r>
         <w:t>ReadyZ</w:t>
       </w:r>
@@ -24923,12 +25305,11 @@
       <w:r>
         <w:t xml:space="preserve"> Request</w:t>
       </w:r>
-      <w:bookmarkEnd w:id="35"/>
+      <w:bookmarkEnd w:id="37"/>
     </w:p>
     <w:p/>
     <w:p>
       <w:r>
-        <w:lastRenderedPageBreak/>
         <w:t>The format of the request:</w:t>
       </w:r>
     </w:p>
@@ -25044,6 +25425,7 @@
     </w:p>
     <w:p>
       <w:r>
+        <w:lastRenderedPageBreak/>
         <w:t xml:space="preserve">The server checks that </w:t>
       </w:r>
       <w:r>
@@ -25076,11 +25458,11 @@
       <w:pPr>
         <w:pStyle w:val="Heading2"/>
       </w:pPr>
-      <w:bookmarkStart w:id="36" w:name="_Toc192688525"/>
+      <w:bookmarkStart w:id="38" w:name="_Toc195699815"/>
       <w:r>
         <w:t>ReadyZWGS Request</w:t>
       </w:r>
-      <w:bookmarkEnd w:id="36"/>
+      <w:bookmarkEnd w:id="38"/>
     </w:p>
     <w:p/>
     <w:p>
@@ -25189,40 +25571,40 @@
     <w:p/>
     <w:p>
       <w:r>
+        <w:t>The URL is for regular checks various monitoring tools may want to perform.</w:t>
+      </w:r>
+    </w:p>
+    <w:p>
+      <w:r>
+        <w:t>The server checks that the data are retrievable from the WGS data source. Upon finishing the check the server will reply to the client with the HTTP status 200 if everything is fine or some other code otherwise. The check is configurable via [WGS]/health_command and [WGS]/timeout parameters.</w:t>
+      </w:r>
+    </w:p>
+    <w:p>
+      <w:r>
+        <w:t>If a verbose parameter is supplied then the server reply HTTP body will have a JSON dictionary with a detailed information of how the check completed. Otherwise the serer reply HTTP body will be empty.</w:t>
+      </w:r>
+    </w:p>
+    <w:p>
+      <w:r>
+        <w:t>The verbose option is supported for the purpose of an interactuve usage by a human. Aoutomated tools should rely on the reply HTTP status code.</w:t>
+      </w:r>
+    </w:p>
+    <w:p>
+      <w:r>
+        <w:t>Note: available starting from version 2.12.0.</w:t>
+      </w:r>
+    </w:p>
+    <w:p/>
+    <w:p>
+      <w:pPr>
+        <w:pStyle w:val="Heading2"/>
+      </w:pPr>
+      <w:bookmarkStart w:id="39" w:name="_Toc195699816"/>
+      <w:r>
         <w:lastRenderedPageBreak/>
-        <w:t>The URL is for regular checks various monitoring tools may want to perform.</w:t>
-      </w:r>
-    </w:p>
-    <w:p>
-      <w:r>
-        <w:t>The server checks that the data are retrievable from the WGS data source. Upon finishing the check the server will reply to the client with the HTTP status 200 if everything is fine or some other code otherwise. The check is configurable via [WGS]/health_command and [WGS]/timeout parameters.</w:t>
-      </w:r>
-    </w:p>
-    <w:p>
-      <w:r>
-        <w:t>If a verbose parameter is supplied then the server reply HTTP body will have a JSON dictionary with a detailed information of how the check completed. Otherwise the serer reply HTTP body will be empty.</w:t>
-      </w:r>
-    </w:p>
-    <w:p>
-      <w:r>
-        <w:t>The verbose option is supported for the purpose of an interactuve usage by a human. Aoutomated tools should rely on the reply HTTP status code.</w:t>
-      </w:r>
-    </w:p>
-    <w:p>
-      <w:r>
-        <w:t>Note: available starting from version 2.12.0.</w:t>
-      </w:r>
-    </w:p>
-    <w:p/>
-    <w:p>
-      <w:pPr>
-        <w:pStyle w:val="Heading2"/>
-      </w:pPr>
-      <w:bookmarkStart w:id="37" w:name="_Toc192688526"/>
-      <w:r>
         <w:t>ReadyZCDD Request</w:t>
       </w:r>
-      <w:bookmarkEnd w:id="37"/>
+      <w:bookmarkEnd w:id="39"/>
     </w:p>
     <w:p/>
     <w:p>
@@ -25359,11 +25741,11 @@
       <w:pPr>
         <w:pStyle w:val="Heading2"/>
       </w:pPr>
-      <w:bookmarkStart w:id="38" w:name="_Toc192688527"/>
+      <w:bookmarkStart w:id="40" w:name="_Toc195699817"/>
       <w:r>
         <w:t>ReadyZSNP Request</w:t>
       </w:r>
-      <w:bookmarkEnd w:id="38"/>
+      <w:bookmarkEnd w:id="40"/>
     </w:p>
     <w:p/>
     <w:p>
@@ -25458,6 +25840,7 @@
           </w:p>
           <w:p>
             <w:r>
+              <w:lastRenderedPageBreak/>
               <w:t>If the flag is provided then the reply HTTP body will contain a JSON dictionary. Otherwise the reply HTTP body will be empty.</w:t>
             </w:r>
           </w:p>
@@ -25500,11 +25883,11 @@
       <w:pPr>
         <w:pStyle w:val="Heading2"/>
       </w:pPr>
-      <w:bookmarkStart w:id="39" w:name="_Toc192688528"/>
+      <w:bookmarkStart w:id="41" w:name="_Toc195699818"/>
       <w:r>
         <w:t>HealthZ Request</w:t>
       </w:r>
-      <w:bookmarkEnd w:id="39"/>
+      <w:bookmarkEnd w:id="41"/>
     </w:p>
     <w:p/>
     <w:p>
@@ -25596,7 +25979,6 @@
           </w:p>
           <w:p>
             <w:r>
-              <w:lastRenderedPageBreak/>
               <w:t>If the flag is provided then the reply HTTP body will contain a JSON dictionary. Otherwise the reply HTTP body will be empty.</w:t>
             </w:r>
           </w:p>
@@ -25614,7 +25996,6 @@
           </w:tcPr>
           <w:p>
             <w:r>
-              <w:lastRenderedPageBreak/>
               <w:t>exclude</w:t>
             </w:r>
           </w:p>
@@ -25652,11 +26033,11 @@
       <w:pPr>
         <w:pStyle w:val="Heading2"/>
       </w:pPr>
-      <w:bookmarkStart w:id="40" w:name="_Toc192688529"/>
+      <w:bookmarkStart w:id="42" w:name="_Toc195699819"/>
       <w:r>
         <w:t>LivezZ Request</w:t>
       </w:r>
-      <w:bookmarkEnd w:id="40"/>
+      <w:bookmarkEnd w:id="42"/>
     </w:p>
     <w:p/>
     <w:p>
@@ -25790,15 +26171,14 @@
       <w:pPr>
         <w:pStyle w:val="Heading2"/>
       </w:pPr>
-      <w:bookmarkStart w:id="41" w:name="_Toc192688530"/>
-      <w:r>
-        <w:lastRenderedPageBreak/>
+      <w:bookmarkStart w:id="43" w:name="_Toc195699820"/>
+      <w:r>
         <w:t>F</w:t>
       </w:r>
       <w:r>
         <w:t>avicon.ico Request</w:t>
       </w:r>
-      <w:bookmarkEnd w:id="41"/>
+      <w:bookmarkEnd w:id="43"/>
     </w:p>
     <w:p/>
     <w:p>
@@ -25842,11 +26222,12 @@
       <w:pPr>
         <w:pStyle w:val="Heading2"/>
       </w:pPr>
-      <w:bookmarkStart w:id="42" w:name="_Toc192688531"/>
-      <w:r>
+      <w:bookmarkStart w:id="44" w:name="_Toc195699821"/>
+      <w:r>
+        <w:lastRenderedPageBreak/>
         <w:t>Unknown URL Request</w:t>
       </w:r>
-      <w:bookmarkEnd w:id="42"/>
+      <w:bookmarkEnd w:id="44"/>
     </w:p>
     <w:p/>
     <w:p>
@@ -25928,11 +26309,11 @@
       <w:pPr>
         <w:pStyle w:val="Heading1"/>
       </w:pPr>
-      <w:bookmarkStart w:id="43" w:name="_Toc192688532"/>
+      <w:bookmarkStart w:id="45" w:name="_Toc195699822"/>
       <w:r>
         <w:t>Cassandra Database</w:t>
       </w:r>
-      <w:bookmarkEnd w:id="43"/>
+      <w:bookmarkEnd w:id="45"/>
     </w:p>
     <w:p/>
     <w:p>
@@ -25956,12 +26337,63 @@
         <w:pStyle w:val="Heading1"/>
         <w:jc w:val="both"/>
       </w:pPr>
-      <w:bookmarkStart w:id="44" w:name="_Toc192688533"/>
+      <w:bookmarkStart w:id="46" w:name="_Toc195699823"/>
+      <w:r>
+        <w:t>Monitoring and Maintenance</w:t>
+      </w:r>
+      <w:bookmarkEnd w:id="46"/>
+    </w:p>
+    <w:p/>
+    <w:p>
+      <w:pPr>
+        <w:jc w:val="both"/>
+      </w:pPr>
+      <w:r>
+        <w:t>The server code uses the standard C++ Toolkit logging. So logging configuration is the same as for all other NCBI C++ written applications.</w:t>
+      </w:r>
+    </w:p>
+    <w:p>
+      <w:pPr>
+        <w:jc w:val="both"/>
+      </w:pPr>
+      <w:r>
+        <w:t xml:space="preserve">The server also </w:t>
+      </w:r>
+      <w:r>
+        <w:t xml:space="preserve">exposes </w:t>
+      </w:r>
+      <w:r>
+        <w:t xml:space="preserve">some internal events monotonically growing </w:t>
+      </w:r>
+      <w:r>
+        <w:t>counters, status and configuration information</w:t>
+      </w:r>
+      <w:r>
+        <w:t>. This information is available via /ADMIN/&lt;item&gt; requests (see the request description above)</w:t>
+      </w:r>
+      <w:r>
+        <w:t>.</w:t>
+      </w:r>
+      <w:r>
+        <w:t xml:space="preserve"> It is also possible to shutdown the server using a URL request.</w:t>
+      </w:r>
+    </w:p>
+    <w:p>
+      <w:r>
+        <w:t>At the moment the alerts infrastructure is not supported.</w:t>
+      </w:r>
+    </w:p>
+    <w:p/>
+    <w:p>
+      <w:pPr>
+        <w:pStyle w:val="Heading1"/>
+      </w:pPr>
+      <w:bookmarkStart w:id="47" w:name="_Toc195699824"/>
       <w:r>
         <w:lastRenderedPageBreak/>
-        <w:t>Monitoring and Maintenance</w:t>
-      </w:r>
-      <w:bookmarkEnd w:id="44"/>
+        <w:t>Files Architecture</w:t>
+      </w:r>
+      <w:bookmarkEnd w:id="47"/>
     </w:p>
     <w:p/>
     <w:p>
@@ -25969,65 +26401,14 @@
         <w:jc w:val="both"/>
       </w:pPr>
       <w:r>
-        <w:t>The server code uses the standard C++ Toolkit logging. So logging configuration is the same as for all other NCBI C++ written applications.</w:t>
-      </w:r>
-    </w:p>
-    <w:p>
-      <w:pPr>
-        <w:jc w:val="both"/>
-      </w:pPr>
-      <w:r>
-        <w:t xml:space="preserve">The server also </w:t>
-      </w:r>
-      <w:r>
-        <w:t xml:space="preserve">exposes </w:t>
-      </w:r>
-      <w:r>
-        <w:t xml:space="preserve">some internal events monotonically growing </w:t>
-      </w:r>
-      <w:r>
-        <w:t>counters, status and configuration information</w:t>
-      </w:r>
-      <w:r>
-        <w:t>. This information is available via /ADMIN/&lt;item&gt; requests (see the request description above)</w:t>
+        <w:t>The diagram below shows the files used by Pubseq Gateway server</w:t>
+      </w:r>
+      <w:r>
+        <w:t xml:space="preserve"> (LMDB cache files are not shown as they are not read directly)</w:t>
       </w:r>
       <w:r>
         <w:t>.</w:t>
       </w:r>
-      <w:r>
-        <w:t xml:space="preserve"> It is also possible to shutdown the server using a URL request.</w:t>
-      </w:r>
-    </w:p>
-    <w:p>
-      <w:r>
-        <w:t>At the moment the alerts infrastructure is not supported.</w:t>
-      </w:r>
-    </w:p>
-    <w:p/>
-    <w:p>
-      <w:pPr>
-        <w:pStyle w:val="Heading1"/>
-      </w:pPr>
-      <w:bookmarkStart w:id="45" w:name="_Toc192688534"/>
-      <w:r>
-        <w:t>Files Architecture</w:t>
-      </w:r>
-      <w:bookmarkEnd w:id="45"/>
-    </w:p>
-    <w:p/>
-    <w:p>
-      <w:pPr>
-        <w:jc w:val="both"/>
-      </w:pPr>
-      <w:r>
-        <w:t>The diagram below shows the files used by Pubseq Gateway server</w:t>
-      </w:r>
-      <w:r>
-        <w:t xml:space="preserve"> (LMDB cache files are not shown as they are not read directly)</w:t>
-      </w:r>
-      <w:r>
-        <w:t>.</w:t>
-      </w:r>
     </w:p>
     <w:p>
       <w:pPr>
@@ -26035,10 +26416,10 @@
       </w:pPr>
       <w:r>
         <w:object w:dxaOrig="7351" w:dyaOrig="1591" w14:anchorId="620B4101">
-          <v:shape id="_x0000_i1026" type="#_x0000_t75" style="width:367.5pt;height:79.5pt" o:ole="">
+          <v:shape id="_x0000_i1026" type="#_x0000_t75" style="width:367.75pt;height:79.3pt" o:ole="">
             <v:imagedata r:id="rId47" o:title=""/>
           </v:shape>
-          <o:OLEObject Type="Embed" ProgID="Visio.Drawing.15" ShapeID="_x0000_i1026" DrawAspect="Content" ObjectID="_1803301258" r:id="rId48"/>
+          <o:OLEObject Type="Embed" ProgID="Visio.Drawing.15" ShapeID="_x0000_i1026" DrawAspect="Content" ObjectID="_1806312550" r:id="rId48"/>
         </w:object>
       </w:r>
     </w:p>
@@ -26064,11 +26445,11 @@
       <w:pPr>
         <w:pStyle w:val="Heading1"/>
       </w:pPr>
-      <w:bookmarkStart w:id="46" w:name="_Toc192688535"/>
+      <w:bookmarkStart w:id="48" w:name="_Toc195699825"/>
       <w:r>
         <w:t>Client API</w:t>
       </w:r>
-      <w:bookmarkEnd w:id="46"/>
+      <w:bookmarkEnd w:id="48"/>
     </w:p>
     <w:p/>
     <w:p>
@@ -26091,11 +26472,11 @@
       <w:pPr>
         <w:pStyle w:val="Heading1"/>
       </w:pPr>
-      <w:bookmarkStart w:id="47" w:name="_Toc192688536"/>
+      <w:bookmarkStart w:id="49" w:name="_Toc195699826"/>
       <w:r>
         <w:t>Command Line Arguments</w:t>
       </w:r>
-      <w:bookmarkEnd w:id="47"/>
+      <w:bookmarkEnd w:id="49"/>
     </w:p>
     <w:p/>
     <w:p>
@@ -26282,6 +26663,7 @@
           </w:tcPr>
           <w:p>
             <w:r>
+              <w:lastRenderedPageBreak/>
               <w:t>-conffile</w:t>
             </w:r>
           </w:p>
@@ -26303,11 +26685,11 @@
       <w:pPr>
         <w:pStyle w:val="Heading1"/>
       </w:pPr>
-      <w:bookmarkStart w:id="48" w:name="_Toc192688537"/>
+      <w:bookmarkStart w:id="50" w:name="_Toc195699827"/>
       <w:r>
         <w:t>Signal Handling</w:t>
       </w:r>
-      <w:bookmarkEnd w:id="48"/>
+      <w:bookmarkEnd w:id="50"/>
     </w:p>
     <w:p/>
     <w:p>
@@ -26457,11 +26839,11 @@
       <w:pPr>
         <w:pStyle w:val="Heading1"/>
       </w:pPr>
-      <w:bookmarkStart w:id="49" w:name="_Toc192688538"/>
+      <w:bookmarkStart w:id="51" w:name="_Toc195699828"/>
       <w:r>
         <w:t>Configuration Parameters</w:t>
       </w:r>
-      <w:bookmarkEnd w:id="49"/>
+      <w:bookmarkEnd w:id="51"/>
     </w:p>
     <w:p>
       <w:pPr>
@@ -26502,7 +26884,6 @@
         <w:jc w:val="both"/>
       </w:pPr>
       <w:r>
-        <w:lastRenderedPageBreak/>
         <w:t xml:space="preserve">The configuration file uses the </w:t>
       </w:r>
       <w:r>
@@ -26521,7 +26902,7 @@
       <w:pPr>
         <w:pStyle w:val="Heading2"/>
       </w:pPr>
-      <w:bookmarkStart w:id="50" w:name="_Toc192688539"/>
+      <w:bookmarkStart w:id="52" w:name="_Toc195699829"/>
       <w:r>
         <w:t>[</w:t>
       </w:r>
@@ -26537,7 +26918,7 @@
       <w:r>
         <w:t>ection</w:t>
       </w:r>
-      <w:bookmarkEnd w:id="50"/>
+      <w:bookmarkEnd w:id="52"/>
     </w:p>
     <w:p/>
     <w:tbl>
@@ -26711,6 +27092,7 @@
               <w:jc w:val="both"/>
             </w:pPr>
             <w:r>
+              <w:lastRenderedPageBreak/>
               <w:t>read_ahead</w:t>
             </w:r>
           </w:p>
@@ -26763,7 +27145,7 @@
       <w:pPr>
         <w:pStyle w:val="Heading2"/>
       </w:pPr>
-      <w:bookmarkStart w:id="51" w:name="_Toc192688540"/>
+      <w:bookmarkStart w:id="53" w:name="_Toc195699830"/>
       <w:r>
         <w:t>[SERVER</w:t>
       </w:r>
@@ -26776,7 +27158,7 @@
       <w:r>
         <w:t>ection</w:t>
       </w:r>
-      <w:bookmarkEnd w:id="51"/>
+      <w:bookmarkEnd w:id="53"/>
     </w:p>
     <w:p/>
     <w:tbl>
@@ -27149,7 +27531,6 @@
               <w:jc w:val="both"/>
             </w:pPr>
             <w:r>
-              <w:lastRenderedPageBreak/>
               <w:t>maxretries</w:t>
             </w:r>
           </w:p>
@@ -27360,6 +27741,7 @@
               <w:jc w:val="both"/>
             </w:pPr>
             <w:r>
+              <w:lastRenderedPageBreak/>
               <w:t>max_hops</w:t>
             </w:r>
           </w:p>
@@ -27620,11 +28002,7 @@
               <w:t>ProcessorMaxConcurrency</w:t>
             </w:r>
             <w:r>
-              <w:t xml:space="preserve"> should be put into a processor group specific section which is built as </w:t>
-            </w:r>
-            <w:r>
-              <w:lastRenderedPageBreak/>
-              <w:t>&lt;group name&gt;_PROCESSOR. For example, to have a specific value for the CDD processor the ini file should have [CDD_PROCESSOR]/</w:t>
+              <w:t xml:space="preserve"> should be put into a processor group specific section which is built as &lt;group name&gt;_PROCESSOR. For example, to have a specific value for the CDD processor the ini file should have [CDD_PROCESSOR]/</w:t>
             </w:r>
             <w:r>
               <w:t>ProcessorMaxConcurrency</w:t>
@@ -27645,7 +28023,6 @@
               <w:jc w:val="both"/>
             </w:pPr>
             <w:r>
-              <w:lastRenderedPageBreak/>
               <w:t>http_max_backlog</w:t>
             </w:r>
           </w:p>
@@ -27767,6 +28144,7 @@
               <w:jc w:val="both"/>
             </w:pPr>
             <w:r>
+              <w:lastRenderedPageBreak/>
               <w:t>Starting from 2.10.0 a decision of logging is made basing on the request session id. If a session id checksum is divided by the log_sampling_ration value with zero rest then the logging will be done.</w:t>
             </w:r>
           </w:p>
@@ -27798,6 +28176,7 @@
               <w:jc w:val="both"/>
             </w:pPr>
             <w:r>
+              <w:lastRenderedPageBreak/>
               <w:t>log_timing_threshold</w:t>
             </w:r>
           </w:p>
@@ -27916,11 +28295,11 @@
       <w:pPr>
         <w:pStyle w:val="Heading2"/>
       </w:pPr>
-      <w:bookmarkStart w:id="52" w:name="_Toc192688541"/>
+      <w:bookmarkStart w:id="54" w:name="_Toc195699831"/>
       <w:r>
         <w:t>[AUTO_EXCLUDE] Section</w:t>
       </w:r>
-      <w:bookmarkEnd w:id="52"/>
+      <w:bookmarkEnd w:id="54"/>
     </w:p>
     <w:p>
       <w:pPr>
@@ -28077,12 +28456,11 @@
       <w:pPr>
         <w:pStyle w:val="Heading2"/>
       </w:pPr>
-      <w:bookmarkStart w:id="53" w:name="_Toc192688542"/>
-      <w:r>
-        <w:lastRenderedPageBreak/>
+      <w:bookmarkStart w:id="55" w:name="_Toc195699832"/>
+      <w:r>
         <w:t>[ADMIN] Section</w:t>
       </w:r>
-      <w:bookmarkEnd w:id="53"/>
+      <w:bookmarkEnd w:id="55"/>
     </w:p>
     <w:p/>
     <w:tbl>
@@ -28198,11 +28576,12 @@
       <w:pPr>
         <w:pStyle w:val="Heading2"/>
       </w:pPr>
-      <w:bookmarkStart w:id="54" w:name="_Toc192688543"/>
-      <w:r>
+      <w:bookmarkStart w:id="56" w:name="_Toc195699833"/>
+      <w:r>
+        <w:lastRenderedPageBreak/>
         <w:t>[STATISTICS] Section</w:t>
       </w:r>
-      <w:bookmarkEnd w:id="54"/>
+      <w:bookmarkEnd w:id="56"/>
     </w:p>
     <w:p/>
     <w:tbl>
@@ -28574,12 +28953,11 @@
       <w:pPr>
         <w:pStyle w:val="Heading2"/>
       </w:pPr>
-      <w:bookmarkStart w:id="55" w:name="_Toc192688544"/>
-      <w:r>
-        <w:lastRenderedPageBreak/>
+      <w:bookmarkStart w:id="57" w:name="_Toc195699834"/>
+      <w:r>
         <w:t>[DEBUG] Section</w:t>
       </w:r>
-      <w:bookmarkEnd w:id="55"/>
+      <w:bookmarkEnd w:id="57"/>
     </w:p>
     <w:p>
       <w:pPr>
@@ -28717,6 +29095,7 @@
           </w:tcPr>
           <w:p>
             <w:r>
+              <w:lastRenderedPageBreak/>
               <w:t>allow_processor_timing</w:t>
             </w:r>
           </w:p>
@@ -28757,11 +29136,11 @@
       <w:pPr>
         <w:pStyle w:val="Heading2"/>
       </w:pPr>
-      <w:bookmarkStart w:id="56" w:name="_Toc192688545"/>
+      <w:bookmarkStart w:id="58" w:name="_Toc195699835"/>
       <w:r>
         <w:t>[IPG] Section</w:t>
       </w:r>
-      <w:bookmarkEnd w:id="56"/>
+      <w:bookmarkEnd w:id="58"/>
     </w:p>
     <w:p>
       <w:pPr>
@@ -28870,8 +29249,8 @@
       <w:pPr>
         <w:pStyle w:val="Heading2"/>
       </w:pPr>
-      <w:bookmarkStart w:id="57" w:name="OLE_LINK6"/>
-      <w:bookmarkStart w:id="58" w:name="_Toc192688546"/>
+      <w:bookmarkStart w:id="59" w:name="OLE_LINK6"/>
+      <w:bookmarkStart w:id="60" w:name="_Toc195699836"/>
       <w:r>
         <w:t xml:space="preserve">[CASSANDRA_DB] </w:t>
       </w:r>
@@ -28881,7 +29260,7 @@
       <w:r>
         <w:t>ection</w:t>
       </w:r>
-      <w:bookmarkEnd w:id="58"/>
+      <w:bookmarkEnd w:id="60"/>
     </w:p>
     <w:p/>
     <w:tbl>
@@ -29179,7 +29558,6 @@
               <w:jc w:val="both"/>
             </w:pPr>
             <w:r>
-              <w:lastRenderedPageBreak/>
               <w:t>numthreadsio</w:t>
             </w:r>
           </w:p>
@@ -29387,6 +29765,7 @@
               <w:jc w:val="both"/>
             </w:pPr>
             <w:r>
+              <w:lastRenderedPageBreak/>
               <w:t>password_section</w:t>
             </w:r>
           </w:p>
@@ -29483,7 +29862,7 @@
           </w:p>
         </w:tc>
       </w:tr>
-      <w:bookmarkEnd w:id="57"/>
+      <w:bookmarkEnd w:id="59"/>
     </w:tbl>
     <w:p>
       <w:pPr>
@@ -29494,11 +29873,11 @@
       <w:pPr>
         <w:pStyle w:val="Heading2"/>
       </w:pPr>
-      <w:bookmarkStart w:id="59" w:name="_Toc192688547"/>
+      <w:bookmarkStart w:id="61" w:name="_Toc195699837"/>
       <w:r>
         <w:t>[CASSANDRA_SECURE_DB] Section</w:t>
       </w:r>
-      <w:bookmarkEnd w:id="59"/>
+      <w:bookmarkEnd w:id="61"/>
     </w:p>
     <w:p/>
     <w:tbl>
@@ -29814,7 +30193,6 @@
               <w:jc w:val="both"/>
             </w:pPr>
             <w:r>
-              <w:lastRenderedPageBreak/>
               <w:t>Basically it is how many blob chunks are requested simultaneously per request. For example, if a blob with 100 chunks is requested then 4 select statements will be created and maintained simultaneously.</w:t>
             </w:r>
           </w:p>
@@ -29838,7 +30216,6 @@
               <w:jc w:val="both"/>
             </w:pPr>
             <w:r>
-              <w:lastRenderedPageBreak/>
               <w:t>numconnperhost</w:t>
             </w:r>
           </w:p>
@@ -29998,6 +30375,7 @@
               <w:jc w:val="both"/>
             </w:pPr>
             <w:r>
+              <w:lastRenderedPageBreak/>
               <w:t>If the value has neither ‘ ‘, nor ‘,’ nor ‘:’ then it is treated as a load balancer name. The load balancer resolved host ports are are sorted in accordance with their rates.</w:t>
             </w:r>
           </w:p>
@@ -30021,11 +30399,11 @@
       <w:pPr>
         <w:pStyle w:val="Heading2"/>
       </w:pPr>
-      <w:bookmarkStart w:id="60" w:name="_Toc192688548"/>
+      <w:bookmarkStart w:id="62" w:name="_Toc195699838"/>
       <w:r>
         <w:t>[CASSANDRA_PROCESSOR] Section</w:t>
       </w:r>
-      <w:bookmarkEnd w:id="60"/>
+      <w:bookmarkEnd w:id="62"/>
     </w:p>
     <w:p/>
     <w:tbl>
@@ -30323,7 +30701,6 @@
               <w:jc w:val="both"/>
             </w:pPr>
             <w:r>
-              <w:lastRenderedPageBreak/>
               <w:t>Default: false  (i . e., do heed the value of 'seq_id_resolve' URL arg)</w:t>
             </w:r>
           </w:p>
@@ -30335,11 +30712,11 @@
       <w:pPr>
         <w:pStyle w:val="Heading2"/>
       </w:pPr>
-      <w:bookmarkStart w:id="61" w:name="_Toc192688549"/>
+      <w:bookmarkStart w:id="63" w:name="_Toc195699839"/>
       <w:r>
         <w:t>[LMDB_PROCESSOR] Section</w:t>
       </w:r>
-      <w:bookmarkEnd w:id="61"/>
+      <w:bookmarkEnd w:id="63"/>
     </w:p>
     <w:p/>
     <w:tbl>
@@ -30466,6 +30843,7 @@
               <w:jc w:val="both"/>
             </w:pPr>
             <w:r>
+              <w:lastRenderedPageBreak/>
               <w:t>Timeout to wait for a completed reply for the 'health_command' (seconds)</w:t>
             </w:r>
           </w:p>
@@ -30493,11 +30871,11 @@
       <w:pPr>
         <w:pStyle w:val="Heading2"/>
       </w:pPr>
-      <w:bookmarkStart w:id="62" w:name="_Toc192688550"/>
+      <w:bookmarkStart w:id="64" w:name="_Toc195699840"/>
       <w:r>
         <w:t>[OSG_PROCESSOR] Section</w:t>
       </w:r>
-      <w:bookmarkEnd w:id="62"/>
+      <w:bookmarkEnd w:id="64"/>
     </w:p>
     <w:p/>
     <w:tbl>
@@ -30760,11 +31138,11 @@
       <w:pPr>
         <w:pStyle w:val="Heading2"/>
       </w:pPr>
-      <w:bookmarkStart w:id="63" w:name="_Toc192688551"/>
+      <w:bookmarkStart w:id="65" w:name="_Toc195699841"/>
       <w:r>
         <w:t>[WGS_PROCESSOR] Section</w:t>
       </w:r>
-      <w:bookmarkEnd w:id="63"/>
+      <w:bookmarkEnd w:id="65"/>
     </w:p>
     <w:p/>
     <w:tbl>
@@ -30851,7 +31229,6 @@
               <w:jc w:val="both"/>
             </w:pPr>
             <w:r>
-              <w:lastRenderedPageBreak/>
               <w:t>ProcessorMaxConcurrency</w:t>
             </w:r>
           </w:p>
@@ -31016,6 +31393,7 @@
               <w:jc w:val="both"/>
             </w:pPr>
             <w:r>
+              <w:lastRenderedPageBreak/>
               <w:t>Note: available starting from psg 2.12.0</w:t>
             </w:r>
           </w:p>
@@ -31027,11 +31405,11 @@
       <w:pPr>
         <w:pStyle w:val="Heading2"/>
       </w:pPr>
-      <w:bookmarkStart w:id="64" w:name="_Toc192688552"/>
+      <w:bookmarkStart w:id="66" w:name="_Toc195699842"/>
       <w:r>
         <w:t>[SNP_PROCESSOR] Section</w:t>
       </w:r>
-      <w:bookmarkEnd w:id="64"/>
+      <w:bookmarkEnd w:id="66"/>
     </w:p>
     <w:p/>
     <w:tbl>
@@ -31293,11 +31671,11 @@
       <w:pPr>
         <w:pStyle w:val="Heading2"/>
       </w:pPr>
-      <w:bookmarkStart w:id="65" w:name="_Toc192688553"/>
+      <w:bookmarkStart w:id="67" w:name="_Toc195699843"/>
       <w:r>
         <w:t>[CDD_PROCESSOR] Section</w:t>
       </w:r>
-      <w:bookmarkEnd w:id="65"/>
+      <w:bookmarkEnd w:id="67"/>
     </w:p>
     <w:p/>
     <w:tbl>
@@ -31348,7 +31726,6 @@
               <w:jc w:val="both"/>
             </w:pPr>
             <w:r>
-              <w:lastRenderedPageBreak/>
               <w:t>enabled</w:t>
             </w:r>
           </w:p>
@@ -31530,6 +31907,7 @@
               <w:jc w:val="both"/>
             </w:pPr>
             <w:r>
+              <w:lastRenderedPageBreak/>
               <w:t>Timeout to wait for a completed reply for the 'health_command' (seconds)</w:t>
             </w:r>
           </w:p>
@@ -31557,11 +31935,11 @@
       <w:pPr>
         <w:pStyle w:val="Heading2"/>
       </w:pPr>
-      <w:bookmarkStart w:id="66" w:name="_Toc192688554"/>
+      <w:bookmarkStart w:id="68" w:name="_Toc195699844"/>
       <w:r>
         <w:t>[COUNTERS] Section</w:t>
       </w:r>
-      <w:bookmarkEnd w:id="66"/>
+      <w:bookmarkEnd w:id="68"/>
     </w:p>
     <w:p/>
     <w:p>
@@ -31650,11 +32028,11 @@
       <w:pPr>
         <w:pStyle w:val="Heading2"/>
       </w:pPr>
-      <w:bookmarkStart w:id="67" w:name="_Toc192688555"/>
+      <w:bookmarkStart w:id="69" w:name="_Toc195699845"/>
       <w:r>
         <w:t>[HEALTH] Section</w:t>
       </w:r>
-      <w:bookmarkEnd w:id="67"/>
+      <w:bookmarkEnd w:id="69"/>
     </w:p>
     <w:p>
       <w:pPr>
@@ -31732,18 +32110,17 @@
             <w:pPr>
               <w:jc w:val="both"/>
             </w:pPr>
-            <w:bookmarkStart w:id="68" w:name="OLE_LINK10"/>
+            <w:bookmarkStart w:id="70" w:name="OLE_LINK10"/>
             <w:r>
               <w:t>Note: Obsolete starting from psg 2.12.0</w:t>
             </w:r>
           </w:p>
-          <w:bookmarkEnd w:id="68"/>
+          <w:bookmarkEnd w:id="70"/>
           <w:p>
             <w:pPr>
               <w:jc w:val="both"/>
             </w:pPr>
             <w:r>
-              <w:lastRenderedPageBreak/>
               <w:t>The seq_id to be resolved within the procedure of checking the server health.</w:t>
             </w:r>
           </w:p>
@@ -31770,7 +32147,6 @@
               <w:jc w:val="both"/>
             </w:pPr>
             <w:r>
-              <w:lastRenderedPageBreak/>
               <w:t>test_seq_id_ignore_error</w:t>
             </w:r>
           </w:p>
@@ -31860,6 +32236,7 @@
               <w:jc w:val="both"/>
             </w:pPr>
             <w:r>
+              <w:lastRenderedPageBreak/>
               <w:t>If only "NONE" is used then assume the list to be empty, return 200 always.</w:t>
             </w:r>
           </w:p>
@@ -31891,6 +32268,7 @@
               <w:jc w:val="both"/>
             </w:pPr>
             <w:r>
+              <w:lastRenderedPageBreak/>
               <w:t>timeout</w:t>
             </w:r>
           </w:p>
@@ -31935,11 +32313,11 @@
       <w:pPr>
         <w:pStyle w:val="Heading2"/>
       </w:pPr>
-      <w:bookmarkStart w:id="69" w:name="_Toc192688556"/>
+      <w:bookmarkStart w:id="71" w:name="_Toc195699846"/>
       <w:r>
         <w:t>[SSL] Section</w:t>
       </w:r>
-      <w:bookmarkEnd w:id="69"/>
+      <w:bookmarkEnd w:id="71"/>
     </w:p>
     <w:p>
       <w:pPr>
@@ -32157,11 +32535,11 @@
       <w:pPr>
         <w:pStyle w:val="Heading2"/>
       </w:pPr>
-      <w:bookmarkStart w:id="70" w:name="_Toc192688557"/>
+      <w:bookmarkStart w:id="72" w:name="_Toc195699847"/>
       <w:r>
         <w:t>[MY_NCBI] Section</w:t>
       </w:r>
-      <w:bookmarkEnd w:id="70"/>
+      <w:bookmarkEnd w:id="72"/>
     </w:p>
     <w:p>
       <w:pPr>
@@ -32173,7 +32551,6 @@
         <w:jc w:val="both"/>
       </w:pPr>
       <w:r>
-        <w:lastRenderedPageBreak/>
         <w:t>The section configures access to th MyNCBI service.</w:t>
       </w:r>
     </w:p>
@@ -32353,7 +32730,7 @@
             <w:pPr>
               <w:jc w:val="both"/>
             </w:pPr>
-            <w:bookmarkStart w:id="71" w:name="OLE_LINK7"/>
+            <w:bookmarkStart w:id="73" w:name="OLE_LINK7"/>
             <w:r>
               <w:t>Low mark is calculated as 0.8 of the high mark.</w:t>
             </w:r>
@@ -32363,6 +32740,7 @@
               <w:jc w:val="both"/>
             </w:pPr>
             <w:r>
+              <w:lastRenderedPageBreak/>
               <w:t>The cleanup is done basing on last touch when the high mark is exceeded.</w:t>
             </w:r>
           </w:p>
@@ -32392,7 +32770,7 @@
             <w:r>
               <w:t>Default: 10000</w:t>
             </w:r>
-            <w:bookmarkEnd w:id="71"/>
+            <w:bookmarkEnd w:id="73"/>
           </w:p>
         </w:tc>
       </w:tr>
@@ -32403,6 +32781,7 @@
           </w:tcPr>
           <w:p>
             <w:r>
+              <w:lastRenderedPageBreak/>
               <w:t>not_found_cache_size</w:t>
             </w:r>
           </w:p>
@@ -32420,7 +32799,7 @@
             <w:pPr>
               <w:jc w:val="both"/>
             </w:pPr>
-            <w:bookmarkStart w:id="72" w:name="OLE_LINK8"/>
+            <w:bookmarkStart w:id="74" w:name="OLE_LINK8"/>
             <w:r>
               <w:t>Low mark is calculated as 0.8 of the high mark.</w:t>
             </w:r>
@@ -32459,7 +32838,7 @@
             <w:r>
               <w:t>Default: 10000</w:t>
             </w:r>
-            <w:bookmarkEnd w:id="72"/>
+            <w:bookmarkEnd w:id="74"/>
           </w:p>
         </w:tc>
       </w:tr>
@@ -32664,7 +33043,6 @@
           </w:tcPr>
           <w:p>
             <w:r>
-              <w:lastRenderedPageBreak/>
               <w:t>dns_resolve_fail_period_sec</w:t>
             </w:r>
           </w:p>
@@ -32770,6 +33148,7 @@
           </w:tcPr>
           <w:p>
             <w:r>
+              <w:lastRenderedPageBreak/>
               <w:t>test_fail_period_sec</w:t>
             </w:r>
           </w:p>
@@ -32805,11 +33184,11 @@
       <w:pPr>
         <w:pStyle w:val="Heading2"/>
       </w:pPr>
-      <w:bookmarkStart w:id="73" w:name="_Toc192688558"/>
+      <w:bookmarkStart w:id="75" w:name="_Toc195699848"/>
       <w:r>
         <w:t>[LOG] Section</w:t>
       </w:r>
-      <w:bookmarkEnd w:id="73"/>
+      <w:bookmarkEnd w:id="75"/>
     </w:p>
     <w:p>
       <w:pPr>
@@ -32904,22 +33283,22 @@
       <w:pPr>
         <w:pStyle w:val="Heading1"/>
       </w:pPr>
-      <w:bookmarkStart w:id="74" w:name="_Toc192688559"/>
+      <w:bookmarkStart w:id="76" w:name="_Toc195699849"/>
       <w:r>
         <w:lastRenderedPageBreak/>
         <w:t>Appendix</w:t>
       </w:r>
-      <w:bookmarkEnd w:id="74"/>
+      <w:bookmarkEnd w:id="76"/>
     </w:p>
     <w:p>
       <w:pPr>
         <w:pStyle w:val="Heading2"/>
       </w:pPr>
-      <w:bookmarkStart w:id="75" w:name="_Toc192688560"/>
+      <w:bookmarkStart w:id="77" w:name="_Toc195699850"/>
       <w:r>
         <w:t>PSG Processors</w:t>
       </w:r>
-      <w:bookmarkEnd w:id="75"/>
+      <w:bookmarkEnd w:id="77"/>
     </w:p>
     <w:p>
       <w:r>
@@ -33590,11 +33969,11 @@
       <w:pPr>
         <w:pStyle w:val="Heading2"/>
       </w:pPr>
-      <w:bookmarkStart w:id="76" w:name="_Toc192688561"/>
+      <w:bookmarkStart w:id="78" w:name="_Toc195699851"/>
       <w:r>
         <w:t>PSG Requests</w:t>
       </w:r>
-      <w:bookmarkEnd w:id="76"/>
+      <w:bookmarkEnd w:id="78"/>
     </w:p>
     <w:p>
       <w:pPr>
@@ -33802,11 +34181,11 @@
       <w:pPr>
         <w:pStyle w:val="Heading2"/>
       </w:pPr>
-      <w:bookmarkStart w:id="77" w:name="_Toc192688562"/>
+      <w:bookmarkStart w:id="79" w:name="_Toc195699852"/>
       <w:r>
         <w:t>PSG Timing Collecting</w:t>
       </w:r>
-      <w:bookmarkEnd w:id="77"/>
+      <w:bookmarkEnd w:id="79"/>
     </w:p>
     <w:p>
       <w:r>
@@ -34146,13 +34525,13 @@
       <w:pPr>
         <w:pStyle w:val="Heading2"/>
       </w:pPr>
-      <w:bookmarkStart w:id="78" w:name="_Exclude_Blob_API"/>
-      <w:bookmarkStart w:id="79" w:name="_Toc192688563"/>
-      <w:bookmarkEnd w:id="78"/>
+      <w:bookmarkStart w:id="80" w:name="_Exclude_Blob_API"/>
+      <w:bookmarkStart w:id="81" w:name="_Toc195699853"/>
+      <w:bookmarkEnd w:id="80"/>
       <w:r>
         <w:t>Exclude Blob API</w:t>
       </w:r>
-      <w:bookmarkEnd w:id="79"/>
+      <w:bookmarkEnd w:id="81"/>
     </w:p>
     <w:p>
       <w:r>
@@ -34286,12 +34665,12 @@
       <w:pPr>
         <w:pStyle w:val="Heading2"/>
       </w:pPr>
-      <w:bookmarkStart w:id="80" w:name="_Toc192688564"/>
+      <w:bookmarkStart w:id="82" w:name="_Toc195699854"/>
       <w:r>
         <w:lastRenderedPageBreak/>
         <w:t>Alerts API</w:t>
       </w:r>
-      <w:bookmarkEnd w:id="80"/>
+      <w:bookmarkEnd w:id="82"/>
     </w:p>
     <w:p>
       <w:r>
@@ -34459,11 +34838,11 @@
       <w:pPr>
         <w:pStyle w:val="Heading2"/>
       </w:pPr>
-      <w:bookmarkStart w:id="81" w:name="_Toc192688565"/>
+      <w:bookmarkStart w:id="83" w:name="_Toc195699855"/>
       <w:r>
         <w:t>Event Counter API</w:t>
       </w:r>
-      <w:bookmarkEnd w:id="81"/>
+      <w:bookmarkEnd w:id="83"/>
     </w:p>
     <w:p>
       <w:pPr>
@@ -34626,11 +35005,11 @@
       <w:pPr>
         <w:pStyle w:val="Heading2"/>
       </w:pPr>
-      <w:bookmarkStart w:id="82" w:name="_Toc192688566"/>
+      <w:bookmarkStart w:id="84" w:name="_Toc195699856"/>
       <w:r>
         <w:t>Asynchronous socket polling API</w:t>
       </w:r>
-      <w:bookmarkEnd w:id="82"/>
+      <w:bookmarkEnd w:id="84"/>
     </w:p>
     <w:p>
       <w:pPr>
@@ -34855,11 +35234,11 @@
       <w:pPr>
         <w:pStyle w:val="Heading2"/>
       </w:pPr>
-      <w:bookmarkStart w:id="83" w:name="_Toc192688567"/>
+      <w:bookmarkStart w:id="85" w:name="_Toc195699857"/>
       <w:r>
         <w:t>Handling Non-libuv Events Asynchronously</w:t>
       </w:r>
-      <w:bookmarkEnd w:id="83"/>
+      <w:bookmarkEnd w:id="85"/>
     </w:p>
     <w:p>
       <w:r>
@@ -36556,11 +36935,11 @@
       <w:pPr>
         <w:pStyle w:val="Heading2"/>
       </w:pPr>
-      <w:bookmarkStart w:id="84" w:name="_Toc192688568"/>
+      <w:bookmarkStart w:id="86" w:name="_Toc195699858"/>
       <w:r>
         <w:t>Protocol Diagrams</w:t>
       </w:r>
-      <w:bookmarkEnd w:id="84"/>
+      <w:bookmarkEnd w:id="86"/>
     </w:p>
     <w:p/>
     <w:p>
@@ -38648,14 +39027,14 @@
       <w:pPr>
         <w:pStyle w:val="Heading2"/>
       </w:pPr>
-      <w:bookmarkStart w:id="85" w:name="_Toc192688569"/>
+      <w:bookmarkStart w:id="87" w:name="_Toc195699859"/>
       <w:r>
         <w:t xml:space="preserve">GetBlob </w:t>
       </w:r>
       <w:r>
         <w:t>Diagram</w:t>
       </w:r>
-      <w:bookmarkEnd w:id="85"/>
+      <w:bookmarkEnd w:id="87"/>
     </w:p>
     <w:p/>
     <w:p>
@@ -38710,12 +39089,12 @@
       <w:pPr>
         <w:pStyle w:val="Heading2"/>
       </w:pPr>
-      <w:bookmarkStart w:id="86" w:name="_Toc192688570"/>
+      <w:bookmarkStart w:id="88" w:name="_Toc195699860"/>
       <w:r>
         <w:lastRenderedPageBreak/>
         <w:t>General Server Structure</w:t>
       </w:r>
-      <w:bookmarkEnd w:id="86"/>
+      <w:bookmarkEnd w:id="88"/>
     </w:p>
     <w:p/>
     <w:p>
@@ -38867,11 +39246,11 @@
       <w:pPr>
         <w:pStyle w:val="Heading3"/>
       </w:pPr>
-      <w:bookmarkStart w:id="87" w:name="_Toc192688571"/>
+      <w:bookmarkStart w:id="89" w:name="_Toc195699861"/>
       <w:r>
         <w:t>Startup</w:t>
       </w:r>
-      <w:bookmarkEnd w:id="87"/>
+      <w:bookmarkEnd w:id="89"/>
     </w:p>
     <w:p>
       <w:r>
@@ -38959,11 +39338,11 @@
       <w:pPr>
         <w:pStyle w:val="Heading3"/>
       </w:pPr>
-      <w:bookmarkStart w:id="88" w:name="_Toc192688572"/>
+      <w:bookmarkStart w:id="90" w:name="_Toc195699862"/>
       <w:r>
         <w:t>CTcpWorker</w:t>
       </w:r>
-      <w:bookmarkEnd w:id="88"/>
+      <w:bookmarkEnd w:id="90"/>
     </w:p>
     <w:p>
       <w:pPr>
@@ -38977,11 +39356,11 @@
       <w:pPr>
         <w:pStyle w:val="Heading3"/>
       </w:pPr>
-      <w:bookmarkStart w:id="89" w:name="_Toc192688573"/>
+      <w:bookmarkStart w:id="91" w:name="_Toc195699863"/>
       <w:r>
         <w:t>CTcpWorkersList</w:t>
       </w:r>
-      <w:bookmarkEnd w:id="89"/>
+      <w:bookmarkEnd w:id="91"/>
     </w:p>
     <w:p>
       <w:pPr>
@@ -38995,11 +39374,11 @@
       <w:pPr>
         <w:pStyle w:val="Heading3"/>
       </w:pPr>
-      <w:bookmarkStart w:id="90" w:name="_Toc192688574"/>
+      <w:bookmarkStart w:id="92" w:name="_Toc195699864"/>
       <w:r>
         <w:t>CTcpDaemon</w:t>
       </w:r>
-      <w:bookmarkEnd w:id="90"/>
+      <w:bookmarkEnd w:id="92"/>
     </w:p>
     <w:p>
       <w:pPr>
@@ -39026,11 +39405,11 @@
       <w:pPr>
         <w:pStyle w:val="Heading3"/>
       </w:pPr>
-      <w:bookmarkStart w:id="91" w:name="_Toc192688575"/>
+      <w:bookmarkStart w:id="93" w:name="_Toc195699865"/>
       <w:r>
         <w:t>CHttpRequest</w:t>
       </w:r>
-      <w:bookmarkEnd w:id="91"/>
+      <w:bookmarkEnd w:id="93"/>
     </w:p>
     <w:p>
       <w:pPr>
@@ -39056,11 +39435,11 @@
       <w:pPr>
         <w:pStyle w:val="Heading3"/>
       </w:pPr>
-      <w:bookmarkStart w:id="92" w:name="_Toc192688576"/>
+      <w:bookmarkStart w:id="94" w:name="_Toc195699866"/>
       <w:r>
         <w:t>CPSGS_Request</w:t>
       </w:r>
-      <w:bookmarkEnd w:id="92"/>
+      <w:bookmarkEnd w:id="94"/>
     </w:p>
     <w:p>
       <w:pPr>
@@ -39074,11 +39453,11 @@
       <w:pPr>
         <w:pStyle w:val="Heading3"/>
       </w:pPr>
-      <w:bookmarkStart w:id="93" w:name="_Toc192688577"/>
+      <w:bookmarkStart w:id="95" w:name="_Toc195699867"/>
       <w:r>
         <w:t>CHttpReply</w:t>
       </w:r>
-      <w:bookmarkEnd w:id="93"/>
+      <w:bookmarkEnd w:id="95"/>
     </w:p>
     <w:p>
       <w:pPr>
@@ -39092,11 +39471,11 @@
       <w:pPr>
         <w:pStyle w:val="Heading3"/>
       </w:pPr>
-      <w:bookmarkStart w:id="94" w:name="_Toc192688578"/>
+      <w:bookmarkStart w:id="96" w:name="_Toc195699868"/>
       <w:r>
         <w:t>CPSGS_Reply</w:t>
       </w:r>
-      <w:bookmarkEnd w:id="94"/>
+      <w:bookmarkEnd w:id="96"/>
     </w:p>
     <w:p>
       <w:pPr>
@@ -39110,11 +39489,11 @@
       <w:pPr>
         <w:pStyle w:val="Heading3"/>
       </w:pPr>
-      <w:bookmarkStart w:id="95" w:name="_Toc192688579"/>
+      <w:bookmarkStart w:id="97" w:name="_Toc195699869"/>
       <w:r>
         <w:t>CHttpConnection</w:t>
       </w:r>
-      <w:bookmarkEnd w:id="95"/>
+      <w:bookmarkEnd w:id="97"/>
     </w:p>
     <w:p>
       <w:pPr>
@@ -39128,11 +39507,11 @@
       <w:pPr>
         <w:pStyle w:val="Heading3"/>
       </w:pPr>
-      <w:bookmarkStart w:id="96" w:name="_Toc192688580"/>
+      <w:bookmarkStart w:id="98" w:name="_Toc195699870"/>
       <w:r>
         <w:t>CHttpProto</w:t>
       </w:r>
-      <w:bookmarkEnd w:id="96"/>
+      <w:bookmarkEnd w:id="98"/>
     </w:p>
     <w:p>
       <w:pPr>
@@ -39146,11 +39525,11 @@
       <w:pPr>
         <w:pStyle w:val="Heading3"/>
       </w:pPr>
-      <w:bookmarkStart w:id="97" w:name="_Toc192688581"/>
+      <w:bookmarkStart w:id="99" w:name="_Toc195699871"/>
       <w:r>
         <w:t>CHttpDaemon</w:t>
       </w:r>
-      <w:bookmarkEnd w:id="97"/>
+      <w:bookmarkEnd w:id="99"/>
     </w:p>
     <w:p>
       <w:pPr>
@@ -39164,12 +39543,12 @@
       <w:pPr>
         <w:pStyle w:val="Heading3"/>
       </w:pPr>
-      <w:bookmarkStart w:id="98" w:name="_Toc192688582"/>
+      <w:bookmarkStart w:id="100" w:name="_Toc195699872"/>
       <w:r>
         <w:lastRenderedPageBreak/>
         <w:t>CPendingOperation</w:t>
       </w:r>
-      <w:bookmarkEnd w:id="98"/>
+      <w:bookmarkEnd w:id="100"/>
     </w:p>
     <w:p>
       <w:pPr>
@@ -39191,11 +39570,11 @@
       <w:pPr>
         <w:pStyle w:val="Heading3"/>
       </w:pPr>
-      <w:bookmarkStart w:id="99" w:name="_Toc192688583"/>
+      <w:bookmarkStart w:id="101" w:name="_Toc195699873"/>
       <w:r>
         <w:t>CPSGS_Dispatcher</w:t>
       </w:r>
-      <w:bookmarkEnd w:id="99"/>
+      <w:bookmarkEnd w:id="101"/>
     </w:p>
     <w:p>
       <w:pPr>
@@ -39214,20 +39593,20 @@
       <w:pPr>
         <w:pStyle w:val="Heading3"/>
       </w:pPr>
-      <w:bookmarkStart w:id="100" w:name="_Toc192688584"/>
+      <w:bookmarkStart w:id="102" w:name="_Toc195699874"/>
       <w:r>
         <w:t>New Connection Flow</w:t>
       </w:r>
-      <w:bookmarkEnd w:id="100"/>
+      <w:bookmarkEnd w:id="102"/>
     </w:p>
     <w:p/>
     <w:p>
       <w:r>
         <w:object w:dxaOrig="12496" w:dyaOrig="8896" w14:anchorId="6EB35AA1">
-          <v:shape id="_x0000_i1027" type="#_x0000_t75" style="width:468pt;height:333pt" o:ole="">
+          <v:shape id="_x0000_i1027" type="#_x0000_t75" style="width:468pt;height:333.1pt" o:ole="">
             <v:imagedata r:id="rId54" o:title=""/>
           </v:shape>
-          <o:OLEObject Type="Embed" ProgID="Visio.Drawing.15" ShapeID="_x0000_i1027" DrawAspect="Content" ObjectID="_1803301259" r:id="rId55"/>
+          <o:OLEObject Type="Embed" ProgID="Visio.Drawing.15" ShapeID="_x0000_i1027" DrawAspect="Content" ObjectID="_1806312551" r:id="rId55"/>
         </w:object>
       </w:r>
     </w:p>
@@ -39236,21 +39615,21 @@
       <w:pPr>
         <w:pStyle w:val="Heading3"/>
       </w:pPr>
-      <w:bookmarkStart w:id="101" w:name="_Toc192688585"/>
+      <w:bookmarkStart w:id="103" w:name="_Toc195699875"/>
       <w:r>
         <w:lastRenderedPageBreak/>
         <w:t>Request Flow</w:t>
       </w:r>
-      <w:bookmarkEnd w:id="101"/>
+      <w:bookmarkEnd w:id="103"/>
     </w:p>
     <w:p/>
     <w:p>
       <w:r>
         <w:object w:dxaOrig="12585" w:dyaOrig="10606" w14:anchorId="2B11D571">
-          <v:shape id="_x0000_i1028" type="#_x0000_t75" style="width:467.5pt;height:394pt" o:ole="">
+          <v:shape id="_x0000_i1028" type="#_x0000_t75" style="width:467.55pt;height:394.2pt" o:ole="">
             <v:imagedata r:id="rId56" o:title=""/>
           </v:shape>
-          <o:OLEObject Type="Embed" ProgID="Visio.Drawing.15" ShapeID="_x0000_i1028" DrawAspect="Content" ObjectID="_1803301260" r:id="rId57"/>
+          <o:OLEObject Type="Embed" ProgID="Visio.Drawing.15" ShapeID="_x0000_i1028" DrawAspect="Content" ObjectID="_1806312552" r:id="rId57"/>
         </w:object>
       </w:r>
     </w:p>
@@ -39264,20 +39643,20 @@
       <w:pPr>
         <w:pStyle w:val="Heading3"/>
       </w:pPr>
-      <w:bookmarkStart w:id="102" w:name="_Toc192688586"/>
+      <w:bookmarkStart w:id="104" w:name="_Toc195699876"/>
       <w:r>
         <w:t>Handling Request In Synchronous Manner</w:t>
       </w:r>
-      <w:bookmarkEnd w:id="102"/>
+      <w:bookmarkEnd w:id="104"/>
     </w:p>
     <w:p/>
     <w:p>
       <w:r>
         <w:object w:dxaOrig="12496" w:dyaOrig="5656" w14:anchorId="371883B3">
-          <v:shape id="_x0000_i1029" type="#_x0000_t75" style="width:468pt;height:212.5pt" o:ole="">
+          <v:shape id="_x0000_i1029" type="#_x0000_t75" style="width:468pt;height:212.35pt" o:ole="">
             <v:imagedata r:id="rId58" o:title=""/>
           </v:shape>
-          <o:OLEObject Type="Embed" ProgID="Visio.Drawing.15" ShapeID="_x0000_i1029" DrawAspect="Content" ObjectID="_1803301261" r:id="rId59"/>
+          <o:OLEObject Type="Embed" ProgID="Visio.Drawing.15" ShapeID="_x0000_i1029" DrawAspect="Content" ObjectID="_1806312553" r:id="rId59"/>
         </w:object>
       </w:r>
     </w:p>
@@ -39290,21 +39669,21 @@
       <w:pPr>
         <w:pStyle w:val="Heading3"/>
       </w:pPr>
-      <w:bookmarkStart w:id="103" w:name="_Toc192688587"/>
+      <w:bookmarkStart w:id="105" w:name="_Toc195699877"/>
       <w:r>
         <w:lastRenderedPageBreak/>
         <w:t>Handling Request In Asynchronous Manner</w:t>
       </w:r>
-      <w:bookmarkEnd w:id="103"/>
+      <w:bookmarkEnd w:id="105"/>
     </w:p>
     <w:p/>
     <w:p>
       <w:r>
         <w:object w:dxaOrig="13306" w:dyaOrig="15195" w14:anchorId="74A987D4">
-          <v:shape id="_x0000_i1030" type="#_x0000_t75" style="width:467.5pt;height:534pt" o:ole="">
+          <v:shape id="_x0000_i1030" type="#_x0000_t75" style="width:467.55pt;height:534.1pt" o:ole="">
             <v:imagedata r:id="rId60" o:title=""/>
           </v:shape>
-          <o:OLEObject Type="Embed" ProgID="Visio.Drawing.15" ShapeID="_x0000_i1030" DrawAspect="Content" ObjectID="_1803301262" r:id="rId61"/>
+          <o:OLEObject Type="Embed" ProgID="Visio.Drawing.15" ShapeID="_x0000_i1030" DrawAspect="Content" ObjectID="_1806312554" r:id="rId61"/>
         </w:object>
       </w:r>
     </w:p>
@@ -44135,6 +44514,7 @@
   <w:style w:type="character" w:default="1" w:styleId="DefaultParagraphFont">
     <w:name w:val="Default Paragraph Font"/>
     <w:uiPriority w:val="1"/>
+    <w:semiHidden/>
     <w:unhideWhenUsed/>
   </w:style>
   <w:style w:type="table" w:default="1" w:styleId="TableNormal">
@@ -44840,7 +45220,7 @@
 <file path=customXml/item1.xml><?xml version="1.0" encoding="utf-8"?>
 <CoverPageProperties xmlns="http://schemas.microsoft.com/office/2006/coverPageProps">
   <PublishDate>2018-01-24T00:00:00</PublishDate>
-  <Abstract>Document version: 2.77</Abstract>
+  <Abstract>Document version: 2.78</Abstract>
   <CompanyAddress/>
   <CompanyPhone/>
   <CompanyFax/>
@@ -44994,6 +45374,15 @@
 </file>
 
 <file path=customXml/item3.xml><?xml version="1.0" encoding="utf-8"?>
+<?mso-contentType ?>
+<FormTemplates xmlns="http://schemas.microsoft.com/sharepoint/v3/contenttype/forms">
+  <Display>DocumentLibraryForm</Display>
+  <Edit>DocumentLibraryForm</Edit>
+  <New>DocumentLibraryForm</New>
+</FormTemplates>
+</file>
+
+<file path=customXml/item4.xml><?xml version="1.0" encoding="utf-8"?>
 <p:properties xmlns:p="http://schemas.microsoft.com/office/2006/metadata/properties" xmlns:xsi="http://www.w3.org/2001/XMLSchema-instance">
   <documentManagement>
     <_dlc_DocId xmlns="bebfb516-47c3-42bf-8695-c627e02fd07c">RP5EP2USD5DN-418-13</_dlc_DocId>
@@ -45005,20 +45394,7 @@
 </p:properties>
 </file>
 
-<file path=customXml/item4.xml><?xml version="1.0" encoding="utf-8"?>
-<b:Sources xmlns:b="http://schemas.openxmlformats.org/officeDocument/2006/bibliography" xmlns="http://schemas.openxmlformats.org/officeDocument/2006/bibliography" SelectedStyle="\APA.XSL" StyleName="APA"/>
-</file>
-
 <file path=customXml/item5.xml><?xml version="1.0" encoding="utf-8"?>
-<?mso-contentType ?>
-<FormTemplates xmlns="http://schemas.microsoft.com/sharepoint/v3/contenttype/forms">
-  <Display>DocumentLibraryForm</Display>
-  <Edit>DocumentLibraryForm</Edit>
-  <New>DocumentLibraryForm</New>
-</FormTemplates>
-</file>
-
-<file path=customXml/item6.xml><?xml version="1.0" encoding="utf-8"?>
 <?mso-contentType ?>
 <spe:Receivers xmlns:spe="http://schemas.microsoft.com/sharepoint/events">
   <Receiver>
@@ -45068,6 +45444,10 @@
 </spe:Receivers>
 </file>
 
+<file path=customXml/item6.xml><?xml version="1.0" encoding="utf-8"?>
+<b:Sources xmlns:b="http://schemas.openxmlformats.org/officeDocument/2006/bibliography" xmlns="http://schemas.openxmlformats.org/officeDocument/2006/bibliography" SelectedStyle="\APA.XSL" StyleName="APA"/>
+</file>
+
 <file path=customXml/itemProps1.xml><?xml version="1.0" encoding="utf-8"?>
 <ds:datastoreItem xmlns:ds="http://schemas.openxmlformats.org/officeDocument/2006/customXml" ds:itemID="{55AF091B-3C7A-41E3-B477-F2FDAA23CFDA}">
   <ds:schemaRefs>
@@ -45095,6 +45475,14 @@
 </file>
 
 <file path=customXml/itemProps3.xml><?xml version="1.0" encoding="utf-8"?>
+<ds:datastoreItem xmlns:ds="http://schemas.openxmlformats.org/officeDocument/2006/customXml" ds:itemID="{910EA325-BFD3-40A7-B49F-A40A5596D5CE}">
+  <ds:schemaRefs>
+    <ds:schemaRef ds:uri="http://schemas.microsoft.com/sharepoint/v3/contenttype/forms"/>
+  </ds:schemaRefs>
+</ds:datastoreItem>
+</file>
+
+<file path=customXml/itemProps4.xml><?xml version="1.0" encoding="utf-8"?>
 <ds:datastoreItem xmlns:ds="http://schemas.openxmlformats.org/officeDocument/2006/customXml" ds:itemID="{AED05E43-12FF-4C22-A572-6E3D13391423}">
   <ds:schemaRefs>
     <ds:schemaRef ds:uri="http://purl.org/dc/elements/1.1/"/>
@@ -45110,26 +45498,18 @@
 </ds:datastoreItem>
 </file>
 
-<file path=customXml/itemProps4.xml><?xml version="1.0" encoding="utf-8"?>
+<file path=customXml/itemProps5.xml><?xml version="1.0" encoding="utf-8"?>
+<ds:datastoreItem xmlns:ds="http://schemas.openxmlformats.org/officeDocument/2006/customXml" ds:itemID="{4BDF85BA-E69F-4D6A-AE92-E7CF998321DD}">
+  <ds:schemaRefs>
+    <ds:schemaRef ds:uri="http://schemas.microsoft.com/sharepoint/events"/>
+  </ds:schemaRefs>
+</ds:datastoreItem>
+</file>
+
+<file path=customXml/itemProps6.xml><?xml version="1.0" encoding="utf-8"?>
 <ds:datastoreItem xmlns:ds="http://schemas.openxmlformats.org/officeDocument/2006/customXml" ds:itemID="{CFFBBBB2-ADC5-4CE0-A9B5-8D3026204BDD}">
   <ds:schemaRefs>
     <ds:schemaRef ds:uri="http://schemas.openxmlformats.org/officeDocument/2006/bibliography"/>
   </ds:schemaRefs>
 </ds:datastoreItem>
-</file>
-
-<file path=customXml/itemProps5.xml><?xml version="1.0" encoding="utf-8"?>
-<ds:datastoreItem xmlns:ds="http://schemas.openxmlformats.org/officeDocument/2006/customXml" ds:itemID="{910EA325-BFD3-40A7-B49F-A40A5596D5CE}">
-  <ds:schemaRefs>
-    <ds:schemaRef ds:uri="http://schemas.microsoft.com/sharepoint/v3/contenttype/forms"/>
-  </ds:schemaRefs>
-</ds:datastoreItem>
-</file>
-
-<file path=customXml/itemProps6.xml><?xml version="1.0" encoding="utf-8"?>
-<ds:datastoreItem xmlns:ds="http://schemas.openxmlformats.org/officeDocument/2006/customXml" ds:itemID="{4BDF85BA-E69F-4D6A-AE92-E7CF998321DD}">
-  <ds:schemaRefs>
-    <ds:schemaRef ds:uri="http://schemas.microsoft.com/sharepoint/events"/>
-  </ds:schemaRefs>
-</ds:datastoreItem>
 </file>
</xml_diff>

<commit_message>
Adding the readyz/connections request description
</commit_message>
<xml_diff>
--- a/misc/PSG Server.docx
+++ b/misc/PSG Server.docx
@@ -362,14 +362,7 @@
                     <w:b/>
                     <w:bCs/>
                   </w:rPr>
-                  <w:t>1</w:t>
-                </w:r>
-                <w:r>
-                  <w:rPr>
-                    <w:b/>
-                    <w:bCs/>
-                  </w:rPr>
-                  <w:t>6</w:t>
+                  <w:t>21</w:t>
                 </w:r>
                 <w:r>
                   <w:rPr>
@@ -428,7 +421,7 @@
                       <w:t>7</w:t>
                     </w:r>
                     <w:r>
-                      <w:t>8</w:t>
+                      <w:t>9</w:t>
                     </w:r>
                   </w:p>
                 </w:tc>
@@ -4448,6 +4441,48 @@
           <w:p>
             <w:r>
               <w:t>Adding ADMIN/connections_status request description</w:t>
+            </w:r>
+          </w:p>
+        </w:tc>
+      </w:tr>
+      <w:tr>
+        <w:tc>
+          <w:tcPr>
+            <w:tcW w:w="1001" w:type="dxa"/>
+          </w:tcPr>
+          <w:p>
+            <w:r>
+              <w:t>2.79</w:t>
+            </w:r>
+          </w:p>
+        </w:tc>
+        <w:tc>
+          <w:tcPr>
+            <w:tcW w:w="1678" w:type="dxa"/>
+          </w:tcPr>
+          <w:p>
+            <w:r>
+              <w:t>Apr 21, 2025</w:t>
+            </w:r>
+          </w:p>
+        </w:tc>
+        <w:tc>
+          <w:tcPr>
+            <w:tcW w:w="2182" w:type="dxa"/>
+          </w:tcPr>
+          <w:p>
+            <w:r>
+              <w:t>Sergey Satskiy</w:t>
+            </w:r>
+          </w:p>
+        </w:tc>
+        <w:tc>
+          <w:tcPr>
+            <w:tcW w:w="4489" w:type="dxa"/>
+          </w:tcPr>
+          <w:p>
+            <w:r>
+              <w:t>Adding /readyz/connections request description</w:t>
             </w:r>
           </w:p>
         </w:tc>
@@ -4514,7 +4549,7 @@
           <w:r>
             <w:fldChar w:fldCharType="separate"/>
           </w:r>
-          <w:hyperlink w:anchor="_Toc195699785" w:history="1">
+          <w:hyperlink w:anchor="_Toc196147680" w:history="1">
             <w:r>
               <w:rPr>
                 <w:rStyle w:val="Hyperlink"/>
@@ -4541,7 +4576,7 @@
                 <w:noProof/>
                 <w:webHidden/>
               </w:rPr>
-              <w:instrText xml:space="preserve"> PAGEREF _Toc195699785 \h </w:instrText>
+              <w:instrText xml:space="preserve"> PAGEREF _Toc196147680 \h </w:instrText>
             </w:r>
             <w:r>
               <w:rPr>
@@ -4587,7 +4622,7 @@
               <w14:ligatures w14:val="standardContextual"/>
             </w:rPr>
           </w:pPr>
-          <w:hyperlink w:anchor="_Toc195699786" w:history="1">
+          <w:hyperlink w:anchor="_Toc196147681" w:history="1">
             <w:r>
               <w:rPr>
                 <w:rStyle w:val="Hyperlink"/>
@@ -4614,7 +4649,7 @@
                 <w:noProof/>
                 <w:webHidden/>
               </w:rPr>
-              <w:instrText xml:space="preserve"> PAGEREF _Toc195699786 \h </w:instrText>
+              <w:instrText xml:space="preserve"> PAGEREF _Toc196147681 \h </w:instrText>
             </w:r>
             <w:r>
               <w:rPr>
@@ -4660,7 +4695,7 @@
               <w14:ligatures w14:val="standardContextual"/>
             </w:rPr>
           </w:pPr>
-          <w:hyperlink w:anchor="_Toc195699787" w:history="1">
+          <w:hyperlink w:anchor="_Toc196147682" w:history="1">
             <w:r>
               <w:rPr>
                 <w:rStyle w:val="Hyperlink"/>
@@ -4687,7 +4722,7 @@
                 <w:noProof/>
                 <w:webHidden/>
               </w:rPr>
-              <w:instrText xml:space="preserve"> PAGEREF _Toc195699787 \h </w:instrText>
+              <w:instrText xml:space="preserve"> PAGEREF _Toc196147682 \h </w:instrText>
             </w:r>
             <w:r>
               <w:rPr>
@@ -4733,7 +4768,7 @@
               <w14:ligatures w14:val="standardContextual"/>
             </w:rPr>
           </w:pPr>
-          <w:hyperlink w:anchor="_Toc195699788" w:history="1">
+          <w:hyperlink w:anchor="_Toc196147683" w:history="1">
             <w:r>
               <w:rPr>
                 <w:rStyle w:val="Hyperlink"/>
@@ -4760,7 +4795,7 @@
                 <w:noProof/>
                 <w:webHidden/>
               </w:rPr>
-              <w:instrText xml:space="preserve"> PAGEREF _Toc195699788 \h </w:instrText>
+              <w:instrText xml:space="preserve"> PAGEREF _Toc196147683 \h </w:instrText>
             </w:r>
             <w:r>
               <w:rPr>
@@ -4806,7 +4841,7 @@
               <w14:ligatures w14:val="standardContextual"/>
             </w:rPr>
           </w:pPr>
-          <w:hyperlink w:anchor="_Toc195699789" w:history="1">
+          <w:hyperlink w:anchor="_Toc196147684" w:history="1">
             <w:r>
               <w:rPr>
                 <w:rStyle w:val="Hyperlink"/>
@@ -4833,7 +4868,7 @@
                 <w:noProof/>
                 <w:webHidden/>
               </w:rPr>
-              <w:instrText xml:space="preserve"> PAGEREF _Toc195699789 \h </w:instrText>
+              <w:instrText xml:space="preserve"> PAGEREF _Toc196147684 \h </w:instrText>
             </w:r>
             <w:r>
               <w:rPr>
@@ -4879,7 +4914,7 @@
               <w14:ligatures w14:val="standardContextual"/>
             </w:rPr>
           </w:pPr>
-          <w:hyperlink w:anchor="_Toc195699790" w:history="1">
+          <w:hyperlink w:anchor="_Toc196147685" w:history="1">
             <w:r>
               <w:rPr>
                 <w:rStyle w:val="Hyperlink"/>
@@ -4906,7 +4941,7 @@
                 <w:noProof/>
                 <w:webHidden/>
               </w:rPr>
-              <w:instrText xml:space="preserve"> PAGEREF _Toc195699790 \h </w:instrText>
+              <w:instrText xml:space="preserve"> PAGEREF _Toc196147685 \h </w:instrText>
             </w:r>
             <w:r>
               <w:rPr>
@@ -4952,7 +4987,7 @@
               <w14:ligatures w14:val="standardContextual"/>
             </w:rPr>
           </w:pPr>
-          <w:hyperlink w:anchor="_Toc195699791" w:history="1">
+          <w:hyperlink w:anchor="_Toc196147686" w:history="1">
             <w:r>
               <w:rPr>
                 <w:rStyle w:val="Hyperlink"/>
@@ -4979,7 +5014,7 @@
                 <w:noProof/>
                 <w:webHidden/>
               </w:rPr>
-              <w:instrText xml:space="preserve"> PAGEREF _Toc195699791 \h </w:instrText>
+              <w:instrText xml:space="preserve"> PAGEREF _Toc196147686 \h </w:instrText>
             </w:r>
             <w:r>
               <w:rPr>
@@ -5025,7 +5060,7 @@
               <w14:ligatures w14:val="standardContextual"/>
             </w:rPr>
           </w:pPr>
-          <w:hyperlink w:anchor="_Toc195699792" w:history="1">
+          <w:hyperlink w:anchor="_Toc196147687" w:history="1">
             <w:r>
               <w:rPr>
                 <w:rStyle w:val="Hyperlink"/>
@@ -5052,7 +5087,7 @@
                 <w:noProof/>
                 <w:webHidden/>
               </w:rPr>
-              <w:instrText xml:space="preserve"> PAGEREF _Toc195699792 \h </w:instrText>
+              <w:instrText xml:space="preserve"> PAGEREF _Toc196147687 \h </w:instrText>
             </w:r>
             <w:r>
               <w:rPr>
@@ -5098,7 +5133,7 @@
               <w14:ligatures w14:val="standardContextual"/>
             </w:rPr>
           </w:pPr>
-          <w:hyperlink w:anchor="_Toc195699793" w:history="1">
+          <w:hyperlink w:anchor="_Toc196147688" w:history="1">
             <w:r>
               <w:rPr>
                 <w:rStyle w:val="Hyperlink"/>
@@ -5125,7 +5160,7 @@
                 <w:noProof/>
                 <w:webHidden/>
               </w:rPr>
-              <w:instrText xml:space="preserve"> PAGEREF _Toc195699793 \h </w:instrText>
+              <w:instrText xml:space="preserve"> PAGEREF _Toc196147688 \h </w:instrText>
             </w:r>
             <w:r>
               <w:rPr>
@@ -5171,7 +5206,7 @@
               <w14:ligatures w14:val="standardContextual"/>
             </w:rPr>
           </w:pPr>
-          <w:hyperlink w:anchor="_Toc195699794" w:history="1">
+          <w:hyperlink w:anchor="_Toc196147689" w:history="1">
             <w:r>
               <w:rPr>
                 <w:rStyle w:val="Hyperlink"/>
@@ -5198,7 +5233,7 @@
                 <w:noProof/>
                 <w:webHidden/>
               </w:rPr>
-              <w:instrText xml:space="preserve"> PAGEREF _Toc195699794 \h </w:instrText>
+              <w:instrText xml:space="preserve"> PAGEREF _Toc196147689 \h </w:instrText>
             </w:r>
             <w:r>
               <w:rPr>
@@ -5244,7 +5279,7 @@
               <w14:ligatures w14:val="standardContextual"/>
             </w:rPr>
           </w:pPr>
-          <w:hyperlink w:anchor="_Toc195699795" w:history="1">
+          <w:hyperlink w:anchor="_Toc196147690" w:history="1">
             <w:r>
               <w:rPr>
                 <w:rStyle w:val="Hyperlink"/>
@@ -5271,7 +5306,7 @@
                 <w:noProof/>
                 <w:webHidden/>
               </w:rPr>
-              <w:instrText xml:space="preserve"> PAGEREF _Toc195699795 \h </w:instrText>
+              <w:instrText xml:space="preserve"> PAGEREF _Toc196147690 \h </w:instrText>
             </w:r>
             <w:r>
               <w:rPr>
@@ -5317,7 +5352,7 @@
               <w14:ligatures w14:val="standardContextual"/>
             </w:rPr>
           </w:pPr>
-          <w:hyperlink w:anchor="_Toc195699796" w:history="1">
+          <w:hyperlink w:anchor="_Toc196147691" w:history="1">
             <w:r>
               <w:rPr>
                 <w:rStyle w:val="Hyperlink"/>
@@ -5344,7 +5379,7 @@
                 <w:noProof/>
                 <w:webHidden/>
               </w:rPr>
-              <w:instrText xml:space="preserve"> PAGEREF _Toc195699796 \h </w:instrText>
+              <w:instrText xml:space="preserve"> PAGEREF _Toc196147691 \h </w:instrText>
             </w:r>
             <w:r>
               <w:rPr>
@@ -5390,7 +5425,7 @@
               <w14:ligatures w14:val="standardContextual"/>
             </w:rPr>
           </w:pPr>
-          <w:hyperlink w:anchor="_Toc195699797" w:history="1">
+          <w:hyperlink w:anchor="_Toc196147692" w:history="1">
             <w:r>
               <w:rPr>
                 <w:rStyle w:val="Hyperlink"/>
@@ -5417,7 +5452,7 @@
                 <w:noProof/>
                 <w:webHidden/>
               </w:rPr>
-              <w:instrText xml:space="preserve"> PAGEREF _Toc195699797 \h </w:instrText>
+              <w:instrText xml:space="preserve"> PAGEREF _Toc196147692 \h </w:instrText>
             </w:r>
             <w:r>
               <w:rPr>
@@ -5463,7 +5498,7 @@
               <w14:ligatures w14:val="standardContextual"/>
             </w:rPr>
           </w:pPr>
-          <w:hyperlink w:anchor="_Toc195699798" w:history="1">
+          <w:hyperlink w:anchor="_Toc196147693" w:history="1">
             <w:r>
               <w:rPr>
                 <w:rStyle w:val="Hyperlink"/>
@@ -5490,7 +5525,7 @@
                 <w:noProof/>
                 <w:webHidden/>
               </w:rPr>
-              <w:instrText xml:space="preserve"> PAGEREF _Toc195699798 \h </w:instrText>
+              <w:instrText xml:space="preserve"> PAGEREF _Toc196147693 \h </w:instrText>
             </w:r>
             <w:r>
               <w:rPr>
@@ -5536,7 +5571,7 @@
               <w14:ligatures w14:val="standardContextual"/>
             </w:rPr>
           </w:pPr>
-          <w:hyperlink w:anchor="_Toc195699799" w:history="1">
+          <w:hyperlink w:anchor="_Toc196147694" w:history="1">
             <w:r>
               <w:rPr>
                 <w:rStyle w:val="Hyperlink"/>
@@ -5563,7 +5598,7 @@
                 <w:noProof/>
                 <w:webHidden/>
               </w:rPr>
-              <w:instrText xml:space="preserve"> PAGEREF _Toc195699799 \h </w:instrText>
+              <w:instrText xml:space="preserve"> PAGEREF _Toc196147694 \h </w:instrText>
             </w:r>
             <w:r>
               <w:rPr>
@@ -5609,7 +5644,7 @@
               <w14:ligatures w14:val="standardContextual"/>
             </w:rPr>
           </w:pPr>
-          <w:hyperlink w:anchor="_Toc195699800" w:history="1">
+          <w:hyperlink w:anchor="_Toc196147695" w:history="1">
             <w:r>
               <w:rPr>
                 <w:rStyle w:val="Hyperlink"/>
@@ -5636,7 +5671,7 @@
                 <w:noProof/>
                 <w:webHidden/>
               </w:rPr>
-              <w:instrText xml:space="preserve"> PAGEREF _Toc195699800 \h </w:instrText>
+              <w:instrText xml:space="preserve"> PAGEREF _Toc196147695 \h </w:instrText>
             </w:r>
             <w:r>
               <w:rPr>
@@ -5682,7 +5717,7 @@
               <w14:ligatures w14:val="standardContextual"/>
             </w:rPr>
           </w:pPr>
-          <w:hyperlink w:anchor="_Toc195699801" w:history="1">
+          <w:hyperlink w:anchor="_Toc196147696" w:history="1">
             <w:r>
               <w:rPr>
                 <w:rStyle w:val="Hyperlink"/>
@@ -5709,7 +5744,7 @@
                 <w:noProof/>
                 <w:webHidden/>
               </w:rPr>
-              <w:instrText xml:space="preserve"> PAGEREF _Toc195699801 \h </w:instrText>
+              <w:instrText xml:space="preserve"> PAGEREF _Toc196147696 \h </w:instrText>
             </w:r>
             <w:r>
               <w:rPr>
@@ -5755,7 +5790,7 @@
               <w14:ligatures w14:val="standardContextual"/>
             </w:rPr>
           </w:pPr>
-          <w:hyperlink w:anchor="_Toc195699802" w:history="1">
+          <w:hyperlink w:anchor="_Toc196147697" w:history="1">
             <w:r>
               <w:rPr>
                 <w:rStyle w:val="Hyperlink"/>
@@ -5782,7 +5817,7 @@
                 <w:noProof/>
                 <w:webHidden/>
               </w:rPr>
-              <w:instrText xml:space="preserve"> PAGEREF _Toc195699802 \h </w:instrText>
+              <w:instrText xml:space="preserve"> PAGEREF _Toc196147697 \h </w:instrText>
             </w:r>
             <w:r>
               <w:rPr>
@@ -5828,7 +5863,7 @@
               <w14:ligatures w14:val="standardContextual"/>
             </w:rPr>
           </w:pPr>
-          <w:hyperlink w:anchor="_Toc195699803" w:history="1">
+          <w:hyperlink w:anchor="_Toc196147698" w:history="1">
             <w:r>
               <w:rPr>
                 <w:rStyle w:val="Hyperlink"/>
@@ -5855,7 +5890,7 @@
                 <w:noProof/>
                 <w:webHidden/>
               </w:rPr>
-              <w:instrText xml:space="preserve"> PAGEREF _Toc195699803 \h </w:instrText>
+              <w:instrText xml:space="preserve"> PAGEREF _Toc196147698 \h </w:instrText>
             </w:r>
             <w:r>
               <w:rPr>
@@ -5901,7 +5936,7 @@
               <w14:ligatures w14:val="standardContextual"/>
             </w:rPr>
           </w:pPr>
-          <w:hyperlink w:anchor="_Toc195699804" w:history="1">
+          <w:hyperlink w:anchor="_Toc196147699" w:history="1">
             <w:r>
               <w:rPr>
                 <w:rStyle w:val="Hyperlink"/>
@@ -5928,7 +5963,7 @@
                 <w:noProof/>
                 <w:webHidden/>
               </w:rPr>
-              <w:instrText xml:space="preserve"> PAGEREF _Toc195699804 \h </w:instrText>
+              <w:instrText xml:space="preserve"> PAGEREF _Toc196147699 \h </w:instrText>
             </w:r>
             <w:r>
               <w:rPr>
@@ -5974,7 +6009,7 @@
               <w14:ligatures w14:val="standardContextual"/>
             </w:rPr>
           </w:pPr>
-          <w:hyperlink w:anchor="_Toc195699805" w:history="1">
+          <w:hyperlink w:anchor="_Toc196147700" w:history="1">
             <w:r>
               <w:rPr>
                 <w:rStyle w:val="Hyperlink"/>
@@ -6001,7 +6036,7 @@
                 <w:noProof/>
                 <w:webHidden/>
               </w:rPr>
-              <w:instrText xml:space="preserve"> PAGEREF _Toc195699805 \h </w:instrText>
+              <w:instrText xml:space="preserve"> PAGEREF _Toc196147700 \h </w:instrText>
             </w:r>
             <w:r>
               <w:rPr>
@@ -6047,7 +6082,7 @@
               <w14:ligatures w14:val="standardContextual"/>
             </w:rPr>
           </w:pPr>
-          <w:hyperlink w:anchor="_Toc195699806" w:history="1">
+          <w:hyperlink w:anchor="_Toc196147701" w:history="1">
             <w:r>
               <w:rPr>
                 <w:rStyle w:val="Hyperlink"/>
@@ -6074,7 +6109,7 @@
                 <w:noProof/>
                 <w:webHidden/>
               </w:rPr>
-              <w:instrText xml:space="preserve"> PAGEREF _Toc195699806 \h </w:instrText>
+              <w:instrText xml:space="preserve"> PAGEREF _Toc196147701 \h </w:instrText>
             </w:r>
             <w:r>
               <w:rPr>
@@ -6120,7 +6155,7 @@
               <w14:ligatures w14:val="standardContextual"/>
             </w:rPr>
           </w:pPr>
-          <w:hyperlink w:anchor="_Toc195699807" w:history="1">
+          <w:hyperlink w:anchor="_Toc196147702" w:history="1">
             <w:r>
               <w:rPr>
                 <w:rStyle w:val="Hyperlink"/>
@@ -6147,7 +6182,7 @@
                 <w:noProof/>
                 <w:webHidden/>
               </w:rPr>
-              <w:instrText xml:space="preserve"> PAGEREF _Toc195699807 \h </w:instrText>
+              <w:instrText xml:space="preserve"> PAGEREF _Toc196147702 \h </w:instrText>
             </w:r>
             <w:r>
               <w:rPr>
@@ -6193,7 +6228,7 @@
               <w14:ligatures w14:val="standardContextual"/>
             </w:rPr>
           </w:pPr>
-          <w:hyperlink w:anchor="_Toc195699808" w:history="1">
+          <w:hyperlink w:anchor="_Toc196147703" w:history="1">
             <w:r>
               <w:rPr>
                 <w:rStyle w:val="Hyperlink"/>
@@ -6220,7 +6255,7 @@
                 <w:noProof/>
                 <w:webHidden/>
               </w:rPr>
-              <w:instrText xml:space="preserve"> PAGEREF _Toc195699808 \h </w:instrText>
+              <w:instrText xml:space="preserve"> PAGEREF _Toc196147703 \h </w:instrText>
             </w:r>
             <w:r>
               <w:rPr>
@@ -6266,7 +6301,7 @@
               <w14:ligatures w14:val="standardContextual"/>
             </w:rPr>
           </w:pPr>
-          <w:hyperlink w:anchor="_Toc195699809" w:history="1">
+          <w:hyperlink w:anchor="_Toc196147704" w:history="1">
             <w:r>
               <w:rPr>
                 <w:rStyle w:val="Hyperlink"/>
@@ -6293,7 +6328,7 @@
                 <w:noProof/>
                 <w:webHidden/>
               </w:rPr>
-              <w:instrText xml:space="preserve"> PAGEREF _Toc195699809 \h </w:instrText>
+              <w:instrText xml:space="preserve"> PAGEREF _Toc196147704 \h </w:instrText>
             </w:r>
             <w:r>
               <w:rPr>
@@ -6339,7 +6374,7 @@
               <w14:ligatures w14:val="standardContextual"/>
             </w:rPr>
           </w:pPr>
-          <w:hyperlink w:anchor="_Toc195699810" w:history="1">
+          <w:hyperlink w:anchor="_Toc196147705" w:history="1">
             <w:r>
               <w:rPr>
                 <w:rStyle w:val="Hyperlink"/>
@@ -6366,7 +6401,7 @@
                 <w:noProof/>
                 <w:webHidden/>
               </w:rPr>
-              <w:instrText xml:space="preserve"> PAGEREF _Toc195699810 \h </w:instrText>
+              <w:instrText xml:space="preserve"> PAGEREF _Toc196147705 \h </w:instrText>
             </w:r>
             <w:r>
               <w:rPr>
@@ -6412,7 +6447,7 @@
               <w14:ligatures w14:val="standardContextual"/>
             </w:rPr>
           </w:pPr>
-          <w:hyperlink w:anchor="_Toc195699811" w:history="1">
+          <w:hyperlink w:anchor="_Toc196147706" w:history="1">
             <w:r>
               <w:rPr>
                 <w:rStyle w:val="Hyperlink"/>
@@ -6439,7 +6474,7 @@
                 <w:noProof/>
                 <w:webHidden/>
               </w:rPr>
-              <w:instrText xml:space="preserve"> PAGEREF _Toc195699811 \h </w:instrText>
+              <w:instrText xml:space="preserve"> PAGEREF _Toc196147706 \h </w:instrText>
             </w:r>
             <w:r>
               <w:rPr>
@@ -6485,7 +6520,7 @@
               <w14:ligatures w14:val="standardContextual"/>
             </w:rPr>
           </w:pPr>
-          <w:hyperlink w:anchor="_Toc195699812" w:history="1">
+          <w:hyperlink w:anchor="_Toc196147707" w:history="1">
             <w:r>
               <w:rPr>
                 <w:rStyle w:val="Hyperlink"/>
@@ -6512,7 +6547,7 @@
                 <w:noProof/>
                 <w:webHidden/>
               </w:rPr>
-              <w:instrText xml:space="preserve"> PAGEREF _Toc195699812 \h </w:instrText>
+              <w:instrText xml:space="preserve"> PAGEREF _Toc196147707 \h </w:instrText>
             </w:r>
             <w:r>
               <w:rPr>
@@ -6558,7 +6593,7 @@
               <w14:ligatures w14:val="standardContextual"/>
             </w:rPr>
           </w:pPr>
-          <w:hyperlink w:anchor="_Toc195699813" w:history="1">
+          <w:hyperlink w:anchor="_Toc196147708" w:history="1">
             <w:r>
               <w:rPr>
                 <w:rStyle w:val="Hyperlink"/>
@@ -6585,7 +6620,7 @@
                 <w:noProof/>
                 <w:webHidden/>
               </w:rPr>
-              <w:instrText xml:space="preserve"> PAGEREF _Toc195699813 \h </w:instrText>
+              <w:instrText xml:space="preserve"> PAGEREF _Toc196147708 \h </w:instrText>
             </w:r>
             <w:r>
               <w:rPr>
@@ -6631,13 +6666,13 @@
               <w14:ligatures w14:val="standardContextual"/>
             </w:rPr>
           </w:pPr>
-          <w:hyperlink w:anchor="_Toc195699814" w:history="1">
+          <w:hyperlink w:anchor="_Toc196147709" w:history="1">
             <w:r>
               <w:rPr>
                 <w:rStyle w:val="Hyperlink"/>
                 <w:noProof/>
               </w:rPr>
-              <w:t>ReadyZLMDB Request</w:t>
+              <w:t>ReadyZConnections Request</w:t>
             </w:r>
             <w:r>
               <w:rPr>
@@ -6658,7 +6693,7 @@
                 <w:noProof/>
                 <w:webHidden/>
               </w:rPr>
-              <w:instrText xml:space="preserve"> PAGEREF _Toc195699814 \h </w:instrText>
+              <w:instrText xml:space="preserve"> PAGEREF _Toc196147709 \h </w:instrText>
             </w:r>
             <w:r>
               <w:rPr>
@@ -6704,13 +6739,13 @@
               <w14:ligatures w14:val="standardContextual"/>
             </w:rPr>
           </w:pPr>
-          <w:hyperlink w:anchor="_Toc195699815" w:history="1">
+          <w:hyperlink w:anchor="_Toc196147710" w:history="1">
             <w:r>
               <w:rPr>
                 <w:rStyle w:val="Hyperlink"/>
                 <w:noProof/>
               </w:rPr>
-              <w:t>ReadyZWGS Request</w:t>
+              <w:t>ReadyZLMDB Request</w:t>
             </w:r>
             <w:r>
               <w:rPr>
@@ -6731,7 +6766,7 @@
                 <w:noProof/>
                 <w:webHidden/>
               </w:rPr>
-              <w:instrText xml:space="preserve"> PAGEREF _Toc195699815 \h </w:instrText>
+              <w:instrText xml:space="preserve"> PAGEREF _Toc196147710 \h </w:instrText>
             </w:r>
             <w:r>
               <w:rPr>
@@ -6777,13 +6812,13 @@
               <w14:ligatures w14:val="standardContextual"/>
             </w:rPr>
           </w:pPr>
-          <w:hyperlink w:anchor="_Toc195699816" w:history="1">
+          <w:hyperlink w:anchor="_Toc196147711" w:history="1">
             <w:r>
               <w:rPr>
                 <w:rStyle w:val="Hyperlink"/>
                 <w:noProof/>
               </w:rPr>
-              <w:t>ReadyZCDD Request</w:t>
+              <w:t>ReadyZWGS Request</w:t>
             </w:r>
             <w:r>
               <w:rPr>
@@ -6804,7 +6839,7 @@
                 <w:noProof/>
                 <w:webHidden/>
               </w:rPr>
-              <w:instrText xml:space="preserve"> PAGEREF _Toc195699816 \h </w:instrText>
+              <w:instrText xml:space="preserve"> PAGEREF _Toc196147711 \h </w:instrText>
             </w:r>
             <w:r>
               <w:rPr>
@@ -6850,13 +6885,13 @@
               <w14:ligatures w14:val="standardContextual"/>
             </w:rPr>
           </w:pPr>
-          <w:hyperlink w:anchor="_Toc195699817" w:history="1">
+          <w:hyperlink w:anchor="_Toc196147712" w:history="1">
             <w:r>
               <w:rPr>
                 <w:rStyle w:val="Hyperlink"/>
                 <w:noProof/>
               </w:rPr>
-              <w:t>ReadyZSNP Request</w:t>
+              <w:t>ReadyZCDD Request</w:t>
             </w:r>
             <w:r>
               <w:rPr>
@@ -6877,7 +6912,7 @@
                 <w:noProof/>
                 <w:webHidden/>
               </w:rPr>
-              <w:instrText xml:space="preserve"> PAGEREF _Toc195699817 \h </w:instrText>
+              <w:instrText xml:space="preserve"> PAGEREF _Toc196147712 \h </w:instrText>
             </w:r>
             <w:r>
               <w:rPr>
@@ -6923,13 +6958,13 @@
               <w14:ligatures w14:val="standardContextual"/>
             </w:rPr>
           </w:pPr>
-          <w:hyperlink w:anchor="_Toc195699818" w:history="1">
+          <w:hyperlink w:anchor="_Toc196147713" w:history="1">
             <w:r>
               <w:rPr>
                 <w:rStyle w:val="Hyperlink"/>
                 <w:noProof/>
               </w:rPr>
-              <w:t>HealthZ Request</w:t>
+              <w:t>ReadyZSNP Request</w:t>
             </w:r>
             <w:r>
               <w:rPr>
@@ -6950,7 +6985,7 @@
                 <w:noProof/>
                 <w:webHidden/>
               </w:rPr>
-              <w:instrText xml:space="preserve"> PAGEREF _Toc195699818 \h </w:instrText>
+              <w:instrText xml:space="preserve"> PAGEREF _Toc196147713 \h </w:instrText>
             </w:r>
             <w:r>
               <w:rPr>
@@ -6996,13 +7031,13 @@
               <w14:ligatures w14:val="standardContextual"/>
             </w:rPr>
           </w:pPr>
-          <w:hyperlink w:anchor="_Toc195699819" w:history="1">
+          <w:hyperlink w:anchor="_Toc196147714" w:history="1">
             <w:r>
               <w:rPr>
                 <w:rStyle w:val="Hyperlink"/>
                 <w:noProof/>
               </w:rPr>
-              <w:t>LivezZ Request</w:t>
+              <w:t>HealthZ Request</w:t>
             </w:r>
             <w:r>
               <w:rPr>
@@ -7023,7 +7058,7 @@
                 <w:noProof/>
                 <w:webHidden/>
               </w:rPr>
-              <w:instrText xml:space="preserve"> PAGEREF _Toc195699819 \h </w:instrText>
+              <w:instrText xml:space="preserve"> PAGEREF _Toc196147714 \h </w:instrText>
             </w:r>
             <w:r>
               <w:rPr>
@@ -7069,13 +7104,13 @@
               <w14:ligatures w14:val="standardContextual"/>
             </w:rPr>
           </w:pPr>
-          <w:hyperlink w:anchor="_Toc195699820" w:history="1">
+          <w:hyperlink w:anchor="_Toc196147715" w:history="1">
             <w:r>
               <w:rPr>
                 <w:rStyle w:val="Hyperlink"/>
                 <w:noProof/>
               </w:rPr>
-              <w:t>Favicon.ico Request</w:t>
+              <w:t>LivezZ Request</w:t>
             </w:r>
             <w:r>
               <w:rPr>
@@ -7096,7 +7131,7 @@
                 <w:noProof/>
                 <w:webHidden/>
               </w:rPr>
-              <w:instrText xml:space="preserve"> PAGEREF _Toc195699820 \h </w:instrText>
+              <w:instrText xml:space="preserve"> PAGEREF _Toc196147715 \h </w:instrText>
             </w:r>
             <w:r>
               <w:rPr>
@@ -7142,12 +7177,85 @@
               <w14:ligatures w14:val="standardContextual"/>
             </w:rPr>
           </w:pPr>
-          <w:hyperlink w:anchor="_Toc195699821" w:history="1">
+          <w:hyperlink w:anchor="_Toc196147716" w:history="1">
             <w:r>
               <w:rPr>
                 <w:rStyle w:val="Hyperlink"/>
                 <w:noProof/>
               </w:rPr>
+              <w:t>Favicon.ico Request</w:t>
+            </w:r>
+            <w:r>
+              <w:rPr>
+                <w:noProof/>
+                <w:webHidden/>
+              </w:rPr>
+              <w:tab/>
+            </w:r>
+            <w:r>
+              <w:rPr>
+                <w:noProof/>
+                <w:webHidden/>
+              </w:rPr>
+              <w:fldChar w:fldCharType="begin"/>
+            </w:r>
+            <w:r>
+              <w:rPr>
+                <w:noProof/>
+                <w:webHidden/>
+              </w:rPr>
+              <w:instrText xml:space="preserve"> PAGEREF _Toc196147716 \h </w:instrText>
+            </w:r>
+            <w:r>
+              <w:rPr>
+                <w:noProof/>
+                <w:webHidden/>
+              </w:rPr>
+            </w:r>
+            <w:r>
+              <w:rPr>
+                <w:noProof/>
+                <w:webHidden/>
+              </w:rPr>
+              <w:fldChar w:fldCharType="separate"/>
+            </w:r>
+            <w:r>
+              <w:rPr>
+                <w:noProof/>
+                <w:webHidden/>
+              </w:rPr>
+              <w:t>57</w:t>
+            </w:r>
+            <w:r>
+              <w:rPr>
+                <w:noProof/>
+                <w:webHidden/>
+              </w:rPr>
+              <w:fldChar w:fldCharType="end"/>
+            </w:r>
+          </w:hyperlink>
+        </w:p>
+        <w:p>
+          <w:pPr>
+            <w:pStyle w:val="TOC2"/>
+            <w:tabs>
+              <w:tab w:val="right" w:leader="dot" w:pos="9350"/>
+            </w:tabs>
+            <w:rPr>
+              <w:rFonts w:eastAsiaTheme="minorEastAsia"/>
+              <w:noProof/>
+              <w:kern w:val="2"/>
+              <w:sz w:val="24"/>
+              <w:szCs w:val="24"/>
+              <w14:ligatures w14:val="standardContextual"/>
+            </w:rPr>
+          </w:pPr>
+          <w:hyperlink w:anchor="_Toc196147717" w:history="1">
+            <w:r>
+              <w:rPr>
+                <w:rStyle w:val="Hyperlink"/>
+                <w:noProof/>
+              </w:rPr>
               <w:t>Unknown URL Request</w:t>
             </w:r>
             <w:r>
@@ -7169,7 +7277,7 @@
                 <w:noProof/>
                 <w:webHidden/>
               </w:rPr>
-              <w:instrText xml:space="preserve"> PAGEREF _Toc195699821 \h </w:instrText>
+              <w:instrText xml:space="preserve"> PAGEREF _Toc196147717 \h </w:instrText>
             </w:r>
             <w:r>
               <w:rPr>
@@ -7215,7 +7323,7 @@
               <w14:ligatures w14:val="standardContextual"/>
             </w:rPr>
           </w:pPr>
-          <w:hyperlink w:anchor="_Toc195699822" w:history="1">
+          <w:hyperlink w:anchor="_Toc196147718" w:history="1">
             <w:r>
               <w:rPr>
                 <w:rStyle w:val="Hyperlink"/>
@@ -7242,7 +7350,7 @@
                 <w:noProof/>
                 <w:webHidden/>
               </w:rPr>
-              <w:instrText xml:space="preserve"> PAGEREF _Toc195699822 \h </w:instrText>
+              <w:instrText xml:space="preserve"> PAGEREF _Toc196147718 \h </w:instrText>
             </w:r>
             <w:r>
               <w:rPr>
@@ -7262,7 +7370,7 @@
                 <w:noProof/>
                 <w:webHidden/>
               </w:rPr>
-              <w:t>57</w:t>
+              <w:t>58</w:t>
             </w:r>
             <w:r>
               <w:rPr>
@@ -7288,7 +7396,7 @@
               <w14:ligatures w14:val="standardContextual"/>
             </w:rPr>
           </w:pPr>
-          <w:hyperlink w:anchor="_Toc195699823" w:history="1">
+          <w:hyperlink w:anchor="_Toc196147719" w:history="1">
             <w:r>
               <w:rPr>
                 <w:rStyle w:val="Hyperlink"/>
@@ -7315,7 +7423,7 @@
                 <w:noProof/>
                 <w:webHidden/>
               </w:rPr>
-              <w:instrText xml:space="preserve"> PAGEREF _Toc195699823 \h </w:instrText>
+              <w:instrText xml:space="preserve"> PAGEREF _Toc196147719 \h </w:instrText>
             </w:r>
             <w:r>
               <w:rPr>
@@ -7335,7 +7443,7 @@
                 <w:noProof/>
                 <w:webHidden/>
               </w:rPr>
-              <w:t>57</w:t>
+              <w:t>58</w:t>
             </w:r>
             <w:r>
               <w:rPr>
@@ -7361,7 +7469,7 @@
               <w14:ligatures w14:val="standardContextual"/>
             </w:rPr>
           </w:pPr>
-          <w:hyperlink w:anchor="_Toc195699824" w:history="1">
+          <w:hyperlink w:anchor="_Toc196147720" w:history="1">
             <w:r>
               <w:rPr>
                 <w:rStyle w:val="Hyperlink"/>
@@ -7388,7 +7496,7 @@
                 <w:noProof/>
                 <w:webHidden/>
               </w:rPr>
-              <w:instrText xml:space="preserve"> PAGEREF _Toc195699824 \h </w:instrText>
+              <w:instrText xml:space="preserve"> PAGEREF _Toc196147720 \h </w:instrText>
             </w:r>
             <w:r>
               <w:rPr>
@@ -7434,7 +7542,7 @@
               <w14:ligatures w14:val="standardContextual"/>
             </w:rPr>
           </w:pPr>
-          <w:hyperlink w:anchor="_Toc195699825" w:history="1">
+          <w:hyperlink w:anchor="_Toc196147721" w:history="1">
             <w:r>
               <w:rPr>
                 <w:rStyle w:val="Hyperlink"/>
@@ -7461,7 +7569,7 @@
                 <w:noProof/>
                 <w:webHidden/>
               </w:rPr>
-              <w:instrText xml:space="preserve"> PAGEREF _Toc195699825 \h </w:instrText>
+              <w:instrText xml:space="preserve"> PAGEREF _Toc196147721 \h </w:instrText>
             </w:r>
             <w:r>
               <w:rPr>
@@ -7481,7 +7589,7 @@
                 <w:noProof/>
                 <w:webHidden/>
               </w:rPr>
-              <w:t>58</w:t>
+              <w:t>59</w:t>
             </w:r>
             <w:r>
               <w:rPr>
@@ -7507,7 +7615,7 @@
               <w14:ligatures w14:val="standardContextual"/>
             </w:rPr>
           </w:pPr>
-          <w:hyperlink w:anchor="_Toc195699826" w:history="1">
+          <w:hyperlink w:anchor="_Toc196147722" w:history="1">
             <w:r>
               <w:rPr>
                 <w:rStyle w:val="Hyperlink"/>
@@ -7534,7 +7642,7 @@
                 <w:noProof/>
                 <w:webHidden/>
               </w:rPr>
-              <w:instrText xml:space="preserve"> PAGEREF _Toc195699826 \h </w:instrText>
+              <w:instrText xml:space="preserve"> PAGEREF _Toc196147722 \h </w:instrText>
             </w:r>
             <w:r>
               <w:rPr>
@@ -7554,7 +7662,7 @@
                 <w:noProof/>
                 <w:webHidden/>
               </w:rPr>
-              <w:t>58</w:t>
+              <w:t>59</w:t>
             </w:r>
             <w:r>
               <w:rPr>
@@ -7580,7 +7688,7 @@
               <w14:ligatures w14:val="standardContextual"/>
             </w:rPr>
           </w:pPr>
-          <w:hyperlink w:anchor="_Toc195699827" w:history="1">
+          <w:hyperlink w:anchor="_Toc196147723" w:history="1">
             <w:r>
               <w:rPr>
                 <w:rStyle w:val="Hyperlink"/>
@@ -7607,7 +7715,7 @@
                 <w:noProof/>
                 <w:webHidden/>
               </w:rPr>
-              <w:instrText xml:space="preserve"> PAGEREF _Toc195699827 \h </w:instrText>
+              <w:instrText xml:space="preserve"> PAGEREF _Toc196147723 \h </w:instrText>
             </w:r>
             <w:r>
               <w:rPr>
@@ -7653,7 +7761,7 @@
               <w14:ligatures w14:val="standardContextual"/>
             </w:rPr>
           </w:pPr>
-          <w:hyperlink w:anchor="_Toc195699828" w:history="1">
+          <w:hyperlink w:anchor="_Toc196147724" w:history="1">
             <w:r>
               <w:rPr>
                 <w:rStyle w:val="Hyperlink"/>
@@ -7680,7 +7788,7 @@
                 <w:noProof/>
                 <w:webHidden/>
               </w:rPr>
-              <w:instrText xml:space="preserve"> PAGEREF _Toc195699828 \h </w:instrText>
+              <w:instrText xml:space="preserve"> PAGEREF _Toc196147724 \h </w:instrText>
             </w:r>
             <w:r>
               <w:rPr>
@@ -7700,7 +7808,7 @@
                 <w:noProof/>
                 <w:webHidden/>
               </w:rPr>
-              <w:t>59</w:t>
+              <w:t>60</w:t>
             </w:r>
             <w:r>
               <w:rPr>
@@ -7726,7 +7834,7 @@
               <w14:ligatures w14:val="standardContextual"/>
             </w:rPr>
           </w:pPr>
-          <w:hyperlink w:anchor="_Toc195699829" w:history="1">
+          <w:hyperlink w:anchor="_Toc196147725" w:history="1">
             <w:r>
               <w:rPr>
                 <w:rStyle w:val="Hyperlink"/>
@@ -7753,7 +7861,7 @@
                 <w:noProof/>
                 <w:webHidden/>
               </w:rPr>
-              <w:instrText xml:space="preserve"> PAGEREF _Toc195699829 \h </w:instrText>
+              <w:instrText xml:space="preserve"> PAGEREF _Toc196147725 \h </w:instrText>
             </w:r>
             <w:r>
               <w:rPr>
@@ -7773,7 +7881,7 @@
                 <w:noProof/>
                 <w:webHidden/>
               </w:rPr>
-              <w:t>59</w:t>
+              <w:t>60</w:t>
             </w:r>
             <w:r>
               <w:rPr>
@@ -7799,7 +7907,7 @@
               <w14:ligatures w14:val="standardContextual"/>
             </w:rPr>
           </w:pPr>
-          <w:hyperlink w:anchor="_Toc195699830" w:history="1">
+          <w:hyperlink w:anchor="_Toc196147726" w:history="1">
             <w:r>
               <w:rPr>
                 <w:rStyle w:val="Hyperlink"/>
@@ -7826,7 +7934,7 @@
                 <w:noProof/>
                 <w:webHidden/>
               </w:rPr>
-              <w:instrText xml:space="preserve"> PAGEREF _Toc195699830 \h </w:instrText>
+              <w:instrText xml:space="preserve"> PAGEREF _Toc196147726 \h </w:instrText>
             </w:r>
             <w:r>
               <w:rPr>
@@ -7872,7 +7980,7 @@
               <w14:ligatures w14:val="standardContextual"/>
             </w:rPr>
           </w:pPr>
-          <w:hyperlink w:anchor="_Toc195699831" w:history="1">
+          <w:hyperlink w:anchor="_Toc196147727" w:history="1">
             <w:r>
               <w:rPr>
                 <w:rStyle w:val="Hyperlink"/>
@@ -7899,7 +8007,7 @@
                 <w:noProof/>
                 <w:webHidden/>
               </w:rPr>
-              <w:instrText xml:space="preserve"> PAGEREF _Toc195699831 \h </w:instrText>
+              <w:instrText xml:space="preserve"> PAGEREF _Toc196147727 \h </w:instrText>
             </w:r>
             <w:r>
               <w:rPr>
@@ -7919,7 +8027,7 @@
                 <w:noProof/>
                 <w:webHidden/>
               </w:rPr>
-              <w:t>62</w:t>
+              <w:t>63</w:t>
             </w:r>
             <w:r>
               <w:rPr>
@@ -7945,7 +8053,7 @@
               <w14:ligatures w14:val="standardContextual"/>
             </w:rPr>
           </w:pPr>
-          <w:hyperlink w:anchor="_Toc195699832" w:history="1">
+          <w:hyperlink w:anchor="_Toc196147728" w:history="1">
             <w:r>
               <w:rPr>
                 <w:rStyle w:val="Hyperlink"/>
@@ -7972,7 +8080,7 @@
                 <w:noProof/>
                 <w:webHidden/>
               </w:rPr>
-              <w:instrText xml:space="preserve"> PAGEREF _Toc195699832 \h </w:instrText>
+              <w:instrText xml:space="preserve"> PAGEREF _Toc196147728 \h </w:instrText>
             </w:r>
             <w:r>
               <w:rPr>
@@ -7992,7 +8100,7 @@
                 <w:noProof/>
                 <w:webHidden/>
               </w:rPr>
-              <w:t>62</w:t>
+              <w:t>63</w:t>
             </w:r>
             <w:r>
               <w:rPr>
@@ -8018,7 +8126,7 @@
               <w14:ligatures w14:val="standardContextual"/>
             </w:rPr>
           </w:pPr>
-          <w:hyperlink w:anchor="_Toc195699833" w:history="1">
+          <w:hyperlink w:anchor="_Toc196147729" w:history="1">
             <w:r>
               <w:rPr>
                 <w:rStyle w:val="Hyperlink"/>
@@ -8045,7 +8153,7 @@
                 <w:noProof/>
                 <w:webHidden/>
               </w:rPr>
-              <w:instrText xml:space="preserve"> PAGEREF _Toc195699833 \h </w:instrText>
+              <w:instrText xml:space="preserve"> PAGEREF _Toc196147729 \h </w:instrText>
             </w:r>
             <w:r>
               <w:rPr>
@@ -8091,7 +8199,7 @@
               <w14:ligatures w14:val="standardContextual"/>
             </w:rPr>
           </w:pPr>
-          <w:hyperlink w:anchor="_Toc195699834" w:history="1">
+          <w:hyperlink w:anchor="_Toc196147730" w:history="1">
             <w:r>
               <w:rPr>
                 <w:rStyle w:val="Hyperlink"/>
@@ -8118,7 +8226,7 @@
                 <w:noProof/>
                 <w:webHidden/>
               </w:rPr>
-              <w:instrText xml:space="preserve"> PAGEREF _Toc195699834 \h </w:instrText>
+              <w:instrText xml:space="preserve"> PAGEREF _Toc196147730 \h </w:instrText>
             </w:r>
             <w:r>
               <w:rPr>
@@ -8138,7 +8246,7 @@
                 <w:noProof/>
                 <w:webHidden/>
               </w:rPr>
-              <w:t>63</w:t>
+              <w:t>64</w:t>
             </w:r>
             <w:r>
               <w:rPr>
@@ -8164,7 +8272,7 @@
               <w14:ligatures w14:val="standardContextual"/>
             </w:rPr>
           </w:pPr>
-          <w:hyperlink w:anchor="_Toc195699835" w:history="1">
+          <w:hyperlink w:anchor="_Toc196147731" w:history="1">
             <w:r>
               <w:rPr>
                 <w:rStyle w:val="Hyperlink"/>
@@ -8191,7 +8299,7 @@
                 <w:noProof/>
                 <w:webHidden/>
               </w:rPr>
-              <w:instrText xml:space="preserve"> PAGEREF _Toc195699835 \h </w:instrText>
+              <w:instrText xml:space="preserve"> PAGEREF _Toc196147731 \h </w:instrText>
             </w:r>
             <w:r>
               <w:rPr>
@@ -8237,7 +8345,7 @@
               <w14:ligatures w14:val="standardContextual"/>
             </w:rPr>
           </w:pPr>
-          <w:hyperlink w:anchor="_Toc195699836" w:history="1">
+          <w:hyperlink w:anchor="_Toc196147732" w:history="1">
             <w:r>
               <w:rPr>
                 <w:rStyle w:val="Hyperlink"/>
@@ -8264,7 +8372,7 @@
                 <w:noProof/>
                 <w:webHidden/>
               </w:rPr>
-              <w:instrText xml:space="preserve"> PAGEREF _Toc195699836 \h </w:instrText>
+              <w:instrText xml:space="preserve"> PAGEREF _Toc196147732 \h </w:instrText>
             </w:r>
             <w:r>
               <w:rPr>
@@ -8284,7 +8392,7 @@
                 <w:noProof/>
                 <w:webHidden/>
               </w:rPr>
-              <w:t>64</w:t>
+              <w:t>65</w:t>
             </w:r>
             <w:r>
               <w:rPr>
@@ -8310,7 +8418,7 @@
               <w14:ligatures w14:val="standardContextual"/>
             </w:rPr>
           </w:pPr>
-          <w:hyperlink w:anchor="_Toc195699837" w:history="1">
+          <w:hyperlink w:anchor="_Toc196147733" w:history="1">
             <w:r>
               <w:rPr>
                 <w:rStyle w:val="Hyperlink"/>
@@ -8337,7 +8445,7 @@
                 <w:noProof/>
                 <w:webHidden/>
               </w:rPr>
-              <w:instrText xml:space="preserve"> PAGEREF _Toc195699837 \h </w:instrText>
+              <w:instrText xml:space="preserve"> PAGEREF _Toc196147733 \h </w:instrText>
             </w:r>
             <w:r>
               <w:rPr>
@@ -8357,7 +8465,7 @@
                 <w:noProof/>
                 <w:webHidden/>
               </w:rPr>
-              <w:t>65</w:t>
+              <w:t>66</w:t>
             </w:r>
             <w:r>
               <w:rPr>
@@ -8383,7 +8491,7 @@
               <w14:ligatures w14:val="standardContextual"/>
             </w:rPr>
           </w:pPr>
-          <w:hyperlink w:anchor="_Toc195699838" w:history="1">
+          <w:hyperlink w:anchor="_Toc196147734" w:history="1">
             <w:r>
               <w:rPr>
                 <w:rStyle w:val="Hyperlink"/>
@@ -8410,7 +8518,7 @@
                 <w:noProof/>
                 <w:webHidden/>
               </w:rPr>
-              <w:instrText xml:space="preserve"> PAGEREF _Toc195699838 \h </w:instrText>
+              <w:instrText xml:space="preserve"> PAGEREF _Toc196147734 \h </w:instrText>
             </w:r>
             <w:r>
               <w:rPr>
@@ -8456,7 +8564,7 @@
               <w14:ligatures w14:val="standardContextual"/>
             </w:rPr>
           </w:pPr>
-          <w:hyperlink w:anchor="_Toc195699839" w:history="1">
+          <w:hyperlink w:anchor="_Toc196147735" w:history="1">
             <w:r>
               <w:rPr>
                 <w:rStyle w:val="Hyperlink"/>
@@ -8483,7 +8591,7 @@
                 <w:noProof/>
                 <w:webHidden/>
               </w:rPr>
-              <w:instrText xml:space="preserve"> PAGEREF _Toc195699839 \h </w:instrText>
+              <w:instrText xml:space="preserve"> PAGEREF _Toc196147735 \h </w:instrText>
             </w:r>
             <w:r>
               <w:rPr>
@@ -8503,7 +8611,7 @@
                 <w:noProof/>
                 <w:webHidden/>
               </w:rPr>
-              <w:t>66</w:t>
+              <w:t>67</w:t>
             </w:r>
             <w:r>
               <w:rPr>
@@ -8529,7 +8637,7 @@
               <w14:ligatures w14:val="standardContextual"/>
             </w:rPr>
           </w:pPr>
-          <w:hyperlink w:anchor="_Toc195699840" w:history="1">
+          <w:hyperlink w:anchor="_Toc196147736" w:history="1">
             <w:r>
               <w:rPr>
                 <w:rStyle w:val="Hyperlink"/>
@@ -8556,7 +8664,7 @@
                 <w:noProof/>
                 <w:webHidden/>
               </w:rPr>
-              <w:instrText xml:space="preserve"> PAGEREF _Toc195699840 \h </w:instrText>
+              <w:instrText xml:space="preserve"> PAGEREF _Toc196147736 \h </w:instrText>
             </w:r>
             <w:r>
               <w:rPr>
@@ -8602,7 +8710,7 @@
               <w14:ligatures w14:val="standardContextual"/>
             </w:rPr>
           </w:pPr>
-          <w:hyperlink w:anchor="_Toc195699841" w:history="1">
+          <w:hyperlink w:anchor="_Toc196147737" w:history="1">
             <w:r>
               <w:rPr>
                 <w:rStyle w:val="Hyperlink"/>
@@ -8629,7 +8737,7 @@
                 <w:noProof/>
                 <w:webHidden/>
               </w:rPr>
-              <w:instrText xml:space="preserve"> PAGEREF _Toc195699841 \h </w:instrText>
+              <w:instrText xml:space="preserve"> PAGEREF _Toc196147737 \h </w:instrText>
             </w:r>
             <w:r>
               <w:rPr>
@@ -8649,7 +8757,7 @@
                 <w:noProof/>
                 <w:webHidden/>
               </w:rPr>
-              <w:t>67</w:t>
+              <w:t>68</w:t>
             </w:r>
             <w:r>
               <w:rPr>
@@ -8675,7 +8783,7 @@
               <w14:ligatures w14:val="standardContextual"/>
             </w:rPr>
           </w:pPr>
-          <w:hyperlink w:anchor="_Toc195699842" w:history="1">
+          <w:hyperlink w:anchor="_Toc196147738" w:history="1">
             <w:r>
               <w:rPr>
                 <w:rStyle w:val="Hyperlink"/>
@@ -8702,7 +8810,7 @@
                 <w:noProof/>
                 <w:webHidden/>
               </w:rPr>
-              <w:instrText xml:space="preserve"> PAGEREF _Toc195699842 \h </w:instrText>
+              <w:instrText xml:space="preserve"> PAGEREF _Toc196147738 \h </w:instrText>
             </w:r>
             <w:r>
               <w:rPr>
@@ -8748,7 +8856,7 @@
               <w14:ligatures w14:val="standardContextual"/>
             </w:rPr>
           </w:pPr>
-          <w:hyperlink w:anchor="_Toc195699843" w:history="1">
+          <w:hyperlink w:anchor="_Toc196147739" w:history="1">
             <w:r>
               <w:rPr>
                 <w:rStyle w:val="Hyperlink"/>
@@ -8775,7 +8883,7 @@
                 <w:noProof/>
                 <w:webHidden/>
               </w:rPr>
-              <w:instrText xml:space="preserve"> PAGEREF _Toc195699843 \h </w:instrText>
+              <w:instrText xml:space="preserve"> PAGEREF _Toc196147739 \h </w:instrText>
             </w:r>
             <w:r>
               <w:rPr>
@@ -8795,7 +8903,7 @@
                 <w:noProof/>
                 <w:webHidden/>
               </w:rPr>
-              <w:t>68</w:t>
+              <w:t>69</w:t>
             </w:r>
             <w:r>
               <w:rPr>
@@ -8821,7 +8929,7 @@
               <w14:ligatures w14:val="standardContextual"/>
             </w:rPr>
           </w:pPr>
-          <w:hyperlink w:anchor="_Toc195699844" w:history="1">
+          <w:hyperlink w:anchor="_Toc196147740" w:history="1">
             <w:r>
               <w:rPr>
                 <w:rStyle w:val="Hyperlink"/>
@@ -8848,7 +8956,7 @@
                 <w:noProof/>
                 <w:webHidden/>
               </w:rPr>
-              <w:instrText xml:space="preserve"> PAGEREF _Toc195699844 \h </w:instrText>
+              <w:instrText xml:space="preserve"> PAGEREF _Toc196147740 \h </w:instrText>
             </w:r>
             <w:r>
               <w:rPr>
@@ -8894,7 +9002,7 @@
               <w14:ligatures w14:val="standardContextual"/>
             </w:rPr>
           </w:pPr>
-          <w:hyperlink w:anchor="_Toc195699845" w:history="1">
+          <w:hyperlink w:anchor="_Toc196147741" w:history="1">
             <w:r>
               <w:rPr>
                 <w:rStyle w:val="Hyperlink"/>
@@ -8921,7 +9029,7 @@
                 <w:noProof/>
                 <w:webHidden/>
               </w:rPr>
-              <w:instrText xml:space="preserve"> PAGEREF _Toc195699845 \h </w:instrText>
+              <w:instrText xml:space="preserve"> PAGEREF _Toc196147741 \h </w:instrText>
             </w:r>
             <w:r>
               <w:rPr>
@@ -8941,7 +9049,7 @@
                 <w:noProof/>
                 <w:webHidden/>
               </w:rPr>
-              <w:t>69</w:t>
+              <w:t>70</w:t>
             </w:r>
             <w:r>
               <w:rPr>
@@ -8967,7 +9075,7 @@
               <w14:ligatures w14:val="standardContextual"/>
             </w:rPr>
           </w:pPr>
-          <w:hyperlink w:anchor="_Toc195699846" w:history="1">
+          <w:hyperlink w:anchor="_Toc196147742" w:history="1">
             <w:r>
               <w:rPr>
                 <w:rStyle w:val="Hyperlink"/>
@@ -8994,7 +9102,7 @@
                 <w:noProof/>
                 <w:webHidden/>
               </w:rPr>
-              <w:instrText xml:space="preserve"> PAGEREF _Toc195699846 \h </w:instrText>
+              <w:instrText xml:space="preserve"> PAGEREF _Toc196147742 \h </w:instrText>
             </w:r>
             <w:r>
               <w:rPr>
@@ -9040,7 +9148,7 @@
               <w14:ligatures w14:val="standardContextual"/>
             </w:rPr>
           </w:pPr>
-          <w:hyperlink w:anchor="_Toc195699847" w:history="1">
+          <w:hyperlink w:anchor="_Toc196147743" w:history="1">
             <w:r>
               <w:rPr>
                 <w:rStyle w:val="Hyperlink"/>
@@ -9067,7 +9175,7 @@
                 <w:noProof/>
                 <w:webHidden/>
               </w:rPr>
-              <w:instrText xml:space="preserve"> PAGEREF _Toc195699847 \h </w:instrText>
+              <w:instrText xml:space="preserve"> PAGEREF _Toc196147743 \h </w:instrText>
             </w:r>
             <w:r>
               <w:rPr>
@@ -9087,7 +9195,7 @@
                 <w:noProof/>
                 <w:webHidden/>
               </w:rPr>
-              <w:t>70</w:t>
+              <w:t>71</w:t>
             </w:r>
             <w:r>
               <w:rPr>
@@ -9113,7 +9221,7 @@
               <w14:ligatures w14:val="standardContextual"/>
             </w:rPr>
           </w:pPr>
-          <w:hyperlink w:anchor="_Toc195699848" w:history="1">
+          <w:hyperlink w:anchor="_Toc196147744" w:history="1">
             <w:r>
               <w:rPr>
                 <w:rStyle w:val="Hyperlink"/>
@@ -9140,7 +9248,7 @@
                 <w:noProof/>
                 <w:webHidden/>
               </w:rPr>
-              <w:instrText xml:space="preserve"> PAGEREF _Toc195699848 \h </w:instrText>
+              <w:instrText xml:space="preserve"> PAGEREF _Toc196147744 \h </w:instrText>
             </w:r>
             <w:r>
               <w:rPr>
@@ -9186,7 +9294,7 @@
               <w14:ligatures w14:val="standardContextual"/>
             </w:rPr>
           </w:pPr>
-          <w:hyperlink w:anchor="_Toc195699849" w:history="1">
+          <w:hyperlink w:anchor="_Toc196147745" w:history="1">
             <w:r>
               <w:rPr>
                 <w:rStyle w:val="Hyperlink"/>
@@ -9213,7 +9321,7 @@
                 <w:noProof/>
                 <w:webHidden/>
               </w:rPr>
-              <w:instrText xml:space="preserve"> PAGEREF _Toc195699849 \h </w:instrText>
+              <w:instrText xml:space="preserve"> PAGEREF _Toc196147745 \h </w:instrText>
             </w:r>
             <w:r>
               <w:rPr>
@@ -9233,7 +9341,7 @@
                 <w:noProof/>
                 <w:webHidden/>
               </w:rPr>
-              <w:t>73</w:t>
+              <w:t>74</w:t>
             </w:r>
             <w:r>
               <w:rPr>
@@ -9259,7 +9367,7 @@
               <w14:ligatures w14:val="standardContextual"/>
             </w:rPr>
           </w:pPr>
-          <w:hyperlink w:anchor="_Toc195699850" w:history="1">
+          <w:hyperlink w:anchor="_Toc196147746" w:history="1">
             <w:r>
               <w:rPr>
                 <w:rStyle w:val="Hyperlink"/>
@@ -9286,7 +9394,7 @@
                 <w:noProof/>
                 <w:webHidden/>
               </w:rPr>
-              <w:instrText xml:space="preserve"> PAGEREF _Toc195699850 \h </w:instrText>
+              <w:instrText xml:space="preserve"> PAGEREF _Toc196147746 \h </w:instrText>
             </w:r>
             <w:r>
               <w:rPr>
@@ -9306,7 +9414,7 @@
                 <w:noProof/>
                 <w:webHidden/>
               </w:rPr>
-              <w:t>73</w:t>
+              <w:t>74</w:t>
             </w:r>
             <w:r>
               <w:rPr>
@@ -9332,7 +9440,7 @@
               <w14:ligatures w14:val="standardContextual"/>
             </w:rPr>
           </w:pPr>
-          <w:hyperlink w:anchor="_Toc195699851" w:history="1">
+          <w:hyperlink w:anchor="_Toc196147747" w:history="1">
             <w:r>
               <w:rPr>
                 <w:rStyle w:val="Hyperlink"/>
@@ -9359,7 +9467,7 @@
                 <w:noProof/>
                 <w:webHidden/>
               </w:rPr>
-              <w:instrText xml:space="preserve"> PAGEREF _Toc195699851 \h </w:instrText>
+              <w:instrText xml:space="preserve"> PAGEREF _Toc196147747 \h </w:instrText>
             </w:r>
             <w:r>
               <w:rPr>
@@ -9379,7 +9487,7 @@
                 <w:noProof/>
                 <w:webHidden/>
               </w:rPr>
-              <w:t>75</w:t>
+              <w:t>76</w:t>
             </w:r>
             <w:r>
               <w:rPr>
@@ -9405,7 +9513,7 @@
               <w14:ligatures w14:val="standardContextual"/>
             </w:rPr>
           </w:pPr>
-          <w:hyperlink w:anchor="_Toc195699852" w:history="1">
+          <w:hyperlink w:anchor="_Toc196147748" w:history="1">
             <w:r>
               <w:rPr>
                 <w:rStyle w:val="Hyperlink"/>
@@ -9432,7 +9540,7 @@
                 <w:noProof/>
                 <w:webHidden/>
               </w:rPr>
-              <w:instrText xml:space="preserve"> PAGEREF _Toc195699852 \h </w:instrText>
+              <w:instrText xml:space="preserve"> PAGEREF _Toc196147748 \h </w:instrText>
             </w:r>
             <w:r>
               <w:rPr>
@@ -9452,7 +9560,7 @@
                 <w:noProof/>
                 <w:webHidden/>
               </w:rPr>
-              <w:t>76</w:t>
+              <w:t>77</w:t>
             </w:r>
             <w:r>
               <w:rPr>
@@ -9478,7 +9586,7 @@
               <w14:ligatures w14:val="standardContextual"/>
             </w:rPr>
           </w:pPr>
-          <w:hyperlink w:anchor="_Toc195699853" w:history="1">
+          <w:hyperlink w:anchor="_Toc196147749" w:history="1">
             <w:r>
               <w:rPr>
                 <w:rStyle w:val="Hyperlink"/>
@@ -9505,7 +9613,7 @@
                 <w:noProof/>
                 <w:webHidden/>
               </w:rPr>
-              <w:instrText xml:space="preserve"> PAGEREF _Toc195699853 \h </w:instrText>
+              <w:instrText xml:space="preserve"> PAGEREF _Toc196147749 \h </w:instrText>
             </w:r>
             <w:r>
               <w:rPr>
@@ -9525,7 +9633,7 @@
                 <w:noProof/>
                 <w:webHidden/>
               </w:rPr>
-              <w:t>78</w:t>
+              <w:t>79</w:t>
             </w:r>
             <w:r>
               <w:rPr>
@@ -9551,7 +9659,7 @@
               <w14:ligatures w14:val="standardContextual"/>
             </w:rPr>
           </w:pPr>
-          <w:hyperlink w:anchor="_Toc195699854" w:history="1">
+          <w:hyperlink w:anchor="_Toc196147750" w:history="1">
             <w:r>
               <w:rPr>
                 <w:rStyle w:val="Hyperlink"/>
@@ -9578,7 +9686,7 @@
                 <w:noProof/>
                 <w:webHidden/>
               </w:rPr>
-              <w:instrText xml:space="preserve"> PAGEREF _Toc195699854 \h </w:instrText>
+              <w:instrText xml:space="preserve"> PAGEREF _Toc196147750 \h </w:instrText>
             </w:r>
             <w:r>
               <w:rPr>
@@ -9598,7 +9706,7 @@
                 <w:noProof/>
                 <w:webHidden/>
               </w:rPr>
-              <w:t>79</w:t>
+              <w:t>80</w:t>
             </w:r>
             <w:r>
               <w:rPr>
@@ -9624,7 +9732,7 @@
               <w14:ligatures w14:val="standardContextual"/>
             </w:rPr>
           </w:pPr>
-          <w:hyperlink w:anchor="_Toc195699855" w:history="1">
+          <w:hyperlink w:anchor="_Toc196147751" w:history="1">
             <w:r>
               <w:rPr>
                 <w:rStyle w:val="Hyperlink"/>
@@ -9651,7 +9759,7 @@
                 <w:noProof/>
                 <w:webHidden/>
               </w:rPr>
-              <w:instrText xml:space="preserve"> PAGEREF _Toc195699855 \h </w:instrText>
+              <w:instrText xml:space="preserve"> PAGEREF _Toc196147751 \h </w:instrText>
             </w:r>
             <w:r>
               <w:rPr>
@@ -9671,7 +9779,7 @@
                 <w:noProof/>
                 <w:webHidden/>
               </w:rPr>
-              <w:t>79</w:t>
+              <w:t>80</w:t>
             </w:r>
             <w:r>
               <w:rPr>
@@ -9697,7 +9805,7 @@
               <w14:ligatures w14:val="standardContextual"/>
             </w:rPr>
           </w:pPr>
-          <w:hyperlink w:anchor="_Toc195699856" w:history="1">
+          <w:hyperlink w:anchor="_Toc196147752" w:history="1">
             <w:r>
               <w:rPr>
                 <w:rStyle w:val="Hyperlink"/>
@@ -9724,7 +9832,7 @@
                 <w:noProof/>
                 <w:webHidden/>
               </w:rPr>
-              <w:instrText xml:space="preserve"> PAGEREF _Toc195699856 \h </w:instrText>
+              <w:instrText xml:space="preserve"> PAGEREF _Toc196147752 \h </w:instrText>
             </w:r>
             <w:r>
               <w:rPr>
@@ -9744,7 +9852,7 @@
                 <w:noProof/>
                 <w:webHidden/>
               </w:rPr>
-              <w:t>80</w:t>
+              <w:t>81</w:t>
             </w:r>
             <w:r>
               <w:rPr>
@@ -9770,7 +9878,7 @@
               <w14:ligatures w14:val="standardContextual"/>
             </w:rPr>
           </w:pPr>
-          <w:hyperlink w:anchor="_Toc195699857" w:history="1">
+          <w:hyperlink w:anchor="_Toc196147753" w:history="1">
             <w:r>
               <w:rPr>
                 <w:rStyle w:val="Hyperlink"/>
@@ -9797,7 +9905,7 @@
                 <w:noProof/>
                 <w:webHidden/>
               </w:rPr>
-              <w:instrText xml:space="preserve"> PAGEREF _Toc195699857 \h </w:instrText>
+              <w:instrText xml:space="preserve"> PAGEREF _Toc196147753 \h </w:instrText>
             </w:r>
             <w:r>
               <w:rPr>
@@ -9817,7 +9925,7 @@
                 <w:noProof/>
                 <w:webHidden/>
               </w:rPr>
-              <w:t>81</w:t>
+              <w:t>82</w:t>
             </w:r>
             <w:r>
               <w:rPr>
@@ -9843,7 +9951,7 @@
               <w14:ligatures w14:val="standardContextual"/>
             </w:rPr>
           </w:pPr>
-          <w:hyperlink w:anchor="_Toc195699858" w:history="1">
+          <w:hyperlink w:anchor="_Toc196147754" w:history="1">
             <w:r>
               <w:rPr>
                 <w:rStyle w:val="Hyperlink"/>
@@ -9870,7 +9978,7 @@
                 <w:noProof/>
                 <w:webHidden/>
               </w:rPr>
-              <w:instrText xml:space="preserve"> PAGEREF _Toc195699858 \h </w:instrText>
+              <w:instrText xml:space="preserve"> PAGEREF _Toc196147754 \h </w:instrText>
             </w:r>
             <w:r>
               <w:rPr>
@@ -9890,7 +9998,7 @@
                 <w:noProof/>
                 <w:webHidden/>
               </w:rPr>
-              <w:t>84</w:t>
+              <w:t>85</w:t>
             </w:r>
             <w:r>
               <w:rPr>
@@ -9916,7 +10024,7 @@
               <w14:ligatures w14:val="standardContextual"/>
             </w:rPr>
           </w:pPr>
-          <w:hyperlink w:anchor="_Toc195699859" w:history="1">
+          <w:hyperlink w:anchor="_Toc196147755" w:history="1">
             <w:r>
               <w:rPr>
                 <w:rStyle w:val="Hyperlink"/>
@@ -9943,7 +10051,7 @@
                 <w:noProof/>
                 <w:webHidden/>
               </w:rPr>
-              <w:instrText xml:space="preserve"> PAGEREF _Toc195699859 \h </w:instrText>
+              <w:instrText xml:space="preserve"> PAGEREF _Toc196147755 \h </w:instrText>
             </w:r>
             <w:r>
               <w:rPr>
@@ -9963,7 +10071,7 @@
                 <w:noProof/>
                 <w:webHidden/>
               </w:rPr>
-              <w:t>87</w:t>
+              <w:t>88</w:t>
             </w:r>
             <w:r>
               <w:rPr>
@@ -9989,7 +10097,7 @@
               <w14:ligatures w14:val="standardContextual"/>
             </w:rPr>
           </w:pPr>
-          <w:hyperlink w:anchor="_Toc195699860" w:history="1">
+          <w:hyperlink w:anchor="_Toc196147756" w:history="1">
             <w:r>
               <w:rPr>
                 <w:rStyle w:val="Hyperlink"/>
@@ -10016,7 +10124,7 @@
                 <w:noProof/>
                 <w:webHidden/>
               </w:rPr>
-              <w:instrText xml:space="preserve"> PAGEREF _Toc195699860 \h </w:instrText>
+              <w:instrText xml:space="preserve"> PAGEREF _Toc196147756 \h </w:instrText>
             </w:r>
             <w:r>
               <w:rPr>
@@ -10036,7 +10144,7 @@
                 <w:noProof/>
                 <w:webHidden/>
               </w:rPr>
-              <w:t>88</w:t>
+              <w:t>89</w:t>
             </w:r>
             <w:r>
               <w:rPr>
@@ -10062,7 +10170,7 @@
               <w14:ligatures w14:val="standardContextual"/>
             </w:rPr>
           </w:pPr>
-          <w:hyperlink w:anchor="_Toc195699861" w:history="1">
+          <w:hyperlink w:anchor="_Toc196147757" w:history="1">
             <w:r>
               <w:rPr>
                 <w:rStyle w:val="Hyperlink"/>
@@ -10089,7 +10197,7 @@
                 <w:noProof/>
                 <w:webHidden/>
               </w:rPr>
-              <w:instrText xml:space="preserve"> PAGEREF _Toc195699861 \h </w:instrText>
+              <w:instrText xml:space="preserve"> PAGEREF _Toc196147757 \h </w:instrText>
             </w:r>
             <w:r>
               <w:rPr>
@@ -10109,7 +10217,7 @@
                 <w:noProof/>
                 <w:webHidden/>
               </w:rPr>
-              <w:t>88</w:t>
+              <w:t>89</w:t>
             </w:r>
             <w:r>
               <w:rPr>
@@ -10135,7 +10243,7 @@
               <w14:ligatures w14:val="standardContextual"/>
             </w:rPr>
           </w:pPr>
-          <w:hyperlink w:anchor="_Toc195699862" w:history="1">
+          <w:hyperlink w:anchor="_Toc196147758" w:history="1">
             <w:r>
               <w:rPr>
                 <w:rStyle w:val="Hyperlink"/>
@@ -10162,7 +10270,7 @@
                 <w:noProof/>
                 <w:webHidden/>
               </w:rPr>
-              <w:instrText xml:space="preserve"> PAGEREF _Toc195699862 \h </w:instrText>
+              <w:instrText xml:space="preserve"> PAGEREF _Toc196147758 \h </w:instrText>
             </w:r>
             <w:r>
               <w:rPr>
@@ -10182,7 +10290,7 @@
                 <w:noProof/>
                 <w:webHidden/>
               </w:rPr>
-              <w:t>88</w:t>
+              <w:t>89</w:t>
             </w:r>
             <w:r>
               <w:rPr>
@@ -10208,7 +10316,7 @@
               <w14:ligatures w14:val="standardContextual"/>
             </w:rPr>
           </w:pPr>
-          <w:hyperlink w:anchor="_Toc195699863" w:history="1">
+          <w:hyperlink w:anchor="_Toc196147759" w:history="1">
             <w:r>
               <w:rPr>
                 <w:rStyle w:val="Hyperlink"/>
@@ -10235,7 +10343,7 @@
                 <w:noProof/>
                 <w:webHidden/>
               </w:rPr>
-              <w:instrText xml:space="preserve"> PAGEREF _Toc195699863 \h </w:instrText>
+              <w:instrText xml:space="preserve"> PAGEREF _Toc196147759 \h </w:instrText>
             </w:r>
             <w:r>
               <w:rPr>
@@ -10255,7 +10363,7 @@
                 <w:noProof/>
                 <w:webHidden/>
               </w:rPr>
-              <w:t>88</w:t>
+              <w:t>89</w:t>
             </w:r>
             <w:r>
               <w:rPr>
@@ -10281,7 +10389,7 @@
               <w14:ligatures w14:val="standardContextual"/>
             </w:rPr>
           </w:pPr>
-          <w:hyperlink w:anchor="_Toc195699864" w:history="1">
+          <w:hyperlink w:anchor="_Toc196147760" w:history="1">
             <w:r>
               <w:rPr>
                 <w:rStyle w:val="Hyperlink"/>
@@ -10308,7 +10416,7 @@
                 <w:noProof/>
                 <w:webHidden/>
               </w:rPr>
-              <w:instrText xml:space="preserve"> PAGEREF _Toc195699864 \h </w:instrText>
+              <w:instrText xml:space="preserve"> PAGEREF _Toc196147760 \h </w:instrText>
             </w:r>
             <w:r>
               <w:rPr>
@@ -10328,7 +10436,7 @@
                 <w:noProof/>
                 <w:webHidden/>
               </w:rPr>
-              <w:t>88</w:t>
+              <w:t>89</w:t>
             </w:r>
             <w:r>
               <w:rPr>
@@ -10354,7 +10462,7 @@
               <w14:ligatures w14:val="standardContextual"/>
             </w:rPr>
           </w:pPr>
-          <w:hyperlink w:anchor="_Toc195699865" w:history="1">
+          <w:hyperlink w:anchor="_Toc196147761" w:history="1">
             <w:r>
               <w:rPr>
                 <w:rStyle w:val="Hyperlink"/>
@@ -10381,7 +10489,7 @@
                 <w:noProof/>
                 <w:webHidden/>
               </w:rPr>
-              <w:instrText xml:space="preserve"> PAGEREF _Toc195699865 \h </w:instrText>
+              <w:instrText xml:space="preserve"> PAGEREF _Toc196147761 \h </w:instrText>
             </w:r>
             <w:r>
               <w:rPr>
@@ -10401,7 +10509,7 @@
                 <w:noProof/>
                 <w:webHidden/>
               </w:rPr>
-              <w:t>89</w:t>
+              <w:t>90</w:t>
             </w:r>
             <w:r>
               <w:rPr>
@@ -10427,7 +10535,7 @@
               <w14:ligatures w14:val="standardContextual"/>
             </w:rPr>
           </w:pPr>
-          <w:hyperlink w:anchor="_Toc195699866" w:history="1">
+          <w:hyperlink w:anchor="_Toc196147762" w:history="1">
             <w:r>
               <w:rPr>
                 <w:rStyle w:val="Hyperlink"/>
@@ -10454,7 +10562,7 @@
                 <w:noProof/>
                 <w:webHidden/>
               </w:rPr>
-              <w:instrText xml:space="preserve"> PAGEREF _Toc195699866 \h </w:instrText>
+              <w:instrText xml:space="preserve"> PAGEREF _Toc196147762 \h </w:instrText>
             </w:r>
             <w:r>
               <w:rPr>
@@ -10474,7 +10582,7 @@
                 <w:noProof/>
                 <w:webHidden/>
               </w:rPr>
-              <w:t>89</w:t>
+              <w:t>90</w:t>
             </w:r>
             <w:r>
               <w:rPr>
@@ -10500,7 +10608,7 @@
               <w14:ligatures w14:val="standardContextual"/>
             </w:rPr>
           </w:pPr>
-          <w:hyperlink w:anchor="_Toc195699867" w:history="1">
+          <w:hyperlink w:anchor="_Toc196147763" w:history="1">
             <w:r>
               <w:rPr>
                 <w:rStyle w:val="Hyperlink"/>
@@ -10527,7 +10635,7 @@
                 <w:noProof/>
                 <w:webHidden/>
               </w:rPr>
-              <w:instrText xml:space="preserve"> PAGEREF _Toc195699867 \h </w:instrText>
+              <w:instrText xml:space="preserve"> PAGEREF _Toc196147763 \h </w:instrText>
             </w:r>
             <w:r>
               <w:rPr>
@@ -10547,7 +10655,7 @@
                 <w:noProof/>
                 <w:webHidden/>
               </w:rPr>
-              <w:t>89</w:t>
+              <w:t>90</w:t>
             </w:r>
             <w:r>
               <w:rPr>
@@ -10573,7 +10681,7 @@
               <w14:ligatures w14:val="standardContextual"/>
             </w:rPr>
           </w:pPr>
-          <w:hyperlink w:anchor="_Toc195699868" w:history="1">
+          <w:hyperlink w:anchor="_Toc196147764" w:history="1">
             <w:r>
               <w:rPr>
                 <w:rStyle w:val="Hyperlink"/>
@@ -10600,7 +10708,7 @@
                 <w:noProof/>
                 <w:webHidden/>
               </w:rPr>
-              <w:instrText xml:space="preserve"> PAGEREF _Toc195699868 \h </w:instrText>
+              <w:instrText xml:space="preserve"> PAGEREF _Toc196147764 \h </w:instrText>
             </w:r>
             <w:r>
               <w:rPr>
@@ -10620,7 +10728,7 @@
                 <w:noProof/>
                 <w:webHidden/>
               </w:rPr>
-              <w:t>89</w:t>
+              <w:t>90</w:t>
             </w:r>
             <w:r>
               <w:rPr>
@@ -10646,7 +10754,7 @@
               <w14:ligatures w14:val="standardContextual"/>
             </w:rPr>
           </w:pPr>
-          <w:hyperlink w:anchor="_Toc195699869" w:history="1">
+          <w:hyperlink w:anchor="_Toc196147765" w:history="1">
             <w:r>
               <w:rPr>
                 <w:rStyle w:val="Hyperlink"/>
@@ -10673,7 +10781,7 @@
                 <w:noProof/>
                 <w:webHidden/>
               </w:rPr>
-              <w:instrText xml:space="preserve"> PAGEREF _Toc195699869 \h </w:instrText>
+              <w:instrText xml:space="preserve"> PAGEREF _Toc196147765 \h </w:instrText>
             </w:r>
             <w:r>
               <w:rPr>
@@ -10693,7 +10801,7 @@
                 <w:noProof/>
                 <w:webHidden/>
               </w:rPr>
-              <w:t>89</w:t>
+              <w:t>90</w:t>
             </w:r>
             <w:r>
               <w:rPr>
@@ -10719,7 +10827,7 @@
               <w14:ligatures w14:val="standardContextual"/>
             </w:rPr>
           </w:pPr>
-          <w:hyperlink w:anchor="_Toc195699870" w:history="1">
+          <w:hyperlink w:anchor="_Toc196147766" w:history="1">
             <w:r>
               <w:rPr>
                 <w:rStyle w:val="Hyperlink"/>
@@ -10746,7 +10854,7 @@
                 <w:noProof/>
                 <w:webHidden/>
               </w:rPr>
-              <w:instrText xml:space="preserve"> PAGEREF _Toc195699870 \h </w:instrText>
+              <w:instrText xml:space="preserve"> PAGEREF _Toc196147766 \h </w:instrText>
             </w:r>
             <w:r>
               <w:rPr>
@@ -10766,7 +10874,7 @@
                 <w:noProof/>
                 <w:webHidden/>
               </w:rPr>
-              <w:t>89</w:t>
+              <w:t>90</w:t>
             </w:r>
             <w:r>
               <w:rPr>
@@ -10792,7 +10900,7 @@
               <w14:ligatures w14:val="standardContextual"/>
             </w:rPr>
           </w:pPr>
-          <w:hyperlink w:anchor="_Toc195699871" w:history="1">
+          <w:hyperlink w:anchor="_Toc196147767" w:history="1">
             <w:r>
               <w:rPr>
                 <w:rStyle w:val="Hyperlink"/>
@@ -10819,7 +10927,7 @@
                 <w:noProof/>
                 <w:webHidden/>
               </w:rPr>
-              <w:instrText xml:space="preserve"> PAGEREF _Toc195699871 \h </w:instrText>
+              <w:instrText xml:space="preserve"> PAGEREF _Toc196147767 \h </w:instrText>
             </w:r>
             <w:r>
               <w:rPr>
@@ -10839,7 +10947,7 @@
                 <w:noProof/>
                 <w:webHidden/>
               </w:rPr>
-              <w:t>89</w:t>
+              <w:t>90</w:t>
             </w:r>
             <w:r>
               <w:rPr>
@@ -10865,7 +10973,7 @@
               <w14:ligatures w14:val="standardContextual"/>
             </w:rPr>
           </w:pPr>
-          <w:hyperlink w:anchor="_Toc195699872" w:history="1">
+          <w:hyperlink w:anchor="_Toc196147768" w:history="1">
             <w:r>
               <w:rPr>
                 <w:rStyle w:val="Hyperlink"/>
@@ -10892,7 +11000,7 @@
                 <w:noProof/>
                 <w:webHidden/>
               </w:rPr>
-              <w:instrText xml:space="preserve"> PAGEREF _Toc195699872 \h </w:instrText>
+              <w:instrText xml:space="preserve"> PAGEREF _Toc196147768 \h </w:instrText>
             </w:r>
             <w:r>
               <w:rPr>
@@ -10912,7 +11020,7 @@
                 <w:noProof/>
                 <w:webHidden/>
               </w:rPr>
-              <w:t>90</w:t>
+              <w:t>91</w:t>
             </w:r>
             <w:r>
               <w:rPr>
@@ -10938,7 +11046,7 @@
               <w14:ligatures w14:val="standardContextual"/>
             </w:rPr>
           </w:pPr>
-          <w:hyperlink w:anchor="_Toc195699873" w:history="1">
+          <w:hyperlink w:anchor="_Toc196147769" w:history="1">
             <w:r>
               <w:rPr>
                 <w:rStyle w:val="Hyperlink"/>
@@ -10965,7 +11073,7 @@
                 <w:noProof/>
                 <w:webHidden/>
               </w:rPr>
-              <w:instrText xml:space="preserve"> PAGEREF _Toc195699873 \h </w:instrText>
+              <w:instrText xml:space="preserve"> PAGEREF _Toc196147769 \h </w:instrText>
             </w:r>
             <w:r>
               <w:rPr>
@@ -10985,7 +11093,7 @@
                 <w:noProof/>
                 <w:webHidden/>
               </w:rPr>
-              <w:t>90</w:t>
+              <w:t>91</w:t>
             </w:r>
             <w:r>
               <w:rPr>
@@ -11011,7 +11119,7 @@
               <w14:ligatures w14:val="standardContextual"/>
             </w:rPr>
           </w:pPr>
-          <w:hyperlink w:anchor="_Toc195699874" w:history="1">
+          <w:hyperlink w:anchor="_Toc196147770" w:history="1">
             <w:r>
               <w:rPr>
                 <w:rStyle w:val="Hyperlink"/>
@@ -11038,7 +11146,7 @@
                 <w:noProof/>
                 <w:webHidden/>
               </w:rPr>
-              <w:instrText xml:space="preserve"> PAGEREF _Toc195699874 \h </w:instrText>
+              <w:instrText xml:space="preserve"> PAGEREF _Toc196147770 \h </w:instrText>
             </w:r>
             <w:r>
               <w:rPr>
@@ -11058,7 +11166,7 @@
                 <w:noProof/>
                 <w:webHidden/>
               </w:rPr>
-              <w:t>90</w:t>
+              <w:t>91</w:t>
             </w:r>
             <w:r>
               <w:rPr>
@@ -11084,7 +11192,7 @@
               <w14:ligatures w14:val="standardContextual"/>
             </w:rPr>
           </w:pPr>
-          <w:hyperlink w:anchor="_Toc195699875" w:history="1">
+          <w:hyperlink w:anchor="_Toc196147771" w:history="1">
             <w:r>
               <w:rPr>
                 <w:rStyle w:val="Hyperlink"/>
@@ -11111,7 +11219,7 @@
                 <w:noProof/>
                 <w:webHidden/>
               </w:rPr>
-              <w:instrText xml:space="preserve"> PAGEREF _Toc195699875 \h </w:instrText>
+              <w:instrText xml:space="preserve"> PAGEREF _Toc196147771 \h </w:instrText>
             </w:r>
             <w:r>
               <w:rPr>
@@ -11131,7 +11239,7 @@
                 <w:noProof/>
                 <w:webHidden/>
               </w:rPr>
-              <w:t>91</w:t>
+              <w:t>92</w:t>
             </w:r>
             <w:r>
               <w:rPr>
@@ -11157,7 +11265,7 @@
               <w14:ligatures w14:val="standardContextual"/>
             </w:rPr>
           </w:pPr>
-          <w:hyperlink w:anchor="_Toc195699876" w:history="1">
+          <w:hyperlink w:anchor="_Toc196147772" w:history="1">
             <w:r>
               <w:rPr>
                 <w:rStyle w:val="Hyperlink"/>
@@ -11184,7 +11292,7 @@
                 <w:noProof/>
                 <w:webHidden/>
               </w:rPr>
-              <w:instrText xml:space="preserve"> PAGEREF _Toc195699876 \h </w:instrText>
+              <w:instrText xml:space="preserve"> PAGEREF _Toc196147772 \h </w:instrText>
             </w:r>
             <w:r>
               <w:rPr>
@@ -11204,7 +11312,7 @@
                 <w:noProof/>
                 <w:webHidden/>
               </w:rPr>
-              <w:t>92</w:t>
+              <w:t>93</w:t>
             </w:r>
             <w:r>
               <w:rPr>
@@ -11230,7 +11338,7 @@
               <w14:ligatures w14:val="standardContextual"/>
             </w:rPr>
           </w:pPr>
-          <w:hyperlink w:anchor="_Toc195699877" w:history="1">
+          <w:hyperlink w:anchor="_Toc196147773" w:history="1">
             <w:r>
               <w:rPr>
                 <w:rStyle w:val="Hyperlink"/>
@@ -11257,7 +11365,7 @@
                 <w:noProof/>
                 <w:webHidden/>
               </w:rPr>
-              <w:instrText xml:space="preserve"> PAGEREF _Toc195699877 \h </w:instrText>
+              <w:instrText xml:space="preserve"> PAGEREF _Toc196147773 \h </w:instrText>
             </w:r>
             <w:r>
               <w:rPr>
@@ -11277,7 +11385,7 @@
                 <w:noProof/>
                 <w:webHidden/>
               </w:rPr>
-              <w:t>93</w:t>
+              <w:t>94</w:t>
             </w:r>
             <w:r>
               <w:rPr>
@@ -11295,7 +11403,6 @@
             </w:rPr>
           </w:pPr>
           <w:r>
-            <w:lastRenderedPageBreak/>
             <w:fldChar w:fldCharType="end"/>
           </w:r>
         </w:p>
@@ -11310,7 +11417,7 @@
       <w:pPr>
         <w:pStyle w:val="Heading1"/>
       </w:pPr>
-      <w:bookmarkStart w:id="0" w:name="_Toc195699785"/>
+      <w:bookmarkStart w:id="0" w:name="_Toc196147680"/>
       <w:r>
         <w:lastRenderedPageBreak/>
         <w:t xml:space="preserve">Pubseq Gateway </w:t>
@@ -11633,7 +11740,7 @@
       <w:pPr>
         <w:pStyle w:val="Heading1"/>
       </w:pPr>
-      <w:bookmarkStart w:id="1" w:name="_Toc195699786"/>
+      <w:bookmarkStart w:id="1" w:name="_Toc196147681"/>
       <w:r>
         <w:lastRenderedPageBreak/>
         <w:t>Overview</w:t>
@@ -11685,7 +11792,7 @@
           <v:shape id="_x0000_i1025" type="#_x0000_t75" style="width:467.1pt;height:231.95pt" o:ole="">
             <v:imagedata r:id="rId11" o:title=""/>
           </v:shape>
-          <o:OLEObject Type="Embed" ProgID="Visio.Drawing.15" ShapeID="_x0000_i1025" DrawAspect="Content" ObjectID="_1806312549" r:id="rId12"/>
+          <o:OLEObject Type="Embed" ProgID="Visio.Drawing.15" ShapeID="_x0000_i1025" DrawAspect="Content" ObjectID="_1806760441" r:id="rId12"/>
         </w:object>
       </w:r>
     </w:p>
@@ -11825,7 +11932,7 @@
       <w:pPr>
         <w:pStyle w:val="Heading1"/>
       </w:pPr>
-      <w:bookmarkStart w:id="2" w:name="_Toc195699787"/>
+      <w:bookmarkStart w:id="2" w:name="_Toc196147682"/>
       <w:r>
         <w:lastRenderedPageBreak/>
         <w:t>Communication Protocol</w:t>
@@ -11896,7 +12003,7 @@
       <w:pPr>
         <w:pStyle w:val="Heading2"/>
       </w:pPr>
-      <w:bookmarkStart w:id="3" w:name="_Toc195699788"/>
+      <w:bookmarkStart w:id="3" w:name="_Toc196147683"/>
       <w:r>
         <w:t>PSG Protocol</w:t>
       </w:r>
@@ -13440,7 +13547,7 @@
         <w:pStyle w:val="Heading1"/>
       </w:pPr>
       <w:bookmarkStart w:id="4" w:name="_Exclude_Blob_Cache"/>
-      <w:bookmarkStart w:id="5" w:name="_Toc195699789"/>
+      <w:bookmarkStart w:id="5" w:name="_Toc196147684"/>
       <w:bookmarkEnd w:id="4"/>
       <w:r>
         <w:t>Exclude Blob Cache</w:t>
@@ -13542,7 +13649,7 @@
       <w:pPr>
         <w:pStyle w:val="Heading1"/>
       </w:pPr>
-      <w:bookmarkStart w:id="6" w:name="_Toc195699790"/>
+      <w:bookmarkStart w:id="6" w:name="_Toc196147685"/>
       <w:r>
         <w:t>Requests</w:t>
       </w:r>
@@ -13627,7 +13734,7 @@
         <w:pStyle w:val="Heading2"/>
       </w:pPr>
       <w:bookmarkStart w:id="7" w:name="_Common_ID/..._Request"/>
-      <w:bookmarkStart w:id="8" w:name="_Toc195699791"/>
+      <w:bookmarkStart w:id="8" w:name="_Toc196147686"/>
       <w:bookmarkEnd w:id="7"/>
       <w:r>
         <w:t>Common ID/</w:t>
@@ -13976,7 +14083,7 @@
       <w:pPr>
         <w:pStyle w:val="Heading2"/>
       </w:pPr>
-      <w:bookmarkStart w:id="10" w:name="_Toc195699792"/>
+      <w:bookmarkStart w:id="10" w:name="_Toc196147687"/>
       <w:r>
         <w:t>ID/</w:t>
       </w:r>
@@ -15100,7 +15207,7 @@
       <w:pPr>
         <w:pStyle w:val="Heading2"/>
       </w:pPr>
-      <w:bookmarkStart w:id="11" w:name="_Toc195699793"/>
+      <w:bookmarkStart w:id="11" w:name="_Toc196147688"/>
       <w:r>
         <w:t>ID/</w:t>
       </w:r>
@@ -16466,7 +16573,7 @@
       <w:pPr>
         <w:pStyle w:val="Heading2"/>
       </w:pPr>
-      <w:bookmarkStart w:id="12" w:name="_Toc195699794"/>
+      <w:bookmarkStart w:id="12" w:name="_Toc196147689"/>
       <w:r>
         <w:t>ID/get_tse_chunk Request</w:t>
       </w:r>
@@ -17038,7 +17145,7 @@
       <w:pPr>
         <w:pStyle w:val="Heading2"/>
       </w:pPr>
-      <w:bookmarkStart w:id="14" w:name="_Toc195699795"/>
+      <w:bookmarkStart w:id="14" w:name="_Toc196147690"/>
       <w:r>
         <w:t>ID/</w:t>
       </w:r>
@@ -17722,7 +17829,7 @@
       <w:pPr>
         <w:pStyle w:val="Heading2"/>
       </w:pPr>
-      <w:bookmarkStart w:id="15" w:name="_Toc195699796"/>
+      <w:bookmarkStart w:id="15" w:name="_Toc196147691"/>
       <w:r>
         <w:t>ID/</w:t>
       </w:r>
@@ -18998,7 +19105,7 @@
       <w:pPr>
         <w:pStyle w:val="Heading2"/>
       </w:pPr>
-      <w:bookmarkStart w:id="19" w:name="_Toc195699797"/>
+      <w:bookmarkStart w:id="19" w:name="_Toc196147692"/>
       <w:r>
         <w:t>ID/</w:t>
       </w:r>
@@ -19324,7 +19431,7 @@
       <w:pPr>
         <w:pStyle w:val="Heading2"/>
       </w:pPr>
-      <w:bookmarkStart w:id="20" w:name="_Toc195699798"/>
+      <w:bookmarkStart w:id="20" w:name="_Toc196147693"/>
       <w:r>
         <w:t>ID/get_sat_mapping Request</w:t>
       </w:r>
@@ -19387,7 +19494,7 @@
       <w:pPr>
         <w:pStyle w:val="Heading2"/>
       </w:pPr>
-      <w:bookmarkStart w:id="21" w:name="_Toc195699799"/>
+      <w:bookmarkStart w:id="21" w:name="_Toc196147694"/>
       <w:r>
         <w:lastRenderedPageBreak/>
         <w:t>IPG/resolve Request</w:t>
@@ -19929,7 +20036,7 @@
       <w:pPr>
         <w:pStyle w:val="Heading2"/>
       </w:pPr>
-      <w:bookmarkStart w:id="22" w:name="_Toc195699800"/>
+      <w:bookmarkStart w:id="22" w:name="_Toc196147695"/>
       <w:r>
         <w:lastRenderedPageBreak/>
         <w:t>ADMIN/</w:t>
@@ -20247,7 +20354,7 @@
       <w:pPr>
         <w:pStyle w:val="Heading2"/>
       </w:pPr>
-      <w:bookmarkStart w:id="23" w:name="_Toc195699801"/>
+      <w:bookmarkStart w:id="23" w:name="_Toc196147696"/>
       <w:r>
         <w:t>ADMIN/</w:t>
       </w:r>
@@ -21453,7 +21560,7 @@
       <w:pPr>
         <w:pStyle w:val="Heading2"/>
       </w:pPr>
-      <w:bookmarkStart w:id="24" w:name="_Toc195699802"/>
+      <w:bookmarkStart w:id="24" w:name="_Toc196147697"/>
       <w:r>
         <w:t>ADMIN/</w:t>
       </w:r>
@@ -22982,7 +23089,7 @@
       <w:pPr>
         <w:pStyle w:val="Heading2"/>
       </w:pPr>
-      <w:bookmarkStart w:id="25" w:name="_Toc195699803"/>
+      <w:bookmarkStart w:id="25" w:name="_Toc196147698"/>
       <w:r>
         <w:t>ADMIN/</w:t>
       </w:r>
@@ -23451,7 +23558,7 @@
       <w:pPr>
         <w:pStyle w:val="Heading2"/>
       </w:pPr>
-      <w:bookmarkStart w:id="26" w:name="_Toc195699804"/>
+      <w:bookmarkStart w:id="26" w:name="_Toc196147699"/>
       <w:r>
         <w:t>ADMIN/</w:t>
       </w:r>
@@ -23641,7 +23748,7 @@
       <w:pPr>
         <w:pStyle w:val="Heading2"/>
       </w:pPr>
-      <w:bookmarkStart w:id="27" w:name="_Toc195699805"/>
+      <w:bookmarkStart w:id="27" w:name="_Toc196147700"/>
       <w:r>
         <w:t>ADMIN/ack_alert Request</w:t>
       </w:r>
@@ -23905,7 +24012,7 @@
       <w:pPr>
         <w:pStyle w:val="Heading2"/>
       </w:pPr>
-      <w:bookmarkStart w:id="28" w:name="_Toc195699806"/>
+      <w:bookmarkStart w:id="28" w:name="_Toc196147701"/>
       <w:r>
         <w:t>ADMIN/statistics Request</w:t>
       </w:r>
@@ -24310,15 +24417,9 @@
       <w:pPr>
         <w:pStyle w:val="Heading2"/>
       </w:pPr>
-      <w:bookmarkStart w:id="29" w:name="_Toc195699807"/>
-      <w:r>
-        <w:t>ADMIN/</w:t>
-      </w:r>
-      <w:r>
-        <w:t>dispatcher_status</w:t>
-      </w:r>
-      <w:r>
-        <w:t xml:space="preserve"> Request</w:t>
+      <w:bookmarkStart w:id="29" w:name="_Toc196147702"/>
+      <w:r>
+        <w:t>ADMIN/dispatcher_status Request</w:t>
       </w:r>
       <w:bookmarkEnd w:id="29"/>
     </w:p>
@@ -24337,13 +24438,7 @@
           <w:rPr>
             <w:rStyle w:val="Hyperlink"/>
           </w:rPr>
-          <w:t>http://&lt;host:port&gt;/ADMIN/</w:t>
-        </w:r>
-        <w:r>
-          <w:rPr>
-            <w:rStyle w:val="Hyperlink"/>
-          </w:rPr>
-          <w:t>dispatcher_status</w:t>
+          <w:t>http://&lt;host:port&gt;/ADMIN/dispatcher_status</w:t>
         </w:r>
       </w:hyperlink>
     </w:p>
@@ -24391,10 +24486,7 @@
         </w:numPr>
       </w:pPr>
       <w:r>
-        <w:t xml:space="preserve">The content has a JSON dictionary which </w:t>
-      </w:r>
-      <w:r>
-        <w:t>provides the request dispatcher detailed information.</w:t>
+        <w:t>The content has a JSON dictionary which provides the request dispatcher detailed information.</w:t>
       </w:r>
     </w:p>
     <w:p/>
@@ -24402,15 +24494,9 @@
       <w:pPr>
         <w:pStyle w:val="Heading2"/>
       </w:pPr>
-      <w:bookmarkStart w:id="30" w:name="_Toc195699808"/>
-      <w:r>
-        <w:t>ADMIN/</w:t>
-      </w:r>
-      <w:r>
-        <w:t>connections</w:t>
-      </w:r>
-      <w:r>
-        <w:t>_status Request</w:t>
+      <w:bookmarkStart w:id="30" w:name="_Toc196147703"/>
+      <w:r>
+        <w:t>ADMIN/connections_status Request</w:t>
       </w:r>
       <w:bookmarkEnd w:id="30"/>
     </w:p>
@@ -24429,19 +24515,7 @@
           <w:rPr>
             <w:rStyle w:val="Hyperlink"/>
           </w:rPr>
-          <w:t>http://&lt;host:port&gt;/ADMIN/</w:t>
-        </w:r>
-        <w:r>
-          <w:rPr>
-            <w:rStyle w:val="Hyperlink"/>
-          </w:rPr>
-          <w:t>connections</w:t>
-        </w:r>
-        <w:r>
-          <w:rPr>
-            <w:rStyle w:val="Hyperlink"/>
-          </w:rPr>
-          <w:t>_status</w:t>
+          <w:t>http://&lt;host:port&gt;/ADMIN/connections_status</w:t>
         </w:r>
       </w:hyperlink>
     </w:p>
@@ -24488,19 +24562,7 @@
         </w:numPr>
       </w:pPr>
       <w:r>
-        <w:t xml:space="preserve">The content has a JSON </w:t>
-      </w:r>
-      <w:r>
-        <w:t xml:space="preserve">list </w:t>
-      </w:r>
-      <w:r>
-        <w:t xml:space="preserve">which provides the </w:t>
-      </w:r>
-      <w:r>
-        <w:t xml:space="preserve">client connections </w:t>
-      </w:r>
-      <w:r>
-        <w:t>detailed information.</w:t>
+        <w:t>The content has a JSON list which provides the client connections detailed information.</w:t>
       </w:r>
     </w:p>
     <w:p/>
@@ -24508,7 +24570,7 @@
       <w:pPr>
         <w:pStyle w:val="Heading2"/>
       </w:pPr>
-      <w:bookmarkStart w:id="31" w:name="_Toc195699809"/>
+      <w:bookmarkStart w:id="31" w:name="_Toc196147704"/>
       <w:r>
         <w:t>TEST/</w:t>
       </w:r>
@@ -24748,7 +24810,7 @@
       <w:pPr>
         <w:pStyle w:val="Heading2"/>
       </w:pPr>
-      <w:bookmarkStart w:id="33" w:name="_Toc195699810"/>
+      <w:bookmarkStart w:id="33" w:name="_Toc196147705"/>
       <w:r>
         <w:t>H</w:t>
       </w:r>
@@ -24938,7 +25000,7 @@
       <w:pPr>
         <w:pStyle w:val="Heading2"/>
       </w:pPr>
-      <w:bookmarkStart w:id="34" w:name="_Toc195699811"/>
+      <w:bookmarkStart w:id="34" w:name="_Toc196147706"/>
       <w:r>
         <w:t>D</w:t>
       </w:r>
@@ -24959,7 +25021,7 @@
       <w:pPr>
         <w:pStyle w:val="Heading2"/>
       </w:pPr>
-      <w:bookmarkStart w:id="35" w:name="_Toc195699812"/>
+      <w:bookmarkStart w:id="35" w:name="_Toc196147707"/>
       <w:r>
         <w:t>ReadyZ Request</w:t>
       </w:r>
@@ -25130,7 +25192,7 @@
       <w:pPr>
         <w:pStyle w:val="Heading2"/>
       </w:pPr>
-      <w:bookmarkStart w:id="36" w:name="_Toc195699813"/>
+      <w:bookmarkStart w:id="36" w:name="_Toc196147708"/>
       <w:r>
         <w:t>ReadyZCassandra Request</w:t>
       </w:r>
@@ -25295,12 +25357,12 @@
       <w:pPr>
         <w:pStyle w:val="Heading2"/>
       </w:pPr>
-      <w:bookmarkStart w:id="37" w:name="_Toc195699814"/>
-      <w:r>
-        <w:t>ReadyZ</w:t>
-      </w:r>
-      <w:r>
-        <w:t>LMDB</w:t>
+      <w:bookmarkStart w:id="37" w:name="_Toc196147709"/>
+      <w:r>
+        <w:t>ReadyZC</w:t>
+      </w:r>
+      <w:r>
+        <w:t>onnections</w:t>
       </w:r>
       <w:r>
         <w:t xml:space="preserve"> Request</w:t>
@@ -25326,10 +25388,10 @@
         </w:r>
       </w:hyperlink>
       <w:r>
-        <w:t>/</w:t>
-      </w:r>
-      <w:r>
-        <w:t>lmdb</w:t>
+        <w:t>/c</w:t>
+      </w:r>
+      <w:r>
+        <w:t>onnections</w:t>
       </w:r>
       <w:r>
         <w:rPr>
@@ -25388,10 +25450,7 @@
           </w:tcPr>
           <w:p>
             <w:r>
-              <w:t>V</w:t>
-            </w:r>
-            <w:r>
-              <w:t>erbose</w:t>
+              <w:t>Verbose</w:t>
             </w:r>
           </w:p>
         </w:tc>
@@ -25426,16 +25485,25 @@
     <w:p>
       <w:r>
         <w:lastRenderedPageBreak/>
-        <w:t xml:space="preserve">The server checks that </w:t>
-      </w:r>
-      <w:r>
-        <w:t xml:space="preserve">the data are retrievable from LMDB </w:t>
-      </w:r>
-      <w:r>
-        <w:t>cache. Upon finishing the check the server will reply to the client with the HTTP status 200 if everything is fine or some other code otherwise.</w:t>
-      </w:r>
-      <w:r>
-        <w:t xml:space="preserve"> The check is configurable via [LMDB]/health_command and [LMDB]/timeout parameters.</w:t>
+        <w:t xml:space="preserve">The server checks that the </w:t>
+      </w:r>
+      <w:r>
+        <w:t xml:space="preserve">current number of client connections is within the soft limit. If so the </w:t>
+      </w:r>
+      <w:r>
+        <w:t>server will reply to the client with the HTTP status 200</w:t>
+      </w:r>
+      <w:r>
+        <w:t>. O</w:t>
+      </w:r>
+      <w:r>
+        <w:t>therwise</w:t>
+      </w:r>
+      <w:r>
+        <w:t xml:space="preserve"> the HTTP status will be 503</w:t>
+      </w:r>
+      <w:r>
+        <w:t>.</w:t>
       </w:r>
     </w:p>
     <w:p>
@@ -25450,7 +25518,13 @@
     </w:p>
     <w:p>
       <w:r>
-        <w:t>Note: available starting from version 2.12.0.</w:t>
+        <w:t>Note: available starting from version 2.1</w:t>
+      </w:r>
+      <w:r>
+        <w:t>6</w:t>
+      </w:r>
+      <w:r>
+        <w:t>.0.</w:t>
       </w:r>
     </w:p>
     <w:p/>
@@ -25458,9 +25532,15 @@
       <w:pPr>
         <w:pStyle w:val="Heading2"/>
       </w:pPr>
-      <w:bookmarkStart w:id="38" w:name="_Toc195699815"/>
-      <w:r>
-        <w:t>ReadyZWGS Request</w:t>
+      <w:bookmarkStart w:id="38" w:name="_Toc196147710"/>
+      <w:r>
+        <w:t>ReadyZ</w:t>
+      </w:r>
+      <w:r>
+        <w:t>LMDB</w:t>
+      </w:r>
+      <w:r>
+        <w:t xml:space="preserve"> Request</w:t>
       </w:r>
       <w:bookmarkEnd w:id="38"/>
     </w:p>
@@ -25483,7 +25563,10 @@
         </w:r>
       </w:hyperlink>
       <w:r>
-        <w:t>/wgs</w:t>
+        <w:t>/</w:t>
+      </w:r>
+      <w:r>
+        <w:t>lmdb</w:t>
       </w:r>
       <w:r>
         <w:rPr>
@@ -25542,7 +25625,10 @@
           </w:tcPr>
           <w:p>
             <w:r>
-              <w:t>Verbose</w:t>
+              <w:t>V</w:t>
+            </w:r>
+            <w:r>
+              <w:t>erbose</w:t>
             </w:r>
           </w:p>
         </w:tc>
@@ -25576,7 +25662,16 @@
     </w:p>
     <w:p>
       <w:r>
-        <w:t>The server checks that the data are retrievable from the WGS data source. Upon finishing the check the server will reply to the client with the HTTP status 200 if everything is fine or some other code otherwise. The check is configurable via [WGS]/health_command and [WGS]/timeout parameters.</w:t>
+        <w:t xml:space="preserve">The server checks that </w:t>
+      </w:r>
+      <w:r>
+        <w:t xml:space="preserve">the data are retrievable from LMDB </w:t>
+      </w:r>
+      <w:r>
+        <w:t>cache. Upon finishing the check the server will reply to the client with the HTTP status 200 if everything is fine or some other code otherwise.</w:t>
+      </w:r>
+      <w:r>
+        <w:t xml:space="preserve"> The check is configurable via [LMDB]/health_command and [LMDB]/timeout parameters.</w:t>
       </w:r>
     </w:p>
     <w:p>
@@ -25599,10 +25694,10 @@
       <w:pPr>
         <w:pStyle w:val="Heading2"/>
       </w:pPr>
-      <w:bookmarkStart w:id="39" w:name="_Toc195699816"/>
+      <w:bookmarkStart w:id="39" w:name="_Toc196147711"/>
       <w:r>
         <w:lastRenderedPageBreak/>
-        <w:t>ReadyZCDD Request</w:t>
+        <w:t>ReadyZWGS Request</w:t>
       </w:r>
       <w:bookmarkEnd w:id="39"/>
     </w:p>
@@ -25625,7 +25720,7 @@
         </w:r>
       </w:hyperlink>
       <w:r>
-        <w:t>/cdd</w:t>
+        <w:t>/wgs</w:t>
       </w:r>
       <w:r>
         <w:rPr>
@@ -25718,7 +25813,7 @@
     </w:p>
     <w:p>
       <w:r>
-        <w:t>The server checks that the data are retrievable from the CDD data source. Upon finishing the check the server will reply to the client with the HTTP status 200 if everything is fine or some other code otherwise. The check is configurable via [CDD]/health_command and [CDD]/timeout parameters.</w:t>
+        <w:t>The server checks that the data are retrievable from the WGS data source. Upon finishing the check the server will reply to the client with the HTTP status 200 if everything is fine or some other code otherwise. The check is configurable via [WGS]/health_command and [WGS]/timeout parameters.</w:t>
       </w:r>
     </w:p>
     <w:p>
@@ -25741,9 +25836,9 @@
       <w:pPr>
         <w:pStyle w:val="Heading2"/>
       </w:pPr>
-      <w:bookmarkStart w:id="40" w:name="_Toc195699817"/>
-      <w:r>
-        <w:t>ReadyZSNP Request</w:t>
+      <w:bookmarkStart w:id="40" w:name="_Toc196147712"/>
+      <w:r>
+        <w:t>ReadyZCDD Request</w:t>
       </w:r>
       <w:bookmarkEnd w:id="40"/>
     </w:p>
@@ -25766,7 +25861,7 @@
         </w:r>
       </w:hyperlink>
       <w:r>
-        <w:t>/snp</w:t>
+        <w:t>/cdd</w:t>
       </w:r>
       <w:r>
         <w:rPr>
@@ -25860,7 +25955,7 @@
     </w:p>
     <w:p>
       <w:r>
-        <w:t>The server checks that the data are retrievable from the SNP data source. Upon finishing the check the server will reply to the client with the HTTP status 200 if everything is fine or some other code otherwise. The check is configurable via [SNP]/health_command and [SNP]/timeout parameters.</w:t>
+        <w:t>The server checks that the data are retrievable from the CDD data source. Upon finishing the check the server will reply to the client with the HTTP status 200 if everything is fine or some other code otherwise. The check is configurable via [CDD]/health_command and [CDD]/timeout parameters.</w:t>
       </w:r>
     </w:p>
     <w:p>
@@ -25883,9 +25978,9 @@
       <w:pPr>
         <w:pStyle w:val="Heading2"/>
       </w:pPr>
-      <w:bookmarkStart w:id="41" w:name="_Toc195699818"/>
-      <w:r>
-        <w:t>HealthZ Request</w:t>
+      <w:bookmarkStart w:id="41" w:name="_Toc196147713"/>
+      <w:r>
+        <w:t>ReadyZSNP Request</w:t>
       </w:r>
       <w:bookmarkEnd w:id="41"/>
     </w:p>
@@ -25904,9 +25999,12 @@
           <w:rPr>
             <w:rStyle w:val="Hyperlink"/>
           </w:rPr>
-          <w:t>http://&lt;host:port&gt;/healthz</w:t>
+          <w:t>http://&lt;host:port&gt;/readyz</w:t>
         </w:r>
       </w:hyperlink>
+      <w:r>
+        <w:t>/snp</w:t>
+      </w:r>
       <w:r>
         <w:rPr>
           <w:rStyle w:val="Hyperlink"/>
@@ -25964,7 +26062,7 @@
           </w:tcPr>
           <w:p>
             <w:r>
-              <w:t>verbose</w:t>
+              <w:t>Verbose</w:t>
             </w:r>
           </w:p>
         </w:tc>
@@ -25980,33 +26078,6 @@
           <w:p>
             <w:r>
               <w:t>If the flag is provided then the reply HTTP body will contain a JSON dictionary. Otherwise the reply HTTP body will be empty.</w:t>
-            </w:r>
-          </w:p>
-          <w:p>
-            <w:r>
-              <w:t>Optional parameter.</w:t>
-            </w:r>
-          </w:p>
-        </w:tc>
-      </w:tr>
-      <w:tr>
-        <w:tc>
-          <w:tcPr>
-            <w:tcW w:w="4675" w:type="dxa"/>
-          </w:tcPr>
-          <w:p>
-            <w:r>
-              <w:t>exclude</w:t>
-            </w:r>
-          </w:p>
-        </w:tc>
-        <w:tc>
-          <w:tcPr>
-            <w:tcW w:w="4675" w:type="dxa"/>
-          </w:tcPr>
-          <w:p>
-            <w:r>
-              <w:t>A name of a check that should not be performed. The parameter can be repeated as many times as needed.</w:t>
             </w:r>
           </w:p>
           <w:p>
@@ -26020,7 +26091,23 @@
     <w:p/>
     <w:p>
       <w:r>
-        <w:t>Currently the implementation matches the /readyz request.</w:t>
+        <w:t>The URL is for regular checks various monitoring tools may want to perform.</w:t>
+      </w:r>
+    </w:p>
+    <w:p>
+      <w:r>
+        <w:t>The server checks that the data are retrievable from the SNP data source. Upon finishing the check the server will reply to the client with the HTTP status 200 if everything is fine or some other code otherwise. The check is configurable via [SNP]/health_command and [SNP]/timeout parameters.</w:t>
+      </w:r>
+    </w:p>
+    <w:p>
+      <w:r>
+        <w:t>If a verbose parameter is supplied then the server reply HTTP body will have a JSON dictionary with a detailed information of how the check completed. Otherwise the serer reply HTTP body will be empty.</w:t>
+      </w:r>
+    </w:p>
+    <w:p>
+      <w:r>
+        <w:lastRenderedPageBreak/>
+        <w:t>The verbose option is supported for the purpose of an interactuve usage by a human. Aoutomated tools should rely on the reply HTTP status code.</w:t>
       </w:r>
     </w:p>
     <w:p>
@@ -26033,9 +26120,9 @@
       <w:pPr>
         <w:pStyle w:val="Heading2"/>
       </w:pPr>
-      <w:bookmarkStart w:id="42" w:name="_Toc195699819"/>
-      <w:r>
-        <w:t>LivezZ Request</w:t>
+      <w:bookmarkStart w:id="42" w:name="_Toc196147714"/>
+      <w:r>
+        <w:t>HealthZ Request</w:t>
       </w:r>
       <w:bookmarkEnd w:id="42"/>
     </w:p>
@@ -26054,7 +26141,7 @@
           <w:rPr>
             <w:rStyle w:val="Hyperlink"/>
           </w:rPr>
-          <w:t>http://&lt;host:port&gt;/livez</w:t>
+          <w:t>http://&lt;host:port&gt;/healthz</w:t>
         </w:r>
       </w:hyperlink>
       <w:r>
@@ -26139,10 +26226,161 @@
           </w:p>
         </w:tc>
       </w:tr>
+      <w:tr>
+        <w:tc>
+          <w:tcPr>
+            <w:tcW w:w="4675" w:type="dxa"/>
+          </w:tcPr>
+          <w:p>
+            <w:r>
+              <w:t>exclude</w:t>
+            </w:r>
+          </w:p>
+        </w:tc>
+        <w:tc>
+          <w:tcPr>
+            <w:tcW w:w="4675" w:type="dxa"/>
+          </w:tcPr>
+          <w:p>
+            <w:r>
+              <w:t>A name of a check that should not be performed. The parameter can be repeated as many times as needed.</w:t>
+            </w:r>
+          </w:p>
+          <w:p>
+            <w:r>
+              <w:t>Optional parameter.</w:t>
+            </w:r>
+          </w:p>
+        </w:tc>
+      </w:tr>
     </w:tbl>
     <w:p/>
     <w:p>
       <w:r>
+        <w:t>Currently the implementation matches the /readyz request.</w:t>
+      </w:r>
+    </w:p>
+    <w:p>
+      <w:r>
+        <w:t>Note: available starting from version 2.12.0.</w:t>
+      </w:r>
+    </w:p>
+    <w:p/>
+    <w:p>
+      <w:pPr>
+        <w:pStyle w:val="Heading2"/>
+      </w:pPr>
+      <w:bookmarkStart w:id="43" w:name="_Toc196147715"/>
+      <w:r>
+        <w:t>LivezZ Request</w:t>
+      </w:r>
+      <w:bookmarkEnd w:id="43"/>
+    </w:p>
+    <w:p/>
+    <w:p>
+      <w:r>
+        <w:t>The format of the request:</w:t>
+      </w:r>
+    </w:p>
+    <w:p>
+      <w:pPr>
+        <w:jc w:val="center"/>
+      </w:pPr>
+      <w:hyperlink w:history="1">
+        <w:r>
+          <w:rPr>
+            <w:rStyle w:val="Hyperlink"/>
+          </w:rPr>
+          <w:t>http://&lt;host:port&gt;/livez</w:t>
+        </w:r>
+      </w:hyperlink>
+      <w:r>
+        <w:rPr>
+          <w:rStyle w:val="Hyperlink"/>
+        </w:rPr>
+        <w:t>?</w:t>
+      </w:r>
+    </w:p>
+    <w:p>
+      <w:r>
+        <w:t>Where</w:t>
+      </w:r>
+    </w:p>
+    <w:tbl>
+      <w:tblPr>
+        <w:tblStyle w:val="TableGrid"/>
+        <w:tblW w:w="0" w:type="auto"/>
+        <w:tblLook w:val="04A0" w:firstRow="1" w:lastRow="0" w:firstColumn="1" w:lastColumn="0" w:noHBand="0" w:noVBand="1"/>
+      </w:tblPr>
+      <w:tblGrid>
+        <w:gridCol w:w="4675"/>
+        <w:gridCol w:w="4675"/>
+      </w:tblGrid>
+      <w:tr>
+        <w:tc>
+          <w:tcPr>
+            <w:tcW w:w="4675" w:type="dxa"/>
+          </w:tcPr>
+          <w:p>
+            <w:pPr>
+              <w:jc w:val="center"/>
+            </w:pPr>
+            <w:r>
+              <w:t>Parameter</w:t>
+            </w:r>
+          </w:p>
+        </w:tc>
+        <w:tc>
+          <w:tcPr>
+            <w:tcW w:w="4675" w:type="dxa"/>
+          </w:tcPr>
+          <w:p>
+            <w:pPr>
+              <w:jc w:val="center"/>
+            </w:pPr>
+            <w:r>
+              <w:t>Description</w:t>
+            </w:r>
+          </w:p>
+        </w:tc>
+      </w:tr>
+      <w:tr>
+        <w:tc>
+          <w:tcPr>
+            <w:tcW w:w="4675" w:type="dxa"/>
+          </w:tcPr>
+          <w:p>
+            <w:r>
+              <w:t>verbose</w:t>
+            </w:r>
+          </w:p>
+        </w:tc>
+        <w:tc>
+          <w:tcPr>
+            <w:tcW w:w="4675" w:type="dxa"/>
+          </w:tcPr>
+          <w:p>
+            <w:r>
+              <w:t>This is a flag parameter, no value is needed (if a value is provided then it is silently ignored).</w:t>
+            </w:r>
+          </w:p>
+          <w:p>
+            <w:r>
+              <w:lastRenderedPageBreak/>
+              <w:t>If the flag is provided then the reply HTTP body will contain a JSON dictionary. Otherwise the reply HTTP body will be empty.</w:t>
+            </w:r>
+          </w:p>
+          <w:p>
+            <w:r>
+              <w:t>Optional parameter.</w:t>
+            </w:r>
+          </w:p>
+        </w:tc>
+      </w:tr>
+    </w:tbl>
+    <w:p/>
+    <w:p>
+      <w:r>
         <w:t>The URL is for regular checks various monitoring tools may want to perform.</w:t>
       </w:r>
     </w:p>
@@ -26171,14 +26409,14 @@
       <w:pPr>
         <w:pStyle w:val="Heading2"/>
       </w:pPr>
-      <w:bookmarkStart w:id="43" w:name="_Toc195699820"/>
+      <w:bookmarkStart w:id="44" w:name="_Toc196147716"/>
       <w:r>
         <w:t>F</w:t>
       </w:r>
       <w:r>
         <w:t>avicon.ico Request</w:t>
       </w:r>
-      <w:bookmarkEnd w:id="43"/>
+      <w:bookmarkEnd w:id="44"/>
     </w:p>
     <w:p/>
     <w:p>
@@ -26222,51 +26460,51 @@
       <w:pPr>
         <w:pStyle w:val="Heading2"/>
       </w:pPr>
-      <w:bookmarkStart w:id="44" w:name="_Toc195699821"/>
-      <w:r>
+      <w:bookmarkStart w:id="45" w:name="_Toc196147717"/>
+      <w:r>
+        <w:t>Unknown URL Request</w:t>
+      </w:r>
+      <w:bookmarkEnd w:id="45"/>
+    </w:p>
+    <w:p/>
+    <w:p>
+      <w:r>
+        <w:t>Response:</w:t>
+      </w:r>
+    </w:p>
+    <w:p>
+      <w:r>
+        <w:t>The PSG protocol is used. The status is 200.</w:t>
+      </w:r>
+    </w:p>
+    <w:p>
+      <w:r>
+        <w:t>The HTTP header Content-Type is set to “application/x-ncbi-psg”.</w:t>
+      </w:r>
+    </w:p>
+    <w:p>
+      <w:r>
+        <w:t>The HTTP header Content-Length is not set.</w:t>
+      </w:r>
+    </w:p>
+    <w:p/>
+    <w:p>
+      <w:r>
+        <w:t>The response body has two chunks</w:t>
+      </w:r>
+      <w:r>
+        <w:t>:</w:t>
+      </w:r>
+    </w:p>
+    <w:p>
+      <w:pPr>
+        <w:jc w:val="center"/>
+      </w:pPr>
+      <w:r>
+        <w:rPr>
+          <w:noProof/>
+        </w:rPr>
         <w:lastRenderedPageBreak/>
-        <w:t>Unknown URL Request</w:t>
-      </w:r>
-      <w:bookmarkEnd w:id="44"/>
-    </w:p>
-    <w:p/>
-    <w:p>
-      <w:r>
-        <w:t>Response:</w:t>
-      </w:r>
-    </w:p>
-    <w:p>
-      <w:r>
-        <w:t>The PSG protocol is used. The status is 200.</w:t>
-      </w:r>
-    </w:p>
-    <w:p>
-      <w:r>
-        <w:t>The HTTP header Content-Type is set to “application/x-ncbi-psg”.</w:t>
-      </w:r>
-    </w:p>
-    <w:p>
-      <w:r>
-        <w:t>The HTTP header Content-Length is not set.</w:t>
-      </w:r>
-    </w:p>
-    <w:p/>
-    <w:p>
-      <w:r>
-        <w:t>The response body has two chunks</w:t>
-      </w:r>
-      <w:r>
-        <w:t>:</w:t>
-      </w:r>
-    </w:p>
-    <w:p>
-      <w:pPr>
-        <w:jc w:val="center"/>
-      </w:pPr>
-      <w:r>
-        <w:rPr>
-          <w:noProof/>
-        </w:rPr>
         <w:drawing>
           <wp:inline distT="0" distB="0" distL="0" distR="0" wp14:anchorId="16516E0D" wp14:editId="4CF7A68A">
             <wp:extent cx="3095625" cy="790575"/>
@@ -26309,11 +26547,11 @@
       <w:pPr>
         <w:pStyle w:val="Heading1"/>
       </w:pPr>
-      <w:bookmarkStart w:id="45" w:name="_Toc195699822"/>
+      <w:bookmarkStart w:id="46" w:name="_Toc196147718"/>
       <w:r>
         <w:t>Cassandra Database</w:t>
       </w:r>
-      <w:bookmarkEnd w:id="45"/>
+      <w:bookmarkEnd w:id="46"/>
     </w:p>
     <w:p/>
     <w:p>
@@ -26337,11 +26575,11 @@
         <w:pStyle w:val="Heading1"/>
         <w:jc w:val="both"/>
       </w:pPr>
-      <w:bookmarkStart w:id="46" w:name="_Toc195699823"/>
+      <w:bookmarkStart w:id="47" w:name="_Toc196147719"/>
       <w:r>
         <w:t>Monitoring and Maintenance</w:t>
       </w:r>
-      <w:bookmarkEnd w:id="46"/>
+      <w:bookmarkEnd w:id="47"/>
     </w:p>
     <w:p/>
     <w:p>
@@ -26388,12 +26626,11 @@
       <w:pPr>
         <w:pStyle w:val="Heading1"/>
       </w:pPr>
-      <w:bookmarkStart w:id="47" w:name="_Toc195699824"/>
-      <w:r>
-        <w:lastRenderedPageBreak/>
+      <w:bookmarkStart w:id="48" w:name="_Toc196147720"/>
+      <w:r>
         <w:t>Files Architecture</w:t>
       </w:r>
-      <w:bookmarkEnd w:id="47"/>
+      <w:bookmarkEnd w:id="48"/>
     </w:p>
     <w:p/>
     <w:p>
@@ -26419,7 +26656,7 @@
           <v:shape id="_x0000_i1026" type="#_x0000_t75" style="width:367.75pt;height:79.3pt" o:ole="">
             <v:imagedata r:id="rId47" o:title=""/>
           </v:shape>
-          <o:OLEObject Type="Embed" ProgID="Visio.Drawing.15" ShapeID="_x0000_i1026" DrawAspect="Content" ObjectID="_1806312550" r:id="rId48"/>
+          <o:OLEObject Type="Embed" ProgID="Visio.Drawing.15" ShapeID="_x0000_i1026" DrawAspect="Content" ObjectID="_1806760442" r:id="rId48"/>
         </w:object>
       </w:r>
     </w:p>
@@ -26445,11 +26682,11 @@
       <w:pPr>
         <w:pStyle w:val="Heading1"/>
       </w:pPr>
-      <w:bookmarkStart w:id="48" w:name="_Toc195699825"/>
+      <w:bookmarkStart w:id="49" w:name="_Toc196147721"/>
       <w:r>
         <w:t>Client API</w:t>
       </w:r>
-      <w:bookmarkEnd w:id="48"/>
+      <w:bookmarkEnd w:id="49"/>
     </w:p>
     <w:p/>
     <w:p>
@@ -26472,11 +26709,11 @@
       <w:pPr>
         <w:pStyle w:val="Heading1"/>
       </w:pPr>
-      <w:bookmarkStart w:id="49" w:name="_Toc195699826"/>
+      <w:bookmarkStart w:id="50" w:name="_Toc196147722"/>
       <w:r>
         <w:t>Command Line Arguments</w:t>
       </w:r>
-      <w:bookmarkEnd w:id="49"/>
+      <w:bookmarkEnd w:id="50"/>
     </w:p>
     <w:p/>
     <w:p>
@@ -26663,7 +26900,6 @@
           </w:tcPr>
           <w:p>
             <w:r>
-              <w:lastRenderedPageBreak/>
               <w:t>-conffile</w:t>
             </w:r>
           </w:p>
@@ -26685,11 +26921,11 @@
       <w:pPr>
         <w:pStyle w:val="Heading1"/>
       </w:pPr>
-      <w:bookmarkStart w:id="50" w:name="_Toc195699827"/>
+      <w:bookmarkStart w:id="51" w:name="_Toc196147723"/>
       <w:r>
         <w:t>Signal Handling</w:t>
       </w:r>
-      <w:bookmarkEnd w:id="50"/>
+      <w:bookmarkEnd w:id="51"/>
     </w:p>
     <w:p/>
     <w:p>
@@ -26779,6 +27015,7 @@
           </w:p>
           <w:p>
             <w:r>
+              <w:lastRenderedPageBreak/>
               <w:t>The server will wait till all the currently executed requests are finished. During that time all new requests are rejected. When all requests are finished, the server will shut down.</w:t>
             </w:r>
           </w:p>
@@ -26796,6 +27033,7 @@
           </w:tcPr>
           <w:p>
             <w:r>
+              <w:lastRenderedPageBreak/>
               <w:t>QUIT</w:t>
             </w:r>
           </w:p>
@@ -26839,11 +27077,11 @@
       <w:pPr>
         <w:pStyle w:val="Heading1"/>
       </w:pPr>
-      <w:bookmarkStart w:id="51" w:name="_Toc195699828"/>
+      <w:bookmarkStart w:id="52" w:name="_Toc196147724"/>
       <w:r>
         <w:t>Configuration Parameters</w:t>
       </w:r>
-      <w:bookmarkEnd w:id="51"/>
+      <w:bookmarkEnd w:id="52"/>
     </w:p>
     <w:p>
       <w:pPr>
@@ -26902,7 +27140,7 @@
       <w:pPr>
         <w:pStyle w:val="Heading2"/>
       </w:pPr>
-      <w:bookmarkStart w:id="52" w:name="_Toc195699829"/>
+      <w:bookmarkStart w:id="53" w:name="_Toc196147725"/>
       <w:r>
         <w:t>[</w:t>
       </w:r>
@@ -26918,7 +27156,7 @@
       <w:r>
         <w:t>ection</w:t>
       </w:r>
-      <w:bookmarkEnd w:id="52"/>
+      <w:bookmarkEnd w:id="53"/>
     </w:p>
     <w:p/>
     <w:tbl>
@@ -27092,7 +27330,6 @@
               <w:jc w:val="both"/>
             </w:pPr>
             <w:r>
-              <w:lastRenderedPageBreak/>
               <w:t>read_ahead</w:t>
             </w:r>
           </w:p>
@@ -27145,7 +27382,7 @@
       <w:pPr>
         <w:pStyle w:val="Heading2"/>
       </w:pPr>
-      <w:bookmarkStart w:id="53" w:name="_Toc195699830"/>
+      <w:bookmarkStart w:id="54" w:name="_Toc196147726"/>
       <w:r>
         <w:t>[SERVER</w:t>
       </w:r>
@@ -27158,7 +27395,7 @@
       <w:r>
         <w:t>ection</w:t>
       </w:r>
-      <w:bookmarkEnd w:id="53"/>
+      <w:bookmarkEnd w:id="54"/>
     </w:p>
     <w:p/>
     <w:tbl>
@@ -27252,6 +27489,7 @@
               <w:jc w:val="both"/>
             </w:pPr>
             <w:r>
+              <w:lastRenderedPageBreak/>
               <w:t>workers</w:t>
             </w:r>
           </w:p>
@@ -27741,7 +27979,6 @@
               <w:jc w:val="both"/>
             </w:pPr>
             <w:r>
-              <w:lastRenderedPageBreak/>
               <w:t>max_hops</w:t>
             </w:r>
           </w:p>
@@ -27865,6 +28102,7 @@
               <w:jc w:val="both"/>
             </w:pPr>
             <w:r>
+              <w:lastRenderedPageBreak/>
               <w:t>The value must be &gt; 0. It is floating point value in seconds.</w:t>
             </w:r>
           </w:p>
@@ -27888,6 +28126,7 @@
               <w:jc w:val="both"/>
             </w:pPr>
             <w:r>
+              <w:lastRenderedPageBreak/>
               <w:t>ShutdownIfTooManyOpenFD</w:t>
             </w:r>
           </w:p>
@@ -28144,7 +28383,6 @@
               <w:jc w:val="both"/>
             </w:pPr>
             <w:r>
-              <w:lastRenderedPageBreak/>
               <w:t>Starting from 2.10.0 a decision of logging is made basing on the request session id. If a session id checksum is divided by the log_sampling_ration value with zero rest then the logging will be done.</w:t>
             </w:r>
           </w:p>
@@ -28176,7 +28414,6 @@
               <w:jc w:val="both"/>
             </w:pPr>
             <w:r>
-              <w:lastRenderedPageBreak/>
               <w:t>log_timing_threshold</w:t>
             </w:r>
           </w:p>
@@ -28280,6 +28517,7 @@
               <w:jc w:val="both"/>
             </w:pPr>
             <w:r>
+              <w:lastRenderedPageBreak/>
               <w:t>Default: 1000</w:t>
             </w:r>
           </w:p>
@@ -28295,11 +28533,11 @@
       <w:pPr>
         <w:pStyle w:val="Heading2"/>
       </w:pPr>
-      <w:bookmarkStart w:id="54" w:name="_Toc195699831"/>
+      <w:bookmarkStart w:id="55" w:name="_Toc196147727"/>
       <w:r>
         <w:t>[AUTO_EXCLUDE] Section</w:t>
       </w:r>
-      <w:bookmarkEnd w:id="54"/>
+      <w:bookmarkEnd w:id="55"/>
     </w:p>
     <w:p>
       <w:pPr>
@@ -28456,11 +28694,11 @@
       <w:pPr>
         <w:pStyle w:val="Heading2"/>
       </w:pPr>
-      <w:bookmarkStart w:id="55" w:name="_Toc195699832"/>
+      <w:bookmarkStart w:id="56" w:name="_Toc196147728"/>
       <w:r>
         <w:t>[ADMIN] Section</w:t>
       </w:r>
-      <w:bookmarkEnd w:id="55"/>
+      <w:bookmarkEnd w:id="56"/>
     </w:p>
     <w:p/>
     <w:tbl>
@@ -28576,12 +28814,11 @@
       <w:pPr>
         <w:pStyle w:val="Heading2"/>
       </w:pPr>
-      <w:bookmarkStart w:id="56" w:name="_Toc195699833"/>
-      <w:r>
-        <w:lastRenderedPageBreak/>
+      <w:bookmarkStart w:id="57" w:name="_Toc196147729"/>
+      <w:r>
         <w:t>[STATISTICS] Section</w:t>
       </w:r>
-      <w:bookmarkEnd w:id="56"/>
+      <w:bookmarkEnd w:id="57"/>
     </w:p>
     <w:p/>
     <w:tbl>
@@ -28764,6 +29001,7 @@
               <w:jc w:val="both"/>
             </w:pPr>
             <w:r>
+              <w:lastRenderedPageBreak/>
               <w:t>Default: 24</w:t>
             </w:r>
           </w:p>
@@ -28779,6 +29017,7 @@
               <w:jc w:val="both"/>
             </w:pPr>
             <w:r>
+              <w:lastRenderedPageBreak/>
               <w:t>type</w:t>
             </w:r>
           </w:p>
@@ -28953,11 +29192,11 @@
       <w:pPr>
         <w:pStyle w:val="Heading2"/>
       </w:pPr>
-      <w:bookmarkStart w:id="57" w:name="_Toc195699834"/>
+      <w:bookmarkStart w:id="58" w:name="_Toc196147730"/>
       <w:r>
         <w:t>[DEBUG] Section</w:t>
       </w:r>
-      <w:bookmarkEnd w:id="57"/>
+      <w:bookmarkEnd w:id="58"/>
     </w:p>
     <w:p>
       <w:pPr>
@@ -29095,7 +29334,6 @@
           </w:tcPr>
           <w:p>
             <w:r>
-              <w:lastRenderedPageBreak/>
               <w:t>allow_processor_timing</w:t>
             </w:r>
           </w:p>
@@ -29136,11 +29374,11 @@
       <w:pPr>
         <w:pStyle w:val="Heading2"/>
       </w:pPr>
-      <w:bookmarkStart w:id="58" w:name="_Toc195699835"/>
+      <w:bookmarkStart w:id="59" w:name="_Toc196147731"/>
       <w:r>
         <w:t>[IPG] Section</w:t>
       </w:r>
-      <w:bookmarkEnd w:id="58"/>
+      <w:bookmarkEnd w:id="59"/>
     </w:p>
     <w:p>
       <w:pPr>
@@ -29249,8 +29487,8 @@
       <w:pPr>
         <w:pStyle w:val="Heading2"/>
       </w:pPr>
-      <w:bookmarkStart w:id="59" w:name="OLE_LINK6"/>
-      <w:bookmarkStart w:id="60" w:name="_Toc195699836"/>
+      <w:bookmarkStart w:id="60" w:name="OLE_LINK6"/>
+      <w:bookmarkStart w:id="61" w:name="_Toc196147732"/>
       <w:r>
         <w:t xml:space="preserve">[CASSANDRA_DB] </w:t>
       </w:r>
@@ -29260,7 +29498,7 @@
       <w:r>
         <w:t>ection</w:t>
       </w:r>
-      <w:bookmarkEnd w:id="60"/>
+      <w:bookmarkEnd w:id="61"/>
     </w:p>
     <w:p/>
     <w:tbl>
@@ -29765,7 +30003,6 @@
               <w:jc w:val="both"/>
             </w:pPr>
             <w:r>
-              <w:lastRenderedPageBreak/>
               <w:t>password_section</w:t>
             </w:r>
           </w:p>
@@ -29862,7 +30099,7 @@
           </w:p>
         </w:tc>
       </w:tr>
-      <w:bookmarkEnd w:id="59"/>
+      <w:bookmarkEnd w:id="60"/>
     </w:tbl>
     <w:p>
       <w:pPr>
@@ -29873,11 +30110,12 @@
       <w:pPr>
         <w:pStyle w:val="Heading2"/>
       </w:pPr>
-      <w:bookmarkStart w:id="61" w:name="_Toc195699837"/>
-      <w:r>
+      <w:bookmarkStart w:id="62" w:name="_Toc196147733"/>
+      <w:r>
+        <w:lastRenderedPageBreak/>
         <w:t>[CASSANDRA_SECURE_DB] Section</w:t>
       </w:r>
-      <w:bookmarkEnd w:id="61"/>
+      <w:bookmarkEnd w:id="62"/>
     </w:p>
     <w:p/>
     <w:tbl>
@@ -30375,7 +30613,6 @@
               <w:jc w:val="both"/>
             </w:pPr>
             <w:r>
-              <w:lastRenderedPageBreak/>
               <w:t>If the value has neither ‘ ‘, nor ‘,’ nor ‘:’ then it is treated as a load balancer name. The load balancer resolved host ports are are sorted in accordance with their rates.</w:t>
             </w:r>
           </w:p>
@@ -30399,11 +30636,11 @@
       <w:pPr>
         <w:pStyle w:val="Heading2"/>
       </w:pPr>
-      <w:bookmarkStart w:id="62" w:name="_Toc195699838"/>
+      <w:bookmarkStart w:id="63" w:name="_Toc196147734"/>
       <w:r>
         <w:t>[CASSANDRA_PROCESSOR] Section</w:t>
       </w:r>
-      <w:bookmarkEnd w:id="62"/>
+      <w:bookmarkEnd w:id="63"/>
     </w:p>
     <w:p/>
     <w:tbl>
@@ -30454,6 +30691,7 @@
               <w:jc w:val="both"/>
             </w:pPr>
             <w:r>
+              <w:lastRenderedPageBreak/>
               <w:t>enabled</w:t>
             </w:r>
           </w:p>
@@ -30712,11 +30950,11 @@
       <w:pPr>
         <w:pStyle w:val="Heading2"/>
       </w:pPr>
-      <w:bookmarkStart w:id="63" w:name="_Toc195699839"/>
+      <w:bookmarkStart w:id="64" w:name="_Toc196147735"/>
       <w:r>
         <w:t>[LMDB_PROCESSOR] Section</w:t>
       </w:r>
-      <w:bookmarkEnd w:id="63"/>
+      <w:bookmarkEnd w:id="64"/>
     </w:p>
     <w:p/>
     <w:tbl>
@@ -30843,7 +31081,6 @@
               <w:jc w:val="both"/>
             </w:pPr>
             <w:r>
-              <w:lastRenderedPageBreak/>
               <w:t>Timeout to wait for a completed reply for the 'health_command' (seconds)</w:t>
             </w:r>
           </w:p>
@@ -30871,11 +31108,11 @@
       <w:pPr>
         <w:pStyle w:val="Heading2"/>
       </w:pPr>
-      <w:bookmarkStart w:id="64" w:name="_Toc195699840"/>
+      <w:bookmarkStart w:id="65" w:name="_Toc196147736"/>
       <w:r>
         <w:t>[OSG_PROCESSOR] Section</w:t>
       </w:r>
-      <w:bookmarkEnd w:id="64"/>
+      <w:bookmarkEnd w:id="65"/>
     </w:p>
     <w:p/>
     <w:tbl>
@@ -30983,6 +31220,7 @@
               <w:jc w:val="both"/>
             </w:pPr>
             <w:r>
+              <w:lastRenderedPageBreak/>
               <w:t>Default: 0</w:t>
             </w:r>
           </w:p>
@@ -30998,6 +31236,7 @@
               <w:jc w:val="both"/>
             </w:pPr>
             <w:r>
+              <w:lastRenderedPageBreak/>
               <w:t>enabled_wgs</w:t>
             </w:r>
           </w:p>
@@ -31138,11 +31377,11 @@
       <w:pPr>
         <w:pStyle w:val="Heading2"/>
       </w:pPr>
-      <w:bookmarkStart w:id="65" w:name="_Toc195699841"/>
+      <w:bookmarkStart w:id="66" w:name="_Toc196147737"/>
       <w:r>
         <w:t>[WGS_PROCESSOR] Section</w:t>
       </w:r>
-      <w:bookmarkEnd w:id="65"/>
+      <w:bookmarkEnd w:id="66"/>
     </w:p>
     <w:p/>
     <w:tbl>
@@ -31393,7 +31632,6 @@
               <w:jc w:val="both"/>
             </w:pPr>
             <w:r>
-              <w:lastRenderedPageBreak/>
               <w:t>Note: available starting from psg 2.12.0</w:t>
             </w:r>
           </w:p>
@@ -31405,11 +31643,11 @@
       <w:pPr>
         <w:pStyle w:val="Heading2"/>
       </w:pPr>
-      <w:bookmarkStart w:id="66" w:name="_Toc195699842"/>
+      <w:bookmarkStart w:id="67" w:name="_Toc196147738"/>
       <w:r>
         <w:t>[SNP_PROCESSOR] Section</w:t>
       </w:r>
-      <w:bookmarkEnd w:id="66"/>
+      <w:bookmarkEnd w:id="67"/>
     </w:p>
     <w:p/>
     <w:tbl>
@@ -31553,6 +31791,7 @@
               <w:jc w:val="both"/>
             </w:pPr>
             <w:r>
+              <w:lastRenderedPageBreak/>
               <w:t>Default: 0 (no simulated errors)</w:t>
             </w:r>
           </w:p>
@@ -31568,6 +31807,7 @@
               <w:jc w:val="both"/>
             </w:pPr>
             <w:r>
+              <w:lastRenderedPageBreak/>
               <w:t>health_command</w:t>
             </w:r>
           </w:p>
@@ -31671,11 +31911,11 @@
       <w:pPr>
         <w:pStyle w:val="Heading2"/>
       </w:pPr>
-      <w:bookmarkStart w:id="67" w:name="_Toc195699843"/>
+      <w:bookmarkStart w:id="68" w:name="_Toc196147739"/>
       <w:r>
         <w:t>[CDD_PROCESSOR] Section</w:t>
       </w:r>
-      <w:bookmarkEnd w:id="67"/>
+      <w:bookmarkEnd w:id="68"/>
     </w:p>
     <w:p/>
     <w:tbl>
@@ -31907,7 +32147,6 @@
               <w:jc w:val="both"/>
             </w:pPr>
             <w:r>
-              <w:lastRenderedPageBreak/>
               <w:t>Timeout to wait for a completed reply for the 'health_command' (seconds)</w:t>
             </w:r>
           </w:p>
@@ -31935,11 +32174,11 @@
       <w:pPr>
         <w:pStyle w:val="Heading2"/>
       </w:pPr>
-      <w:bookmarkStart w:id="68" w:name="_Toc195699844"/>
+      <w:bookmarkStart w:id="69" w:name="_Toc196147740"/>
       <w:r>
         <w:t>[COUNTERS] Section</w:t>
       </w:r>
-      <w:bookmarkEnd w:id="68"/>
+      <w:bookmarkEnd w:id="69"/>
     </w:p>
     <w:p/>
     <w:p>
@@ -31977,6 +32216,7 @@
         <w:jc w:val="both"/>
       </w:pPr>
       <w:r>
+        <w:lastRenderedPageBreak/>
         <w:t>Where:</w:t>
       </w:r>
     </w:p>
@@ -32028,11 +32268,11 @@
       <w:pPr>
         <w:pStyle w:val="Heading2"/>
       </w:pPr>
-      <w:bookmarkStart w:id="69" w:name="_Toc195699845"/>
+      <w:bookmarkStart w:id="70" w:name="_Toc196147741"/>
       <w:r>
         <w:t>[HEALTH] Section</w:t>
       </w:r>
-      <w:bookmarkEnd w:id="69"/>
+      <w:bookmarkEnd w:id="70"/>
     </w:p>
     <w:p>
       <w:pPr>
@@ -32110,12 +32350,12 @@
             <w:pPr>
               <w:jc w:val="both"/>
             </w:pPr>
-            <w:bookmarkStart w:id="70" w:name="OLE_LINK10"/>
+            <w:bookmarkStart w:id="71" w:name="OLE_LINK10"/>
             <w:r>
               <w:t>Note: Obsolete starting from psg 2.12.0</w:t>
             </w:r>
           </w:p>
-          <w:bookmarkEnd w:id="70"/>
+          <w:bookmarkEnd w:id="71"/>
           <w:p>
             <w:pPr>
               <w:jc w:val="both"/>
@@ -32236,7 +32476,6 @@
               <w:jc w:val="both"/>
             </w:pPr>
             <w:r>
-              <w:lastRenderedPageBreak/>
               <w:t>If only "NONE" is used then assume the list to be empty, return 200 always.</w:t>
             </w:r>
           </w:p>
@@ -32268,7 +32507,6 @@
               <w:jc w:val="both"/>
             </w:pPr>
             <w:r>
-              <w:lastRenderedPageBreak/>
               <w:t>timeout</w:t>
             </w:r>
           </w:p>
@@ -32313,11 +32551,11 @@
       <w:pPr>
         <w:pStyle w:val="Heading2"/>
       </w:pPr>
-      <w:bookmarkStart w:id="71" w:name="_Toc195699846"/>
+      <w:bookmarkStart w:id="72" w:name="_Toc196147742"/>
       <w:r>
         <w:t>[SSL] Section</w:t>
       </w:r>
-      <w:bookmarkEnd w:id="71"/>
+      <w:bookmarkEnd w:id="72"/>
     </w:p>
     <w:p>
       <w:pPr>
@@ -32352,6 +32590,7 @@
               <w:jc w:val="center"/>
             </w:pPr>
             <w:r>
+              <w:lastRenderedPageBreak/>
               <w:t>Value</w:t>
             </w:r>
           </w:p>
@@ -32535,11 +32774,11 @@
       <w:pPr>
         <w:pStyle w:val="Heading2"/>
       </w:pPr>
-      <w:bookmarkStart w:id="72" w:name="_Toc195699847"/>
+      <w:bookmarkStart w:id="73" w:name="_Toc196147743"/>
       <w:r>
         <w:t>[MY_NCBI] Section</w:t>
       </w:r>
-      <w:bookmarkEnd w:id="72"/>
+      <w:bookmarkEnd w:id="73"/>
     </w:p>
     <w:p>
       <w:pPr>
@@ -32730,7 +32969,7 @@
             <w:pPr>
               <w:jc w:val="both"/>
             </w:pPr>
-            <w:bookmarkStart w:id="73" w:name="OLE_LINK7"/>
+            <w:bookmarkStart w:id="74" w:name="OLE_LINK7"/>
             <w:r>
               <w:t>Low mark is calculated as 0.8 of the high mark.</w:t>
             </w:r>
@@ -32740,7 +32979,6 @@
               <w:jc w:val="both"/>
             </w:pPr>
             <w:r>
-              <w:lastRenderedPageBreak/>
               <w:t>The cleanup is done basing on last touch when the high mark is exceeded.</w:t>
             </w:r>
           </w:p>
@@ -32770,7 +33008,7 @@
             <w:r>
               <w:t>Default: 10000</w:t>
             </w:r>
-            <w:bookmarkEnd w:id="73"/>
+            <w:bookmarkEnd w:id="74"/>
           </w:p>
         </w:tc>
       </w:tr>
@@ -32781,7 +33019,6 @@
           </w:tcPr>
           <w:p>
             <w:r>
-              <w:lastRenderedPageBreak/>
               <w:t>not_found_cache_size</w:t>
             </w:r>
           </w:p>
@@ -32799,7 +33036,7 @@
             <w:pPr>
               <w:jc w:val="both"/>
             </w:pPr>
-            <w:bookmarkStart w:id="74" w:name="OLE_LINK8"/>
+            <w:bookmarkStart w:id="75" w:name="OLE_LINK8"/>
             <w:r>
               <w:t>Low mark is calculated as 0.8 of the high mark.</w:t>
             </w:r>
@@ -32838,7 +33075,7 @@
             <w:r>
               <w:t>Default: 10000</w:t>
             </w:r>
-            <w:bookmarkEnd w:id="74"/>
+            <w:bookmarkEnd w:id="75"/>
           </w:p>
         </w:tc>
       </w:tr>
@@ -32881,6 +33118,7 @@
           </w:tcPr>
           <w:p>
             <w:r>
+              <w:lastRenderedPageBreak/>
               <w:t>error_cache_size</w:t>
             </w:r>
           </w:p>
@@ -33148,7 +33386,6 @@
           </w:tcPr>
           <w:p>
             <w:r>
-              <w:lastRenderedPageBreak/>
               <w:t>test_fail_period_sec</w:t>
             </w:r>
           </w:p>
@@ -33184,11 +33421,11 @@
       <w:pPr>
         <w:pStyle w:val="Heading2"/>
       </w:pPr>
-      <w:bookmarkStart w:id="75" w:name="_Toc195699848"/>
+      <w:bookmarkStart w:id="76" w:name="_Toc196147744"/>
       <w:r>
         <w:t>[LOG] Section</w:t>
       </w:r>
-      <w:bookmarkEnd w:id="75"/>
+      <w:bookmarkEnd w:id="76"/>
     </w:p>
     <w:p>
       <w:pPr>
@@ -33276,6 +33513,7 @@
     </w:p>
     <w:p>
       <w:r>
+        <w:lastRenderedPageBreak/>
         <w:br w:type="page"/>
       </w:r>
     </w:p>
@@ -33283,22 +33521,22 @@
       <w:pPr>
         <w:pStyle w:val="Heading1"/>
       </w:pPr>
-      <w:bookmarkStart w:id="76" w:name="_Toc195699849"/>
+      <w:bookmarkStart w:id="77" w:name="_Toc196147745"/>
       <w:r>
         <w:lastRenderedPageBreak/>
         <w:t>Appendix</w:t>
       </w:r>
-      <w:bookmarkEnd w:id="76"/>
+      <w:bookmarkEnd w:id="77"/>
     </w:p>
     <w:p>
       <w:pPr>
         <w:pStyle w:val="Heading2"/>
       </w:pPr>
-      <w:bookmarkStart w:id="77" w:name="_Toc195699850"/>
+      <w:bookmarkStart w:id="78" w:name="_Toc196147746"/>
       <w:r>
         <w:t>PSG Processors</w:t>
       </w:r>
-      <w:bookmarkEnd w:id="77"/>
+      <w:bookmarkEnd w:id="78"/>
     </w:p>
     <w:p>
       <w:r>
@@ -33969,11 +34207,11 @@
       <w:pPr>
         <w:pStyle w:val="Heading2"/>
       </w:pPr>
-      <w:bookmarkStart w:id="78" w:name="_Toc195699851"/>
+      <w:bookmarkStart w:id="79" w:name="_Toc196147747"/>
       <w:r>
         <w:t>PSG Requests</w:t>
       </w:r>
-      <w:bookmarkEnd w:id="78"/>
+      <w:bookmarkEnd w:id="79"/>
     </w:p>
     <w:p>
       <w:pPr>
@@ -34181,11 +34419,11 @@
       <w:pPr>
         <w:pStyle w:val="Heading2"/>
       </w:pPr>
-      <w:bookmarkStart w:id="79" w:name="_Toc195699852"/>
+      <w:bookmarkStart w:id="80" w:name="_Toc196147748"/>
       <w:r>
         <w:t>PSG Timing Collecting</w:t>
       </w:r>
-      <w:bookmarkEnd w:id="79"/>
+      <w:bookmarkEnd w:id="80"/>
     </w:p>
     <w:p>
       <w:r>
@@ -34525,13 +34763,13 @@
       <w:pPr>
         <w:pStyle w:val="Heading2"/>
       </w:pPr>
-      <w:bookmarkStart w:id="80" w:name="_Exclude_Blob_API"/>
-      <w:bookmarkStart w:id="81" w:name="_Toc195699853"/>
-      <w:bookmarkEnd w:id="80"/>
+      <w:bookmarkStart w:id="81" w:name="_Exclude_Blob_API"/>
+      <w:bookmarkStart w:id="82" w:name="_Toc196147749"/>
+      <w:bookmarkEnd w:id="81"/>
       <w:r>
         <w:t>Exclude Blob API</w:t>
       </w:r>
-      <w:bookmarkEnd w:id="81"/>
+      <w:bookmarkEnd w:id="82"/>
     </w:p>
     <w:p>
       <w:r>
@@ -34665,12 +34903,12 @@
       <w:pPr>
         <w:pStyle w:val="Heading2"/>
       </w:pPr>
-      <w:bookmarkStart w:id="82" w:name="_Toc195699854"/>
+      <w:bookmarkStart w:id="83" w:name="_Toc196147750"/>
       <w:r>
         <w:lastRenderedPageBreak/>
         <w:t>Alerts API</w:t>
       </w:r>
-      <w:bookmarkEnd w:id="82"/>
+      <w:bookmarkEnd w:id="83"/>
     </w:p>
     <w:p>
       <w:r>
@@ -34838,11 +35076,11 @@
       <w:pPr>
         <w:pStyle w:val="Heading2"/>
       </w:pPr>
-      <w:bookmarkStart w:id="83" w:name="_Toc195699855"/>
+      <w:bookmarkStart w:id="84" w:name="_Toc196147751"/>
       <w:r>
         <w:t>Event Counter API</w:t>
       </w:r>
-      <w:bookmarkEnd w:id="83"/>
+      <w:bookmarkEnd w:id="84"/>
     </w:p>
     <w:p>
       <w:pPr>
@@ -35005,11 +35243,11 @@
       <w:pPr>
         <w:pStyle w:val="Heading2"/>
       </w:pPr>
-      <w:bookmarkStart w:id="84" w:name="_Toc195699856"/>
+      <w:bookmarkStart w:id="85" w:name="_Toc196147752"/>
       <w:r>
         <w:t>Asynchronous socket polling API</w:t>
       </w:r>
-      <w:bookmarkEnd w:id="84"/>
+      <w:bookmarkEnd w:id="85"/>
     </w:p>
     <w:p>
       <w:pPr>
@@ -35234,11 +35472,11 @@
       <w:pPr>
         <w:pStyle w:val="Heading2"/>
       </w:pPr>
-      <w:bookmarkStart w:id="85" w:name="_Toc195699857"/>
+      <w:bookmarkStart w:id="86" w:name="_Toc196147753"/>
       <w:r>
         <w:t>Handling Non-libuv Events Asynchronously</w:t>
       </w:r>
-      <w:bookmarkEnd w:id="85"/>
+      <w:bookmarkEnd w:id="86"/>
     </w:p>
     <w:p>
       <w:r>
@@ -36935,11 +37173,11 @@
       <w:pPr>
         <w:pStyle w:val="Heading2"/>
       </w:pPr>
-      <w:bookmarkStart w:id="86" w:name="_Toc195699858"/>
+      <w:bookmarkStart w:id="87" w:name="_Toc196147754"/>
       <w:r>
         <w:t>Protocol Diagrams</w:t>
       </w:r>
-      <w:bookmarkEnd w:id="86"/>
+      <w:bookmarkEnd w:id="87"/>
     </w:p>
     <w:p/>
     <w:p>
@@ -39027,14 +39265,14 @@
       <w:pPr>
         <w:pStyle w:val="Heading2"/>
       </w:pPr>
-      <w:bookmarkStart w:id="87" w:name="_Toc195699859"/>
+      <w:bookmarkStart w:id="88" w:name="_Toc196147755"/>
       <w:r>
         <w:t xml:space="preserve">GetBlob </w:t>
       </w:r>
       <w:r>
         <w:t>Diagram</w:t>
       </w:r>
-      <w:bookmarkEnd w:id="87"/>
+      <w:bookmarkEnd w:id="88"/>
     </w:p>
     <w:p/>
     <w:p>
@@ -39089,12 +39327,12 @@
       <w:pPr>
         <w:pStyle w:val="Heading2"/>
       </w:pPr>
-      <w:bookmarkStart w:id="88" w:name="_Toc195699860"/>
+      <w:bookmarkStart w:id="89" w:name="_Toc196147756"/>
       <w:r>
         <w:lastRenderedPageBreak/>
         <w:t>General Server Structure</w:t>
       </w:r>
-      <w:bookmarkEnd w:id="88"/>
+      <w:bookmarkEnd w:id="89"/>
     </w:p>
     <w:p/>
     <w:p>
@@ -39246,11 +39484,11 @@
       <w:pPr>
         <w:pStyle w:val="Heading3"/>
       </w:pPr>
-      <w:bookmarkStart w:id="89" w:name="_Toc195699861"/>
+      <w:bookmarkStart w:id="90" w:name="_Toc196147757"/>
       <w:r>
         <w:t>Startup</w:t>
       </w:r>
-      <w:bookmarkEnd w:id="89"/>
+      <w:bookmarkEnd w:id="90"/>
     </w:p>
     <w:p>
       <w:r>
@@ -39338,11 +39576,11 @@
       <w:pPr>
         <w:pStyle w:val="Heading3"/>
       </w:pPr>
-      <w:bookmarkStart w:id="90" w:name="_Toc195699862"/>
+      <w:bookmarkStart w:id="91" w:name="_Toc196147758"/>
       <w:r>
         <w:t>CTcpWorker</w:t>
       </w:r>
-      <w:bookmarkEnd w:id="90"/>
+      <w:bookmarkEnd w:id="91"/>
     </w:p>
     <w:p>
       <w:pPr>
@@ -39356,11 +39594,11 @@
       <w:pPr>
         <w:pStyle w:val="Heading3"/>
       </w:pPr>
-      <w:bookmarkStart w:id="91" w:name="_Toc195699863"/>
+      <w:bookmarkStart w:id="92" w:name="_Toc196147759"/>
       <w:r>
         <w:t>CTcpWorkersList</w:t>
       </w:r>
-      <w:bookmarkEnd w:id="91"/>
+      <w:bookmarkEnd w:id="92"/>
     </w:p>
     <w:p>
       <w:pPr>
@@ -39374,11 +39612,11 @@
       <w:pPr>
         <w:pStyle w:val="Heading3"/>
       </w:pPr>
-      <w:bookmarkStart w:id="92" w:name="_Toc195699864"/>
+      <w:bookmarkStart w:id="93" w:name="_Toc196147760"/>
       <w:r>
         <w:t>CTcpDaemon</w:t>
       </w:r>
-      <w:bookmarkEnd w:id="92"/>
+      <w:bookmarkEnd w:id="93"/>
     </w:p>
     <w:p>
       <w:pPr>
@@ -39405,11 +39643,11 @@
       <w:pPr>
         <w:pStyle w:val="Heading3"/>
       </w:pPr>
-      <w:bookmarkStart w:id="93" w:name="_Toc195699865"/>
+      <w:bookmarkStart w:id="94" w:name="_Toc196147761"/>
       <w:r>
         <w:t>CHttpRequest</w:t>
       </w:r>
-      <w:bookmarkEnd w:id="93"/>
+      <w:bookmarkEnd w:id="94"/>
     </w:p>
     <w:p>
       <w:pPr>
@@ -39435,11 +39673,11 @@
       <w:pPr>
         <w:pStyle w:val="Heading3"/>
       </w:pPr>
-      <w:bookmarkStart w:id="94" w:name="_Toc195699866"/>
+      <w:bookmarkStart w:id="95" w:name="_Toc196147762"/>
       <w:r>
         <w:t>CPSGS_Request</w:t>
       </w:r>
-      <w:bookmarkEnd w:id="94"/>
+      <w:bookmarkEnd w:id="95"/>
     </w:p>
     <w:p>
       <w:pPr>
@@ -39453,11 +39691,11 @@
       <w:pPr>
         <w:pStyle w:val="Heading3"/>
       </w:pPr>
-      <w:bookmarkStart w:id="95" w:name="_Toc195699867"/>
+      <w:bookmarkStart w:id="96" w:name="_Toc196147763"/>
       <w:r>
         <w:t>CHttpReply</w:t>
       </w:r>
-      <w:bookmarkEnd w:id="95"/>
+      <w:bookmarkEnd w:id="96"/>
     </w:p>
     <w:p>
       <w:pPr>
@@ -39471,11 +39709,11 @@
       <w:pPr>
         <w:pStyle w:val="Heading3"/>
       </w:pPr>
-      <w:bookmarkStart w:id="96" w:name="_Toc195699868"/>
+      <w:bookmarkStart w:id="97" w:name="_Toc196147764"/>
       <w:r>
         <w:t>CPSGS_Reply</w:t>
       </w:r>
-      <w:bookmarkEnd w:id="96"/>
+      <w:bookmarkEnd w:id="97"/>
     </w:p>
     <w:p>
       <w:pPr>
@@ -39489,11 +39727,11 @@
       <w:pPr>
         <w:pStyle w:val="Heading3"/>
       </w:pPr>
-      <w:bookmarkStart w:id="97" w:name="_Toc195699869"/>
+      <w:bookmarkStart w:id="98" w:name="_Toc196147765"/>
       <w:r>
         <w:t>CHttpConnection</w:t>
       </w:r>
-      <w:bookmarkEnd w:id="97"/>
+      <w:bookmarkEnd w:id="98"/>
     </w:p>
     <w:p>
       <w:pPr>
@@ -39507,11 +39745,11 @@
       <w:pPr>
         <w:pStyle w:val="Heading3"/>
       </w:pPr>
-      <w:bookmarkStart w:id="98" w:name="_Toc195699870"/>
+      <w:bookmarkStart w:id="99" w:name="_Toc196147766"/>
       <w:r>
         <w:t>CHttpProto</w:t>
       </w:r>
-      <w:bookmarkEnd w:id="98"/>
+      <w:bookmarkEnd w:id="99"/>
     </w:p>
     <w:p>
       <w:pPr>
@@ -39525,11 +39763,11 @@
       <w:pPr>
         <w:pStyle w:val="Heading3"/>
       </w:pPr>
-      <w:bookmarkStart w:id="99" w:name="_Toc195699871"/>
+      <w:bookmarkStart w:id="100" w:name="_Toc196147767"/>
       <w:r>
         <w:t>CHttpDaemon</w:t>
       </w:r>
-      <w:bookmarkEnd w:id="99"/>
+      <w:bookmarkEnd w:id="100"/>
     </w:p>
     <w:p>
       <w:pPr>
@@ -39543,12 +39781,12 @@
       <w:pPr>
         <w:pStyle w:val="Heading3"/>
       </w:pPr>
-      <w:bookmarkStart w:id="100" w:name="_Toc195699872"/>
+      <w:bookmarkStart w:id="101" w:name="_Toc196147768"/>
       <w:r>
         <w:lastRenderedPageBreak/>
         <w:t>CPendingOperation</w:t>
       </w:r>
-      <w:bookmarkEnd w:id="100"/>
+      <w:bookmarkEnd w:id="101"/>
     </w:p>
     <w:p>
       <w:pPr>
@@ -39570,11 +39808,11 @@
       <w:pPr>
         <w:pStyle w:val="Heading3"/>
       </w:pPr>
-      <w:bookmarkStart w:id="101" w:name="_Toc195699873"/>
+      <w:bookmarkStart w:id="102" w:name="_Toc196147769"/>
       <w:r>
         <w:t>CPSGS_Dispatcher</w:t>
       </w:r>
-      <w:bookmarkEnd w:id="101"/>
+      <w:bookmarkEnd w:id="102"/>
     </w:p>
     <w:p>
       <w:pPr>
@@ -39593,11 +39831,11 @@
       <w:pPr>
         <w:pStyle w:val="Heading3"/>
       </w:pPr>
-      <w:bookmarkStart w:id="102" w:name="_Toc195699874"/>
+      <w:bookmarkStart w:id="103" w:name="_Toc196147770"/>
       <w:r>
         <w:t>New Connection Flow</w:t>
       </w:r>
-      <w:bookmarkEnd w:id="102"/>
+      <w:bookmarkEnd w:id="103"/>
     </w:p>
     <w:p/>
     <w:p>
@@ -39606,7 +39844,7 @@
           <v:shape id="_x0000_i1027" type="#_x0000_t75" style="width:468pt;height:333.1pt" o:ole="">
             <v:imagedata r:id="rId54" o:title=""/>
           </v:shape>
-          <o:OLEObject Type="Embed" ProgID="Visio.Drawing.15" ShapeID="_x0000_i1027" DrawAspect="Content" ObjectID="_1806312551" r:id="rId55"/>
+          <o:OLEObject Type="Embed" ProgID="Visio.Drawing.15" ShapeID="_x0000_i1027" DrawAspect="Content" ObjectID="_1806760443" r:id="rId55"/>
         </w:object>
       </w:r>
     </w:p>
@@ -39615,12 +39853,12 @@
       <w:pPr>
         <w:pStyle w:val="Heading3"/>
       </w:pPr>
-      <w:bookmarkStart w:id="103" w:name="_Toc195699875"/>
+      <w:bookmarkStart w:id="104" w:name="_Toc196147771"/>
       <w:r>
         <w:lastRenderedPageBreak/>
         <w:t>Request Flow</w:t>
       </w:r>
-      <w:bookmarkEnd w:id="103"/>
+      <w:bookmarkEnd w:id="104"/>
     </w:p>
     <w:p/>
     <w:p>
@@ -39629,7 +39867,7 @@
           <v:shape id="_x0000_i1028" type="#_x0000_t75" style="width:467.55pt;height:394.2pt" o:ole="">
             <v:imagedata r:id="rId56" o:title=""/>
           </v:shape>
-          <o:OLEObject Type="Embed" ProgID="Visio.Drawing.15" ShapeID="_x0000_i1028" DrawAspect="Content" ObjectID="_1806312552" r:id="rId57"/>
+          <o:OLEObject Type="Embed" ProgID="Visio.Drawing.15" ShapeID="_x0000_i1028" DrawAspect="Content" ObjectID="_1806760444" r:id="rId57"/>
         </w:object>
       </w:r>
     </w:p>
@@ -39643,11 +39881,11 @@
       <w:pPr>
         <w:pStyle w:val="Heading3"/>
       </w:pPr>
-      <w:bookmarkStart w:id="104" w:name="_Toc195699876"/>
+      <w:bookmarkStart w:id="105" w:name="_Toc196147772"/>
       <w:r>
         <w:t>Handling Request In Synchronous Manner</w:t>
       </w:r>
-      <w:bookmarkEnd w:id="104"/>
+      <w:bookmarkEnd w:id="105"/>
     </w:p>
     <w:p/>
     <w:p>
@@ -39656,7 +39894,7 @@
           <v:shape id="_x0000_i1029" type="#_x0000_t75" style="width:468pt;height:212.35pt" o:ole="">
             <v:imagedata r:id="rId58" o:title=""/>
           </v:shape>
-          <o:OLEObject Type="Embed" ProgID="Visio.Drawing.15" ShapeID="_x0000_i1029" DrawAspect="Content" ObjectID="_1806312553" r:id="rId59"/>
+          <o:OLEObject Type="Embed" ProgID="Visio.Drawing.15" ShapeID="_x0000_i1029" DrawAspect="Content" ObjectID="_1806760445" r:id="rId59"/>
         </w:object>
       </w:r>
     </w:p>
@@ -39669,12 +39907,12 @@
       <w:pPr>
         <w:pStyle w:val="Heading3"/>
       </w:pPr>
-      <w:bookmarkStart w:id="105" w:name="_Toc195699877"/>
+      <w:bookmarkStart w:id="106" w:name="_Toc196147773"/>
       <w:r>
         <w:lastRenderedPageBreak/>
         <w:t>Handling Request In Asynchronous Manner</w:t>
       </w:r>
-      <w:bookmarkEnd w:id="105"/>
+      <w:bookmarkEnd w:id="106"/>
     </w:p>
     <w:p/>
     <w:p>
@@ -39683,7 +39921,7 @@
           <v:shape id="_x0000_i1030" type="#_x0000_t75" style="width:467.55pt;height:534.1pt" o:ole="">
             <v:imagedata r:id="rId60" o:title=""/>
           </v:shape>
-          <o:OLEObject Type="Embed" ProgID="Visio.Drawing.15" ShapeID="_x0000_i1030" DrawAspect="Content" ObjectID="_1806312554" r:id="rId61"/>
+          <o:OLEObject Type="Embed" ProgID="Visio.Drawing.15" ShapeID="_x0000_i1030" DrawAspect="Content" ObjectID="_1806760446" r:id="rId61"/>
         </w:object>
       </w:r>
     </w:p>
@@ -44929,6 +45167,106 @@
     <w:basedOn w:val="DefaultParagraphFont"/>
     <w:rsid w:val="00D90BE3"/>
   </w:style>
+  <w:style w:type="paragraph" w:styleId="TOC5">
+    <w:name w:val="toc 5"/>
+    <w:basedOn w:val="Normal"/>
+    <w:next w:val="Normal"/>
+    <w:autoRedefine/>
+    <w:uiPriority w:val="39"/>
+    <w:unhideWhenUsed/>
+    <w:rsid w:val="00AA3D1B"/>
+    <w:pPr>
+      <w:spacing w:after="100" w:line="278" w:lineRule="auto"/>
+      <w:ind w:left="960"/>
+    </w:pPr>
+    <w:rPr>
+      <w:rFonts w:eastAsiaTheme="minorEastAsia"/>
+      <w:kern w:val="2"/>
+      <w:sz w:val="24"/>
+      <w:szCs w:val="24"/>
+      <w14:ligatures w14:val="standardContextual"/>
+    </w:rPr>
+  </w:style>
+  <w:style w:type="paragraph" w:styleId="TOC6">
+    <w:name w:val="toc 6"/>
+    <w:basedOn w:val="Normal"/>
+    <w:next w:val="Normal"/>
+    <w:autoRedefine/>
+    <w:uiPriority w:val="39"/>
+    <w:unhideWhenUsed/>
+    <w:rsid w:val="00AA3D1B"/>
+    <w:pPr>
+      <w:spacing w:after="100" w:line="278" w:lineRule="auto"/>
+      <w:ind w:left="1200"/>
+    </w:pPr>
+    <w:rPr>
+      <w:rFonts w:eastAsiaTheme="minorEastAsia"/>
+      <w:kern w:val="2"/>
+      <w:sz w:val="24"/>
+      <w:szCs w:val="24"/>
+      <w14:ligatures w14:val="standardContextual"/>
+    </w:rPr>
+  </w:style>
+  <w:style w:type="paragraph" w:styleId="TOC7">
+    <w:name w:val="toc 7"/>
+    <w:basedOn w:val="Normal"/>
+    <w:next w:val="Normal"/>
+    <w:autoRedefine/>
+    <w:uiPriority w:val="39"/>
+    <w:unhideWhenUsed/>
+    <w:rsid w:val="00AA3D1B"/>
+    <w:pPr>
+      <w:spacing w:after="100" w:line="278" w:lineRule="auto"/>
+      <w:ind w:left="1440"/>
+    </w:pPr>
+    <w:rPr>
+      <w:rFonts w:eastAsiaTheme="minorEastAsia"/>
+      <w:kern w:val="2"/>
+      <w:sz w:val="24"/>
+      <w:szCs w:val="24"/>
+      <w14:ligatures w14:val="standardContextual"/>
+    </w:rPr>
+  </w:style>
+  <w:style w:type="paragraph" w:styleId="TOC8">
+    <w:name w:val="toc 8"/>
+    <w:basedOn w:val="Normal"/>
+    <w:next w:val="Normal"/>
+    <w:autoRedefine/>
+    <w:uiPriority w:val="39"/>
+    <w:unhideWhenUsed/>
+    <w:rsid w:val="00AA3D1B"/>
+    <w:pPr>
+      <w:spacing w:after="100" w:line="278" w:lineRule="auto"/>
+      <w:ind w:left="1680"/>
+    </w:pPr>
+    <w:rPr>
+      <w:rFonts w:eastAsiaTheme="minorEastAsia"/>
+      <w:kern w:val="2"/>
+      <w:sz w:val="24"/>
+      <w:szCs w:val="24"/>
+      <w14:ligatures w14:val="standardContextual"/>
+    </w:rPr>
+  </w:style>
+  <w:style w:type="paragraph" w:styleId="TOC9">
+    <w:name w:val="toc 9"/>
+    <w:basedOn w:val="Normal"/>
+    <w:next w:val="Normal"/>
+    <w:autoRedefine/>
+    <w:uiPriority w:val="39"/>
+    <w:unhideWhenUsed/>
+    <w:rsid w:val="00AA3D1B"/>
+    <w:pPr>
+      <w:spacing w:after="100" w:line="278" w:lineRule="auto"/>
+      <w:ind w:left="1920"/>
+    </w:pPr>
+    <w:rPr>
+      <w:rFonts w:eastAsiaTheme="minorEastAsia"/>
+      <w:kern w:val="2"/>
+      <w:sz w:val="24"/>
+      <w:szCs w:val="24"/>
+      <w14:ligatures w14:val="standardContextual"/>
+    </w:rPr>
+  </w:style>
 </w:styles>
 </file>
 
@@ -45220,7 +45558,7 @@
 <file path=customXml/item1.xml><?xml version="1.0" encoding="utf-8"?>
 <CoverPageProperties xmlns="http://schemas.microsoft.com/office/2006/coverPageProps">
   <PublishDate>2018-01-24T00:00:00</PublishDate>
-  <Abstract>Document version: 2.78</Abstract>
+  <Abstract>Document version: 2.79</Abstract>
   <CompanyAddress/>
   <CompanyPhone/>
   <CompanyFax/>
@@ -45375,27 +45713,6 @@
 
 <file path=customXml/item3.xml><?xml version="1.0" encoding="utf-8"?>
 <?mso-contentType ?>
-<FormTemplates xmlns="http://schemas.microsoft.com/sharepoint/v3/contenttype/forms">
-  <Display>DocumentLibraryForm</Display>
-  <Edit>DocumentLibraryForm</Edit>
-  <New>DocumentLibraryForm</New>
-</FormTemplates>
-</file>
-
-<file path=customXml/item4.xml><?xml version="1.0" encoding="utf-8"?>
-<p:properties xmlns:p="http://schemas.microsoft.com/office/2006/metadata/properties" xmlns:xsi="http://www.w3.org/2001/XMLSchema-instance">
-  <documentManagement>
-    <_dlc_DocId xmlns="bebfb516-47c3-42bf-8695-c627e02fd07c">RP5EP2USD5DN-418-13</_dlc_DocId>
-    <_dlc_DocIdUrl xmlns="bebfb516-47c3-42bf-8695-c627e02fd07c">
-      <Url>https://sp.ncbi.nlm.nih.gov/IEB/ISS/_layouts/15/DocIdRedir.aspx?ID=RP5EP2USD5DN-418-13</Url>
-      <Description>RP5EP2USD5DN-418-13</Description>
-    </_dlc_DocIdUrl>
-  </documentManagement>
-</p:properties>
-</file>
-
-<file path=customXml/item5.xml><?xml version="1.0" encoding="utf-8"?>
-<?mso-contentType ?>
 <spe:Receivers xmlns:spe="http://schemas.microsoft.com/sharepoint/events">
   <Receiver>
     <Name>Document ID Generator</Name>
@@ -45444,8 +45761,29 @@
 </spe:Receivers>
 </file>
 
+<file path=customXml/item4.xml><?xml version="1.0" encoding="utf-8"?>
+<?mso-contentType ?>
+<FormTemplates xmlns="http://schemas.microsoft.com/sharepoint/v3/contenttype/forms">
+  <Display>DocumentLibraryForm</Display>
+  <Edit>DocumentLibraryForm</Edit>
+  <New>DocumentLibraryForm</New>
+</FormTemplates>
+</file>
+
+<file path=customXml/item5.xml><?xml version="1.0" encoding="utf-8"?>
+<b:Sources xmlns:b="http://schemas.openxmlformats.org/officeDocument/2006/bibliography" xmlns="http://schemas.openxmlformats.org/officeDocument/2006/bibliography" SelectedStyle="\APA.XSL" StyleName="APA"/>
+</file>
+
 <file path=customXml/item6.xml><?xml version="1.0" encoding="utf-8"?>
-<b:Sources xmlns:b="http://schemas.openxmlformats.org/officeDocument/2006/bibliography" xmlns="http://schemas.openxmlformats.org/officeDocument/2006/bibliography" SelectedStyle="\APA.XSL" StyleName="APA"/>
+<p:properties xmlns:p="http://schemas.microsoft.com/office/2006/metadata/properties" xmlns:xsi="http://www.w3.org/2001/XMLSchema-instance">
+  <documentManagement>
+    <_dlc_DocId xmlns="bebfb516-47c3-42bf-8695-c627e02fd07c">RP5EP2USD5DN-418-13</_dlc_DocId>
+    <_dlc_DocIdUrl xmlns="bebfb516-47c3-42bf-8695-c627e02fd07c">
+      <Url>https://sp.ncbi.nlm.nih.gov/IEB/ISS/_layouts/15/DocIdRedir.aspx?ID=RP5EP2USD5DN-418-13</Url>
+      <Description>RP5EP2USD5DN-418-13</Description>
+    </_dlc_DocIdUrl>
+  </documentManagement>
+</p:properties>
 </file>
 
 <file path=customXml/itemProps1.xml><?xml version="1.0" encoding="utf-8"?>
@@ -45475,6 +45813,14 @@
 </file>
 
 <file path=customXml/itemProps3.xml><?xml version="1.0" encoding="utf-8"?>
+<ds:datastoreItem xmlns:ds="http://schemas.openxmlformats.org/officeDocument/2006/customXml" ds:itemID="{4BDF85BA-E69F-4D6A-AE92-E7CF998321DD}">
+  <ds:schemaRefs>
+    <ds:schemaRef ds:uri="http://schemas.microsoft.com/sharepoint/events"/>
+  </ds:schemaRefs>
+</ds:datastoreItem>
+</file>
+
+<file path=customXml/itemProps4.xml><?xml version="1.0" encoding="utf-8"?>
 <ds:datastoreItem xmlns:ds="http://schemas.openxmlformats.org/officeDocument/2006/customXml" ds:itemID="{910EA325-BFD3-40A7-B49F-A40A5596D5CE}">
   <ds:schemaRefs>
     <ds:schemaRef ds:uri="http://schemas.microsoft.com/sharepoint/v3/contenttype/forms"/>
@@ -45482,7 +45828,15 @@
 </ds:datastoreItem>
 </file>
 
-<file path=customXml/itemProps4.xml><?xml version="1.0" encoding="utf-8"?>
+<file path=customXml/itemProps5.xml><?xml version="1.0" encoding="utf-8"?>
+<ds:datastoreItem xmlns:ds="http://schemas.openxmlformats.org/officeDocument/2006/customXml" ds:itemID="{CFFBBBB2-ADC5-4CE0-A9B5-8D3026204BDD}">
+  <ds:schemaRefs>
+    <ds:schemaRef ds:uri="http://schemas.openxmlformats.org/officeDocument/2006/bibliography"/>
+  </ds:schemaRefs>
+</ds:datastoreItem>
+</file>
+
+<file path=customXml/itemProps6.xml><?xml version="1.0" encoding="utf-8"?>
 <ds:datastoreItem xmlns:ds="http://schemas.openxmlformats.org/officeDocument/2006/customXml" ds:itemID="{AED05E43-12FF-4C22-A572-6E3D13391423}">
   <ds:schemaRefs>
     <ds:schemaRef ds:uri="http://purl.org/dc/elements/1.1/"/>
@@ -45496,20 +45850,4 @@
     <ds:schemaRef ds:uri="http://www.w3.org/XML/1998/namespace"/>
   </ds:schemaRefs>
 </ds:datastoreItem>
-</file>
-
-<file path=customXml/itemProps5.xml><?xml version="1.0" encoding="utf-8"?>
-<ds:datastoreItem xmlns:ds="http://schemas.openxmlformats.org/officeDocument/2006/customXml" ds:itemID="{4BDF85BA-E69F-4D6A-AE92-E7CF998321DD}">
-  <ds:schemaRefs>
-    <ds:schemaRef ds:uri="http://schemas.microsoft.com/sharepoint/events"/>
-  </ds:schemaRefs>
-</ds:datastoreItem>
-</file>
-
-<file path=customXml/itemProps6.xml><?xml version="1.0" encoding="utf-8"?>
-<ds:datastoreItem xmlns:ds="http://schemas.openxmlformats.org/officeDocument/2006/customXml" ds:itemID="{CFFBBBB2-ADC5-4CE0-A9B5-8D3026204BDD}">
-  <ds:schemaRefs>
-    <ds:schemaRef ds:uri="http://schemas.openxmlformats.org/officeDocument/2006/bibliography"/>
-  </ds:schemaRefs>
-</ds:datastoreItem>
 </file>
</xml_diff>

<commit_message>
Adding the /hello request description
</commit_message>
<xml_diff>
--- a/misc/PSG Server.docx
+++ b/misc/PSG Server.docx
@@ -348,7 +348,7 @@
                     <w:b/>
                     <w:bCs/>
                   </w:rPr>
-                  <w:t>4</w:t>
+                  <w:t>5</w:t>
                 </w:r>
                 <w:r>
                   <w:rPr>
@@ -362,7 +362,7 @@
                     <w:b/>
                     <w:bCs/>
                   </w:rPr>
-                  <w:t>21</w:t>
+                  <w:t>09</w:t>
                 </w:r>
                 <w:r>
                   <w:rPr>
@@ -418,10 +418,7 @@
                       <w:t>2.</w:t>
                     </w:r>
                     <w:r>
-                      <w:t>7</w:t>
-                    </w:r>
-                    <w:r>
-                      <w:t>9</w:t>
+                      <w:t>80</w:t>
                     </w:r>
                   </w:p>
                 </w:tc>
@@ -4483,6 +4480,48 @@
           <w:p>
             <w:r>
               <w:t>Adding /readyz/connections request description</w:t>
+            </w:r>
+          </w:p>
+        </w:tc>
+      </w:tr>
+      <w:tr>
+        <w:tc>
+          <w:tcPr>
+            <w:tcW w:w="1001" w:type="dxa"/>
+          </w:tcPr>
+          <w:p>
+            <w:r>
+              <w:t>2.80</w:t>
+            </w:r>
+          </w:p>
+        </w:tc>
+        <w:tc>
+          <w:tcPr>
+            <w:tcW w:w="1678" w:type="dxa"/>
+          </w:tcPr>
+          <w:p>
+            <w:r>
+              <w:t>May 9, 2025</w:t>
+            </w:r>
+          </w:p>
+        </w:tc>
+        <w:tc>
+          <w:tcPr>
+            <w:tcW w:w="2182" w:type="dxa"/>
+          </w:tcPr>
+          <w:p>
+            <w:r>
+              <w:t>Sergey Satskiy</w:t>
+            </w:r>
+          </w:p>
+        </w:tc>
+        <w:tc>
+          <w:tcPr>
+            <w:tcW w:w="4489" w:type="dxa"/>
+          </w:tcPr>
+          <w:p>
+            <w:r>
+              <w:t>Adding /hello request description</w:t>
             </w:r>
           </w:p>
         </w:tc>
@@ -4549,7 +4588,7 @@
           <w:r>
             <w:fldChar w:fldCharType="separate"/>
           </w:r>
-          <w:hyperlink w:anchor="_Toc196147680" w:history="1">
+          <w:hyperlink w:anchor="_Toc197679114" w:history="1">
             <w:r>
               <w:rPr>
                 <w:rStyle w:val="Hyperlink"/>
@@ -4576,7 +4615,7 @@
                 <w:noProof/>
                 <w:webHidden/>
               </w:rPr>
-              <w:instrText xml:space="preserve"> PAGEREF _Toc196147680 \h </w:instrText>
+              <w:instrText xml:space="preserve"> PAGEREF _Toc197679114 \h </w:instrText>
             </w:r>
             <w:r>
               <w:rPr>
@@ -4622,7 +4661,7 @@
               <w14:ligatures w14:val="standardContextual"/>
             </w:rPr>
           </w:pPr>
-          <w:hyperlink w:anchor="_Toc196147681" w:history="1">
+          <w:hyperlink w:anchor="_Toc197679115" w:history="1">
             <w:r>
               <w:rPr>
                 <w:rStyle w:val="Hyperlink"/>
@@ -4649,7 +4688,7 @@
                 <w:noProof/>
                 <w:webHidden/>
               </w:rPr>
-              <w:instrText xml:space="preserve"> PAGEREF _Toc196147681 \h </w:instrText>
+              <w:instrText xml:space="preserve"> PAGEREF _Toc197679115 \h </w:instrText>
             </w:r>
             <w:r>
               <w:rPr>
@@ -4695,7 +4734,7 @@
               <w14:ligatures w14:val="standardContextual"/>
             </w:rPr>
           </w:pPr>
-          <w:hyperlink w:anchor="_Toc196147682" w:history="1">
+          <w:hyperlink w:anchor="_Toc197679116" w:history="1">
             <w:r>
               <w:rPr>
                 <w:rStyle w:val="Hyperlink"/>
@@ -4722,7 +4761,7 @@
                 <w:noProof/>
                 <w:webHidden/>
               </w:rPr>
-              <w:instrText xml:space="preserve"> PAGEREF _Toc196147682 \h </w:instrText>
+              <w:instrText xml:space="preserve"> PAGEREF _Toc197679116 \h </w:instrText>
             </w:r>
             <w:r>
               <w:rPr>
@@ -4768,7 +4807,7 @@
               <w14:ligatures w14:val="standardContextual"/>
             </w:rPr>
           </w:pPr>
-          <w:hyperlink w:anchor="_Toc196147683" w:history="1">
+          <w:hyperlink w:anchor="_Toc197679117" w:history="1">
             <w:r>
               <w:rPr>
                 <w:rStyle w:val="Hyperlink"/>
@@ -4795,7 +4834,7 @@
                 <w:noProof/>
                 <w:webHidden/>
               </w:rPr>
-              <w:instrText xml:space="preserve"> PAGEREF _Toc196147683 \h </w:instrText>
+              <w:instrText xml:space="preserve"> PAGEREF _Toc197679117 \h </w:instrText>
             </w:r>
             <w:r>
               <w:rPr>
@@ -4841,7 +4880,7 @@
               <w14:ligatures w14:val="standardContextual"/>
             </w:rPr>
           </w:pPr>
-          <w:hyperlink w:anchor="_Toc196147684" w:history="1">
+          <w:hyperlink w:anchor="_Toc197679118" w:history="1">
             <w:r>
               <w:rPr>
                 <w:rStyle w:val="Hyperlink"/>
@@ -4868,7 +4907,7 @@
                 <w:noProof/>
                 <w:webHidden/>
               </w:rPr>
-              <w:instrText xml:space="preserve"> PAGEREF _Toc196147684 \h </w:instrText>
+              <w:instrText xml:space="preserve"> PAGEREF _Toc197679118 \h </w:instrText>
             </w:r>
             <w:r>
               <w:rPr>
@@ -4914,7 +4953,7 @@
               <w14:ligatures w14:val="standardContextual"/>
             </w:rPr>
           </w:pPr>
-          <w:hyperlink w:anchor="_Toc196147685" w:history="1">
+          <w:hyperlink w:anchor="_Toc197679119" w:history="1">
             <w:r>
               <w:rPr>
                 <w:rStyle w:val="Hyperlink"/>
@@ -4941,7 +4980,7 @@
                 <w:noProof/>
                 <w:webHidden/>
               </w:rPr>
-              <w:instrText xml:space="preserve"> PAGEREF _Toc196147685 \h </w:instrText>
+              <w:instrText xml:space="preserve"> PAGEREF _Toc197679119 \h </w:instrText>
             </w:r>
             <w:r>
               <w:rPr>
@@ -4987,7 +5026,7 @@
               <w14:ligatures w14:val="standardContextual"/>
             </w:rPr>
           </w:pPr>
-          <w:hyperlink w:anchor="_Toc196147686" w:history="1">
+          <w:hyperlink w:anchor="_Toc197679120" w:history="1">
             <w:r>
               <w:rPr>
                 <w:rStyle w:val="Hyperlink"/>
@@ -5014,7 +5053,7 @@
                 <w:noProof/>
                 <w:webHidden/>
               </w:rPr>
-              <w:instrText xml:space="preserve"> PAGEREF _Toc196147686 \h </w:instrText>
+              <w:instrText xml:space="preserve"> PAGEREF _Toc197679120 \h </w:instrText>
             </w:r>
             <w:r>
               <w:rPr>
@@ -5060,7 +5099,7 @@
               <w14:ligatures w14:val="standardContextual"/>
             </w:rPr>
           </w:pPr>
-          <w:hyperlink w:anchor="_Toc196147687" w:history="1">
+          <w:hyperlink w:anchor="_Toc197679121" w:history="1">
             <w:r>
               <w:rPr>
                 <w:rStyle w:val="Hyperlink"/>
@@ -5087,7 +5126,7 @@
                 <w:noProof/>
                 <w:webHidden/>
               </w:rPr>
-              <w:instrText xml:space="preserve"> PAGEREF _Toc196147687 \h </w:instrText>
+              <w:instrText xml:space="preserve"> PAGEREF _Toc197679121 \h </w:instrText>
             </w:r>
             <w:r>
               <w:rPr>
@@ -5133,7 +5172,7 @@
               <w14:ligatures w14:val="standardContextual"/>
             </w:rPr>
           </w:pPr>
-          <w:hyperlink w:anchor="_Toc196147688" w:history="1">
+          <w:hyperlink w:anchor="_Toc197679122" w:history="1">
             <w:r>
               <w:rPr>
                 <w:rStyle w:val="Hyperlink"/>
@@ -5160,7 +5199,7 @@
                 <w:noProof/>
                 <w:webHidden/>
               </w:rPr>
-              <w:instrText xml:space="preserve"> PAGEREF _Toc196147688 \h </w:instrText>
+              <w:instrText xml:space="preserve"> PAGEREF _Toc197679122 \h </w:instrText>
             </w:r>
             <w:r>
               <w:rPr>
@@ -5206,7 +5245,7 @@
               <w14:ligatures w14:val="standardContextual"/>
             </w:rPr>
           </w:pPr>
-          <w:hyperlink w:anchor="_Toc196147689" w:history="1">
+          <w:hyperlink w:anchor="_Toc197679123" w:history="1">
             <w:r>
               <w:rPr>
                 <w:rStyle w:val="Hyperlink"/>
@@ -5233,7 +5272,7 @@
                 <w:noProof/>
                 <w:webHidden/>
               </w:rPr>
-              <w:instrText xml:space="preserve"> PAGEREF _Toc196147689 \h </w:instrText>
+              <w:instrText xml:space="preserve"> PAGEREF _Toc197679123 \h </w:instrText>
             </w:r>
             <w:r>
               <w:rPr>
@@ -5279,7 +5318,7 @@
               <w14:ligatures w14:val="standardContextual"/>
             </w:rPr>
           </w:pPr>
-          <w:hyperlink w:anchor="_Toc196147690" w:history="1">
+          <w:hyperlink w:anchor="_Toc197679124" w:history="1">
             <w:r>
               <w:rPr>
                 <w:rStyle w:val="Hyperlink"/>
@@ -5306,7 +5345,7 @@
                 <w:noProof/>
                 <w:webHidden/>
               </w:rPr>
-              <w:instrText xml:space="preserve"> PAGEREF _Toc196147690 \h </w:instrText>
+              <w:instrText xml:space="preserve"> PAGEREF _Toc197679124 \h </w:instrText>
             </w:r>
             <w:r>
               <w:rPr>
@@ -5352,7 +5391,7 @@
               <w14:ligatures w14:val="standardContextual"/>
             </w:rPr>
           </w:pPr>
-          <w:hyperlink w:anchor="_Toc196147691" w:history="1">
+          <w:hyperlink w:anchor="_Toc197679125" w:history="1">
             <w:r>
               <w:rPr>
                 <w:rStyle w:val="Hyperlink"/>
@@ -5379,7 +5418,7 @@
                 <w:noProof/>
                 <w:webHidden/>
               </w:rPr>
-              <w:instrText xml:space="preserve"> PAGEREF _Toc196147691 \h </w:instrText>
+              <w:instrText xml:space="preserve"> PAGEREF _Toc197679125 \h </w:instrText>
             </w:r>
             <w:r>
               <w:rPr>
@@ -5425,7 +5464,7 @@
               <w14:ligatures w14:val="standardContextual"/>
             </w:rPr>
           </w:pPr>
-          <w:hyperlink w:anchor="_Toc196147692" w:history="1">
+          <w:hyperlink w:anchor="_Toc197679126" w:history="1">
             <w:r>
               <w:rPr>
                 <w:rStyle w:val="Hyperlink"/>
@@ -5452,7 +5491,7 @@
                 <w:noProof/>
                 <w:webHidden/>
               </w:rPr>
-              <w:instrText xml:space="preserve"> PAGEREF _Toc196147692 \h </w:instrText>
+              <w:instrText xml:space="preserve"> PAGEREF _Toc197679126 \h </w:instrText>
             </w:r>
             <w:r>
               <w:rPr>
@@ -5498,7 +5537,7 @@
               <w14:ligatures w14:val="standardContextual"/>
             </w:rPr>
           </w:pPr>
-          <w:hyperlink w:anchor="_Toc196147693" w:history="1">
+          <w:hyperlink w:anchor="_Toc197679127" w:history="1">
             <w:r>
               <w:rPr>
                 <w:rStyle w:val="Hyperlink"/>
@@ -5525,7 +5564,7 @@
                 <w:noProof/>
                 <w:webHidden/>
               </w:rPr>
-              <w:instrText xml:space="preserve"> PAGEREF _Toc196147693 \h </w:instrText>
+              <w:instrText xml:space="preserve"> PAGEREF _Toc197679127 \h </w:instrText>
             </w:r>
             <w:r>
               <w:rPr>
@@ -5571,7 +5610,7 @@
               <w14:ligatures w14:val="standardContextual"/>
             </w:rPr>
           </w:pPr>
-          <w:hyperlink w:anchor="_Toc196147694" w:history="1">
+          <w:hyperlink w:anchor="_Toc197679128" w:history="1">
             <w:r>
               <w:rPr>
                 <w:rStyle w:val="Hyperlink"/>
@@ -5598,7 +5637,7 @@
                 <w:noProof/>
                 <w:webHidden/>
               </w:rPr>
-              <w:instrText xml:space="preserve"> PAGEREF _Toc196147694 \h </w:instrText>
+              <w:instrText xml:space="preserve"> PAGEREF _Toc197679128 \h </w:instrText>
             </w:r>
             <w:r>
               <w:rPr>
@@ -5644,7 +5683,7 @@
               <w14:ligatures w14:val="standardContextual"/>
             </w:rPr>
           </w:pPr>
-          <w:hyperlink w:anchor="_Toc196147695" w:history="1">
+          <w:hyperlink w:anchor="_Toc197679129" w:history="1">
             <w:r>
               <w:rPr>
                 <w:rStyle w:val="Hyperlink"/>
@@ -5671,7 +5710,7 @@
                 <w:noProof/>
                 <w:webHidden/>
               </w:rPr>
-              <w:instrText xml:space="preserve"> PAGEREF _Toc196147695 \h </w:instrText>
+              <w:instrText xml:space="preserve"> PAGEREF _Toc197679129 \h </w:instrText>
             </w:r>
             <w:r>
               <w:rPr>
@@ -5717,7 +5756,7 @@
               <w14:ligatures w14:val="standardContextual"/>
             </w:rPr>
           </w:pPr>
-          <w:hyperlink w:anchor="_Toc196147696" w:history="1">
+          <w:hyperlink w:anchor="_Toc197679130" w:history="1">
             <w:r>
               <w:rPr>
                 <w:rStyle w:val="Hyperlink"/>
@@ -5744,7 +5783,7 @@
                 <w:noProof/>
                 <w:webHidden/>
               </w:rPr>
-              <w:instrText xml:space="preserve"> PAGEREF _Toc196147696 \h </w:instrText>
+              <w:instrText xml:space="preserve"> PAGEREF _Toc197679130 \h </w:instrText>
             </w:r>
             <w:r>
               <w:rPr>
@@ -5790,7 +5829,7 @@
               <w14:ligatures w14:val="standardContextual"/>
             </w:rPr>
           </w:pPr>
-          <w:hyperlink w:anchor="_Toc196147697" w:history="1">
+          <w:hyperlink w:anchor="_Toc197679131" w:history="1">
             <w:r>
               <w:rPr>
                 <w:rStyle w:val="Hyperlink"/>
@@ -5817,7 +5856,7 @@
                 <w:noProof/>
                 <w:webHidden/>
               </w:rPr>
-              <w:instrText xml:space="preserve"> PAGEREF _Toc196147697 \h </w:instrText>
+              <w:instrText xml:space="preserve"> PAGEREF _Toc197679131 \h </w:instrText>
             </w:r>
             <w:r>
               <w:rPr>
@@ -5863,7 +5902,7 @@
               <w14:ligatures w14:val="standardContextual"/>
             </w:rPr>
           </w:pPr>
-          <w:hyperlink w:anchor="_Toc196147698" w:history="1">
+          <w:hyperlink w:anchor="_Toc197679132" w:history="1">
             <w:r>
               <w:rPr>
                 <w:rStyle w:val="Hyperlink"/>
@@ -5890,7 +5929,7 @@
                 <w:noProof/>
                 <w:webHidden/>
               </w:rPr>
-              <w:instrText xml:space="preserve"> PAGEREF _Toc196147698 \h </w:instrText>
+              <w:instrText xml:space="preserve"> PAGEREF _Toc197679132 \h </w:instrText>
             </w:r>
             <w:r>
               <w:rPr>
@@ -5936,7 +5975,7 @@
               <w14:ligatures w14:val="standardContextual"/>
             </w:rPr>
           </w:pPr>
-          <w:hyperlink w:anchor="_Toc196147699" w:history="1">
+          <w:hyperlink w:anchor="_Toc197679133" w:history="1">
             <w:r>
               <w:rPr>
                 <w:rStyle w:val="Hyperlink"/>
@@ -5963,7 +6002,7 @@
                 <w:noProof/>
                 <w:webHidden/>
               </w:rPr>
-              <w:instrText xml:space="preserve"> PAGEREF _Toc196147699 \h </w:instrText>
+              <w:instrText xml:space="preserve"> PAGEREF _Toc197679133 \h </w:instrText>
             </w:r>
             <w:r>
               <w:rPr>
@@ -6009,7 +6048,7 @@
               <w14:ligatures w14:val="standardContextual"/>
             </w:rPr>
           </w:pPr>
-          <w:hyperlink w:anchor="_Toc196147700" w:history="1">
+          <w:hyperlink w:anchor="_Toc197679134" w:history="1">
             <w:r>
               <w:rPr>
                 <w:rStyle w:val="Hyperlink"/>
@@ -6036,7 +6075,7 @@
                 <w:noProof/>
                 <w:webHidden/>
               </w:rPr>
-              <w:instrText xml:space="preserve"> PAGEREF _Toc196147700 \h </w:instrText>
+              <w:instrText xml:space="preserve"> PAGEREF _Toc197679134 \h </w:instrText>
             </w:r>
             <w:r>
               <w:rPr>
@@ -6082,7 +6121,7 @@
               <w14:ligatures w14:val="standardContextual"/>
             </w:rPr>
           </w:pPr>
-          <w:hyperlink w:anchor="_Toc196147701" w:history="1">
+          <w:hyperlink w:anchor="_Toc197679135" w:history="1">
             <w:r>
               <w:rPr>
                 <w:rStyle w:val="Hyperlink"/>
@@ -6109,7 +6148,7 @@
                 <w:noProof/>
                 <w:webHidden/>
               </w:rPr>
-              <w:instrText xml:space="preserve"> PAGEREF _Toc196147701 \h </w:instrText>
+              <w:instrText xml:space="preserve"> PAGEREF _Toc197679135 \h </w:instrText>
             </w:r>
             <w:r>
               <w:rPr>
@@ -6155,7 +6194,7 @@
               <w14:ligatures w14:val="standardContextual"/>
             </w:rPr>
           </w:pPr>
-          <w:hyperlink w:anchor="_Toc196147702" w:history="1">
+          <w:hyperlink w:anchor="_Toc197679136" w:history="1">
             <w:r>
               <w:rPr>
                 <w:rStyle w:val="Hyperlink"/>
@@ -6182,7 +6221,7 @@
                 <w:noProof/>
                 <w:webHidden/>
               </w:rPr>
-              <w:instrText xml:space="preserve"> PAGEREF _Toc196147702 \h </w:instrText>
+              <w:instrText xml:space="preserve"> PAGEREF _Toc197679136 \h </w:instrText>
             </w:r>
             <w:r>
               <w:rPr>
@@ -6228,7 +6267,7 @@
               <w14:ligatures w14:val="standardContextual"/>
             </w:rPr>
           </w:pPr>
-          <w:hyperlink w:anchor="_Toc196147703" w:history="1">
+          <w:hyperlink w:anchor="_Toc197679137" w:history="1">
             <w:r>
               <w:rPr>
                 <w:rStyle w:val="Hyperlink"/>
@@ -6255,7 +6294,7 @@
                 <w:noProof/>
                 <w:webHidden/>
               </w:rPr>
-              <w:instrText xml:space="preserve"> PAGEREF _Toc196147703 \h </w:instrText>
+              <w:instrText xml:space="preserve"> PAGEREF _Toc197679137 \h </w:instrText>
             </w:r>
             <w:r>
               <w:rPr>
@@ -6301,7 +6340,7 @@
               <w14:ligatures w14:val="standardContextual"/>
             </w:rPr>
           </w:pPr>
-          <w:hyperlink w:anchor="_Toc196147704" w:history="1">
+          <w:hyperlink w:anchor="_Toc197679138" w:history="1">
             <w:r>
               <w:rPr>
                 <w:rStyle w:val="Hyperlink"/>
@@ -6328,7 +6367,7 @@
                 <w:noProof/>
                 <w:webHidden/>
               </w:rPr>
-              <w:instrText xml:space="preserve"> PAGEREF _Toc196147704 \h </w:instrText>
+              <w:instrText xml:space="preserve"> PAGEREF _Toc197679138 \h </w:instrText>
             </w:r>
             <w:r>
               <w:rPr>
@@ -6374,7 +6413,7 @@
               <w14:ligatures w14:val="standardContextual"/>
             </w:rPr>
           </w:pPr>
-          <w:hyperlink w:anchor="_Toc196147705" w:history="1">
+          <w:hyperlink w:anchor="_Toc197679139" w:history="1">
             <w:r>
               <w:rPr>
                 <w:rStyle w:val="Hyperlink"/>
@@ -6401,7 +6440,7 @@
                 <w:noProof/>
                 <w:webHidden/>
               </w:rPr>
-              <w:instrText xml:space="preserve"> PAGEREF _Toc196147705 \h </w:instrText>
+              <w:instrText xml:space="preserve"> PAGEREF _Toc197679139 \h </w:instrText>
             </w:r>
             <w:r>
               <w:rPr>
@@ -6447,7 +6486,7 @@
               <w14:ligatures w14:val="standardContextual"/>
             </w:rPr>
           </w:pPr>
-          <w:hyperlink w:anchor="_Toc196147706" w:history="1">
+          <w:hyperlink w:anchor="_Toc197679140" w:history="1">
             <w:r>
               <w:rPr>
                 <w:rStyle w:val="Hyperlink"/>
@@ -6474,7 +6513,7 @@
                 <w:noProof/>
                 <w:webHidden/>
               </w:rPr>
-              <w:instrText xml:space="preserve"> PAGEREF _Toc196147706 \h </w:instrText>
+              <w:instrText xml:space="preserve"> PAGEREF _Toc197679140 \h </w:instrText>
             </w:r>
             <w:r>
               <w:rPr>
@@ -6520,7 +6559,7 @@
               <w14:ligatures w14:val="standardContextual"/>
             </w:rPr>
           </w:pPr>
-          <w:hyperlink w:anchor="_Toc196147707" w:history="1">
+          <w:hyperlink w:anchor="_Toc197679141" w:history="1">
             <w:r>
               <w:rPr>
                 <w:rStyle w:val="Hyperlink"/>
@@ -6547,7 +6586,7 @@
                 <w:noProof/>
                 <w:webHidden/>
               </w:rPr>
-              <w:instrText xml:space="preserve"> PAGEREF _Toc196147707 \h </w:instrText>
+              <w:instrText xml:space="preserve"> PAGEREF _Toc197679141 \h </w:instrText>
             </w:r>
             <w:r>
               <w:rPr>
@@ -6593,7 +6632,7 @@
               <w14:ligatures w14:val="standardContextual"/>
             </w:rPr>
           </w:pPr>
-          <w:hyperlink w:anchor="_Toc196147708" w:history="1">
+          <w:hyperlink w:anchor="_Toc197679142" w:history="1">
             <w:r>
               <w:rPr>
                 <w:rStyle w:val="Hyperlink"/>
@@ -6620,7 +6659,7 @@
                 <w:noProof/>
                 <w:webHidden/>
               </w:rPr>
-              <w:instrText xml:space="preserve"> PAGEREF _Toc196147708 \h </w:instrText>
+              <w:instrText xml:space="preserve"> PAGEREF _Toc197679142 \h </w:instrText>
             </w:r>
             <w:r>
               <w:rPr>
@@ -6666,7 +6705,7 @@
               <w14:ligatures w14:val="standardContextual"/>
             </w:rPr>
           </w:pPr>
-          <w:hyperlink w:anchor="_Toc196147709" w:history="1">
+          <w:hyperlink w:anchor="_Toc197679143" w:history="1">
             <w:r>
               <w:rPr>
                 <w:rStyle w:val="Hyperlink"/>
@@ -6693,7 +6732,7 @@
                 <w:noProof/>
                 <w:webHidden/>
               </w:rPr>
-              <w:instrText xml:space="preserve"> PAGEREF _Toc196147709 \h </w:instrText>
+              <w:instrText xml:space="preserve"> PAGEREF _Toc197679143 \h </w:instrText>
             </w:r>
             <w:r>
               <w:rPr>
@@ -6739,7 +6778,7 @@
               <w14:ligatures w14:val="standardContextual"/>
             </w:rPr>
           </w:pPr>
-          <w:hyperlink w:anchor="_Toc196147710" w:history="1">
+          <w:hyperlink w:anchor="_Toc197679144" w:history="1">
             <w:r>
               <w:rPr>
                 <w:rStyle w:val="Hyperlink"/>
@@ -6766,7 +6805,7 @@
                 <w:noProof/>
                 <w:webHidden/>
               </w:rPr>
-              <w:instrText xml:space="preserve"> PAGEREF _Toc196147710 \h </w:instrText>
+              <w:instrText xml:space="preserve"> PAGEREF _Toc197679144 \h </w:instrText>
             </w:r>
             <w:r>
               <w:rPr>
@@ -6812,7 +6851,7 @@
               <w14:ligatures w14:val="standardContextual"/>
             </w:rPr>
           </w:pPr>
-          <w:hyperlink w:anchor="_Toc196147711" w:history="1">
+          <w:hyperlink w:anchor="_Toc197679145" w:history="1">
             <w:r>
               <w:rPr>
                 <w:rStyle w:val="Hyperlink"/>
@@ -6839,7 +6878,7 @@
                 <w:noProof/>
                 <w:webHidden/>
               </w:rPr>
-              <w:instrText xml:space="preserve"> PAGEREF _Toc196147711 \h </w:instrText>
+              <w:instrText xml:space="preserve"> PAGEREF _Toc197679145 \h </w:instrText>
             </w:r>
             <w:r>
               <w:rPr>
@@ -6885,7 +6924,7 @@
               <w14:ligatures w14:val="standardContextual"/>
             </w:rPr>
           </w:pPr>
-          <w:hyperlink w:anchor="_Toc196147712" w:history="1">
+          <w:hyperlink w:anchor="_Toc197679146" w:history="1">
             <w:r>
               <w:rPr>
                 <w:rStyle w:val="Hyperlink"/>
@@ -6912,7 +6951,7 @@
                 <w:noProof/>
                 <w:webHidden/>
               </w:rPr>
-              <w:instrText xml:space="preserve"> PAGEREF _Toc196147712 \h </w:instrText>
+              <w:instrText xml:space="preserve"> PAGEREF _Toc197679146 \h </w:instrText>
             </w:r>
             <w:r>
               <w:rPr>
@@ -6958,7 +6997,7 @@
               <w14:ligatures w14:val="standardContextual"/>
             </w:rPr>
           </w:pPr>
-          <w:hyperlink w:anchor="_Toc196147713" w:history="1">
+          <w:hyperlink w:anchor="_Toc197679147" w:history="1">
             <w:r>
               <w:rPr>
                 <w:rStyle w:val="Hyperlink"/>
@@ -6985,7 +7024,7 @@
                 <w:noProof/>
                 <w:webHidden/>
               </w:rPr>
-              <w:instrText xml:space="preserve"> PAGEREF _Toc196147713 \h </w:instrText>
+              <w:instrText xml:space="preserve"> PAGEREF _Toc197679147 \h </w:instrText>
             </w:r>
             <w:r>
               <w:rPr>
@@ -7031,7 +7070,7 @@
               <w14:ligatures w14:val="standardContextual"/>
             </w:rPr>
           </w:pPr>
-          <w:hyperlink w:anchor="_Toc196147714" w:history="1">
+          <w:hyperlink w:anchor="_Toc197679148" w:history="1">
             <w:r>
               <w:rPr>
                 <w:rStyle w:val="Hyperlink"/>
@@ -7058,7 +7097,7 @@
                 <w:noProof/>
                 <w:webHidden/>
               </w:rPr>
-              <w:instrText xml:space="preserve"> PAGEREF _Toc196147714 \h </w:instrText>
+              <w:instrText xml:space="preserve"> PAGEREF _Toc197679148 \h </w:instrText>
             </w:r>
             <w:r>
               <w:rPr>
@@ -7104,7 +7143,7 @@
               <w14:ligatures w14:val="standardContextual"/>
             </w:rPr>
           </w:pPr>
-          <w:hyperlink w:anchor="_Toc196147715" w:history="1">
+          <w:hyperlink w:anchor="_Toc197679149" w:history="1">
             <w:r>
               <w:rPr>
                 <w:rStyle w:val="Hyperlink"/>
@@ -7131,7 +7170,7 @@
                 <w:noProof/>
                 <w:webHidden/>
               </w:rPr>
-              <w:instrText xml:space="preserve"> PAGEREF _Toc196147715 \h </w:instrText>
+              <w:instrText xml:space="preserve"> PAGEREF _Toc197679149 \h </w:instrText>
             </w:r>
             <w:r>
               <w:rPr>
@@ -7177,13 +7216,13 @@
               <w14:ligatures w14:val="standardContextual"/>
             </w:rPr>
           </w:pPr>
-          <w:hyperlink w:anchor="_Toc196147716" w:history="1">
+          <w:hyperlink w:anchor="_Toc197679150" w:history="1">
             <w:r>
               <w:rPr>
                 <w:rStyle w:val="Hyperlink"/>
                 <w:noProof/>
               </w:rPr>
-              <w:t>Favicon.ico Request</w:t>
+              <w:t>Hello Request</w:t>
             </w:r>
             <w:r>
               <w:rPr>
@@ -7204,7 +7243,7 @@
                 <w:noProof/>
                 <w:webHidden/>
               </w:rPr>
-              <w:instrText xml:space="preserve"> PAGEREF _Toc196147716 \h </w:instrText>
+              <w:instrText xml:space="preserve"> PAGEREF _Toc197679150 \h </w:instrText>
             </w:r>
             <w:r>
               <w:rPr>
@@ -7250,12 +7289,85 @@
               <w14:ligatures w14:val="standardContextual"/>
             </w:rPr>
           </w:pPr>
-          <w:hyperlink w:anchor="_Toc196147717" w:history="1">
+          <w:hyperlink w:anchor="_Toc197679151" w:history="1">
             <w:r>
               <w:rPr>
                 <w:rStyle w:val="Hyperlink"/>
                 <w:noProof/>
               </w:rPr>
+              <w:t>Favicon.ico Request</w:t>
+            </w:r>
+            <w:r>
+              <w:rPr>
+                <w:noProof/>
+                <w:webHidden/>
+              </w:rPr>
+              <w:tab/>
+            </w:r>
+            <w:r>
+              <w:rPr>
+                <w:noProof/>
+                <w:webHidden/>
+              </w:rPr>
+              <w:fldChar w:fldCharType="begin"/>
+            </w:r>
+            <w:r>
+              <w:rPr>
+                <w:noProof/>
+                <w:webHidden/>
+              </w:rPr>
+              <w:instrText xml:space="preserve"> PAGEREF _Toc197679151 \h </w:instrText>
+            </w:r>
+            <w:r>
+              <w:rPr>
+                <w:noProof/>
+                <w:webHidden/>
+              </w:rPr>
+            </w:r>
+            <w:r>
+              <w:rPr>
+                <w:noProof/>
+                <w:webHidden/>
+              </w:rPr>
+              <w:fldChar w:fldCharType="separate"/>
+            </w:r>
+            <w:r>
+              <w:rPr>
+                <w:noProof/>
+                <w:webHidden/>
+              </w:rPr>
+              <w:t>58</w:t>
+            </w:r>
+            <w:r>
+              <w:rPr>
+                <w:noProof/>
+                <w:webHidden/>
+              </w:rPr>
+              <w:fldChar w:fldCharType="end"/>
+            </w:r>
+          </w:hyperlink>
+        </w:p>
+        <w:p>
+          <w:pPr>
+            <w:pStyle w:val="TOC2"/>
+            <w:tabs>
+              <w:tab w:val="right" w:leader="dot" w:pos="9350"/>
+            </w:tabs>
+            <w:rPr>
+              <w:rFonts w:eastAsiaTheme="minorEastAsia"/>
+              <w:noProof/>
+              <w:kern w:val="2"/>
+              <w:sz w:val="24"/>
+              <w:szCs w:val="24"/>
+              <w14:ligatures w14:val="standardContextual"/>
+            </w:rPr>
+          </w:pPr>
+          <w:hyperlink w:anchor="_Toc197679152" w:history="1">
+            <w:r>
+              <w:rPr>
+                <w:rStyle w:val="Hyperlink"/>
+                <w:noProof/>
+              </w:rPr>
               <w:t>Unknown URL Request</w:t>
             </w:r>
             <w:r>
@@ -7277,7 +7389,7 @@
                 <w:noProof/>
                 <w:webHidden/>
               </w:rPr>
-              <w:instrText xml:space="preserve"> PAGEREF _Toc196147717 \h </w:instrText>
+              <w:instrText xml:space="preserve"> PAGEREF _Toc197679152 \h </w:instrText>
             </w:r>
             <w:r>
               <w:rPr>
@@ -7297,7 +7409,7 @@
                 <w:noProof/>
                 <w:webHidden/>
               </w:rPr>
-              <w:t>57</w:t>
+              <w:t>58</w:t>
             </w:r>
             <w:r>
               <w:rPr>
@@ -7323,7 +7435,7 @@
               <w14:ligatures w14:val="standardContextual"/>
             </w:rPr>
           </w:pPr>
-          <w:hyperlink w:anchor="_Toc196147718" w:history="1">
+          <w:hyperlink w:anchor="_Toc197679153" w:history="1">
             <w:r>
               <w:rPr>
                 <w:rStyle w:val="Hyperlink"/>
@@ -7350,7 +7462,7 @@
                 <w:noProof/>
                 <w:webHidden/>
               </w:rPr>
-              <w:instrText xml:space="preserve"> PAGEREF _Toc196147718 \h </w:instrText>
+              <w:instrText xml:space="preserve"> PAGEREF _Toc197679153 \h </w:instrText>
             </w:r>
             <w:r>
               <w:rPr>
@@ -7370,7 +7482,7 @@
                 <w:noProof/>
                 <w:webHidden/>
               </w:rPr>
-              <w:t>58</w:t>
+              <w:t>59</w:t>
             </w:r>
             <w:r>
               <w:rPr>
@@ -7396,7 +7508,7 @@
               <w14:ligatures w14:val="standardContextual"/>
             </w:rPr>
           </w:pPr>
-          <w:hyperlink w:anchor="_Toc196147719" w:history="1">
+          <w:hyperlink w:anchor="_Toc197679154" w:history="1">
             <w:r>
               <w:rPr>
                 <w:rStyle w:val="Hyperlink"/>
@@ -7423,7 +7535,7 @@
                 <w:noProof/>
                 <w:webHidden/>
               </w:rPr>
-              <w:instrText xml:space="preserve"> PAGEREF _Toc196147719 \h </w:instrText>
+              <w:instrText xml:space="preserve"> PAGEREF _Toc197679154 \h </w:instrText>
             </w:r>
             <w:r>
               <w:rPr>
@@ -7443,7 +7555,7 @@
                 <w:noProof/>
                 <w:webHidden/>
               </w:rPr>
-              <w:t>58</w:t>
+              <w:t>59</w:t>
             </w:r>
             <w:r>
               <w:rPr>
@@ -7469,7 +7581,7 @@
               <w14:ligatures w14:val="standardContextual"/>
             </w:rPr>
           </w:pPr>
-          <w:hyperlink w:anchor="_Toc196147720" w:history="1">
+          <w:hyperlink w:anchor="_Toc197679155" w:history="1">
             <w:r>
               <w:rPr>
                 <w:rStyle w:val="Hyperlink"/>
@@ -7496,7 +7608,7 @@
                 <w:noProof/>
                 <w:webHidden/>
               </w:rPr>
-              <w:instrText xml:space="preserve"> PAGEREF _Toc196147720 \h </w:instrText>
+              <w:instrText xml:space="preserve"> PAGEREF _Toc197679155 \h </w:instrText>
             </w:r>
             <w:r>
               <w:rPr>
@@ -7516,7 +7628,7 @@
                 <w:noProof/>
                 <w:webHidden/>
               </w:rPr>
-              <w:t>58</w:t>
+              <w:t>59</w:t>
             </w:r>
             <w:r>
               <w:rPr>
@@ -7542,7 +7654,7 @@
               <w14:ligatures w14:val="standardContextual"/>
             </w:rPr>
           </w:pPr>
-          <w:hyperlink w:anchor="_Toc196147721" w:history="1">
+          <w:hyperlink w:anchor="_Toc197679156" w:history="1">
             <w:r>
               <w:rPr>
                 <w:rStyle w:val="Hyperlink"/>
@@ -7569,7 +7681,7 @@
                 <w:noProof/>
                 <w:webHidden/>
               </w:rPr>
-              <w:instrText xml:space="preserve"> PAGEREF _Toc196147721 \h </w:instrText>
+              <w:instrText xml:space="preserve"> PAGEREF _Toc197679156 \h </w:instrText>
             </w:r>
             <w:r>
               <w:rPr>
@@ -7589,7 +7701,7 @@
                 <w:noProof/>
                 <w:webHidden/>
               </w:rPr>
-              <w:t>59</w:t>
+              <w:t>60</w:t>
             </w:r>
             <w:r>
               <w:rPr>
@@ -7615,7 +7727,7 @@
               <w14:ligatures w14:val="standardContextual"/>
             </w:rPr>
           </w:pPr>
-          <w:hyperlink w:anchor="_Toc196147722" w:history="1">
+          <w:hyperlink w:anchor="_Toc197679157" w:history="1">
             <w:r>
               <w:rPr>
                 <w:rStyle w:val="Hyperlink"/>
@@ -7642,7 +7754,7 @@
                 <w:noProof/>
                 <w:webHidden/>
               </w:rPr>
-              <w:instrText xml:space="preserve"> PAGEREF _Toc196147722 \h </w:instrText>
+              <w:instrText xml:space="preserve"> PAGEREF _Toc197679157 \h </w:instrText>
             </w:r>
             <w:r>
               <w:rPr>
@@ -7662,7 +7774,7 @@
                 <w:noProof/>
                 <w:webHidden/>
               </w:rPr>
-              <w:t>59</w:t>
+              <w:t>60</w:t>
             </w:r>
             <w:r>
               <w:rPr>
@@ -7688,7 +7800,7 @@
               <w14:ligatures w14:val="standardContextual"/>
             </w:rPr>
           </w:pPr>
-          <w:hyperlink w:anchor="_Toc196147723" w:history="1">
+          <w:hyperlink w:anchor="_Toc197679158" w:history="1">
             <w:r>
               <w:rPr>
                 <w:rStyle w:val="Hyperlink"/>
@@ -7715,7 +7827,7 @@
                 <w:noProof/>
                 <w:webHidden/>
               </w:rPr>
-              <w:instrText xml:space="preserve"> PAGEREF _Toc196147723 \h </w:instrText>
+              <w:instrText xml:space="preserve"> PAGEREF _Toc197679158 \h </w:instrText>
             </w:r>
             <w:r>
               <w:rPr>
@@ -7735,7 +7847,7 @@
                 <w:noProof/>
                 <w:webHidden/>
               </w:rPr>
-              <w:t>59</w:t>
+              <w:t>60</w:t>
             </w:r>
             <w:r>
               <w:rPr>
@@ -7761,7 +7873,7 @@
               <w14:ligatures w14:val="standardContextual"/>
             </w:rPr>
           </w:pPr>
-          <w:hyperlink w:anchor="_Toc196147724" w:history="1">
+          <w:hyperlink w:anchor="_Toc197679159" w:history="1">
             <w:r>
               <w:rPr>
                 <w:rStyle w:val="Hyperlink"/>
@@ -7788,7 +7900,7 @@
                 <w:noProof/>
                 <w:webHidden/>
               </w:rPr>
-              <w:instrText xml:space="preserve"> PAGEREF _Toc196147724 \h </w:instrText>
+              <w:instrText xml:space="preserve"> PAGEREF _Toc197679159 \h </w:instrText>
             </w:r>
             <w:r>
               <w:rPr>
@@ -7808,7 +7920,7 @@
                 <w:noProof/>
                 <w:webHidden/>
               </w:rPr>
-              <w:t>60</w:t>
+              <w:t>61</w:t>
             </w:r>
             <w:r>
               <w:rPr>
@@ -7834,7 +7946,7 @@
               <w14:ligatures w14:val="standardContextual"/>
             </w:rPr>
           </w:pPr>
-          <w:hyperlink w:anchor="_Toc196147725" w:history="1">
+          <w:hyperlink w:anchor="_Toc197679160" w:history="1">
             <w:r>
               <w:rPr>
                 <w:rStyle w:val="Hyperlink"/>
@@ -7861,7 +7973,7 @@
                 <w:noProof/>
                 <w:webHidden/>
               </w:rPr>
-              <w:instrText xml:space="preserve"> PAGEREF _Toc196147725 \h </w:instrText>
+              <w:instrText xml:space="preserve"> PAGEREF _Toc197679160 \h </w:instrText>
             </w:r>
             <w:r>
               <w:rPr>
@@ -7881,7 +7993,7 @@
                 <w:noProof/>
                 <w:webHidden/>
               </w:rPr>
-              <w:t>60</w:t>
+              <w:t>61</w:t>
             </w:r>
             <w:r>
               <w:rPr>
@@ -7907,7 +8019,7 @@
               <w14:ligatures w14:val="standardContextual"/>
             </w:rPr>
           </w:pPr>
-          <w:hyperlink w:anchor="_Toc196147726" w:history="1">
+          <w:hyperlink w:anchor="_Toc197679161" w:history="1">
             <w:r>
               <w:rPr>
                 <w:rStyle w:val="Hyperlink"/>
@@ -7934,7 +8046,7 @@
                 <w:noProof/>
                 <w:webHidden/>
               </w:rPr>
-              <w:instrText xml:space="preserve"> PAGEREF _Toc196147726 \h </w:instrText>
+              <w:instrText xml:space="preserve"> PAGEREF _Toc197679161 \h </w:instrText>
             </w:r>
             <w:r>
               <w:rPr>
@@ -7954,7 +8066,7 @@
                 <w:noProof/>
                 <w:webHidden/>
               </w:rPr>
-              <w:t>60</w:t>
+              <w:t>61</w:t>
             </w:r>
             <w:r>
               <w:rPr>
@@ -7980,7 +8092,7 @@
               <w14:ligatures w14:val="standardContextual"/>
             </w:rPr>
           </w:pPr>
-          <w:hyperlink w:anchor="_Toc196147727" w:history="1">
+          <w:hyperlink w:anchor="_Toc197679162" w:history="1">
             <w:r>
               <w:rPr>
                 <w:rStyle w:val="Hyperlink"/>
@@ -8007,7 +8119,7 @@
                 <w:noProof/>
                 <w:webHidden/>
               </w:rPr>
-              <w:instrText xml:space="preserve"> PAGEREF _Toc196147727 \h </w:instrText>
+              <w:instrText xml:space="preserve"> PAGEREF _Toc197679162 \h </w:instrText>
             </w:r>
             <w:r>
               <w:rPr>
@@ -8053,7 +8165,7 @@
               <w14:ligatures w14:val="standardContextual"/>
             </w:rPr>
           </w:pPr>
-          <w:hyperlink w:anchor="_Toc196147728" w:history="1">
+          <w:hyperlink w:anchor="_Toc197679163" w:history="1">
             <w:r>
               <w:rPr>
                 <w:rStyle w:val="Hyperlink"/>
@@ -8080,7 +8192,7 @@
                 <w:noProof/>
                 <w:webHidden/>
               </w:rPr>
-              <w:instrText xml:space="preserve"> PAGEREF _Toc196147728 \h </w:instrText>
+              <w:instrText xml:space="preserve"> PAGEREF _Toc197679163 \h </w:instrText>
             </w:r>
             <w:r>
               <w:rPr>
@@ -8100,7 +8212,7 @@
                 <w:noProof/>
                 <w:webHidden/>
               </w:rPr>
-              <w:t>63</w:t>
+              <w:t>64</w:t>
             </w:r>
             <w:r>
               <w:rPr>
@@ -8126,7 +8238,7 @@
               <w14:ligatures w14:val="standardContextual"/>
             </w:rPr>
           </w:pPr>
-          <w:hyperlink w:anchor="_Toc196147729" w:history="1">
+          <w:hyperlink w:anchor="_Toc197679164" w:history="1">
             <w:r>
               <w:rPr>
                 <w:rStyle w:val="Hyperlink"/>
@@ -8153,7 +8265,7 @@
                 <w:noProof/>
                 <w:webHidden/>
               </w:rPr>
-              <w:instrText xml:space="preserve"> PAGEREF _Toc196147729 \h </w:instrText>
+              <w:instrText xml:space="preserve"> PAGEREF _Toc197679164 \h </w:instrText>
             </w:r>
             <w:r>
               <w:rPr>
@@ -8173,7 +8285,7 @@
                 <w:noProof/>
                 <w:webHidden/>
               </w:rPr>
-              <w:t>63</w:t>
+              <w:t>64</w:t>
             </w:r>
             <w:r>
               <w:rPr>
@@ -8199,7 +8311,7 @@
               <w14:ligatures w14:val="standardContextual"/>
             </w:rPr>
           </w:pPr>
-          <w:hyperlink w:anchor="_Toc196147730" w:history="1">
+          <w:hyperlink w:anchor="_Toc197679165" w:history="1">
             <w:r>
               <w:rPr>
                 <w:rStyle w:val="Hyperlink"/>
@@ -8226,7 +8338,7 @@
                 <w:noProof/>
                 <w:webHidden/>
               </w:rPr>
-              <w:instrText xml:space="preserve"> PAGEREF _Toc196147730 \h </w:instrText>
+              <w:instrText xml:space="preserve"> PAGEREF _Toc197679165 \h </w:instrText>
             </w:r>
             <w:r>
               <w:rPr>
@@ -8246,7 +8358,7 @@
                 <w:noProof/>
                 <w:webHidden/>
               </w:rPr>
-              <w:t>64</w:t>
+              <w:t>65</w:t>
             </w:r>
             <w:r>
               <w:rPr>
@@ -8272,7 +8384,7 @@
               <w14:ligatures w14:val="standardContextual"/>
             </w:rPr>
           </w:pPr>
-          <w:hyperlink w:anchor="_Toc196147731" w:history="1">
+          <w:hyperlink w:anchor="_Toc197679166" w:history="1">
             <w:r>
               <w:rPr>
                 <w:rStyle w:val="Hyperlink"/>
@@ -8299,7 +8411,7 @@
                 <w:noProof/>
                 <w:webHidden/>
               </w:rPr>
-              <w:instrText xml:space="preserve"> PAGEREF _Toc196147731 \h </w:instrText>
+              <w:instrText xml:space="preserve"> PAGEREF _Toc197679166 \h </w:instrText>
             </w:r>
             <w:r>
               <w:rPr>
@@ -8319,7 +8431,7 @@
                 <w:noProof/>
                 <w:webHidden/>
               </w:rPr>
-              <w:t>64</w:t>
+              <w:t>65</w:t>
             </w:r>
             <w:r>
               <w:rPr>
@@ -8345,7 +8457,7 @@
               <w14:ligatures w14:val="standardContextual"/>
             </w:rPr>
           </w:pPr>
-          <w:hyperlink w:anchor="_Toc196147732" w:history="1">
+          <w:hyperlink w:anchor="_Toc197679167" w:history="1">
             <w:r>
               <w:rPr>
                 <w:rStyle w:val="Hyperlink"/>
@@ -8372,7 +8484,7 @@
                 <w:noProof/>
                 <w:webHidden/>
               </w:rPr>
-              <w:instrText xml:space="preserve"> PAGEREF _Toc196147732 \h </w:instrText>
+              <w:instrText xml:space="preserve"> PAGEREF _Toc197679167 \h </w:instrText>
             </w:r>
             <w:r>
               <w:rPr>
@@ -8418,7 +8530,7 @@
               <w14:ligatures w14:val="standardContextual"/>
             </w:rPr>
           </w:pPr>
-          <w:hyperlink w:anchor="_Toc196147733" w:history="1">
+          <w:hyperlink w:anchor="_Toc197679168" w:history="1">
             <w:r>
               <w:rPr>
                 <w:rStyle w:val="Hyperlink"/>
@@ -8445,7 +8557,7 @@
                 <w:noProof/>
                 <w:webHidden/>
               </w:rPr>
-              <w:instrText xml:space="preserve"> PAGEREF _Toc196147733 \h </w:instrText>
+              <w:instrText xml:space="preserve"> PAGEREF _Toc197679168 \h </w:instrText>
             </w:r>
             <w:r>
               <w:rPr>
@@ -8491,7 +8603,7 @@
               <w14:ligatures w14:val="standardContextual"/>
             </w:rPr>
           </w:pPr>
-          <w:hyperlink w:anchor="_Toc196147734" w:history="1">
+          <w:hyperlink w:anchor="_Toc197679169" w:history="1">
             <w:r>
               <w:rPr>
                 <w:rStyle w:val="Hyperlink"/>
@@ -8518,7 +8630,7 @@
                 <w:noProof/>
                 <w:webHidden/>
               </w:rPr>
-              <w:instrText xml:space="preserve"> PAGEREF _Toc196147734 \h </w:instrText>
+              <w:instrText xml:space="preserve"> PAGEREF _Toc197679169 \h </w:instrText>
             </w:r>
             <w:r>
               <w:rPr>
@@ -8538,7 +8650,7 @@
                 <w:noProof/>
                 <w:webHidden/>
               </w:rPr>
-              <w:t>66</w:t>
+              <w:t>67</w:t>
             </w:r>
             <w:r>
               <w:rPr>
@@ -8564,7 +8676,7 @@
               <w14:ligatures w14:val="standardContextual"/>
             </w:rPr>
           </w:pPr>
-          <w:hyperlink w:anchor="_Toc196147735" w:history="1">
+          <w:hyperlink w:anchor="_Toc197679170" w:history="1">
             <w:r>
               <w:rPr>
                 <w:rStyle w:val="Hyperlink"/>
@@ -8591,7 +8703,7 @@
                 <w:noProof/>
                 <w:webHidden/>
               </w:rPr>
-              <w:instrText xml:space="preserve"> PAGEREF _Toc196147735 \h </w:instrText>
+              <w:instrText xml:space="preserve"> PAGEREF _Toc197679170 \h </w:instrText>
             </w:r>
             <w:r>
               <w:rPr>
@@ -8611,7 +8723,7 @@
                 <w:noProof/>
                 <w:webHidden/>
               </w:rPr>
-              <w:t>67</w:t>
+              <w:t>68</w:t>
             </w:r>
             <w:r>
               <w:rPr>
@@ -8637,7 +8749,7 @@
               <w14:ligatures w14:val="standardContextual"/>
             </w:rPr>
           </w:pPr>
-          <w:hyperlink w:anchor="_Toc196147736" w:history="1">
+          <w:hyperlink w:anchor="_Toc197679171" w:history="1">
             <w:r>
               <w:rPr>
                 <w:rStyle w:val="Hyperlink"/>
@@ -8664,7 +8776,7 @@
                 <w:noProof/>
                 <w:webHidden/>
               </w:rPr>
-              <w:instrText xml:space="preserve"> PAGEREF _Toc196147736 \h </w:instrText>
+              <w:instrText xml:space="preserve"> PAGEREF _Toc197679171 \h </w:instrText>
             </w:r>
             <w:r>
               <w:rPr>
@@ -8684,7 +8796,7 @@
                 <w:noProof/>
                 <w:webHidden/>
               </w:rPr>
-              <w:t>67</w:t>
+              <w:t>68</w:t>
             </w:r>
             <w:r>
               <w:rPr>
@@ -8710,7 +8822,7 @@
               <w14:ligatures w14:val="standardContextual"/>
             </w:rPr>
           </w:pPr>
-          <w:hyperlink w:anchor="_Toc196147737" w:history="1">
+          <w:hyperlink w:anchor="_Toc197679172" w:history="1">
             <w:r>
               <w:rPr>
                 <w:rStyle w:val="Hyperlink"/>
@@ -8737,7 +8849,7 @@
                 <w:noProof/>
                 <w:webHidden/>
               </w:rPr>
-              <w:instrText xml:space="preserve"> PAGEREF _Toc196147737 \h </w:instrText>
+              <w:instrText xml:space="preserve"> PAGEREF _Toc197679172 \h </w:instrText>
             </w:r>
             <w:r>
               <w:rPr>
@@ -8757,7 +8869,7 @@
                 <w:noProof/>
                 <w:webHidden/>
               </w:rPr>
-              <w:t>68</w:t>
+              <w:t>69</w:t>
             </w:r>
             <w:r>
               <w:rPr>
@@ -8783,7 +8895,7 @@
               <w14:ligatures w14:val="standardContextual"/>
             </w:rPr>
           </w:pPr>
-          <w:hyperlink w:anchor="_Toc196147738" w:history="1">
+          <w:hyperlink w:anchor="_Toc197679173" w:history="1">
             <w:r>
               <w:rPr>
                 <w:rStyle w:val="Hyperlink"/>
@@ -8810,7 +8922,7 @@
                 <w:noProof/>
                 <w:webHidden/>
               </w:rPr>
-              <w:instrText xml:space="preserve"> PAGEREF _Toc196147738 \h </w:instrText>
+              <w:instrText xml:space="preserve"> PAGEREF _Toc197679173 \h </w:instrText>
             </w:r>
             <w:r>
               <w:rPr>
@@ -8830,7 +8942,7 @@
                 <w:noProof/>
                 <w:webHidden/>
               </w:rPr>
-              <w:t>68</w:t>
+              <w:t>69</w:t>
             </w:r>
             <w:r>
               <w:rPr>
@@ -8856,7 +8968,7 @@
               <w14:ligatures w14:val="standardContextual"/>
             </w:rPr>
           </w:pPr>
-          <w:hyperlink w:anchor="_Toc196147739" w:history="1">
+          <w:hyperlink w:anchor="_Toc197679174" w:history="1">
             <w:r>
               <w:rPr>
                 <w:rStyle w:val="Hyperlink"/>
@@ -8883,7 +8995,7 @@
                 <w:noProof/>
                 <w:webHidden/>
               </w:rPr>
-              <w:instrText xml:space="preserve"> PAGEREF _Toc196147739 \h </w:instrText>
+              <w:instrText xml:space="preserve"> PAGEREF _Toc197679174 \h </w:instrText>
             </w:r>
             <w:r>
               <w:rPr>
@@ -8903,7 +9015,7 @@
                 <w:noProof/>
                 <w:webHidden/>
               </w:rPr>
-              <w:t>69</w:t>
+              <w:t>70</w:t>
             </w:r>
             <w:r>
               <w:rPr>
@@ -8929,7 +9041,7 @@
               <w14:ligatures w14:val="standardContextual"/>
             </w:rPr>
           </w:pPr>
-          <w:hyperlink w:anchor="_Toc196147740" w:history="1">
+          <w:hyperlink w:anchor="_Toc197679175" w:history="1">
             <w:r>
               <w:rPr>
                 <w:rStyle w:val="Hyperlink"/>
@@ -8956,7 +9068,7 @@
                 <w:noProof/>
                 <w:webHidden/>
               </w:rPr>
-              <w:instrText xml:space="preserve"> PAGEREF _Toc196147740 \h </w:instrText>
+              <w:instrText xml:space="preserve"> PAGEREF _Toc197679175 \h </w:instrText>
             </w:r>
             <w:r>
               <w:rPr>
@@ -8976,7 +9088,7 @@
                 <w:noProof/>
                 <w:webHidden/>
               </w:rPr>
-              <w:t>69</w:t>
+              <w:t>70</w:t>
             </w:r>
             <w:r>
               <w:rPr>
@@ -9002,7 +9114,7 @@
               <w14:ligatures w14:val="standardContextual"/>
             </w:rPr>
           </w:pPr>
-          <w:hyperlink w:anchor="_Toc196147741" w:history="1">
+          <w:hyperlink w:anchor="_Toc197679176" w:history="1">
             <w:r>
               <w:rPr>
                 <w:rStyle w:val="Hyperlink"/>
@@ -9029,7 +9141,7 @@
                 <w:noProof/>
                 <w:webHidden/>
               </w:rPr>
-              <w:instrText xml:space="preserve"> PAGEREF _Toc196147741 \h </w:instrText>
+              <w:instrText xml:space="preserve"> PAGEREF _Toc197679176 \h </w:instrText>
             </w:r>
             <w:r>
               <w:rPr>
@@ -9049,7 +9161,7 @@
                 <w:noProof/>
                 <w:webHidden/>
               </w:rPr>
-              <w:t>70</w:t>
+              <w:t>71</w:t>
             </w:r>
             <w:r>
               <w:rPr>
@@ -9075,7 +9187,7 @@
               <w14:ligatures w14:val="standardContextual"/>
             </w:rPr>
           </w:pPr>
-          <w:hyperlink w:anchor="_Toc196147742" w:history="1">
+          <w:hyperlink w:anchor="_Toc197679177" w:history="1">
             <w:r>
               <w:rPr>
                 <w:rStyle w:val="Hyperlink"/>
@@ -9102,7 +9214,7 @@
                 <w:noProof/>
                 <w:webHidden/>
               </w:rPr>
-              <w:instrText xml:space="preserve"> PAGEREF _Toc196147742 \h </w:instrText>
+              <w:instrText xml:space="preserve"> PAGEREF _Toc197679177 \h </w:instrText>
             </w:r>
             <w:r>
               <w:rPr>
@@ -9122,7 +9234,7 @@
                 <w:noProof/>
                 <w:webHidden/>
               </w:rPr>
-              <w:t>70</w:t>
+              <w:t>71</w:t>
             </w:r>
             <w:r>
               <w:rPr>
@@ -9148,7 +9260,7 @@
               <w14:ligatures w14:val="standardContextual"/>
             </w:rPr>
           </w:pPr>
-          <w:hyperlink w:anchor="_Toc196147743" w:history="1">
+          <w:hyperlink w:anchor="_Toc197679178" w:history="1">
             <w:r>
               <w:rPr>
                 <w:rStyle w:val="Hyperlink"/>
@@ -9175,7 +9287,7 @@
                 <w:noProof/>
                 <w:webHidden/>
               </w:rPr>
-              <w:instrText xml:space="preserve"> PAGEREF _Toc196147743 \h </w:instrText>
+              <w:instrText xml:space="preserve"> PAGEREF _Toc197679178 \h </w:instrText>
             </w:r>
             <w:r>
               <w:rPr>
@@ -9195,7 +9307,7 @@
                 <w:noProof/>
                 <w:webHidden/>
               </w:rPr>
-              <w:t>71</w:t>
+              <w:t>72</w:t>
             </w:r>
             <w:r>
               <w:rPr>
@@ -9221,7 +9333,7 @@
               <w14:ligatures w14:val="standardContextual"/>
             </w:rPr>
           </w:pPr>
-          <w:hyperlink w:anchor="_Toc196147744" w:history="1">
+          <w:hyperlink w:anchor="_Toc197679179" w:history="1">
             <w:r>
               <w:rPr>
                 <w:rStyle w:val="Hyperlink"/>
@@ -9248,7 +9360,7 @@
                 <w:noProof/>
                 <w:webHidden/>
               </w:rPr>
-              <w:instrText xml:space="preserve"> PAGEREF _Toc196147744 \h </w:instrText>
+              <w:instrText xml:space="preserve"> PAGEREF _Toc197679179 \h </w:instrText>
             </w:r>
             <w:r>
               <w:rPr>
@@ -9268,7 +9380,7 @@
                 <w:noProof/>
                 <w:webHidden/>
               </w:rPr>
-              <w:t>72</w:t>
+              <w:t>73</w:t>
             </w:r>
             <w:r>
               <w:rPr>
@@ -9294,7 +9406,7 @@
               <w14:ligatures w14:val="standardContextual"/>
             </w:rPr>
           </w:pPr>
-          <w:hyperlink w:anchor="_Toc196147745" w:history="1">
+          <w:hyperlink w:anchor="_Toc197679180" w:history="1">
             <w:r>
               <w:rPr>
                 <w:rStyle w:val="Hyperlink"/>
@@ -9321,7 +9433,7 @@
                 <w:noProof/>
                 <w:webHidden/>
               </w:rPr>
-              <w:instrText xml:space="preserve"> PAGEREF _Toc196147745 \h </w:instrText>
+              <w:instrText xml:space="preserve"> PAGEREF _Toc197679180 \h </w:instrText>
             </w:r>
             <w:r>
               <w:rPr>
@@ -9367,7 +9479,7 @@
               <w14:ligatures w14:val="standardContextual"/>
             </w:rPr>
           </w:pPr>
-          <w:hyperlink w:anchor="_Toc196147746" w:history="1">
+          <w:hyperlink w:anchor="_Toc197679181" w:history="1">
             <w:r>
               <w:rPr>
                 <w:rStyle w:val="Hyperlink"/>
@@ -9394,7 +9506,7 @@
                 <w:noProof/>
                 <w:webHidden/>
               </w:rPr>
-              <w:instrText xml:space="preserve"> PAGEREF _Toc196147746 \h </w:instrText>
+              <w:instrText xml:space="preserve"> PAGEREF _Toc197679181 \h </w:instrText>
             </w:r>
             <w:r>
               <w:rPr>
@@ -9440,7 +9552,7 @@
               <w14:ligatures w14:val="standardContextual"/>
             </w:rPr>
           </w:pPr>
-          <w:hyperlink w:anchor="_Toc196147747" w:history="1">
+          <w:hyperlink w:anchor="_Toc197679182" w:history="1">
             <w:r>
               <w:rPr>
                 <w:rStyle w:val="Hyperlink"/>
@@ -9467,7 +9579,7 @@
                 <w:noProof/>
                 <w:webHidden/>
               </w:rPr>
-              <w:instrText xml:space="preserve"> PAGEREF _Toc196147747 \h </w:instrText>
+              <w:instrText xml:space="preserve"> PAGEREF _Toc197679182 \h </w:instrText>
             </w:r>
             <w:r>
               <w:rPr>
@@ -9513,7 +9625,7 @@
               <w14:ligatures w14:val="standardContextual"/>
             </w:rPr>
           </w:pPr>
-          <w:hyperlink w:anchor="_Toc196147748" w:history="1">
+          <w:hyperlink w:anchor="_Toc197679183" w:history="1">
             <w:r>
               <w:rPr>
                 <w:rStyle w:val="Hyperlink"/>
@@ -9540,7 +9652,7 @@
                 <w:noProof/>
                 <w:webHidden/>
               </w:rPr>
-              <w:instrText xml:space="preserve"> PAGEREF _Toc196147748 \h </w:instrText>
+              <w:instrText xml:space="preserve"> PAGEREF _Toc197679183 \h </w:instrText>
             </w:r>
             <w:r>
               <w:rPr>
@@ -9586,7 +9698,7 @@
               <w14:ligatures w14:val="standardContextual"/>
             </w:rPr>
           </w:pPr>
-          <w:hyperlink w:anchor="_Toc196147749" w:history="1">
+          <w:hyperlink w:anchor="_Toc197679184" w:history="1">
             <w:r>
               <w:rPr>
                 <w:rStyle w:val="Hyperlink"/>
@@ -9613,7 +9725,7 @@
                 <w:noProof/>
                 <w:webHidden/>
               </w:rPr>
-              <w:instrText xml:space="preserve"> PAGEREF _Toc196147749 \h </w:instrText>
+              <w:instrText xml:space="preserve"> PAGEREF _Toc197679184 \h </w:instrText>
             </w:r>
             <w:r>
               <w:rPr>
@@ -9659,7 +9771,7 @@
               <w14:ligatures w14:val="standardContextual"/>
             </w:rPr>
           </w:pPr>
-          <w:hyperlink w:anchor="_Toc196147750" w:history="1">
+          <w:hyperlink w:anchor="_Toc197679185" w:history="1">
             <w:r>
               <w:rPr>
                 <w:rStyle w:val="Hyperlink"/>
@@ -9686,7 +9798,7 @@
                 <w:noProof/>
                 <w:webHidden/>
               </w:rPr>
-              <w:instrText xml:space="preserve"> PAGEREF _Toc196147750 \h </w:instrText>
+              <w:instrText xml:space="preserve"> PAGEREF _Toc197679185 \h </w:instrText>
             </w:r>
             <w:r>
               <w:rPr>
@@ -9732,7 +9844,7 @@
               <w14:ligatures w14:val="standardContextual"/>
             </w:rPr>
           </w:pPr>
-          <w:hyperlink w:anchor="_Toc196147751" w:history="1">
+          <w:hyperlink w:anchor="_Toc197679186" w:history="1">
             <w:r>
               <w:rPr>
                 <w:rStyle w:val="Hyperlink"/>
@@ -9759,7 +9871,7 @@
                 <w:noProof/>
                 <w:webHidden/>
               </w:rPr>
-              <w:instrText xml:space="preserve"> PAGEREF _Toc196147751 \h </w:instrText>
+              <w:instrText xml:space="preserve"> PAGEREF _Toc197679186 \h </w:instrText>
             </w:r>
             <w:r>
               <w:rPr>
@@ -9805,7 +9917,7 @@
               <w14:ligatures w14:val="standardContextual"/>
             </w:rPr>
           </w:pPr>
-          <w:hyperlink w:anchor="_Toc196147752" w:history="1">
+          <w:hyperlink w:anchor="_Toc197679187" w:history="1">
             <w:r>
               <w:rPr>
                 <w:rStyle w:val="Hyperlink"/>
@@ -9832,7 +9944,7 @@
                 <w:noProof/>
                 <w:webHidden/>
               </w:rPr>
-              <w:instrText xml:space="preserve"> PAGEREF _Toc196147752 \h </w:instrText>
+              <w:instrText xml:space="preserve"> PAGEREF _Toc197679187 \h </w:instrText>
             </w:r>
             <w:r>
               <w:rPr>
@@ -9878,7 +9990,7 @@
               <w14:ligatures w14:val="standardContextual"/>
             </w:rPr>
           </w:pPr>
-          <w:hyperlink w:anchor="_Toc196147753" w:history="1">
+          <w:hyperlink w:anchor="_Toc197679188" w:history="1">
             <w:r>
               <w:rPr>
                 <w:rStyle w:val="Hyperlink"/>
@@ -9905,7 +10017,7 @@
                 <w:noProof/>
                 <w:webHidden/>
               </w:rPr>
-              <w:instrText xml:space="preserve"> PAGEREF _Toc196147753 \h </w:instrText>
+              <w:instrText xml:space="preserve"> PAGEREF _Toc197679188 \h </w:instrText>
             </w:r>
             <w:r>
               <w:rPr>
@@ -9951,7 +10063,7 @@
               <w14:ligatures w14:val="standardContextual"/>
             </w:rPr>
           </w:pPr>
-          <w:hyperlink w:anchor="_Toc196147754" w:history="1">
+          <w:hyperlink w:anchor="_Toc197679189" w:history="1">
             <w:r>
               <w:rPr>
                 <w:rStyle w:val="Hyperlink"/>
@@ -9978,7 +10090,7 @@
                 <w:noProof/>
                 <w:webHidden/>
               </w:rPr>
-              <w:instrText xml:space="preserve"> PAGEREF _Toc196147754 \h </w:instrText>
+              <w:instrText xml:space="preserve"> PAGEREF _Toc197679189 \h </w:instrText>
             </w:r>
             <w:r>
               <w:rPr>
@@ -10024,7 +10136,7 @@
               <w14:ligatures w14:val="standardContextual"/>
             </w:rPr>
           </w:pPr>
-          <w:hyperlink w:anchor="_Toc196147755" w:history="1">
+          <w:hyperlink w:anchor="_Toc197679190" w:history="1">
             <w:r>
               <w:rPr>
                 <w:rStyle w:val="Hyperlink"/>
@@ -10051,7 +10163,7 @@
                 <w:noProof/>
                 <w:webHidden/>
               </w:rPr>
-              <w:instrText xml:space="preserve"> PAGEREF _Toc196147755 \h </w:instrText>
+              <w:instrText xml:space="preserve"> PAGEREF _Toc197679190 \h </w:instrText>
             </w:r>
             <w:r>
               <w:rPr>
@@ -10097,7 +10209,7 @@
               <w14:ligatures w14:val="standardContextual"/>
             </w:rPr>
           </w:pPr>
-          <w:hyperlink w:anchor="_Toc196147756" w:history="1">
+          <w:hyperlink w:anchor="_Toc197679191" w:history="1">
             <w:r>
               <w:rPr>
                 <w:rStyle w:val="Hyperlink"/>
@@ -10124,7 +10236,7 @@
                 <w:noProof/>
                 <w:webHidden/>
               </w:rPr>
-              <w:instrText xml:space="preserve"> PAGEREF _Toc196147756 \h </w:instrText>
+              <w:instrText xml:space="preserve"> PAGEREF _Toc197679191 \h </w:instrText>
             </w:r>
             <w:r>
               <w:rPr>
@@ -10170,7 +10282,7 @@
               <w14:ligatures w14:val="standardContextual"/>
             </w:rPr>
           </w:pPr>
-          <w:hyperlink w:anchor="_Toc196147757" w:history="1">
+          <w:hyperlink w:anchor="_Toc197679192" w:history="1">
             <w:r>
               <w:rPr>
                 <w:rStyle w:val="Hyperlink"/>
@@ -10197,7 +10309,7 @@
                 <w:noProof/>
                 <w:webHidden/>
               </w:rPr>
-              <w:instrText xml:space="preserve"> PAGEREF _Toc196147757 \h </w:instrText>
+              <w:instrText xml:space="preserve"> PAGEREF _Toc197679192 \h </w:instrText>
             </w:r>
             <w:r>
               <w:rPr>
@@ -10243,7 +10355,7 @@
               <w14:ligatures w14:val="standardContextual"/>
             </w:rPr>
           </w:pPr>
-          <w:hyperlink w:anchor="_Toc196147758" w:history="1">
+          <w:hyperlink w:anchor="_Toc197679193" w:history="1">
             <w:r>
               <w:rPr>
                 <w:rStyle w:val="Hyperlink"/>
@@ -10270,7 +10382,7 @@
                 <w:noProof/>
                 <w:webHidden/>
               </w:rPr>
-              <w:instrText xml:space="preserve"> PAGEREF _Toc196147758 \h </w:instrText>
+              <w:instrText xml:space="preserve"> PAGEREF _Toc197679193 \h </w:instrText>
             </w:r>
             <w:r>
               <w:rPr>
@@ -10316,7 +10428,7 @@
               <w14:ligatures w14:val="standardContextual"/>
             </w:rPr>
           </w:pPr>
-          <w:hyperlink w:anchor="_Toc196147759" w:history="1">
+          <w:hyperlink w:anchor="_Toc197679194" w:history="1">
             <w:r>
               <w:rPr>
                 <w:rStyle w:val="Hyperlink"/>
@@ -10343,7 +10455,7 @@
                 <w:noProof/>
                 <w:webHidden/>
               </w:rPr>
-              <w:instrText xml:space="preserve"> PAGEREF _Toc196147759 \h </w:instrText>
+              <w:instrText xml:space="preserve"> PAGEREF _Toc197679194 \h </w:instrText>
             </w:r>
             <w:r>
               <w:rPr>
@@ -10389,7 +10501,7 @@
               <w14:ligatures w14:val="standardContextual"/>
             </w:rPr>
           </w:pPr>
-          <w:hyperlink w:anchor="_Toc196147760" w:history="1">
+          <w:hyperlink w:anchor="_Toc197679195" w:history="1">
             <w:r>
               <w:rPr>
                 <w:rStyle w:val="Hyperlink"/>
@@ -10416,7 +10528,7 @@
                 <w:noProof/>
                 <w:webHidden/>
               </w:rPr>
-              <w:instrText xml:space="preserve"> PAGEREF _Toc196147760 \h </w:instrText>
+              <w:instrText xml:space="preserve"> PAGEREF _Toc197679195 \h </w:instrText>
             </w:r>
             <w:r>
               <w:rPr>
@@ -10462,7 +10574,7 @@
               <w14:ligatures w14:val="standardContextual"/>
             </w:rPr>
           </w:pPr>
-          <w:hyperlink w:anchor="_Toc196147761" w:history="1">
+          <w:hyperlink w:anchor="_Toc197679196" w:history="1">
             <w:r>
               <w:rPr>
                 <w:rStyle w:val="Hyperlink"/>
@@ -10489,7 +10601,7 @@
                 <w:noProof/>
                 <w:webHidden/>
               </w:rPr>
-              <w:instrText xml:space="preserve"> PAGEREF _Toc196147761 \h </w:instrText>
+              <w:instrText xml:space="preserve"> PAGEREF _Toc197679196 \h </w:instrText>
             </w:r>
             <w:r>
               <w:rPr>
@@ -10535,7 +10647,7 @@
               <w14:ligatures w14:val="standardContextual"/>
             </w:rPr>
           </w:pPr>
-          <w:hyperlink w:anchor="_Toc196147762" w:history="1">
+          <w:hyperlink w:anchor="_Toc197679197" w:history="1">
             <w:r>
               <w:rPr>
                 <w:rStyle w:val="Hyperlink"/>
@@ -10562,7 +10674,7 @@
                 <w:noProof/>
                 <w:webHidden/>
               </w:rPr>
-              <w:instrText xml:space="preserve"> PAGEREF _Toc196147762 \h </w:instrText>
+              <w:instrText xml:space="preserve"> PAGEREF _Toc197679197 \h </w:instrText>
             </w:r>
             <w:r>
               <w:rPr>
@@ -10608,7 +10720,7 @@
               <w14:ligatures w14:val="standardContextual"/>
             </w:rPr>
           </w:pPr>
-          <w:hyperlink w:anchor="_Toc196147763" w:history="1">
+          <w:hyperlink w:anchor="_Toc197679198" w:history="1">
             <w:r>
               <w:rPr>
                 <w:rStyle w:val="Hyperlink"/>
@@ -10635,7 +10747,7 @@
                 <w:noProof/>
                 <w:webHidden/>
               </w:rPr>
-              <w:instrText xml:space="preserve"> PAGEREF _Toc196147763 \h </w:instrText>
+              <w:instrText xml:space="preserve"> PAGEREF _Toc197679198 \h </w:instrText>
             </w:r>
             <w:r>
               <w:rPr>
@@ -10681,7 +10793,7 @@
               <w14:ligatures w14:val="standardContextual"/>
             </w:rPr>
           </w:pPr>
-          <w:hyperlink w:anchor="_Toc196147764" w:history="1">
+          <w:hyperlink w:anchor="_Toc197679199" w:history="1">
             <w:r>
               <w:rPr>
                 <w:rStyle w:val="Hyperlink"/>
@@ -10708,7 +10820,7 @@
                 <w:noProof/>
                 <w:webHidden/>
               </w:rPr>
-              <w:instrText xml:space="preserve"> PAGEREF _Toc196147764 \h </w:instrText>
+              <w:instrText xml:space="preserve"> PAGEREF _Toc197679199 \h </w:instrText>
             </w:r>
             <w:r>
               <w:rPr>
@@ -10754,7 +10866,7 @@
               <w14:ligatures w14:val="standardContextual"/>
             </w:rPr>
           </w:pPr>
-          <w:hyperlink w:anchor="_Toc196147765" w:history="1">
+          <w:hyperlink w:anchor="_Toc197679200" w:history="1">
             <w:r>
               <w:rPr>
                 <w:rStyle w:val="Hyperlink"/>
@@ -10781,7 +10893,7 @@
                 <w:noProof/>
                 <w:webHidden/>
               </w:rPr>
-              <w:instrText xml:space="preserve"> PAGEREF _Toc196147765 \h </w:instrText>
+              <w:instrText xml:space="preserve"> PAGEREF _Toc197679200 \h </w:instrText>
             </w:r>
             <w:r>
               <w:rPr>
@@ -10827,7 +10939,7 @@
               <w14:ligatures w14:val="standardContextual"/>
             </w:rPr>
           </w:pPr>
-          <w:hyperlink w:anchor="_Toc196147766" w:history="1">
+          <w:hyperlink w:anchor="_Toc197679201" w:history="1">
             <w:r>
               <w:rPr>
                 <w:rStyle w:val="Hyperlink"/>
@@ -10854,7 +10966,7 @@
                 <w:noProof/>
                 <w:webHidden/>
               </w:rPr>
-              <w:instrText xml:space="preserve"> PAGEREF _Toc196147766 \h </w:instrText>
+              <w:instrText xml:space="preserve"> PAGEREF _Toc197679201 \h </w:instrText>
             </w:r>
             <w:r>
               <w:rPr>
@@ -10900,7 +11012,7 @@
               <w14:ligatures w14:val="standardContextual"/>
             </w:rPr>
           </w:pPr>
-          <w:hyperlink w:anchor="_Toc196147767" w:history="1">
+          <w:hyperlink w:anchor="_Toc197679202" w:history="1">
             <w:r>
               <w:rPr>
                 <w:rStyle w:val="Hyperlink"/>
@@ -10927,7 +11039,7 @@
                 <w:noProof/>
                 <w:webHidden/>
               </w:rPr>
-              <w:instrText xml:space="preserve"> PAGEREF _Toc196147767 \h </w:instrText>
+              <w:instrText xml:space="preserve"> PAGEREF _Toc197679202 \h </w:instrText>
             </w:r>
             <w:r>
               <w:rPr>
@@ -10973,7 +11085,7 @@
               <w14:ligatures w14:val="standardContextual"/>
             </w:rPr>
           </w:pPr>
-          <w:hyperlink w:anchor="_Toc196147768" w:history="1">
+          <w:hyperlink w:anchor="_Toc197679203" w:history="1">
             <w:r>
               <w:rPr>
                 <w:rStyle w:val="Hyperlink"/>
@@ -11000,7 +11112,7 @@
                 <w:noProof/>
                 <w:webHidden/>
               </w:rPr>
-              <w:instrText xml:space="preserve"> PAGEREF _Toc196147768 \h </w:instrText>
+              <w:instrText xml:space="preserve"> PAGEREF _Toc197679203 \h </w:instrText>
             </w:r>
             <w:r>
               <w:rPr>
@@ -11046,7 +11158,7 @@
               <w14:ligatures w14:val="standardContextual"/>
             </w:rPr>
           </w:pPr>
-          <w:hyperlink w:anchor="_Toc196147769" w:history="1">
+          <w:hyperlink w:anchor="_Toc197679204" w:history="1">
             <w:r>
               <w:rPr>
                 <w:rStyle w:val="Hyperlink"/>
@@ -11073,7 +11185,7 @@
                 <w:noProof/>
                 <w:webHidden/>
               </w:rPr>
-              <w:instrText xml:space="preserve"> PAGEREF _Toc196147769 \h </w:instrText>
+              <w:instrText xml:space="preserve"> PAGEREF _Toc197679204 \h </w:instrText>
             </w:r>
             <w:r>
               <w:rPr>
@@ -11119,7 +11231,7 @@
               <w14:ligatures w14:val="standardContextual"/>
             </w:rPr>
           </w:pPr>
-          <w:hyperlink w:anchor="_Toc196147770" w:history="1">
+          <w:hyperlink w:anchor="_Toc197679205" w:history="1">
             <w:r>
               <w:rPr>
                 <w:rStyle w:val="Hyperlink"/>
@@ -11146,7 +11258,7 @@
                 <w:noProof/>
                 <w:webHidden/>
               </w:rPr>
-              <w:instrText xml:space="preserve"> PAGEREF _Toc196147770 \h </w:instrText>
+              <w:instrText xml:space="preserve"> PAGEREF _Toc197679205 \h </w:instrText>
             </w:r>
             <w:r>
               <w:rPr>
@@ -11192,7 +11304,7 @@
               <w14:ligatures w14:val="standardContextual"/>
             </w:rPr>
           </w:pPr>
-          <w:hyperlink w:anchor="_Toc196147771" w:history="1">
+          <w:hyperlink w:anchor="_Toc197679206" w:history="1">
             <w:r>
               <w:rPr>
                 <w:rStyle w:val="Hyperlink"/>
@@ -11219,7 +11331,7 @@
                 <w:noProof/>
                 <w:webHidden/>
               </w:rPr>
-              <w:instrText xml:space="preserve"> PAGEREF _Toc196147771 \h </w:instrText>
+              <w:instrText xml:space="preserve"> PAGEREF _Toc197679206 \h </w:instrText>
             </w:r>
             <w:r>
               <w:rPr>
@@ -11265,7 +11377,7 @@
               <w14:ligatures w14:val="standardContextual"/>
             </w:rPr>
           </w:pPr>
-          <w:hyperlink w:anchor="_Toc196147772" w:history="1">
+          <w:hyperlink w:anchor="_Toc197679207" w:history="1">
             <w:r>
               <w:rPr>
                 <w:rStyle w:val="Hyperlink"/>
@@ -11292,7 +11404,7 @@
                 <w:noProof/>
                 <w:webHidden/>
               </w:rPr>
-              <w:instrText xml:space="preserve"> PAGEREF _Toc196147772 \h </w:instrText>
+              <w:instrText xml:space="preserve"> PAGEREF _Toc197679207 \h </w:instrText>
             </w:r>
             <w:r>
               <w:rPr>
@@ -11338,7 +11450,7 @@
               <w14:ligatures w14:val="standardContextual"/>
             </w:rPr>
           </w:pPr>
-          <w:hyperlink w:anchor="_Toc196147773" w:history="1">
+          <w:hyperlink w:anchor="_Toc197679208" w:history="1">
             <w:r>
               <w:rPr>
                 <w:rStyle w:val="Hyperlink"/>
@@ -11365,7 +11477,7 @@
                 <w:noProof/>
                 <w:webHidden/>
               </w:rPr>
-              <w:instrText xml:space="preserve"> PAGEREF _Toc196147773 \h </w:instrText>
+              <w:instrText xml:space="preserve"> PAGEREF _Toc197679208 \h </w:instrText>
             </w:r>
             <w:r>
               <w:rPr>
@@ -11417,7 +11529,7 @@
       <w:pPr>
         <w:pStyle w:val="Heading1"/>
       </w:pPr>
-      <w:bookmarkStart w:id="0" w:name="_Toc196147680"/>
+      <w:bookmarkStart w:id="0" w:name="_Toc197679114"/>
       <w:r>
         <w:lastRenderedPageBreak/>
         <w:t xml:space="preserve">Pubseq Gateway </w:t>
@@ -11740,7 +11852,7 @@
       <w:pPr>
         <w:pStyle w:val="Heading1"/>
       </w:pPr>
-      <w:bookmarkStart w:id="1" w:name="_Toc196147681"/>
+      <w:bookmarkStart w:id="1" w:name="_Toc197679115"/>
       <w:r>
         <w:lastRenderedPageBreak/>
         <w:t>Overview</w:t>
@@ -11789,10 +11901,10 @@
             <v:path o:extrusionok="f" gradientshapeok="t" o:connecttype="rect"/>
             <o:lock v:ext="edit" aspectratio="t"/>
           </v:shapetype>
-          <v:shape id="_x0000_i1025" type="#_x0000_t75" style="width:467.1pt;height:231.95pt" o:ole="">
+          <v:shape id="_x0000_i1025" type="#_x0000_t75" style="width:467.3pt;height:231.6pt" o:ole="">
             <v:imagedata r:id="rId11" o:title=""/>
           </v:shape>
-          <o:OLEObject Type="Embed" ProgID="Visio.Drawing.15" ShapeID="_x0000_i1025" DrawAspect="Content" ObjectID="_1806760441" r:id="rId12"/>
+          <o:OLEObject Type="Embed" ProgID="Visio.Drawing.15" ShapeID="_x0000_i1025" DrawAspect="Content" ObjectID="_1808291884" r:id="rId12"/>
         </w:object>
       </w:r>
     </w:p>
@@ -11932,7 +12044,7 @@
       <w:pPr>
         <w:pStyle w:val="Heading1"/>
       </w:pPr>
-      <w:bookmarkStart w:id="2" w:name="_Toc196147682"/>
+      <w:bookmarkStart w:id="2" w:name="_Toc197679116"/>
       <w:r>
         <w:lastRenderedPageBreak/>
         <w:t>Communication Protocol</w:t>
@@ -12003,7 +12115,7 @@
       <w:pPr>
         <w:pStyle w:val="Heading2"/>
       </w:pPr>
-      <w:bookmarkStart w:id="3" w:name="_Toc196147683"/>
+      <w:bookmarkStart w:id="3" w:name="_Toc197679117"/>
       <w:r>
         <w:t>PSG Protocol</w:t>
       </w:r>
@@ -13547,7 +13659,7 @@
         <w:pStyle w:val="Heading1"/>
       </w:pPr>
       <w:bookmarkStart w:id="4" w:name="_Exclude_Blob_Cache"/>
-      <w:bookmarkStart w:id="5" w:name="_Toc196147684"/>
+      <w:bookmarkStart w:id="5" w:name="_Toc197679118"/>
       <w:bookmarkEnd w:id="4"/>
       <w:r>
         <w:t>Exclude Blob Cache</w:t>
@@ -13649,7 +13761,7 @@
       <w:pPr>
         <w:pStyle w:val="Heading1"/>
       </w:pPr>
-      <w:bookmarkStart w:id="6" w:name="_Toc196147685"/>
+      <w:bookmarkStart w:id="6" w:name="_Toc197679119"/>
       <w:r>
         <w:t>Requests</w:t>
       </w:r>
@@ -13734,7 +13846,7 @@
         <w:pStyle w:val="Heading2"/>
       </w:pPr>
       <w:bookmarkStart w:id="7" w:name="_Common_ID/..._Request"/>
-      <w:bookmarkStart w:id="8" w:name="_Toc196147686"/>
+      <w:bookmarkStart w:id="8" w:name="_Toc197679120"/>
       <w:bookmarkEnd w:id="7"/>
       <w:r>
         <w:t>Common ID/</w:t>
@@ -14083,7 +14195,7 @@
       <w:pPr>
         <w:pStyle w:val="Heading2"/>
       </w:pPr>
-      <w:bookmarkStart w:id="10" w:name="_Toc196147687"/>
+      <w:bookmarkStart w:id="10" w:name="_Toc197679121"/>
       <w:r>
         <w:t>ID/</w:t>
       </w:r>
@@ -15207,7 +15319,7 @@
       <w:pPr>
         <w:pStyle w:val="Heading2"/>
       </w:pPr>
-      <w:bookmarkStart w:id="11" w:name="_Toc196147688"/>
+      <w:bookmarkStart w:id="11" w:name="_Toc197679122"/>
       <w:r>
         <w:t>ID/</w:t>
       </w:r>
@@ -16573,7 +16685,7 @@
       <w:pPr>
         <w:pStyle w:val="Heading2"/>
       </w:pPr>
-      <w:bookmarkStart w:id="12" w:name="_Toc196147689"/>
+      <w:bookmarkStart w:id="12" w:name="_Toc197679123"/>
       <w:r>
         <w:t>ID/get_tse_chunk Request</w:t>
       </w:r>
@@ -17145,7 +17257,7 @@
       <w:pPr>
         <w:pStyle w:val="Heading2"/>
       </w:pPr>
-      <w:bookmarkStart w:id="14" w:name="_Toc196147690"/>
+      <w:bookmarkStart w:id="14" w:name="_Toc197679124"/>
       <w:r>
         <w:t>ID/</w:t>
       </w:r>
@@ -17829,7 +17941,7 @@
       <w:pPr>
         <w:pStyle w:val="Heading2"/>
       </w:pPr>
-      <w:bookmarkStart w:id="15" w:name="_Toc196147691"/>
+      <w:bookmarkStart w:id="15" w:name="_Toc197679125"/>
       <w:r>
         <w:t>ID/</w:t>
       </w:r>
@@ -19105,7 +19217,7 @@
       <w:pPr>
         <w:pStyle w:val="Heading2"/>
       </w:pPr>
-      <w:bookmarkStart w:id="19" w:name="_Toc196147692"/>
+      <w:bookmarkStart w:id="19" w:name="_Toc197679126"/>
       <w:r>
         <w:t>ID/</w:t>
       </w:r>
@@ -19431,7 +19543,7 @@
       <w:pPr>
         <w:pStyle w:val="Heading2"/>
       </w:pPr>
-      <w:bookmarkStart w:id="20" w:name="_Toc196147693"/>
+      <w:bookmarkStart w:id="20" w:name="_Toc197679127"/>
       <w:r>
         <w:t>ID/get_sat_mapping Request</w:t>
       </w:r>
@@ -19494,7 +19606,7 @@
       <w:pPr>
         <w:pStyle w:val="Heading2"/>
       </w:pPr>
-      <w:bookmarkStart w:id="21" w:name="_Toc196147694"/>
+      <w:bookmarkStart w:id="21" w:name="_Toc197679128"/>
       <w:r>
         <w:lastRenderedPageBreak/>
         <w:t>IPG/resolve Request</w:t>
@@ -20036,7 +20148,7 @@
       <w:pPr>
         <w:pStyle w:val="Heading2"/>
       </w:pPr>
-      <w:bookmarkStart w:id="22" w:name="_Toc196147695"/>
+      <w:bookmarkStart w:id="22" w:name="_Toc197679129"/>
       <w:r>
         <w:lastRenderedPageBreak/>
         <w:t>ADMIN/</w:t>
@@ -20354,7 +20466,7 @@
       <w:pPr>
         <w:pStyle w:val="Heading2"/>
       </w:pPr>
-      <w:bookmarkStart w:id="23" w:name="_Toc196147696"/>
+      <w:bookmarkStart w:id="23" w:name="_Toc197679130"/>
       <w:r>
         <w:t>ADMIN/</w:t>
       </w:r>
@@ -21560,7 +21672,7 @@
       <w:pPr>
         <w:pStyle w:val="Heading2"/>
       </w:pPr>
-      <w:bookmarkStart w:id="24" w:name="_Toc196147697"/>
+      <w:bookmarkStart w:id="24" w:name="_Toc197679131"/>
       <w:r>
         <w:t>ADMIN/</w:t>
       </w:r>
@@ -23089,7 +23201,7 @@
       <w:pPr>
         <w:pStyle w:val="Heading2"/>
       </w:pPr>
-      <w:bookmarkStart w:id="25" w:name="_Toc196147698"/>
+      <w:bookmarkStart w:id="25" w:name="_Toc197679132"/>
       <w:r>
         <w:t>ADMIN/</w:t>
       </w:r>
@@ -23558,7 +23670,7 @@
       <w:pPr>
         <w:pStyle w:val="Heading2"/>
       </w:pPr>
-      <w:bookmarkStart w:id="26" w:name="_Toc196147699"/>
+      <w:bookmarkStart w:id="26" w:name="_Toc197679133"/>
       <w:r>
         <w:t>ADMIN/</w:t>
       </w:r>
@@ -23748,7 +23860,7 @@
       <w:pPr>
         <w:pStyle w:val="Heading2"/>
       </w:pPr>
-      <w:bookmarkStart w:id="27" w:name="_Toc196147700"/>
+      <w:bookmarkStart w:id="27" w:name="_Toc197679134"/>
       <w:r>
         <w:t>ADMIN/ack_alert Request</w:t>
       </w:r>
@@ -24012,7 +24124,7 @@
       <w:pPr>
         <w:pStyle w:val="Heading2"/>
       </w:pPr>
-      <w:bookmarkStart w:id="28" w:name="_Toc196147701"/>
+      <w:bookmarkStart w:id="28" w:name="_Toc197679135"/>
       <w:r>
         <w:t>ADMIN/statistics Request</w:t>
       </w:r>
@@ -24417,7 +24529,7 @@
       <w:pPr>
         <w:pStyle w:val="Heading2"/>
       </w:pPr>
-      <w:bookmarkStart w:id="29" w:name="_Toc196147702"/>
+      <w:bookmarkStart w:id="29" w:name="_Toc197679136"/>
       <w:r>
         <w:t>ADMIN/dispatcher_status Request</w:t>
       </w:r>
@@ -24494,7 +24606,7 @@
       <w:pPr>
         <w:pStyle w:val="Heading2"/>
       </w:pPr>
-      <w:bookmarkStart w:id="30" w:name="_Toc196147703"/>
+      <w:bookmarkStart w:id="30" w:name="_Toc197679137"/>
       <w:r>
         <w:t>ADMIN/connections_status Request</w:t>
       </w:r>
@@ -24570,7 +24682,7 @@
       <w:pPr>
         <w:pStyle w:val="Heading2"/>
       </w:pPr>
-      <w:bookmarkStart w:id="31" w:name="_Toc196147704"/>
+      <w:bookmarkStart w:id="31" w:name="_Toc197679138"/>
       <w:r>
         <w:t>TEST/</w:t>
       </w:r>
@@ -24810,7 +24922,7 @@
       <w:pPr>
         <w:pStyle w:val="Heading2"/>
       </w:pPr>
-      <w:bookmarkStart w:id="33" w:name="_Toc196147705"/>
+      <w:bookmarkStart w:id="33" w:name="_Toc197679139"/>
       <w:r>
         <w:t>H</w:t>
       </w:r>
@@ -25000,7 +25112,7 @@
       <w:pPr>
         <w:pStyle w:val="Heading2"/>
       </w:pPr>
-      <w:bookmarkStart w:id="34" w:name="_Toc196147706"/>
+      <w:bookmarkStart w:id="34" w:name="_Toc197679140"/>
       <w:r>
         <w:t>D</w:t>
       </w:r>
@@ -25021,7 +25133,7 @@
       <w:pPr>
         <w:pStyle w:val="Heading2"/>
       </w:pPr>
-      <w:bookmarkStart w:id="35" w:name="_Toc196147707"/>
+      <w:bookmarkStart w:id="35" w:name="_Toc197679141"/>
       <w:r>
         <w:t>ReadyZ Request</w:t>
       </w:r>
@@ -25192,7 +25304,7 @@
       <w:pPr>
         <w:pStyle w:val="Heading2"/>
       </w:pPr>
-      <w:bookmarkStart w:id="36" w:name="_Toc196147708"/>
+      <w:bookmarkStart w:id="36" w:name="_Toc197679142"/>
       <w:r>
         <w:t>ReadyZCassandra Request</w:t>
       </w:r>
@@ -25357,15 +25469,9 @@
       <w:pPr>
         <w:pStyle w:val="Heading2"/>
       </w:pPr>
-      <w:bookmarkStart w:id="37" w:name="_Toc196147709"/>
-      <w:r>
-        <w:t>ReadyZC</w:t>
-      </w:r>
-      <w:r>
-        <w:t>onnections</w:t>
-      </w:r>
-      <w:r>
-        <w:t xml:space="preserve"> Request</w:t>
+      <w:bookmarkStart w:id="37" w:name="_Toc197679143"/>
+      <w:r>
+        <w:t>ReadyZConnections Request</w:t>
       </w:r>
       <w:bookmarkEnd w:id="37"/>
     </w:p>
@@ -25388,10 +25494,7 @@
         </w:r>
       </w:hyperlink>
       <w:r>
-        <w:t>/c</w:t>
-      </w:r>
-      <w:r>
-        <w:t>onnections</w:t>
+        <w:t>/connections</w:t>
       </w:r>
       <w:r>
         <w:rPr>
@@ -25485,25 +25588,7 @@
     <w:p>
       <w:r>
         <w:lastRenderedPageBreak/>
-        <w:t xml:space="preserve">The server checks that the </w:t>
-      </w:r>
-      <w:r>
-        <w:t xml:space="preserve">current number of client connections is within the soft limit. If so the </w:t>
-      </w:r>
-      <w:r>
-        <w:t>server will reply to the client with the HTTP status 200</w:t>
-      </w:r>
-      <w:r>
-        <w:t>. O</w:t>
-      </w:r>
-      <w:r>
-        <w:t>therwise</w:t>
-      </w:r>
-      <w:r>
-        <w:t xml:space="preserve"> the HTTP status will be 503</w:t>
-      </w:r>
-      <w:r>
-        <w:t>.</w:t>
+        <w:t>The server checks that the current number of client connections is within the soft limit. If so the server will reply to the client with the HTTP status 200. Otherwise the HTTP status will be 503.</w:t>
       </w:r>
     </w:p>
     <w:p>
@@ -25518,13 +25603,7 @@
     </w:p>
     <w:p>
       <w:r>
-        <w:t>Note: available starting from version 2.1</w:t>
-      </w:r>
-      <w:r>
-        <w:t>6</w:t>
-      </w:r>
-      <w:r>
-        <w:t>.0.</w:t>
+        <w:t>Note: available starting from version 2.16.0.</w:t>
       </w:r>
     </w:p>
     <w:p/>
@@ -25532,7 +25611,7 @@
       <w:pPr>
         <w:pStyle w:val="Heading2"/>
       </w:pPr>
-      <w:bookmarkStart w:id="38" w:name="_Toc196147710"/>
+      <w:bookmarkStart w:id="38" w:name="_Toc197679144"/>
       <w:r>
         <w:t>ReadyZ</w:t>
       </w:r>
@@ -25694,7 +25773,7 @@
       <w:pPr>
         <w:pStyle w:val="Heading2"/>
       </w:pPr>
-      <w:bookmarkStart w:id="39" w:name="_Toc196147711"/>
+      <w:bookmarkStart w:id="39" w:name="_Toc197679145"/>
       <w:r>
         <w:lastRenderedPageBreak/>
         <w:t>ReadyZWGS Request</w:t>
@@ -25836,7 +25915,7 @@
       <w:pPr>
         <w:pStyle w:val="Heading2"/>
       </w:pPr>
-      <w:bookmarkStart w:id="40" w:name="_Toc196147712"/>
+      <w:bookmarkStart w:id="40" w:name="_Toc197679146"/>
       <w:r>
         <w:t>ReadyZCDD Request</w:t>
       </w:r>
@@ -25978,7 +26057,7 @@
       <w:pPr>
         <w:pStyle w:val="Heading2"/>
       </w:pPr>
-      <w:bookmarkStart w:id="41" w:name="_Toc196147713"/>
+      <w:bookmarkStart w:id="41" w:name="_Toc197679147"/>
       <w:r>
         <w:t>ReadyZSNP Request</w:t>
       </w:r>
@@ -26120,7 +26199,7 @@
       <w:pPr>
         <w:pStyle w:val="Heading2"/>
       </w:pPr>
-      <w:bookmarkStart w:id="42" w:name="_Toc196147714"/>
+      <w:bookmarkStart w:id="42" w:name="_Toc197679148"/>
       <w:r>
         <w:t>HealthZ Request</w:t>
       </w:r>
@@ -26270,7 +26349,7 @@
       <w:pPr>
         <w:pStyle w:val="Heading2"/>
       </w:pPr>
-      <w:bookmarkStart w:id="43" w:name="_Toc196147715"/>
+      <w:bookmarkStart w:id="43" w:name="_Toc197679149"/>
       <w:r>
         <w:t>LivezZ Request</w:t>
       </w:r>
@@ -26409,14 +26488,246 @@
       <w:pPr>
         <w:pStyle w:val="Heading2"/>
       </w:pPr>
-      <w:bookmarkStart w:id="44" w:name="_Toc196147716"/>
+      <w:bookmarkStart w:id="44" w:name="_Toc197679150"/>
+      <w:r>
+        <w:t>Hello</w:t>
+      </w:r>
+      <w:r>
+        <w:t xml:space="preserve"> Request</w:t>
+      </w:r>
+      <w:bookmarkEnd w:id="44"/>
+    </w:p>
+    <w:p/>
+    <w:p>
+      <w:r>
+        <w:t>The format of the request:</w:t>
+      </w:r>
+    </w:p>
+    <w:p>
+      <w:pPr>
+        <w:jc w:val="center"/>
+      </w:pPr>
+      <w:r>
+        <w:t>http://&lt;host:port&gt;/</w:t>
+      </w:r>
+      <w:r>
+        <w:t>hello</w:t>
+      </w:r>
+      <w:r>
+        <w:rPr>
+          <w:rStyle w:val="Hyperlink"/>
+        </w:rPr>
+        <w:t>?</w:t>
+      </w:r>
+    </w:p>
+    <w:p>
+      <w:r>
+        <w:t>Where</w:t>
+      </w:r>
+    </w:p>
+    <w:tbl>
+      <w:tblPr>
+        <w:tblStyle w:val="TableGrid"/>
+        <w:tblW w:w="0" w:type="auto"/>
+        <w:tblLook w:val="04A0" w:firstRow="1" w:lastRow="0" w:firstColumn="1" w:lastColumn="0" w:noHBand="0" w:noVBand="1"/>
+      </w:tblPr>
+      <w:tblGrid>
+        <w:gridCol w:w="4675"/>
+        <w:gridCol w:w="4675"/>
+      </w:tblGrid>
+      <w:tr>
+        <w:tc>
+          <w:tcPr>
+            <w:tcW w:w="4675" w:type="dxa"/>
+          </w:tcPr>
+          <w:p>
+            <w:pPr>
+              <w:jc w:val="center"/>
+            </w:pPr>
+            <w:r>
+              <w:t>Parameter</w:t>
+            </w:r>
+          </w:p>
+        </w:tc>
+        <w:tc>
+          <w:tcPr>
+            <w:tcW w:w="4675" w:type="dxa"/>
+          </w:tcPr>
+          <w:p>
+            <w:pPr>
+              <w:jc w:val="center"/>
+            </w:pPr>
+            <w:r>
+              <w:t>Description</w:t>
+            </w:r>
+          </w:p>
+        </w:tc>
+      </w:tr>
+      <w:tr>
+        <w:tc>
+          <w:tcPr>
+            <w:tcW w:w="4675" w:type="dxa"/>
+            <w:shd w:val="clear" w:color="auto" w:fill="F2DBDB" w:themeFill="accent2" w:themeFillTint="33"/>
+          </w:tcPr>
+          <w:p>
+            <w:r>
+              <w:t>peer_id</w:t>
+            </w:r>
+          </w:p>
+        </w:tc>
+        <w:tc>
+          <w:tcPr>
+            <w:tcW w:w="4675" w:type="dxa"/>
+            <w:shd w:val="clear" w:color="auto" w:fill="F2DBDB" w:themeFill="accent2" w:themeFillTint="33"/>
+          </w:tcPr>
+          <w:p>
+            <w:r>
+              <w:t xml:space="preserve">The peer </w:t>
+            </w:r>
+            <w:r>
+              <w:t>ID.</w:t>
+            </w:r>
+          </w:p>
+          <w:p>
+            <w:r>
+              <w:t>It must be a</w:t>
+            </w:r>
+            <w:r>
+              <w:t xml:space="preserve"> non-empty string without white space symbols</w:t>
+            </w:r>
+            <w:r>
+              <w:t>.</w:t>
+            </w:r>
+          </w:p>
+          <w:p>
+            <w:r>
+              <w:t>Mandatory</w:t>
+            </w:r>
+            <w:r>
+              <w:t xml:space="preserve"> parameter.</w:t>
+            </w:r>
+          </w:p>
+        </w:tc>
+      </w:tr>
+      <w:tr>
+        <w:tc>
+          <w:tcPr>
+            <w:tcW w:w="4675" w:type="dxa"/>
+            <w:shd w:val="clear" w:color="auto" w:fill="F2DBDB" w:themeFill="accent2" w:themeFillTint="33"/>
+          </w:tcPr>
+          <w:p>
+            <w:r>
+              <w:t>peer_user_agent</w:t>
+            </w:r>
+          </w:p>
+        </w:tc>
+        <w:tc>
+          <w:tcPr>
+            <w:tcW w:w="4675" w:type="dxa"/>
+            <w:shd w:val="clear" w:color="auto" w:fill="F2DBDB" w:themeFill="accent2" w:themeFillTint="33"/>
+          </w:tcPr>
+          <w:p>
+            <w:r>
+              <w:t>The peer user agent</w:t>
+            </w:r>
+            <w:r>
+              <w:t>.</w:t>
+            </w:r>
+          </w:p>
+          <w:p>
+            <w:r>
+              <w:t>It must be a</w:t>
+            </w:r>
+            <w:r>
+              <w:t xml:space="preserve"> non-empty string without white space symbols</w:t>
+            </w:r>
+            <w:r>
+              <w:t>.</w:t>
+            </w:r>
+          </w:p>
+          <w:p>
+            <w:r>
+              <w:t>Mandatory parameter.</w:t>
+            </w:r>
+          </w:p>
+        </w:tc>
+      </w:tr>
+    </w:tbl>
+    <w:p/>
+    <w:p>
+      <w:r>
+        <w:t>The request is supposed to be used by the clients as the first one after opening a connection. Using the request a client can provide additional information about itself. The server memorises the provided values in the connection properties and can use it later I a few scenarios. One scenario is connection monitoring (see the ADMIN/connections_info request). Another scenario is throttling based on the saved connection properties.</w:t>
+      </w:r>
+    </w:p>
+    <w:p>
+      <w:r>
+        <w:t>The reply is using the HTTP protocol. Here are the possible options:</w:t>
+      </w:r>
+    </w:p>
+    <w:p>
+      <w:pPr>
+        <w:pStyle w:val="ListParagraph"/>
+        <w:numPr>
+          <w:ilvl w:val="0"/>
+          <w:numId w:val="38"/>
+        </w:numPr>
+      </w:pPr>
+      <w:r>
+        <w:lastRenderedPageBreak/>
+        <w:t>Everything is OK, the supplied values are successfully stored. In this case the HTTP status is 200 and the HTTP body is empty.</w:t>
+      </w:r>
+    </w:p>
+    <w:p>
+      <w:pPr>
+        <w:pStyle w:val="ListParagraph"/>
+        <w:numPr>
+          <w:ilvl w:val="0"/>
+          <w:numId w:val="38"/>
+        </w:numPr>
+      </w:pPr>
+      <w:r>
+        <w:t>The</w:t>
+      </w:r>
+      <w:r>
+        <w:t xml:space="preserve"> supplied values did not pass validation procedure. In this case the HTTP status is 400 and the HTTP body contains a plain text error message.</w:t>
+      </w:r>
+    </w:p>
+    <w:p>
+      <w:pPr>
+        <w:pStyle w:val="ListParagraph"/>
+        <w:numPr>
+          <w:ilvl w:val="0"/>
+          <w:numId w:val="38"/>
+        </w:numPr>
+      </w:pPr>
+      <w:r>
+        <w:t>There was a problem during execution of the request. In this case the HTTP status is 500 and the HTTP body contains a paint text error message.</w:t>
+      </w:r>
+    </w:p>
+    <w:p>
+      <w:r>
+        <w:t>Note: available starting from version 2.1</w:t>
+      </w:r>
+      <w:r>
+        <w:t>6</w:t>
+      </w:r>
+      <w:r>
+        <w:t>.0.</w:t>
+      </w:r>
+    </w:p>
+    <w:p/>
+    <w:p>
+      <w:pPr>
+        <w:pStyle w:val="Heading2"/>
+      </w:pPr>
+      <w:bookmarkStart w:id="45" w:name="_Toc197679151"/>
       <w:r>
         <w:t>F</w:t>
       </w:r>
       <w:r>
         <w:t>avicon.ico Request</w:t>
       </w:r>
-      <w:bookmarkEnd w:id="44"/>
+      <w:bookmarkEnd w:id="45"/>
     </w:p>
     <w:p/>
     <w:p>
@@ -26460,11 +26771,11 @@
       <w:pPr>
         <w:pStyle w:val="Heading2"/>
       </w:pPr>
-      <w:bookmarkStart w:id="45" w:name="_Toc196147717"/>
+      <w:bookmarkStart w:id="46" w:name="_Toc197679152"/>
       <w:r>
         <w:t>Unknown URL Request</w:t>
       </w:r>
-      <w:bookmarkEnd w:id="45"/>
+      <w:bookmarkEnd w:id="46"/>
     </w:p>
     <w:p/>
     <w:p>
@@ -26504,7 +26815,6 @@
         <w:rPr>
           <w:noProof/>
         </w:rPr>
-        <w:lastRenderedPageBreak/>
         <w:drawing>
           <wp:inline distT="0" distB="0" distL="0" distR="0" wp14:anchorId="16516E0D" wp14:editId="4CF7A68A">
             <wp:extent cx="3095625" cy="790575"/>
@@ -26547,11 +26857,12 @@
       <w:pPr>
         <w:pStyle w:val="Heading1"/>
       </w:pPr>
-      <w:bookmarkStart w:id="46" w:name="_Toc196147718"/>
-      <w:r>
+      <w:bookmarkStart w:id="47" w:name="_Toc197679153"/>
+      <w:r>
+        <w:lastRenderedPageBreak/>
         <w:t>Cassandra Database</w:t>
       </w:r>
-      <w:bookmarkEnd w:id="46"/>
+      <w:bookmarkEnd w:id="47"/>
     </w:p>
     <w:p/>
     <w:p>
@@ -26575,11 +26886,11 @@
         <w:pStyle w:val="Heading1"/>
         <w:jc w:val="both"/>
       </w:pPr>
-      <w:bookmarkStart w:id="47" w:name="_Toc196147719"/>
+      <w:bookmarkStart w:id="48" w:name="_Toc197679154"/>
       <w:r>
         <w:t>Monitoring and Maintenance</w:t>
       </w:r>
-      <w:bookmarkEnd w:id="47"/>
+      <w:bookmarkEnd w:id="48"/>
     </w:p>
     <w:p/>
     <w:p>
@@ -26626,11 +26937,11 @@
       <w:pPr>
         <w:pStyle w:val="Heading1"/>
       </w:pPr>
-      <w:bookmarkStart w:id="48" w:name="_Toc196147720"/>
+      <w:bookmarkStart w:id="49" w:name="_Toc197679155"/>
       <w:r>
         <w:t>Files Architecture</w:t>
       </w:r>
-      <w:bookmarkEnd w:id="48"/>
+      <w:bookmarkEnd w:id="49"/>
     </w:p>
     <w:p/>
     <w:p>
@@ -26653,10 +26964,10 @@
       </w:pPr>
       <w:r>
         <w:object w:dxaOrig="7351" w:dyaOrig="1591" w14:anchorId="620B4101">
-          <v:shape id="_x0000_i1026" type="#_x0000_t75" style="width:367.75pt;height:79.3pt" o:ole="">
+          <v:shape id="_x0000_i1026" type="#_x0000_t75" style="width:368.15pt;height:79.45pt" o:ole="">
             <v:imagedata r:id="rId47" o:title=""/>
           </v:shape>
-          <o:OLEObject Type="Embed" ProgID="Visio.Drawing.15" ShapeID="_x0000_i1026" DrawAspect="Content" ObjectID="_1806760442" r:id="rId48"/>
+          <o:OLEObject Type="Embed" ProgID="Visio.Drawing.15" ShapeID="_x0000_i1026" DrawAspect="Content" ObjectID="_1808291885" r:id="rId48"/>
         </w:object>
       </w:r>
     </w:p>
@@ -26682,11 +26993,11 @@
       <w:pPr>
         <w:pStyle w:val="Heading1"/>
       </w:pPr>
-      <w:bookmarkStart w:id="49" w:name="_Toc196147721"/>
+      <w:bookmarkStart w:id="50" w:name="_Toc197679156"/>
       <w:r>
         <w:t>Client API</w:t>
       </w:r>
-      <w:bookmarkEnd w:id="49"/>
+      <w:bookmarkEnd w:id="50"/>
     </w:p>
     <w:p/>
     <w:p>
@@ -26709,11 +27020,11 @@
       <w:pPr>
         <w:pStyle w:val="Heading1"/>
       </w:pPr>
-      <w:bookmarkStart w:id="50" w:name="_Toc196147722"/>
+      <w:bookmarkStart w:id="51" w:name="_Toc197679157"/>
       <w:r>
         <w:t>Command Line Arguments</w:t>
       </w:r>
-      <w:bookmarkEnd w:id="50"/>
+      <w:bookmarkEnd w:id="51"/>
     </w:p>
     <w:p/>
     <w:p>
@@ -26921,11 +27232,11 @@
       <w:pPr>
         <w:pStyle w:val="Heading1"/>
       </w:pPr>
-      <w:bookmarkStart w:id="51" w:name="_Toc196147723"/>
+      <w:bookmarkStart w:id="52" w:name="_Toc197679158"/>
       <w:r>
         <w:t>Signal Handling</w:t>
       </w:r>
-      <w:bookmarkEnd w:id="51"/>
+      <w:bookmarkEnd w:id="52"/>
     </w:p>
     <w:p/>
     <w:p>
@@ -27015,7 +27326,6 @@
           </w:p>
           <w:p>
             <w:r>
-              <w:lastRenderedPageBreak/>
               <w:t>The server will wait till all the currently executed requests are finished. During that time all new requests are rejected. When all requests are finished, the server will shut down.</w:t>
             </w:r>
           </w:p>
@@ -27033,7 +27343,6 @@
           </w:tcPr>
           <w:p>
             <w:r>
-              <w:lastRenderedPageBreak/>
               <w:t>QUIT</w:t>
             </w:r>
           </w:p>
@@ -27056,6 +27365,7 @@
           </w:tcPr>
           <w:p>
             <w:r>
+              <w:lastRenderedPageBreak/>
               <w:t>HUP USR1 USR2 WINCH</w:t>
             </w:r>
           </w:p>
@@ -27077,11 +27387,11 @@
       <w:pPr>
         <w:pStyle w:val="Heading1"/>
       </w:pPr>
-      <w:bookmarkStart w:id="52" w:name="_Toc196147724"/>
+      <w:bookmarkStart w:id="53" w:name="_Toc197679159"/>
       <w:r>
         <w:t>Configuration Parameters</w:t>
       </w:r>
-      <w:bookmarkEnd w:id="52"/>
+      <w:bookmarkEnd w:id="53"/>
     </w:p>
     <w:p>
       <w:pPr>
@@ -27140,7 +27450,7 @@
       <w:pPr>
         <w:pStyle w:val="Heading2"/>
       </w:pPr>
-      <w:bookmarkStart w:id="53" w:name="_Toc196147725"/>
+      <w:bookmarkStart w:id="54" w:name="_Toc197679160"/>
       <w:r>
         <w:t>[</w:t>
       </w:r>
@@ -27156,7 +27466,7 @@
       <w:r>
         <w:t>ection</w:t>
       </w:r>
-      <w:bookmarkEnd w:id="53"/>
+      <w:bookmarkEnd w:id="54"/>
     </w:p>
     <w:p/>
     <w:tbl>
@@ -27382,7 +27692,7 @@
       <w:pPr>
         <w:pStyle w:val="Heading2"/>
       </w:pPr>
-      <w:bookmarkStart w:id="54" w:name="_Toc196147726"/>
+      <w:bookmarkStart w:id="55" w:name="_Toc197679161"/>
       <w:r>
         <w:t>[SERVER</w:t>
       </w:r>
@@ -27395,7 +27705,7 @@
       <w:r>
         <w:t>ection</w:t>
       </w:r>
-      <w:bookmarkEnd w:id="54"/>
+      <w:bookmarkEnd w:id="55"/>
     </w:p>
     <w:p/>
     <w:tbl>
@@ -27489,7 +27799,6 @@
               <w:jc w:val="both"/>
             </w:pPr>
             <w:r>
-              <w:lastRenderedPageBreak/>
               <w:t>workers</w:t>
             </w:r>
           </w:p>
@@ -27640,6 +27949,7 @@
               <w:jc w:val="both"/>
             </w:pPr>
             <w:r>
+              <w:lastRenderedPageBreak/>
               <w:t>When reached then the new connections will handle only livez</w:t>
             </w:r>
             <w:r>
@@ -27689,6 +27999,7 @@
               <w:jc w:val="both"/>
             </w:pPr>
             <w:r>
+              <w:lastRenderedPageBreak/>
               <w:t>maxconnalertlimit</w:t>
             </w:r>
           </w:p>
@@ -28102,7 +28413,6 @@
               <w:jc w:val="both"/>
             </w:pPr>
             <w:r>
-              <w:lastRenderedPageBreak/>
               <w:t>The value must be &gt; 0. It is floating point value in seconds.</w:t>
             </w:r>
           </w:p>
@@ -28126,44 +28436,44 @@
               <w:jc w:val="both"/>
             </w:pPr>
             <w:r>
+              <w:t>ShutdownIfTooManyOpenFD</w:t>
+            </w:r>
+          </w:p>
+        </w:tc>
+        <w:tc>
+          <w:tcPr>
+            <w:tcW w:w="6530" w:type="dxa"/>
+          </w:tcPr>
+          <w:p>
+            <w:pPr>
+              <w:jc w:val="both"/>
+            </w:pPr>
+            <w:r>
+              <w:t>Server will auto-shutdown if the number of open file descriptors exceeds this threshold.</w:t>
+            </w:r>
+          </w:p>
+          <w:p>
+            <w:pPr>
+              <w:jc w:val="both"/>
+            </w:pPr>
+            <w:r>
+              <w:t>Zero means no auto-shutdown.</w:t>
+            </w:r>
+          </w:p>
+          <w:p>
+            <w:pPr>
+              <w:jc w:val="both"/>
+            </w:pPr>
+            <w:r>
+              <w:t>In the SSL mode (where there is a bug leading to the leakage of client connections) the default is set to a reasonable non-zero value (8000).</w:t>
+            </w:r>
+          </w:p>
+          <w:p>
+            <w:pPr>
+              <w:jc w:val="both"/>
+            </w:pPr>
+            <w:r>
               <w:lastRenderedPageBreak/>
-              <w:t>ShutdownIfTooManyOpenFD</w:t>
-            </w:r>
-          </w:p>
-        </w:tc>
-        <w:tc>
-          <w:tcPr>
-            <w:tcW w:w="6530" w:type="dxa"/>
-          </w:tcPr>
-          <w:p>
-            <w:pPr>
-              <w:jc w:val="both"/>
-            </w:pPr>
-            <w:r>
-              <w:t>Server will auto-shutdown if the number of open file descriptors exceeds this threshold.</w:t>
-            </w:r>
-          </w:p>
-          <w:p>
-            <w:pPr>
-              <w:jc w:val="both"/>
-            </w:pPr>
-            <w:r>
-              <w:t>Zero means no auto-shutdown.</w:t>
-            </w:r>
-          </w:p>
-          <w:p>
-            <w:pPr>
-              <w:jc w:val="both"/>
-            </w:pPr>
-            <w:r>
-              <w:t>In the SSL mode (where there is a bug leading to the leakage of client connections) the default is set to a reasonable non-zero value (8000).</w:t>
-            </w:r>
-          </w:p>
-          <w:p>
-            <w:pPr>
-              <w:jc w:val="both"/>
-            </w:pPr>
-            <w:r>
               <w:t>In non SSL mode the default is 0.</w:t>
             </w:r>
           </w:p>
@@ -28187,6 +28497,7 @@
               <w:jc w:val="both"/>
             </w:pPr>
             <w:r>
+              <w:lastRenderedPageBreak/>
               <w:t>ProcessorMaxConcurrency</w:t>
             </w:r>
           </w:p>
@@ -28517,7 +28828,6 @@
               <w:jc w:val="both"/>
             </w:pPr>
             <w:r>
-              <w:lastRenderedPageBreak/>
               <w:t>Default: 1000</w:t>
             </w:r>
           </w:p>
@@ -28533,11 +28843,11 @@
       <w:pPr>
         <w:pStyle w:val="Heading2"/>
       </w:pPr>
-      <w:bookmarkStart w:id="55" w:name="_Toc196147727"/>
+      <w:bookmarkStart w:id="56" w:name="_Toc197679162"/>
       <w:r>
         <w:t>[AUTO_EXCLUDE] Section</w:t>
       </w:r>
-      <w:bookmarkEnd w:id="55"/>
+      <w:bookmarkEnd w:id="56"/>
     </w:p>
     <w:p>
       <w:pPr>
@@ -28575,6 +28885,7 @@
               <w:jc w:val="center"/>
             </w:pPr>
             <w:r>
+              <w:lastRenderedPageBreak/>
               <w:t>Value</w:t>
             </w:r>
           </w:p>
@@ -28694,11 +29005,11 @@
       <w:pPr>
         <w:pStyle w:val="Heading2"/>
       </w:pPr>
-      <w:bookmarkStart w:id="56" w:name="_Toc196147728"/>
+      <w:bookmarkStart w:id="57" w:name="_Toc197679163"/>
       <w:r>
         <w:t>[ADMIN] Section</w:t>
       </w:r>
-      <w:bookmarkEnd w:id="56"/>
+      <w:bookmarkEnd w:id="57"/>
     </w:p>
     <w:p/>
     <w:tbl>
@@ -28814,11 +29125,11 @@
       <w:pPr>
         <w:pStyle w:val="Heading2"/>
       </w:pPr>
-      <w:bookmarkStart w:id="57" w:name="_Toc196147729"/>
+      <w:bookmarkStart w:id="58" w:name="_Toc197679164"/>
       <w:r>
         <w:t>[STATISTICS] Section</w:t>
       </w:r>
-      <w:bookmarkEnd w:id="57"/>
+      <w:bookmarkEnd w:id="58"/>
     </w:p>
     <w:p/>
     <w:tbl>
@@ -29001,7 +29312,6 @@
               <w:jc w:val="both"/>
             </w:pPr>
             <w:r>
-              <w:lastRenderedPageBreak/>
               <w:t>Default: 24</w:t>
             </w:r>
           </w:p>
@@ -29017,7 +29327,6 @@
               <w:jc w:val="both"/>
             </w:pPr>
             <w:r>
-              <w:lastRenderedPageBreak/>
               <w:t>type</w:t>
             </w:r>
           </w:p>
@@ -29091,6 +29400,7 @@
               <w:jc w:val="both"/>
             </w:pPr>
             <w:r>
+              <w:lastRenderedPageBreak/>
               <w:t>Currently the following group names are supported:</w:t>
             </w:r>
           </w:p>
@@ -29192,11 +29502,11 @@
       <w:pPr>
         <w:pStyle w:val="Heading2"/>
       </w:pPr>
-      <w:bookmarkStart w:id="58" w:name="_Toc196147730"/>
+      <w:bookmarkStart w:id="59" w:name="_Toc197679165"/>
       <w:r>
         <w:t>[DEBUG] Section</w:t>
       </w:r>
-      <w:bookmarkEnd w:id="58"/>
+      <w:bookmarkEnd w:id="59"/>
     </w:p>
     <w:p>
       <w:pPr>
@@ -29374,11 +29684,11 @@
       <w:pPr>
         <w:pStyle w:val="Heading2"/>
       </w:pPr>
-      <w:bookmarkStart w:id="59" w:name="_Toc196147731"/>
+      <w:bookmarkStart w:id="60" w:name="_Toc197679166"/>
       <w:r>
         <w:t>[IPG] Section</w:t>
       </w:r>
-      <w:bookmarkEnd w:id="59"/>
+      <w:bookmarkEnd w:id="60"/>
     </w:p>
     <w:p>
       <w:pPr>
@@ -29487,8 +29797,8 @@
       <w:pPr>
         <w:pStyle w:val="Heading2"/>
       </w:pPr>
-      <w:bookmarkStart w:id="60" w:name="OLE_LINK6"/>
-      <w:bookmarkStart w:id="61" w:name="_Toc196147732"/>
+      <w:bookmarkStart w:id="61" w:name="OLE_LINK6"/>
+      <w:bookmarkStart w:id="62" w:name="_Toc197679167"/>
       <w:r>
         <w:t xml:space="preserve">[CASSANDRA_DB] </w:t>
       </w:r>
@@ -29498,7 +29808,7 @@
       <w:r>
         <w:t>ection</w:t>
       </w:r>
-      <w:bookmarkEnd w:id="61"/>
+      <w:bookmarkEnd w:id="62"/>
     </w:p>
     <w:p/>
     <w:tbl>
@@ -29587,6 +29897,7 @@
               <w:jc w:val="both"/>
             </w:pPr>
             <w:r>
+              <w:lastRenderedPageBreak/>
               <w:t>Recommended: 15000</w:t>
             </w:r>
           </w:p>
@@ -29602,6 +29913,7 @@
               <w:jc w:val="both"/>
             </w:pPr>
             <w:r>
+              <w:lastRenderedPageBreak/>
               <w:t>qtimeout</w:t>
             </w:r>
           </w:p>
@@ -30099,7 +30411,7 @@
           </w:p>
         </w:tc>
       </w:tr>
-      <w:bookmarkEnd w:id="60"/>
+      <w:bookmarkEnd w:id="61"/>
     </w:tbl>
     <w:p>
       <w:pPr>
@@ -30110,12 +30422,11 @@
       <w:pPr>
         <w:pStyle w:val="Heading2"/>
       </w:pPr>
-      <w:bookmarkStart w:id="62" w:name="_Toc196147733"/>
-      <w:r>
-        <w:lastRenderedPageBreak/>
+      <w:bookmarkStart w:id="63" w:name="_Toc197679168"/>
+      <w:r>
         <w:t>[CASSANDRA_SECURE_DB] Section</w:t>
       </w:r>
-      <w:bookmarkEnd w:id="62"/>
+      <w:bookmarkEnd w:id="63"/>
     </w:p>
     <w:p/>
     <w:tbl>
@@ -30237,6 +30548,7 @@
               <w:jc w:val="both"/>
             </w:pPr>
             <w:r>
+              <w:lastRenderedPageBreak/>
               <w:t xml:space="preserve">Default: </w:t>
             </w:r>
             <w:r>
@@ -30266,6 +30578,7 @@
               <w:jc w:val="both"/>
             </w:pPr>
             <w:r>
+              <w:lastRenderedPageBreak/>
               <w:t>namespace</w:t>
             </w:r>
           </w:p>
@@ -30636,11 +30949,11 @@
       <w:pPr>
         <w:pStyle w:val="Heading2"/>
       </w:pPr>
-      <w:bookmarkStart w:id="63" w:name="_Toc196147734"/>
+      <w:bookmarkStart w:id="64" w:name="_Toc197679169"/>
       <w:r>
         <w:t>[CASSANDRA_PROCESSOR] Section</w:t>
       </w:r>
-      <w:bookmarkEnd w:id="63"/>
+      <w:bookmarkEnd w:id="64"/>
     </w:p>
     <w:p/>
     <w:tbl>
@@ -30691,7 +31004,6 @@
               <w:jc w:val="both"/>
             </w:pPr>
             <w:r>
-              <w:lastRenderedPageBreak/>
               <w:t>enabled</w:t>
             </w:r>
           </w:p>
@@ -30821,6 +31133,7 @@
               <w:jc w:val="both"/>
             </w:pPr>
             <w:r>
+              <w:lastRenderedPageBreak/>
               <w:t>The args to use for testing the health of the data source. For the Cassandra health check we try resolving a seq id</w:t>
             </w:r>
           </w:p>
@@ -30858,6 +31171,7 @@
               <w:jc w:val="both"/>
             </w:pPr>
             <w:r>
+              <w:lastRenderedPageBreak/>
               <w:t>health_timeout</w:t>
             </w:r>
           </w:p>
@@ -30950,11 +31264,11 @@
       <w:pPr>
         <w:pStyle w:val="Heading2"/>
       </w:pPr>
-      <w:bookmarkStart w:id="64" w:name="_Toc196147735"/>
+      <w:bookmarkStart w:id="65" w:name="_Toc197679170"/>
       <w:r>
         <w:t>[LMDB_PROCESSOR] Section</w:t>
       </w:r>
-      <w:bookmarkEnd w:id="64"/>
+      <w:bookmarkEnd w:id="65"/>
     </w:p>
     <w:p/>
     <w:tbl>
@@ -31108,11 +31422,11 @@
       <w:pPr>
         <w:pStyle w:val="Heading2"/>
       </w:pPr>
-      <w:bookmarkStart w:id="65" w:name="_Toc196147736"/>
+      <w:bookmarkStart w:id="66" w:name="_Toc197679171"/>
       <w:r>
         <w:t>[OSG_PROCESSOR] Section</w:t>
       </w:r>
-      <w:bookmarkEnd w:id="65"/>
+      <w:bookmarkEnd w:id="66"/>
     </w:p>
     <w:p/>
     <w:tbl>
@@ -31220,7 +31534,6 @@
               <w:jc w:val="both"/>
             </w:pPr>
             <w:r>
-              <w:lastRenderedPageBreak/>
               <w:t>Default: 0</w:t>
             </w:r>
           </w:p>
@@ -31236,7 +31549,6 @@
               <w:jc w:val="both"/>
             </w:pPr>
             <w:r>
-              <w:lastRenderedPageBreak/>
               <w:t>enabled_wgs</w:t>
             </w:r>
           </w:p>
@@ -31366,6 +31678,7 @@
               <w:jc w:val="both"/>
             </w:pPr>
             <w:r>
+              <w:lastRenderedPageBreak/>
               <w:t>Default: 0 (no simulated errors)</w:t>
             </w:r>
           </w:p>
@@ -31377,11 +31690,11 @@
       <w:pPr>
         <w:pStyle w:val="Heading2"/>
       </w:pPr>
-      <w:bookmarkStart w:id="66" w:name="_Toc196147737"/>
+      <w:bookmarkStart w:id="67" w:name="_Toc197679172"/>
       <w:r>
         <w:t>[WGS_PROCESSOR] Section</w:t>
       </w:r>
-      <w:bookmarkEnd w:id="66"/>
+      <w:bookmarkEnd w:id="67"/>
     </w:p>
     <w:p/>
     <w:tbl>
@@ -31643,11 +31956,11 @@
       <w:pPr>
         <w:pStyle w:val="Heading2"/>
       </w:pPr>
-      <w:bookmarkStart w:id="67" w:name="_Toc196147738"/>
+      <w:bookmarkStart w:id="68" w:name="_Toc197679173"/>
       <w:r>
         <w:t>[SNP_PROCESSOR] Section</w:t>
       </w:r>
-      <w:bookmarkEnd w:id="67"/>
+      <w:bookmarkEnd w:id="68"/>
     </w:p>
     <w:p/>
     <w:tbl>
@@ -31791,7 +32104,6 @@
               <w:jc w:val="both"/>
             </w:pPr>
             <w:r>
-              <w:lastRenderedPageBreak/>
               <w:t>Default: 0 (no simulated errors)</w:t>
             </w:r>
           </w:p>
@@ -31807,7 +32119,6 @@
               <w:jc w:val="both"/>
             </w:pPr>
             <w:r>
-              <w:lastRenderedPageBreak/>
               <w:t>health_command</w:t>
             </w:r>
           </w:p>
@@ -31884,6 +32195,7 @@
               <w:jc w:val="both"/>
             </w:pPr>
             <w:r>
+              <w:lastRenderedPageBreak/>
               <w:t>Timeout to wait for a completed reply for the 'health_command' (seconds)</w:t>
             </w:r>
           </w:p>
@@ -31911,11 +32223,11 @@
       <w:pPr>
         <w:pStyle w:val="Heading2"/>
       </w:pPr>
-      <w:bookmarkStart w:id="68" w:name="_Toc196147739"/>
+      <w:bookmarkStart w:id="69" w:name="_Toc197679174"/>
       <w:r>
         <w:t>[CDD_PROCESSOR] Section</w:t>
       </w:r>
-      <w:bookmarkEnd w:id="68"/>
+      <w:bookmarkEnd w:id="69"/>
     </w:p>
     <w:p/>
     <w:tbl>
@@ -32174,11 +32486,11 @@
       <w:pPr>
         <w:pStyle w:val="Heading2"/>
       </w:pPr>
-      <w:bookmarkStart w:id="69" w:name="_Toc196147740"/>
+      <w:bookmarkStart w:id="70" w:name="_Toc197679175"/>
       <w:r>
         <w:t>[COUNTERS] Section</w:t>
       </w:r>
-      <w:bookmarkEnd w:id="69"/>
+      <w:bookmarkEnd w:id="70"/>
     </w:p>
     <w:p/>
     <w:p>
@@ -32216,7 +32528,6 @@
         <w:jc w:val="both"/>
       </w:pPr>
       <w:r>
-        <w:lastRenderedPageBreak/>
         <w:t>Where:</w:t>
       </w:r>
     </w:p>
@@ -32268,11 +32579,12 @@
       <w:pPr>
         <w:pStyle w:val="Heading2"/>
       </w:pPr>
-      <w:bookmarkStart w:id="70" w:name="_Toc196147741"/>
-      <w:r>
+      <w:bookmarkStart w:id="71" w:name="_Toc197679176"/>
+      <w:r>
+        <w:lastRenderedPageBreak/>
         <w:t>[HEALTH] Section</w:t>
       </w:r>
-      <w:bookmarkEnd w:id="70"/>
+      <w:bookmarkEnd w:id="71"/>
     </w:p>
     <w:p>
       <w:pPr>
@@ -32350,12 +32662,12 @@
             <w:pPr>
               <w:jc w:val="both"/>
             </w:pPr>
-            <w:bookmarkStart w:id="71" w:name="OLE_LINK10"/>
+            <w:bookmarkStart w:id="72" w:name="OLE_LINK10"/>
             <w:r>
               <w:t>Note: Obsolete starting from psg 2.12.0</w:t>
             </w:r>
           </w:p>
-          <w:bookmarkEnd w:id="71"/>
+          <w:bookmarkEnd w:id="72"/>
           <w:p>
             <w:pPr>
               <w:jc w:val="both"/>
@@ -32551,11 +32863,11 @@
       <w:pPr>
         <w:pStyle w:val="Heading2"/>
       </w:pPr>
-      <w:bookmarkStart w:id="72" w:name="_Toc196147742"/>
+      <w:bookmarkStart w:id="73" w:name="_Toc197679177"/>
       <w:r>
         <w:t>[SSL] Section</w:t>
       </w:r>
-      <w:bookmarkEnd w:id="72"/>
+      <w:bookmarkEnd w:id="73"/>
     </w:p>
     <w:p>
       <w:pPr>
@@ -32590,7 +32902,6 @@
               <w:jc w:val="center"/>
             </w:pPr>
             <w:r>
-              <w:lastRenderedPageBreak/>
               <w:t>Value</w:t>
             </w:r>
           </w:p>
@@ -32756,6 +33067,7 @@
               <w:jc w:val="both"/>
             </w:pPr>
             <w:r>
+              <w:lastRenderedPageBreak/>
               <w:t xml:space="preserve">Default: </w:t>
             </w:r>
             <w:r>
@@ -32774,11 +33086,11 @@
       <w:pPr>
         <w:pStyle w:val="Heading2"/>
       </w:pPr>
-      <w:bookmarkStart w:id="73" w:name="_Toc196147743"/>
+      <w:bookmarkStart w:id="74" w:name="_Toc197679178"/>
       <w:r>
         <w:t>[MY_NCBI] Section</w:t>
       </w:r>
-      <w:bookmarkEnd w:id="73"/>
+      <w:bookmarkEnd w:id="74"/>
     </w:p>
     <w:p>
       <w:pPr>
@@ -32969,7 +33281,7 @@
             <w:pPr>
               <w:jc w:val="both"/>
             </w:pPr>
-            <w:bookmarkStart w:id="74" w:name="OLE_LINK7"/>
+            <w:bookmarkStart w:id="75" w:name="OLE_LINK7"/>
             <w:r>
               <w:t>Low mark is calculated as 0.8 of the high mark.</w:t>
             </w:r>
@@ -33008,7 +33320,7 @@
             <w:r>
               <w:t>Default: 10000</w:t>
             </w:r>
-            <w:bookmarkEnd w:id="74"/>
+            <w:bookmarkEnd w:id="75"/>
           </w:p>
         </w:tc>
       </w:tr>
@@ -33036,7 +33348,7 @@
             <w:pPr>
               <w:jc w:val="both"/>
             </w:pPr>
-            <w:bookmarkStart w:id="75" w:name="OLE_LINK8"/>
+            <w:bookmarkStart w:id="76" w:name="OLE_LINK8"/>
             <w:r>
               <w:t>Low mark is calculated as 0.8 of the high mark.</w:t>
             </w:r>
@@ -33075,7 +33387,7 @@
             <w:r>
               <w:t>Default: 10000</w:t>
             </w:r>
-            <w:bookmarkEnd w:id="75"/>
+            <w:bookmarkEnd w:id="76"/>
           </w:p>
         </w:tc>
       </w:tr>
@@ -33118,7 +33430,6 @@
           </w:tcPr>
           <w:p>
             <w:r>
-              <w:lastRenderedPageBreak/>
               <w:t>error_cache_size</w:t>
             </w:r>
           </w:p>
@@ -33204,6 +33515,7 @@
           </w:p>
           <w:p>
             <w:r>
+              <w:lastRenderedPageBreak/>
               <w:t>Default: 1000</w:t>
             </w:r>
           </w:p>
@@ -33216,6 +33528,7 @@
           </w:tcPr>
           <w:p>
             <w:r>
+              <w:lastRenderedPageBreak/>
               <w:t>resolve_timeout_ms</w:t>
             </w:r>
           </w:p>
@@ -33421,11 +33734,11 @@
       <w:pPr>
         <w:pStyle w:val="Heading2"/>
       </w:pPr>
-      <w:bookmarkStart w:id="76" w:name="_Toc196147744"/>
+      <w:bookmarkStart w:id="77" w:name="_Toc197679179"/>
       <w:r>
         <w:t>[LOG] Section</w:t>
       </w:r>
-      <w:bookmarkEnd w:id="76"/>
+      <w:bookmarkEnd w:id="77"/>
     </w:p>
     <w:p>
       <w:pPr>
@@ -33513,7 +33826,6 @@
     </w:p>
     <w:p>
       <w:r>
-        <w:lastRenderedPageBreak/>
         <w:br w:type="page"/>
       </w:r>
     </w:p>
@@ -33521,22 +33833,22 @@
       <w:pPr>
         <w:pStyle w:val="Heading1"/>
       </w:pPr>
-      <w:bookmarkStart w:id="77" w:name="_Toc196147745"/>
+      <w:bookmarkStart w:id="78" w:name="_Toc197679180"/>
       <w:r>
         <w:lastRenderedPageBreak/>
         <w:t>Appendix</w:t>
       </w:r>
-      <w:bookmarkEnd w:id="77"/>
+      <w:bookmarkEnd w:id="78"/>
     </w:p>
     <w:p>
       <w:pPr>
         <w:pStyle w:val="Heading2"/>
       </w:pPr>
-      <w:bookmarkStart w:id="78" w:name="_Toc196147746"/>
+      <w:bookmarkStart w:id="79" w:name="_Toc197679181"/>
       <w:r>
         <w:t>PSG Processors</w:t>
       </w:r>
-      <w:bookmarkEnd w:id="78"/>
+      <w:bookmarkEnd w:id="79"/>
     </w:p>
     <w:p>
       <w:r>
@@ -34207,11 +34519,11 @@
       <w:pPr>
         <w:pStyle w:val="Heading2"/>
       </w:pPr>
-      <w:bookmarkStart w:id="79" w:name="_Toc196147747"/>
+      <w:bookmarkStart w:id="80" w:name="_Toc197679182"/>
       <w:r>
         <w:t>PSG Requests</w:t>
       </w:r>
-      <w:bookmarkEnd w:id="79"/>
+      <w:bookmarkEnd w:id="80"/>
     </w:p>
     <w:p>
       <w:pPr>
@@ -34419,11 +34731,11 @@
       <w:pPr>
         <w:pStyle w:val="Heading2"/>
       </w:pPr>
-      <w:bookmarkStart w:id="80" w:name="_Toc196147748"/>
+      <w:bookmarkStart w:id="81" w:name="_Toc197679183"/>
       <w:r>
         <w:t>PSG Timing Collecting</w:t>
       </w:r>
-      <w:bookmarkEnd w:id="80"/>
+      <w:bookmarkEnd w:id="81"/>
     </w:p>
     <w:p>
       <w:r>
@@ -34763,13 +35075,13 @@
       <w:pPr>
         <w:pStyle w:val="Heading2"/>
       </w:pPr>
-      <w:bookmarkStart w:id="81" w:name="_Exclude_Blob_API"/>
-      <w:bookmarkStart w:id="82" w:name="_Toc196147749"/>
-      <w:bookmarkEnd w:id="81"/>
+      <w:bookmarkStart w:id="82" w:name="_Exclude_Blob_API"/>
+      <w:bookmarkStart w:id="83" w:name="_Toc197679184"/>
+      <w:bookmarkEnd w:id="82"/>
       <w:r>
         <w:t>Exclude Blob API</w:t>
       </w:r>
-      <w:bookmarkEnd w:id="82"/>
+      <w:bookmarkEnd w:id="83"/>
     </w:p>
     <w:p>
       <w:r>
@@ -34903,12 +35215,12 @@
       <w:pPr>
         <w:pStyle w:val="Heading2"/>
       </w:pPr>
-      <w:bookmarkStart w:id="83" w:name="_Toc196147750"/>
+      <w:bookmarkStart w:id="84" w:name="_Toc197679185"/>
       <w:r>
         <w:lastRenderedPageBreak/>
         <w:t>Alerts API</w:t>
       </w:r>
-      <w:bookmarkEnd w:id="83"/>
+      <w:bookmarkEnd w:id="84"/>
     </w:p>
     <w:p>
       <w:r>
@@ -35076,11 +35388,11 @@
       <w:pPr>
         <w:pStyle w:val="Heading2"/>
       </w:pPr>
-      <w:bookmarkStart w:id="84" w:name="_Toc196147751"/>
+      <w:bookmarkStart w:id="85" w:name="_Toc197679186"/>
       <w:r>
         <w:t>Event Counter API</w:t>
       </w:r>
-      <w:bookmarkEnd w:id="84"/>
+      <w:bookmarkEnd w:id="85"/>
     </w:p>
     <w:p>
       <w:pPr>
@@ -35243,11 +35555,11 @@
       <w:pPr>
         <w:pStyle w:val="Heading2"/>
       </w:pPr>
-      <w:bookmarkStart w:id="85" w:name="_Toc196147752"/>
+      <w:bookmarkStart w:id="86" w:name="_Toc197679187"/>
       <w:r>
         <w:t>Asynchronous socket polling API</w:t>
       </w:r>
-      <w:bookmarkEnd w:id="85"/>
+      <w:bookmarkEnd w:id="86"/>
     </w:p>
     <w:p>
       <w:pPr>
@@ -35472,11 +35784,11 @@
       <w:pPr>
         <w:pStyle w:val="Heading2"/>
       </w:pPr>
-      <w:bookmarkStart w:id="86" w:name="_Toc196147753"/>
+      <w:bookmarkStart w:id="87" w:name="_Toc197679188"/>
       <w:r>
         <w:t>Handling Non-libuv Events Asynchronously</w:t>
       </w:r>
-      <w:bookmarkEnd w:id="86"/>
+      <w:bookmarkEnd w:id="87"/>
     </w:p>
     <w:p>
       <w:r>
@@ -37173,11 +37485,11 @@
       <w:pPr>
         <w:pStyle w:val="Heading2"/>
       </w:pPr>
-      <w:bookmarkStart w:id="87" w:name="_Toc196147754"/>
+      <w:bookmarkStart w:id="88" w:name="_Toc197679189"/>
       <w:r>
         <w:t>Protocol Diagrams</w:t>
       </w:r>
-      <w:bookmarkEnd w:id="87"/>
+      <w:bookmarkEnd w:id="88"/>
     </w:p>
     <w:p/>
     <w:p>
@@ -39265,14 +39577,14 @@
       <w:pPr>
         <w:pStyle w:val="Heading2"/>
       </w:pPr>
-      <w:bookmarkStart w:id="88" w:name="_Toc196147755"/>
+      <w:bookmarkStart w:id="89" w:name="_Toc197679190"/>
       <w:r>
         <w:t xml:space="preserve">GetBlob </w:t>
       </w:r>
       <w:r>
         <w:t>Diagram</w:t>
       </w:r>
-      <w:bookmarkEnd w:id="88"/>
+      <w:bookmarkEnd w:id="89"/>
     </w:p>
     <w:p/>
     <w:p>
@@ -39327,12 +39639,12 @@
       <w:pPr>
         <w:pStyle w:val="Heading2"/>
       </w:pPr>
-      <w:bookmarkStart w:id="89" w:name="_Toc196147756"/>
+      <w:bookmarkStart w:id="90" w:name="_Toc197679191"/>
       <w:r>
         <w:lastRenderedPageBreak/>
         <w:t>General Server Structure</w:t>
       </w:r>
-      <w:bookmarkEnd w:id="89"/>
+      <w:bookmarkEnd w:id="90"/>
     </w:p>
     <w:p/>
     <w:p>
@@ -39484,11 +39796,11 @@
       <w:pPr>
         <w:pStyle w:val="Heading3"/>
       </w:pPr>
-      <w:bookmarkStart w:id="90" w:name="_Toc196147757"/>
+      <w:bookmarkStart w:id="91" w:name="_Toc197679192"/>
       <w:r>
         <w:t>Startup</w:t>
       </w:r>
-      <w:bookmarkEnd w:id="90"/>
+      <w:bookmarkEnd w:id="91"/>
     </w:p>
     <w:p>
       <w:r>
@@ -39576,11 +39888,11 @@
       <w:pPr>
         <w:pStyle w:val="Heading3"/>
       </w:pPr>
-      <w:bookmarkStart w:id="91" w:name="_Toc196147758"/>
+      <w:bookmarkStart w:id="92" w:name="_Toc197679193"/>
       <w:r>
         <w:t>CTcpWorker</w:t>
       </w:r>
-      <w:bookmarkEnd w:id="91"/>
+      <w:bookmarkEnd w:id="92"/>
     </w:p>
     <w:p>
       <w:pPr>
@@ -39594,11 +39906,11 @@
       <w:pPr>
         <w:pStyle w:val="Heading3"/>
       </w:pPr>
-      <w:bookmarkStart w:id="92" w:name="_Toc196147759"/>
+      <w:bookmarkStart w:id="93" w:name="_Toc197679194"/>
       <w:r>
         <w:t>CTcpWorkersList</w:t>
       </w:r>
-      <w:bookmarkEnd w:id="92"/>
+      <w:bookmarkEnd w:id="93"/>
     </w:p>
     <w:p>
       <w:pPr>
@@ -39612,11 +39924,11 @@
       <w:pPr>
         <w:pStyle w:val="Heading3"/>
       </w:pPr>
-      <w:bookmarkStart w:id="93" w:name="_Toc196147760"/>
+      <w:bookmarkStart w:id="94" w:name="_Toc197679195"/>
       <w:r>
         <w:t>CTcpDaemon</w:t>
       </w:r>
-      <w:bookmarkEnd w:id="93"/>
+      <w:bookmarkEnd w:id="94"/>
     </w:p>
     <w:p>
       <w:pPr>
@@ -39643,11 +39955,11 @@
       <w:pPr>
         <w:pStyle w:val="Heading3"/>
       </w:pPr>
-      <w:bookmarkStart w:id="94" w:name="_Toc196147761"/>
+      <w:bookmarkStart w:id="95" w:name="_Toc197679196"/>
       <w:r>
         <w:t>CHttpRequest</w:t>
       </w:r>
-      <w:bookmarkEnd w:id="94"/>
+      <w:bookmarkEnd w:id="95"/>
     </w:p>
     <w:p>
       <w:pPr>
@@ -39673,11 +39985,11 @@
       <w:pPr>
         <w:pStyle w:val="Heading3"/>
       </w:pPr>
-      <w:bookmarkStart w:id="95" w:name="_Toc196147762"/>
+      <w:bookmarkStart w:id="96" w:name="_Toc197679197"/>
       <w:r>
         <w:t>CPSGS_Request</w:t>
       </w:r>
-      <w:bookmarkEnd w:id="95"/>
+      <w:bookmarkEnd w:id="96"/>
     </w:p>
     <w:p>
       <w:pPr>
@@ -39691,11 +40003,11 @@
       <w:pPr>
         <w:pStyle w:val="Heading3"/>
       </w:pPr>
-      <w:bookmarkStart w:id="96" w:name="_Toc196147763"/>
+      <w:bookmarkStart w:id="97" w:name="_Toc197679198"/>
       <w:r>
         <w:t>CHttpReply</w:t>
       </w:r>
-      <w:bookmarkEnd w:id="96"/>
+      <w:bookmarkEnd w:id="97"/>
     </w:p>
     <w:p>
       <w:pPr>
@@ -39709,11 +40021,11 @@
       <w:pPr>
         <w:pStyle w:val="Heading3"/>
       </w:pPr>
-      <w:bookmarkStart w:id="97" w:name="_Toc196147764"/>
+      <w:bookmarkStart w:id="98" w:name="_Toc197679199"/>
       <w:r>
         <w:t>CPSGS_Reply</w:t>
       </w:r>
-      <w:bookmarkEnd w:id="97"/>
+      <w:bookmarkEnd w:id="98"/>
     </w:p>
     <w:p>
       <w:pPr>
@@ -39727,11 +40039,11 @@
       <w:pPr>
         <w:pStyle w:val="Heading3"/>
       </w:pPr>
-      <w:bookmarkStart w:id="98" w:name="_Toc196147765"/>
+      <w:bookmarkStart w:id="99" w:name="_Toc197679200"/>
       <w:r>
         <w:t>CHttpConnection</w:t>
       </w:r>
-      <w:bookmarkEnd w:id="98"/>
+      <w:bookmarkEnd w:id="99"/>
     </w:p>
     <w:p>
       <w:pPr>
@@ -39745,11 +40057,11 @@
       <w:pPr>
         <w:pStyle w:val="Heading3"/>
       </w:pPr>
-      <w:bookmarkStart w:id="99" w:name="_Toc196147766"/>
+      <w:bookmarkStart w:id="100" w:name="_Toc197679201"/>
       <w:r>
         <w:t>CHttpProto</w:t>
       </w:r>
-      <w:bookmarkEnd w:id="99"/>
+      <w:bookmarkEnd w:id="100"/>
     </w:p>
     <w:p>
       <w:pPr>
@@ -39763,11 +40075,11 @@
       <w:pPr>
         <w:pStyle w:val="Heading3"/>
       </w:pPr>
-      <w:bookmarkStart w:id="100" w:name="_Toc196147767"/>
+      <w:bookmarkStart w:id="101" w:name="_Toc197679202"/>
       <w:r>
         <w:t>CHttpDaemon</w:t>
       </w:r>
-      <w:bookmarkEnd w:id="100"/>
+      <w:bookmarkEnd w:id="101"/>
     </w:p>
     <w:p>
       <w:pPr>
@@ -39781,12 +40093,12 @@
       <w:pPr>
         <w:pStyle w:val="Heading3"/>
       </w:pPr>
-      <w:bookmarkStart w:id="101" w:name="_Toc196147768"/>
+      <w:bookmarkStart w:id="102" w:name="_Toc197679203"/>
       <w:r>
         <w:lastRenderedPageBreak/>
         <w:t>CPendingOperation</w:t>
       </w:r>
-      <w:bookmarkEnd w:id="101"/>
+      <w:bookmarkEnd w:id="102"/>
     </w:p>
     <w:p>
       <w:pPr>
@@ -39808,11 +40120,11 @@
       <w:pPr>
         <w:pStyle w:val="Heading3"/>
       </w:pPr>
-      <w:bookmarkStart w:id="102" w:name="_Toc196147769"/>
+      <w:bookmarkStart w:id="103" w:name="_Toc197679204"/>
       <w:r>
         <w:t>CPSGS_Dispatcher</w:t>
       </w:r>
-      <w:bookmarkEnd w:id="102"/>
+      <w:bookmarkEnd w:id="103"/>
     </w:p>
     <w:p>
       <w:pPr>
@@ -39831,20 +40143,20 @@
       <w:pPr>
         <w:pStyle w:val="Heading3"/>
       </w:pPr>
-      <w:bookmarkStart w:id="103" w:name="_Toc196147770"/>
+      <w:bookmarkStart w:id="104" w:name="_Toc197679205"/>
       <w:r>
         <w:t>New Connection Flow</w:t>
       </w:r>
-      <w:bookmarkEnd w:id="103"/>
+      <w:bookmarkEnd w:id="104"/>
     </w:p>
     <w:p/>
     <w:p>
       <w:r>
         <w:object w:dxaOrig="12496" w:dyaOrig="8896" w14:anchorId="6EB35AA1">
-          <v:shape id="_x0000_i1027" type="#_x0000_t75" style="width:468pt;height:333.1pt" o:ole="">
+          <v:shape id="_x0000_i1027" type="#_x0000_t75" style="width:468pt;height:332.85pt" o:ole="">
             <v:imagedata r:id="rId54" o:title=""/>
           </v:shape>
-          <o:OLEObject Type="Embed" ProgID="Visio.Drawing.15" ShapeID="_x0000_i1027" DrawAspect="Content" ObjectID="_1806760443" r:id="rId55"/>
+          <o:OLEObject Type="Embed" ProgID="Visio.Drawing.15" ShapeID="_x0000_i1027" DrawAspect="Content" ObjectID="_1808291886" r:id="rId55"/>
         </w:object>
       </w:r>
     </w:p>
@@ -39853,21 +40165,21 @@
       <w:pPr>
         <w:pStyle w:val="Heading3"/>
       </w:pPr>
-      <w:bookmarkStart w:id="104" w:name="_Toc196147771"/>
+      <w:bookmarkStart w:id="105" w:name="_Toc197679206"/>
       <w:r>
         <w:lastRenderedPageBreak/>
         <w:t>Request Flow</w:t>
       </w:r>
-      <w:bookmarkEnd w:id="104"/>
+      <w:bookmarkEnd w:id="105"/>
     </w:p>
     <w:p/>
     <w:p>
       <w:r>
         <w:object w:dxaOrig="12585" w:dyaOrig="10606" w14:anchorId="2B11D571">
-          <v:shape id="_x0000_i1028" type="#_x0000_t75" style="width:467.55pt;height:394.2pt" o:ole="">
+          <v:shape id="_x0000_i1028" type="#_x0000_t75" style="width:467.3pt;height:393.95pt" o:ole="">
             <v:imagedata r:id="rId56" o:title=""/>
           </v:shape>
-          <o:OLEObject Type="Embed" ProgID="Visio.Drawing.15" ShapeID="_x0000_i1028" DrawAspect="Content" ObjectID="_1806760444" r:id="rId57"/>
+          <o:OLEObject Type="Embed" ProgID="Visio.Drawing.15" ShapeID="_x0000_i1028" DrawAspect="Content" ObjectID="_1808291887" r:id="rId57"/>
         </w:object>
       </w:r>
     </w:p>
@@ -39881,20 +40193,20 @@
       <w:pPr>
         <w:pStyle w:val="Heading3"/>
       </w:pPr>
-      <w:bookmarkStart w:id="105" w:name="_Toc196147772"/>
+      <w:bookmarkStart w:id="106" w:name="_Toc197679207"/>
       <w:r>
         <w:t>Handling Request In Synchronous Manner</w:t>
       </w:r>
-      <w:bookmarkEnd w:id="105"/>
+      <w:bookmarkEnd w:id="106"/>
     </w:p>
     <w:p/>
     <w:p>
       <w:r>
         <w:object w:dxaOrig="12496" w:dyaOrig="5656" w14:anchorId="371883B3">
-          <v:shape id="_x0000_i1029" type="#_x0000_t75" style="width:468pt;height:212.35pt" o:ole="">
+          <v:shape id="_x0000_i1029" type="#_x0000_t75" style="width:468pt;height:212.6pt" o:ole="">
             <v:imagedata r:id="rId58" o:title=""/>
           </v:shape>
-          <o:OLEObject Type="Embed" ProgID="Visio.Drawing.15" ShapeID="_x0000_i1029" DrawAspect="Content" ObjectID="_1806760445" r:id="rId59"/>
+          <o:OLEObject Type="Embed" ProgID="Visio.Drawing.15" ShapeID="_x0000_i1029" DrawAspect="Content" ObjectID="_1808291888" r:id="rId59"/>
         </w:object>
       </w:r>
     </w:p>
@@ -39907,21 +40219,21 @@
       <w:pPr>
         <w:pStyle w:val="Heading3"/>
       </w:pPr>
-      <w:bookmarkStart w:id="106" w:name="_Toc196147773"/>
+      <w:bookmarkStart w:id="107" w:name="_Toc197679208"/>
       <w:r>
         <w:lastRenderedPageBreak/>
         <w:t>Handling Request In Asynchronous Manner</w:t>
       </w:r>
-      <w:bookmarkEnd w:id="106"/>
+      <w:bookmarkEnd w:id="107"/>
     </w:p>
     <w:p/>
     <w:p>
       <w:r>
         <w:object w:dxaOrig="13306" w:dyaOrig="15195" w14:anchorId="74A987D4">
-          <v:shape id="_x0000_i1030" type="#_x0000_t75" style="width:467.55pt;height:534.1pt" o:ole="">
+          <v:shape id="_x0000_i1030" type="#_x0000_t75" style="width:468pt;height:533.9pt" o:ole="">
             <v:imagedata r:id="rId60" o:title=""/>
           </v:shape>
-          <o:OLEObject Type="Embed" ProgID="Visio.Drawing.15" ShapeID="_x0000_i1030" DrawAspect="Content" ObjectID="_1806760446" r:id="rId61"/>
+          <o:OLEObject Type="Embed" ProgID="Visio.Drawing.15" ShapeID="_x0000_i1030" DrawAspect="Content" ObjectID="_1808291889" r:id="rId61"/>
         </w:object>
       </w:r>
     </w:p>
@@ -43331,9 +43643,9 @@
     </w:lvl>
   </w:abstractNum>
   <w:abstractNum w:abstractNumId="30" w15:restartNumberingAfterBreak="0">
-    <w:nsid w:val="5F517C64"/>
+    <w:nsid w:val="5D486E68"/>
     <w:multiLevelType w:val="hybridMultilevel"/>
-    <w:tmpl w:val="DC009890"/>
+    <w:tmpl w:val="A6C42676"/>
     <w:lvl w:ilvl="0" w:tplc="04090001">
       <w:start w:val="1"/>
       <w:numFmt w:val="bullet"/>
@@ -43444,9 +43756,9 @@
     </w:lvl>
   </w:abstractNum>
   <w:abstractNum w:abstractNumId="31" w15:restartNumberingAfterBreak="0">
-    <w:nsid w:val="5FF63C52"/>
+    <w:nsid w:val="5F517C64"/>
     <w:multiLevelType w:val="hybridMultilevel"/>
-    <w:tmpl w:val="9AE49904"/>
+    <w:tmpl w:val="DC009890"/>
     <w:lvl w:ilvl="0" w:tplc="04090001">
       <w:start w:val="1"/>
       <w:numFmt w:val="bullet"/>
@@ -43557,9 +43869,9 @@
     </w:lvl>
   </w:abstractNum>
   <w:abstractNum w:abstractNumId="32" w15:restartNumberingAfterBreak="0">
-    <w:nsid w:val="63E765E6"/>
+    <w:nsid w:val="5FF63C52"/>
     <w:multiLevelType w:val="hybridMultilevel"/>
-    <w:tmpl w:val="E7F405C4"/>
+    <w:tmpl w:val="9AE49904"/>
     <w:lvl w:ilvl="0" w:tplc="04090001">
       <w:start w:val="1"/>
       <w:numFmt w:val="bullet"/>
@@ -43670,9 +43982,9 @@
     </w:lvl>
   </w:abstractNum>
   <w:abstractNum w:abstractNumId="33" w15:restartNumberingAfterBreak="0">
-    <w:nsid w:val="68C63AA6"/>
+    <w:nsid w:val="63E765E6"/>
     <w:multiLevelType w:val="hybridMultilevel"/>
-    <w:tmpl w:val="544A3404"/>
+    <w:tmpl w:val="E7F405C4"/>
     <w:lvl w:ilvl="0" w:tplc="04090001">
       <w:start w:val="1"/>
       <w:numFmt w:val="bullet"/>
@@ -43783,6 +44095,119 @@
     </w:lvl>
   </w:abstractNum>
   <w:abstractNum w:abstractNumId="34" w15:restartNumberingAfterBreak="0">
+    <w:nsid w:val="68C63AA6"/>
+    <w:multiLevelType w:val="hybridMultilevel"/>
+    <w:tmpl w:val="544A3404"/>
+    <w:lvl w:ilvl="0" w:tplc="04090001">
+      <w:start w:val="1"/>
+      <w:numFmt w:val="bullet"/>
+      <w:lvlText w:val=""/>
+      <w:lvlJc w:val="left"/>
+      <w:pPr>
+        <w:ind w:left="720" w:hanging="360"/>
+      </w:pPr>
+      <w:rPr>
+        <w:rFonts w:ascii="Symbol" w:hAnsi="Symbol" w:hint="default"/>
+      </w:rPr>
+    </w:lvl>
+    <w:lvl w:ilvl="1" w:tplc="04090003" w:tentative="1">
+      <w:start w:val="1"/>
+      <w:numFmt w:val="bullet"/>
+      <w:lvlText w:val="o"/>
+      <w:lvlJc w:val="left"/>
+      <w:pPr>
+        <w:ind w:left="1440" w:hanging="360"/>
+      </w:pPr>
+      <w:rPr>
+        <w:rFonts w:ascii="Courier New" w:hAnsi="Courier New" w:cs="Courier New" w:hint="default"/>
+      </w:rPr>
+    </w:lvl>
+    <w:lvl w:ilvl="2" w:tplc="04090005" w:tentative="1">
+      <w:start w:val="1"/>
+      <w:numFmt w:val="bullet"/>
+      <w:lvlText w:val=""/>
+      <w:lvlJc w:val="left"/>
+      <w:pPr>
+        <w:ind w:left="2160" w:hanging="360"/>
+      </w:pPr>
+      <w:rPr>
+        <w:rFonts w:ascii="Wingdings" w:hAnsi="Wingdings" w:hint="default"/>
+      </w:rPr>
+    </w:lvl>
+    <w:lvl w:ilvl="3" w:tplc="04090001" w:tentative="1">
+      <w:start w:val="1"/>
+      <w:numFmt w:val="bullet"/>
+      <w:lvlText w:val=""/>
+      <w:lvlJc w:val="left"/>
+      <w:pPr>
+        <w:ind w:left="2880" w:hanging="360"/>
+      </w:pPr>
+      <w:rPr>
+        <w:rFonts w:ascii="Symbol" w:hAnsi="Symbol" w:hint="default"/>
+      </w:rPr>
+    </w:lvl>
+    <w:lvl w:ilvl="4" w:tplc="04090003" w:tentative="1">
+      <w:start w:val="1"/>
+      <w:numFmt w:val="bullet"/>
+      <w:lvlText w:val="o"/>
+      <w:lvlJc w:val="left"/>
+      <w:pPr>
+        <w:ind w:left="3600" w:hanging="360"/>
+      </w:pPr>
+      <w:rPr>
+        <w:rFonts w:ascii="Courier New" w:hAnsi="Courier New" w:cs="Courier New" w:hint="default"/>
+      </w:rPr>
+    </w:lvl>
+    <w:lvl w:ilvl="5" w:tplc="04090005" w:tentative="1">
+      <w:start w:val="1"/>
+      <w:numFmt w:val="bullet"/>
+      <w:lvlText w:val=""/>
+      <w:lvlJc w:val="left"/>
+      <w:pPr>
+        <w:ind w:left="4320" w:hanging="360"/>
+      </w:pPr>
+      <w:rPr>
+        <w:rFonts w:ascii="Wingdings" w:hAnsi="Wingdings" w:hint="default"/>
+      </w:rPr>
+    </w:lvl>
+    <w:lvl w:ilvl="6" w:tplc="04090001" w:tentative="1">
+      <w:start w:val="1"/>
+      <w:numFmt w:val="bullet"/>
+      <w:lvlText w:val=""/>
+      <w:lvlJc w:val="left"/>
+      <w:pPr>
+        <w:ind w:left="5040" w:hanging="360"/>
+      </w:pPr>
+      <w:rPr>
+        <w:rFonts w:ascii="Symbol" w:hAnsi="Symbol" w:hint="default"/>
+      </w:rPr>
+    </w:lvl>
+    <w:lvl w:ilvl="7" w:tplc="04090003" w:tentative="1">
+      <w:start w:val="1"/>
+      <w:numFmt w:val="bullet"/>
+      <w:lvlText w:val="o"/>
+      <w:lvlJc w:val="left"/>
+      <w:pPr>
+        <w:ind w:left="5760" w:hanging="360"/>
+      </w:pPr>
+      <w:rPr>
+        <w:rFonts w:ascii="Courier New" w:hAnsi="Courier New" w:cs="Courier New" w:hint="default"/>
+      </w:rPr>
+    </w:lvl>
+    <w:lvl w:ilvl="8" w:tplc="04090005" w:tentative="1">
+      <w:start w:val="1"/>
+      <w:numFmt w:val="bullet"/>
+      <w:lvlText w:val=""/>
+      <w:lvlJc w:val="left"/>
+      <w:pPr>
+        <w:ind w:left="6480" w:hanging="360"/>
+      </w:pPr>
+      <w:rPr>
+        <w:rFonts w:ascii="Wingdings" w:hAnsi="Wingdings" w:hint="default"/>
+      </w:rPr>
+    </w:lvl>
+  </w:abstractNum>
+  <w:abstractNum w:abstractNumId="35" w15:restartNumberingAfterBreak="0">
     <w:nsid w:val="68CE7E8A"/>
     <w:multiLevelType w:val="hybridMultilevel"/>
     <w:tmpl w:val="0EA4180C"/>
@@ -43895,7 +44320,7 @@
       </w:rPr>
     </w:lvl>
   </w:abstractNum>
-  <w:abstractNum w:abstractNumId="35" w15:restartNumberingAfterBreak="0">
+  <w:abstractNum w:abstractNumId="36" w15:restartNumberingAfterBreak="0">
     <w:nsid w:val="6E254055"/>
     <w:multiLevelType w:val="hybridMultilevel"/>
     <w:tmpl w:val="290E6274"/>
@@ -44008,7 +44433,7 @@
       </w:rPr>
     </w:lvl>
   </w:abstractNum>
-  <w:abstractNum w:abstractNumId="36" w15:restartNumberingAfterBreak="0">
+  <w:abstractNum w:abstractNumId="37" w15:restartNumberingAfterBreak="0">
     <w:nsid w:val="7F8C0059"/>
     <w:multiLevelType w:val="hybridMultilevel"/>
     <w:tmpl w:val="2870A98C"/>
@@ -44128,13 +44553,13 @@
     <w:abstractNumId w:val="18"/>
   </w:num>
   <w:num w:numId="3" w16cid:durableId="1448617514">
-    <w:abstractNumId w:val="32"/>
+    <w:abstractNumId w:val="33"/>
   </w:num>
   <w:num w:numId="4" w16cid:durableId="9459003">
     <w:abstractNumId w:val="4"/>
   </w:num>
   <w:num w:numId="5" w16cid:durableId="1651328103">
-    <w:abstractNumId w:val="36"/>
+    <w:abstractNumId w:val="37"/>
   </w:num>
   <w:num w:numId="6" w16cid:durableId="44186156">
     <w:abstractNumId w:val="29"/>
@@ -44170,16 +44595,16 @@
     <w:abstractNumId w:val="17"/>
   </w:num>
   <w:num w:numId="17" w16cid:durableId="125317027">
-    <w:abstractNumId w:val="33"/>
+    <w:abstractNumId w:val="34"/>
   </w:num>
   <w:num w:numId="18" w16cid:durableId="1295715083">
-    <w:abstractNumId w:val="31"/>
+    <w:abstractNumId w:val="32"/>
   </w:num>
   <w:num w:numId="19" w16cid:durableId="1155999305">
     <w:abstractNumId w:val="15"/>
   </w:num>
   <w:num w:numId="20" w16cid:durableId="96411031">
-    <w:abstractNumId w:val="30"/>
+    <w:abstractNumId w:val="31"/>
   </w:num>
   <w:num w:numId="21" w16cid:durableId="2010330148">
     <w:abstractNumId w:val="25"/>
@@ -44188,7 +44613,7 @@
     <w:abstractNumId w:val="14"/>
   </w:num>
   <w:num w:numId="23" w16cid:durableId="741760067">
-    <w:abstractNumId w:val="35"/>
+    <w:abstractNumId w:val="36"/>
   </w:num>
   <w:num w:numId="24" w16cid:durableId="781221248">
     <w:abstractNumId w:val="2"/>
@@ -44215,7 +44640,7 @@
     <w:abstractNumId w:val="19"/>
   </w:num>
   <w:num w:numId="32" w16cid:durableId="678891535">
-    <w:abstractNumId w:val="34"/>
+    <w:abstractNumId w:val="35"/>
   </w:num>
   <w:num w:numId="33" w16cid:durableId="688723629">
     <w:abstractNumId w:val="9"/>
@@ -44231,6 +44656,9 @@
   </w:num>
   <w:num w:numId="37" w16cid:durableId="786389885">
     <w:abstractNumId w:val="1"/>
+  </w:num>
+  <w:num w:numId="38" w16cid:durableId="542792175">
+    <w:abstractNumId w:val="30"/>
   </w:num>
   <w:numIdMacAtCleanup w:val="29"/>
 </w:numbering>
@@ -44752,7 +45180,6 @@
   <w:style w:type="character" w:default="1" w:styleId="DefaultParagraphFont">
     <w:name w:val="Default Paragraph Font"/>
     <w:uiPriority w:val="1"/>
-    <w:semiHidden/>
     <w:unhideWhenUsed/>
   </w:style>
   <w:style w:type="table" w:default="1" w:styleId="TableNormal">
@@ -45558,7 +45985,7 @@
 <file path=customXml/item1.xml><?xml version="1.0" encoding="utf-8"?>
 <CoverPageProperties xmlns="http://schemas.microsoft.com/office/2006/coverPageProps">
   <PublishDate>2018-01-24T00:00:00</PublishDate>
-  <Abstract>Document version: 2.79</Abstract>
+  <Abstract>Document version: 2.80</Abstract>
   <CompanyAddress/>
   <CompanyPhone/>
   <CompanyFax/>
@@ -45712,6 +46139,10 @@
 </file>
 
 <file path=customXml/item3.xml><?xml version="1.0" encoding="utf-8"?>
+<b:Sources xmlns:b="http://schemas.openxmlformats.org/officeDocument/2006/bibliography" xmlns="http://schemas.openxmlformats.org/officeDocument/2006/bibliography" SelectedStyle="\APA.XSL" StyleName="APA"/>
+</file>
+
+<file path=customXml/item4.xml><?xml version="1.0" encoding="utf-8"?>
 <?mso-contentType ?>
 <spe:Receivers xmlns:spe="http://schemas.microsoft.com/sharepoint/events">
   <Receiver>
@@ -45761,20 +46192,7 @@
 </spe:Receivers>
 </file>
 
-<file path=customXml/item4.xml><?xml version="1.0" encoding="utf-8"?>
-<?mso-contentType ?>
-<FormTemplates xmlns="http://schemas.microsoft.com/sharepoint/v3/contenttype/forms">
-  <Display>DocumentLibraryForm</Display>
-  <Edit>DocumentLibraryForm</Edit>
-  <New>DocumentLibraryForm</New>
-</FormTemplates>
-</file>
-
 <file path=customXml/item5.xml><?xml version="1.0" encoding="utf-8"?>
-<b:Sources xmlns:b="http://schemas.openxmlformats.org/officeDocument/2006/bibliography" xmlns="http://schemas.openxmlformats.org/officeDocument/2006/bibliography" SelectedStyle="\APA.XSL" StyleName="APA"/>
-</file>
-
-<file path=customXml/item6.xml><?xml version="1.0" encoding="utf-8"?>
 <p:properties xmlns:p="http://schemas.microsoft.com/office/2006/metadata/properties" xmlns:xsi="http://www.w3.org/2001/XMLSchema-instance">
   <documentManagement>
     <_dlc_DocId xmlns="bebfb516-47c3-42bf-8695-c627e02fd07c">RP5EP2USD5DN-418-13</_dlc_DocId>
@@ -45784,6 +46202,15 @@
     </_dlc_DocIdUrl>
   </documentManagement>
 </p:properties>
+</file>
+
+<file path=customXml/item6.xml><?xml version="1.0" encoding="utf-8"?>
+<?mso-contentType ?>
+<FormTemplates xmlns="http://schemas.microsoft.com/sharepoint/v3/contenttype/forms">
+  <Display>DocumentLibraryForm</Display>
+  <Edit>DocumentLibraryForm</Edit>
+  <New>DocumentLibraryForm</New>
+</FormTemplates>
 </file>
 
 <file path=customXml/itemProps1.xml><?xml version="1.0" encoding="utf-8"?>
@@ -45813,6 +46240,14 @@
 </file>
 
 <file path=customXml/itemProps3.xml><?xml version="1.0" encoding="utf-8"?>
+<ds:datastoreItem xmlns:ds="http://schemas.openxmlformats.org/officeDocument/2006/customXml" ds:itemID="{CFFBBBB2-ADC5-4CE0-A9B5-8D3026204BDD}">
+  <ds:schemaRefs>
+    <ds:schemaRef ds:uri="http://schemas.openxmlformats.org/officeDocument/2006/bibliography"/>
+  </ds:schemaRefs>
+</ds:datastoreItem>
+</file>
+
+<file path=customXml/itemProps4.xml><?xml version="1.0" encoding="utf-8"?>
 <ds:datastoreItem xmlns:ds="http://schemas.openxmlformats.org/officeDocument/2006/customXml" ds:itemID="{4BDF85BA-E69F-4D6A-AE92-E7CF998321DD}">
   <ds:schemaRefs>
     <ds:schemaRef ds:uri="http://schemas.microsoft.com/sharepoint/events"/>
@@ -45820,23 +46255,7 @@
 </ds:datastoreItem>
 </file>
 
-<file path=customXml/itemProps4.xml><?xml version="1.0" encoding="utf-8"?>
-<ds:datastoreItem xmlns:ds="http://schemas.openxmlformats.org/officeDocument/2006/customXml" ds:itemID="{910EA325-BFD3-40A7-B49F-A40A5596D5CE}">
-  <ds:schemaRefs>
-    <ds:schemaRef ds:uri="http://schemas.microsoft.com/sharepoint/v3/contenttype/forms"/>
-  </ds:schemaRefs>
-</ds:datastoreItem>
-</file>
-
 <file path=customXml/itemProps5.xml><?xml version="1.0" encoding="utf-8"?>
-<ds:datastoreItem xmlns:ds="http://schemas.openxmlformats.org/officeDocument/2006/customXml" ds:itemID="{CFFBBBB2-ADC5-4CE0-A9B5-8D3026204BDD}">
-  <ds:schemaRefs>
-    <ds:schemaRef ds:uri="http://schemas.openxmlformats.org/officeDocument/2006/bibliography"/>
-  </ds:schemaRefs>
-</ds:datastoreItem>
-</file>
-
-<file path=customXml/itemProps6.xml><?xml version="1.0" encoding="utf-8"?>
 <ds:datastoreItem xmlns:ds="http://schemas.openxmlformats.org/officeDocument/2006/customXml" ds:itemID="{AED05E43-12FF-4C22-A572-6E3D13391423}">
   <ds:schemaRefs>
     <ds:schemaRef ds:uri="http://purl.org/dc/elements/1.1/"/>
@@ -45850,4 +46269,12 @@
     <ds:schemaRef ds:uri="http://www.w3.org/XML/1998/namespace"/>
   </ds:schemaRefs>
 </ds:datastoreItem>
+</file>
+
+<file path=customXml/itemProps6.xml><?xml version="1.0" encoding="utf-8"?>
+<ds:datastoreItem xmlns:ds="http://schemas.openxmlformats.org/officeDocument/2006/customXml" ds:itemID="{910EA325-BFD3-40A7-B49F-A40A5596D5CE}">
+  <ds:schemaRefs>
+    <ds:schemaRef ds:uri="http://schemas.microsoft.com/sharepoint/v3/contenttype/forms"/>
+  </ds:schemaRefs>
+</ds:datastoreItem>
 </file>
</xml_diff>

<commit_message>
Add 'log_timing_threshold' per processor parameter description. JIRA: CXX-14282
</commit_message>
<xml_diff>
--- a/misc/PSG Server.docx
+++ b/misc/PSG Server.docx
@@ -341,21 +341,21 @@
                     <w:b/>
                     <w:bCs/>
                   </w:rPr>
-                  <w:t>10</w:t>
+                  <w:t>0</w:t>
                 </w:r>
                 <w:r>
                   <w:rPr>
                     <w:b/>
                     <w:bCs/>
                   </w:rPr>
-                  <w:t>/</w:t>
+                  <w:t>1</w:t>
                 </w:r>
                 <w:r>
                   <w:rPr>
                     <w:b/>
                     <w:bCs/>
                   </w:rPr>
-                  <w:t>06</w:t>
+                  <w:t>/22</w:t>
                 </w:r>
                 <w:r>
                   <w:rPr>
@@ -369,7 +369,7 @@
                     <w:b/>
                     <w:bCs/>
                   </w:rPr>
-                  <w:t>5</w:t>
+                  <w:t>6</w:t>
                 </w:r>
               </w:p>
             </w:tc>
@@ -414,7 +414,7 @@
                       <w:t>8</w:t>
                     </w:r>
                     <w:r>
-                      <w:t>4</w:t>
+                      <w:t>5</w:t>
                     </w:r>
                   </w:p>
                 </w:tc>
@@ -4699,6 +4699,48 @@
             </w:r>
             <w:r>
               <w:t>the processor throttling by end client ip settings</w:t>
+            </w:r>
+          </w:p>
+        </w:tc>
+      </w:tr>
+      <w:tr>
+        <w:tc>
+          <w:tcPr>
+            <w:tcW w:w="1001" w:type="dxa"/>
+          </w:tcPr>
+          <w:p>
+            <w:r>
+              <w:t>2.85</w:t>
+            </w:r>
+          </w:p>
+        </w:tc>
+        <w:tc>
+          <w:tcPr>
+            <w:tcW w:w="1678" w:type="dxa"/>
+          </w:tcPr>
+          <w:p>
+            <w:r>
+              <w:t>Jan 22, 2026</w:t>
+            </w:r>
+          </w:p>
+        </w:tc>
+        <w:tc>
+          <w:tcPr>
+            <w:tcW w:w="2182" w:type="dxa"/>
+          </w:tcPr>
+          <w:p>
+            <w:r>
+              <w:t>Sergey Satskiy</w:t>
+            </w:r>
+          </w:p>
+        </w:tc>
+        <w:tc>
+          <w:tcPr>
+            <w:tcW w:w="4489" w:type="dxa"/>
+          </w:tcPr>
+          <w:p>
+            <w:r>
+              <w:t>Add log_timing_threshold per processor parameter description</w:t>
             </w:r>
           </w:p>
         </w:tc>
@@ -9338,7 +9380,7 @@
                 <w:noProof/>
                 <w:webHidden/>
               </w:rPr>
-              <w:t>73</w:t>
+              <w:t>74</w:t>
             </w:r>
             <w:r>
               <w:rPr>
@@ -9484,7 +9526,7 @@
                 <w:noProof/>
                 <w:webHidden/>
               </w:rPr>
-              <w:t>74</w:t>
+              <w:t>75</w:t>
             </w:r>
             <w:r>
               <w:rPr>
@@ -9630,7 +9672,7 @@
                 <w:noProof/>
                 <w:webHidden/>
               </w:rPr>
-              <w:t>75</w:t>
+              <w:t>76</w:t>
             </w:r>
             <w:r>
               <w:rPr>
@@ -9776,7 +9818,7 @@
                 <w:noProof/>
                 <w:webHidden/>
               </w:rPr>
-              <w:t>77</w:t>
+              <w:t>78</w:t>
             </w:r>
             <w:r>
               <w:rPr>
@@ -9849,7 +9891,7 @@
                 <w:noProof/>
                 <w:webHidden/>
               </w:rPr>
-              <w:t>78</w:t>
+              <w:t>79</w:t>
             </w:r>
             <w:r>
               <w:rPr>
@@ -9922,7 +9964,7 @@
                 <w:noProof/>
                 <w:webHidden/>
               </w:rPr>
-              <w:t>78</w:t>
+              <w:t>79</w:t>
             </w:r>
             <w:r>
               <w:rPr>
@@ -9995,7 +10037,7 @@
                 <w:noProof/>
                 <w:webHidden/>
               </w:rPr>
-              <w:t>80</w:t>
+              <w:t>81</w:t>
             </w:r>
             <w:r>
               <w:rPr>
@@ -10068,7 +10110,7 @@
                 <w:noProof/>
                 <w:webHidden/>
               </w:rPr>
-              <w:t>81</w:t>
+              <w:t>82</w:t>
             </w:r>
             <w:r>
               <w:rPr>
@@ -10141,7 +10183,7 @@
                 <w:noProof/>
                 <w:webHidden/>
               </w:rPr>
-              <w:t>83</w:t>
+              <w:t>84</w:t>
             </w:r>
             <w:r>
               <w:rPr>
@@ -10214,7 +10256,7 @@
                 <w:noProof/>
                 <w:webHidden/>
               </w:rPr>
-              <w:t>84</w:t>
+              <w:t>85</w:t>
             </w:r>
             <w:r>
               <w:rPr>
@@ -10287,7 +10329,7 @@
                 <w:noProof/>
                 <w:webHidden/>
               </w:rPr>
-              <w:t>84</w:t>
+              <w:t>85</w:t>
             </w:r>
             <w:r>
               <w:rPr>
@@ -10360,7 +10402,7 @@
                 <w:noProof/>
                 <w:webHidden/>
               </w:rPr>
-              <w:t>85</w:t>
+              <w:t>86</w:t>
             </w:r>
             <w:r>
               <w:rPr>
@@ -10433,7 +10475,7 @@
                 <w:noProof/>
                 <w:webHidden/>
               </w:rPr>
-              <w:t>86</w:t>
+              <w:t>87</w:t>
             </w:r>
             <w:r>
               <w:rPr>
@@ -10506,7 +10548,7 @@
                 <w:noProof/>
                 <w:webHidden/>
               </w:rPr>
-              <w:t>89</w:t>
+              <w:t>90</w:t>
             </w:r>
             <w:r>
               <w:rPr>
@@ -10579,7 +10621,7 @@
                 <w:noProof/>
                 <w:webHidden/>
               </w:rPr>
-              <w:t>92</w:t>
+              <w:t>93</w:t>
             </w:r>
             <w:r>
               <w:rPr>
@@ -10652,7 +10694,7 @@
                 <w:noProof/>
                 <w:webHidden/>
               </w:rPr>
-              <w:t>93</w:t>
+              <w:t>94</w:t>
             </w:r>
             <w:r>
               <w:rPr>
@@ -10725,7 +10767,7 @@
                 <w:noProof/>
                 <w:webHidden/>
               </w:rPr>
-              <w:t>93</w:t>
+              <w:t>94</w:t>
             </w:r>
             <w:r>
               <w:rPr>
@@ -10798,7 +10840,7 @@
                 <w:noProof/>
                 <w:webHidden/>
               </w:rPr>
-              <w:t>93</w:t>
+              <w:t>94</w:t>
             </w:r>
             <w:r>
               <w:rPr>
@@ -10871,7 +10913,7 @@
                 <w:noProof/>
                 <w:webHidden/>
               </w:rPr>
-              <w:t>93</w:t>
+              <w:t>94</w:t>
             </w:r>
             <w:r>
               <w:rPr>
@@ -10944,7 +10986,7 @@
                 <w:noProof/>
                 <w:webHidden/>
               </w:rPr>
-              <w:t>93</w:t>
+              <w:t>94</w:t>
             </w:r>
             <w:r>
               <w:rPr>
@@ -11017,7 +11059,7 @@
                 <w:noProof/>
                 <w:webHidden/>
               </w:rPr>
-              <w:t>94</w:t>
+              <w:t>95</w:t>
             </w:r>
             <w:r>
               <w:rPr>
@@ -11090,7 +11132,7 @@
                 <w:noProof/>
                 <w:webHidden/>
               </w:rPr>
-              <w:t>94</w:t>
+              <w:t>95</w:t>
             </w:r>
             <w:r>
               <w:rPr>
@@ -11163,7 +11205,7 @@
                 <w:noProof/>
                 <w:webHidden/>
               </w:rPr>
-              <w:t>94</w:t>
+              <w:t>95</w:t>
             </w:r>
             <w:r>
               <w:rPr>
@@ -11236,7 +11278,7 @@
                 <w:noProof/>
                 <w:webHidden/>
               </w:rPr>
-              <w:t>94</w:t>
+              <w:t>95</w:t>
             </w:r>
             <w:r>
               <w:rPr>
@@ -11309,7 +11351,7 @@
                 <w:noProof/>
                 <w:webHidden/>
               </w:rPr>
-              <w:t>94</w:t>
+              <w:t>95</w:t>
             </w:r>
             <w:r>
               <w:rPr>
@@ -11382,7 +11424,7 @@
                 <w:noProof/>
                 <w:webHidden/>
               </w:rPr>
-              <w:t>94</w:t>
+              <w:t>95</w:t>
             </w:r>
             <w:r>
               <w:rPr>
@@ -11455,7 +11497,7 @@
                 <w:noProof/>
                 <w:webHidden/>
               </w:rPr>
-              <w:t>94</w:t>
+              <w:t>95</w:t>
             </w:r>
             <w:r>
               <w:rPr>
@@ -11528,7 +11570,7 @@
                 <w:noProof/>
                 <w:webHidden/>
               </w:rPr>
-              <w:t>95</w:t>
+              <w:t>96</w:t>
             </w:r>
             <w:r>
               <w:rPr>
@@ -11601,7 +11643,7 @@
                 <w:noProof/>
                 <w:webHidden/>
               </w:rPr>
-              <w:t>95</w:t>
+              <w:t>96</w:t>
             </w:r>
             <w:r>
               <w:rPr>
@@ -11674,7 +11716,7 @@
                 <w:noProof/>
                 <w:webHidden/>
               </w:rPr>
-              <w:t>95</w:t>
+              <w:t>96</w:t>
             </w:r>
             <w:r>
               <w:rPr>
@@ -11747,7 +11789,7 @@
                 <w:noProof/>
                 <w:webHidden/>
               </w:rPr>
-              <w:t>96</w:t>
+              <w:t>97</w:t>
             </w:r>
             <w:r>
               <w:rPr>
@@ -11820,7 +11862,7 @@
                 <w:noProof/>
                 <w:webHidden/>
               </w:rPr>
-              <w:t>97</w:t>
+              <w:t>98</w:t>
             </w:r>
             <w:r>
               <w:rPr>
@@ -11893,7 +11935,7 @@
                 <w:noProof/>
                 <w:webHidden/>
               </w:rPr>
-              <w:t>98</w:t>
+              <w:t>99</w:t>
             </w:r>
             <w:r>
               <w:rPr>
@@ -12300,7 +12342,7 @@
           <v:shape id="_x0000_i1025" type="#_x0000_t75" style="width:468pt;height:231.5pt" o:ole="">
             <v:imagedata r:id="rId11" o:title=""/>
           </v:shape>
-          <o:OLEObject Type="Embed" ProgID="Visio.Drawing.15" ShapeID="_x0000_i1025" DrawAspect="Content" ObjectID="_1821252503" r:id="rId12"/>
+          <o:OLEObject Type="Embed" ProgID="Visio.Drawing.15" ShapeID="_x0000_i1025" DrawAspect="Content" ObjectID="_1830594580" r:id="rId12"/>
         </w:object>
       </w:r>
     </w:p>
@@ -26199,7 +26241,19 @@
     </w:p>
     <w:p>
       <w:r>
-        <w:t>The verbose option is supported for the purpose of an interactuve usage by a human. Aoutomated tools should rely on the reply HTTP status code.</w:t>
+        <w:t xml:space="preserve">The verbose option is supported for the purpose of an </w:t>
+      </w:r>
+      <w:r>
+        <w:t>interactive</w:t>
+      </w:r>
+      <w:r>
+        <w:t xml:space="preserve"> usage by a human. </w:t>
+      </w:r>
+      <w:r>
+        <w:t>Automated</w:t>
+      </w:r>
+      <w:r>
+        <w:t xml:space="preserve"> tools should rely on the reply HTTP status code.</w:t>
       </w:r>
     </w:p>
     <w:p>
@@ -27564,7 +27618,7 @@
           <v:shape id="_x0000_i1026" type="#_x0000_t75" style="width:370pt;height:77pt" o:ole="">
             <v:imagedata r:id="rId47" o:title=""/>
           </v:shape>
-          <o:OLEObject Type="Embed" ProgID="Visio.Drawing.15" ShapeID="_x0000_i1026" DrawAspect="Content" ObjectID="_1821252504" r:id="rId48"/>
+          <o:OLEObject Type="Embed" ProgID="Visio.Drawing.15" ShapeID="_x0000_i1026" DrawAspect="Content" ObjectID="_1830594581" r:id="rId48"/>
         </w:object>
       </w:r>
     </w:p>
@@ -29258,13 +29312,16 @@
               <w:jc w:val="both"/>
             </w:pPr>
             <w:r>
-              <w:t>yield applog extra for an operation if the operation takes longer than</w:t>
+              <w:t>if the operation takes longer than</w:t>
             </w:r>
             <w:r>
               <w:t xml:space="preserve"> </w:t>
             </w:r>
             <w:r>
-              <w:t>the provided threshold and the log is set to true</w:t>
+              <w:t>the provided threshold</w:t>
+            </w:r>
+            <w:r>
+              <w:t>:</w:t>
             </w:r>
           </w:p>
           <w:p>
@@ -29272,6 +29329,31 @@
               <w:jc w:val="both"/>
             </w:pPr>
             <w:r>
+              <w:t xml:space="preserve">- </w:t>
+            </w:r>
+            <w:r>
+              <w:t xml:space="preserve">yield applog extra for an operation </w:t>
+            </w:r>
+            <w:r>
+              <w:t>if</w:t>
+            </w:r>
+            <w:r>
+              <w:t xml:space="preserve"> the log is set to true</w:t>
+            </w:r>
+          </w:p>
+          <w:p>
+            <w:pPr>
+              <w:jc w:val="both"/>
+            </w:pPr>
+            <w:r>
+              <w:t>- collects too long operation statistics</w:t>
+            </w:r>
+          </w:p>
+          <w:p>
+            <w:pPr>
+              <w:jc w:val="both"/>
+            </w:pPr>
+            <w:r>
               <w:t>0 means the feature is switched off</w:t>
             </w:r>
           </w:p>
@@ -29280,7 +29362,11 @@
               <w:jc w:val="both"/>
             </w:pPr>
             <w:r>
-              <w:t>default: 1000 ms</w:t>
+              <w:lastRenderedPageBreak/>
+              <w:t xml:space="preserve">default: </w:t>
+            </w:r>
+            <w:r>
+              <w:t>1000 ms</w:t>
             </w:r>
           </w:p>
         </w:tc>
@@ -29779,19 +29865,7 @@
               <w:jc w:val="both"/>
             </w:pPr>
             <w:r>
-              <w:t>This throttling kicks in if the number of PSG processors of the given type</w:t>
-            </w:r>
-            <w:r>
-              <w:t xml:space="preserve"> </w:t>
-            </w:r>
-            <w:r>
-              <w:t>exceeds the specified percentage ('processor_throttle_threshold') of the</w:t>
-            </w:r>
-            <w:r>
-              <w:t xml:space="preserve"> </w:t>
-            </w:r>
-            <w:r>
-              <w:t>'ProcessorMaxConcurrency' for the processor type.</w:t>
+              <w:t>This throttling kicks in if the number of PSG processors of the given type exceeds the specified percentage ('processor_throttle_threshold') of the 'ProcessorMaxConcurrency' for the processor type.</w:t>
             </w:r>
           </w:p>
           <w:p>
@@ -29835,25 +29909,7 @@
               <w:jc w:val="both"/>
             </w:pPr>
             <w:r>
-              <w:t>If the processor throttling is in effect (per the 'processor_throttle_threshold' above) for</w:t>
-            </w:r>
-            <w:r>
-              <w:t xml:space="preserve"> </w:t>
-            </w:r>
-            <w:r>
-              <w:t>the given processor, and a new request comes from a client IP which already</w:t>
-            </w:r>
-            <w:r>
-              <w:t xml:space="preserve"> </w:t>
-            </w:r>
-            <w:r>
-              <w:t>occupies over the 'processor_throttle_by_ip' percentage of the processor capacity, then</w:t>
-            </w:r>
-            <w:r>
-              <w:t xml:space="preserve"> </w:t>
-            </w:r>
-            <w:r>
-              <w:t>the processor will refuse to serve the request.</w:t>
+              <w:t>If the processor throttling is in effect (per the 'processor_throttle_threshold' above) for the given processor, and a new request comes from a client IP which already occupies over the 'processor_throttle_by_ip' percentage of the processor capacity, then the processor will refuse to serve the request.</w:t>
             </w:r>
           </w:p>
           <w:p>
@@ -32210,13 +32266,13 @@
         <w:tblLook w:val="04A0" w:firstRow="1" w:lastRow="0" w:firstColumn="1" w:lastColumn="0" w:noHBand="0" w:noVBand="1"/>
       </w:tblPr>
       <w:tblGrid>
-        <w:gridCol w:w="2860"/>
-        <w:gridCol w:w="6490"/>
+        <w:gridCol w:w="2895"/>
+        <w:gridCol w:w="6455"/>
       </w:tblGrid>
       <w:tr>
         <w:tc>
           <w:tcPr>
-            <w:tcW w:w="2860" w:type="dxa"/>
+            <w:tcW w:w="2895" w:type="dxa"/>
           </w:tcPr>
           <w:p>
             <w:pPr>
@@ -32229,7 +32285,7 @@
         </w:tc>
         <w:tc>
           <w:tcPr>
-            <w:tcW w:w="6490" w:type="dxa"/>
+            <w:tcW w:w="6455" w:type="dxa"/>
           </w:tcPr>
           <w:p>
             <w:pPr>
@@ -32244,7 +32300,7 @@
       <w:tr>
         <w:tc>
           <w:tcPr>
-            <w:tcW w:w="2860" w:type="dxa"/>
+            <w:tcW w:w="2895" w:type="dxa"/>
           </w:tcPr>
           <w:p>
             <w:pPr>
@@ -32257,7 +32313,7 @@
         </w:tc>
         <w:tc>
           <w:tcPr>
-            <w:tcW w:w="6490" w:type="dxa"/>
+            <w:tcW w:w="6455" w:type="dxa"/>
           </w:tcPr>
           <w:p>
             <w:pPr>
@@ -32280,7 +32336,7 @@
       <w:tr>
         <w:tc>
           <w:tcPr>
-            <w:tcW w:w="2860" w:type="dxa"/>
+            <w:tcW w:w="2895" w:type="dxa"/>
           </w:tcPr>
           <w:p>
             <w:pPr>
@@ -32293,7 +32349,7 @@
         </w:tc>
         <w:tc>
           <w:tcPr>
-            <w:tcW w:w="6490" w:type="dxa"/>
+            <w:tcW w:w="6455" w:type="dxa"/>
           </w:tcPr>
           <w:p>
             <w:pPr>
@@ -32316,7 +32372,7 @@
       <w:tr>
         <w:tc>
           <w:tcPr>
-            <w:tcW w:w="2860" w:type="dxa"/>
+            <w:tcW w:w="2895" w:type="dxa"/>
           </w:tcPr>
           <w:p>
             <w:pPr>
@@ -32329,7 +32385,7 @@
         </w:tc>
         <w:tc>
           <w:tcPr>
-            <w:tcW w:w="6490" w:type="dxa"/>
+            <w:tcW w:w="6455" w:type="dxa"/>
           </w:tcPr>
           <w:p>
             <w:pPr>
@@ -32352,7 +32408,7 @@
       <w:tr>
         <w:tc>
           <w:tcPr>
-            <w:tcW w:w="2860" w:type="dxa"/>
+            <w:tcW w:w="2895" w:type="dxa"/>
           </w:tcPr>
           <w:p>
             <w:pPr>
@@ -32365,7 +32421,7 @@
         </w:tc>
         <w:tc>
           <w:tcPr>
-            <w:tcW w:w="6490" w:type="dxa"/>
+            <w:tcW w:w="6455" w:type="dxa"/>
           </w:tcPr>
           <w:p>
             <w:pPr>
@@ -32410,7 +32466,7 @@
       <w:tr>
         <w:tc>
           <w:tcPr>
-            <w:tcW w:w="2860" w:type="dxa"/>
+            <w:tcW w:w="2895" w:type="dxa"/>
           </w:tcPr>
           <w:p>
             <w:pPr>
@@ -32423,7 +32479,7 @@
         </w:tc>
         <w:tc>
           <w:tcPr>
-            <w:tcW w:w="6490" w:type="dxa"/>
+            <w:tcW w:w="6455" w:type="dxa"/>
           </w:tcPr>
           <w:p>
             <w:pPr>
@@ -32462,7 +32518,7 @@
       <w:tr>
         <w:tc>
           <w:tcPr>
-            <w:tcW w:w="2860" w:type="dxa"/>
+            <w:tcW w:w="2895" w:type="dxa"/>
           </w:tcPr>
           <w:p>
             <w:pPr>
@@ -32475,7 +32531,7 @@
         </w:tc>
         <w:tc>
           <w:tcPr>
-            <w:tcW w:w="6490" w:type="dxa"/>
+            <w:tcW w:w="6455" w:type="dxa"/>
           </w:tcPr>
           <w:p>
             <w:pPr>
@@ -32506,7 +32562,7 @@
       <w:tr>
         <w:tc>
           <w:tcPr>
-            <w:tcW w:w="2860" w:type="dxa"/>
+            <w:tcW w:w="2895" w:type="dxa"/>
           </w:tcPr>
           <w:p>
             <w:pPr>
@@ -32519,7 +32575,7 @@
         </w:tc>
         <w:tc>
           <w:tcPr>
-            <w:tcW w:w="6490" w:type="dxa"/>
+            <w:tcW w:w="6455" w:type="dxa"/>
           </w:tcPr>
           <w:p>
             <w:pPr>
@@ -32546,7 +32602,7 @@
       <w:tr>
         <w:tc>
           <w:tcPr>
-            <w:tcW w:w="2860" w:type="dxa"/>
+            <w:tcW w:w="2895" w:type="dxa"/>
           </w:tcPr>
           <w:p>
             <w:pPr>
@@ -32559,7 +32615,7 @@
         </w:tc>
         <w:tc>
           <w:tcPr>
-            <w:tcW w:w="6490" w:type="dxa"/>
+            <w:tcW w:w="6455" w:type="dxa"/>
           </w:tcPr>
           <w:p>
             <w:pPr>
@@ -32579,6 +32635,90 @@
             </w:r>
             <w:r>
               <w:t xml:space="preserve"> the value from the [SERVER] section</w:t>
+            </w:r>
+          </w:p>
+        </w:tc>
+      </w:tr>
+      <w:tr>
+        <w:tc>
+          <w:tcPr>
+            <w:tcW w:w="2895" w:type="dxa"/>
+          </w:tcPr>
+          <w:p>
+            <w:pPr>
+              <w:jc w:val="both"/>
+            </w:pPr>
+            <w:r>
+              <w:t>log_timing_threshold</w:t>
+            </w:r>
+          </w:p>
+        </w:tc>
+        <w:tc>
+          <w:tcPr>
+            <w:tcW w:w="6455" w:type="dxa"/>
+          </w:tcPr>
+          <w:p>
+            <w:pPr>
+              <w:jc w:val="both"/>
+            </w:pPr>
+            <w:r>
+              <w:t>if the operation takes longer than</w:t>
+            </w:r>
+            <w:r>
+              <w:t xml:space="preserve"> </w:t>
+            </w:r>
+            <w:r>
+              <w:t>the provided threshold</w:t>
+            </w:r>
+            <w:r>
+              <w:t>:</w:t>
+            </w:r>
+          </w:p>
+          <w:p>
+            <w:pPr>
+              <w:jc w:val="both"/>
+            </w:pPr>
+            <w:r>
+              <w:t xml:space="preserve">- </w:t>
+            </w:r>
+            <w:r>
+              <w:t xml:space="preserve">yield applog extra for an operation </w:t>
+            </w:r>
+            <w:r>
+              <w:t>if</w:t>
+            </w:r>
+            <w:r>
+              <w:t xml:space="preserve"> the log is set to true</w:t>
+            </w:r>
+          </w:p>
+          <w:p>
+            <w:pPr>
+              <w:jc w:val="both"/>
+            </w:pPr>
+            <w:r>
+              <w:t>- collects too long operation statistics</w:t>
+            </w:r>
+          </w:p>
+          <w:p>
+            <w:pPr>
+              <w:jc w:val="both"/>
+            </w:pPr>
+            <w:r>
+              <w:t>0 means the feature is switched off</w:t>
+            </w:r>
+          </w:p>
+          <w:p>
+            <w:pPr>
+              <w:jc w:val="both"/>
+            </w:pPr>
+            <w:r>
+              <w:t xml:space="preserve">default: </w:t>
+            </w:r>
+            <w:r>
+              <w:t>[SERVER]/</w:t>
+            </w:r>
+            <w:r>
+              <w:t>log_timing_threshold</w:t>
             </w:r>
           </w:p>
         </w:tc>
@@ -32665,6 +32805,7 @@
               <w:jc w:val="both"/>
             </w:pPr>
             <w:r>
+              <w:lastRenderedPageBreak/>
               <w:t>The args to use for testing the health of the data source. For the LMDB health check we try resolving a seq id</w:t>
             </w:r>
           </w:p>
@@ -32699,6 +32840,7 @@
               <w:jc w:val="both"/>
             </w:pPr>
             <w:r>
+              <w:lastRenderedPageBreak/>
               <w:t>health_timeout</w:t>
             </w:r>
           </w:p>
@@ -32720,7 +32862,6 @@
               <w:jc w:val="both"/>
             </w:pPr>
             <w:r>
-              <w:lastRenderedPageBreak/>
               <w:t>Timeout to wait for a completed reply for the 'health_command' (seconds)</w:t>
             </w:r>
           </w:p>
@@ -33207,6 +33348,7 @@
               <w:jc w:val="both"/>
             </w:pPr>
             <w:r>
+              <w:lastRenderedPageBreak/>
               <w:t xml:space="preserve">Default: </w:t>
             </w:r>
             <w:r>
@@ -33233,6 +33375,7 @@
               <w:jc w:val="both"/>
             </w:pPr>
             <w:r>
+              <w:lastRenderedPageBreak/>
               <w:t>health_timeout</w:t>
             </w:r>
           </w:p>
@@ -33262,7 +33405,6 @@
               <w:jc w:val="both"/>
             </w:pPr>
             <w:r>
-              <w:lastRenderedPageBreak/>
               <w:t>Default: 0  (means to use [HEALTH]/timeout)</w:t>
             </w:r>
           </w:p>
@@ -33286,7 +33428,6 @@
               <w:jc w:val="both"/>
             </w:pPr>
             <w:r>
-              <w:lastRenderedPageBreak/>
               <w:t>processor_throttle_threshold</w:t>
             </w:r>
           </w:p>
@@ -33353,6 +33494,90 @@
             </w:r>
             <w:r>
               <w:t xml:space="preserve"> the value from the [SERVER] section</w:t>
+            </w:r>
+          </w:p>
+        </w:tc>
+      </w:tr>
+      <w:tr>
+        <w:tc>
+          <w:tcPr>
+            <w:tcW w:w="2860" w:type="dxa"/>
+          </w:tcPr>
+          <w:p>
+            <w:pPr>
+              <w:jc w:val="both"/>
+            </w:pPr>
+            <w:r>
+              <w:t>log_timing_threshold</w:t>
+            </w:r>
+          </w:p>
+        </w:tc>
+        <w:tc>
+          <w:tcPr>
+            <w:tcW w:w="6490" w:type="dxa"/>
+          </w:tcPr>
+          <w:p>
+            <w:pPr>
+              <w:jc w:val="both"/>
+            </w:pPr>
+            <w:r>
+              <w:t>if the operation takes longer than</w:t>
+            </w:r>
+            <w:r>
+              <w:t xml:space="preserve"> </w:t>
+            </w:r>
+            <w:r>
+              <w:t>the provided threshold</w:t>
+            </w:r>
+            <w:r>
+              <w:t>:</w:t>
+            </w:r>
+          </w:p>
+          <w:p>
+            <w:pPr>
+              <w:jc w:val="both"/>
+            </w:pPr>
+            <w:r>
+              <w:t xml:space="preserve">- </w:t>
+            </w:r>
+            <w:r>
+              <w:t xml:space="preserve">yield applog extra for an operation </w:t>
+            </w:r>
+            <w:r>
+              <w:t>if</w:t>
+            </w:r>
+            <w:r>
+              <w:t xml:space="preserve"> the log is set to true</w:t>
+            </w:r>
+          </w:p>
+          <w:p>
+            <w:pPr>
+              <w:jc w:val="both"/>
+            </w:pPr>
+            <w:r>
+              <w:t>- collects too long operation statistics</w:t>
+            </w:r>
+          </w:p>
+          <w:p>
+            <w:pPr>
+              <w:jc w:val="both"/>
+            </w:pPr>
+            <w:r>
+              <w:t>0 means the feature is switched off</w:t>
+            </w:r>
+          </w:p>
+          <w:p>
+            <w:pPr>
+              <w:jc w:val="both"/>
+            </w:pPr>
+            <w:r>
+              <w:t xml:space="preserve">default: </w:t>
+            </w:r>
+            <w:r>
+              <w:t>[SERVER]/</w:t>
+            </w:r>
+            <w:r>
+              <w:t>log_timing_threshold</w:t>
             </w:r>
           </w:p>
         </w:tc>
@@ -33374,16 +33599,17 @@
       <w:tblPr>
         <w:tblStyle w:val="TableGrid"/>
         <w:tblW w:w="0" w:type="auto"/>
+        <w:tblLayout w:type="fixed"/>
         <w:tblLook w:val="04A0" w:firstRow="1" w:lastRow="0" w:firstColumn="1" w:lastColumn="0" w:noHBand="0" w:noVBand="1"/>
       </w:tblPr>
       <w:tblGrid>
-        <w:gridCol w:w="2421"/>
-        <w:gridCol w:w="6929"/>
+        <w:gridCol w:w="2965"/>
+        <w:gridCol w:w="6385"/>
       </w:tblGrid>
       <w:tr>
         <w:tc>
           <w:tcPr>
-            <w:tcW w:w="2259" w:type="dxa"/>
+            <w:tcW w:w="2965" w:type="dxa"/>
           </w:tcPr>
           <w:p>
             <w:pPr>
@@ -33396,7 +33622,7 @@
         </w:tc>
         <w:tc>
           <w:tcPr>
-            <w:tcW w:w="7091" w:type="dxa"/>
+            <w:tcW w:w="6385" w:type="dxa"/>
           </w:tcPr>
           <w:p>
             <w:pPr>
@@ -33411,7 +33637,7 @@
       <w:tr>
         <w:tc>
           <w:tcPr>
-            <w:tcW w:w="2259" w:type="dxa"/>
+            <w:tcW w:w="2965" w:type="dxa"/>
           </w:tcPr>
           <w:p>
             <w:pPr>
@@ -33424,7 +33650,7 @@
         </w:tc>
         <w:tc>
           <w:tcPr>
-            <w:tcW w:w="7091" w:type="dxa"/>
+            <w:tcW w:w="6385" w:type="dxa"/>
           </w:tcPr>
           <w:p>
             <w:pPr>
@@ -33447,7 +33673,7 @@
       <w:tr>
         <w:tc>
           <w:tcPr>
-            <w:tcW w:w="2259" w:type="dxa"/>
+            <w:tcW w:w="2965" w:type="dxa"/>
           </w:tcPr>
           <w:p>
             <w:pPr>
@@ -33460,7 +33686,7 @@
         </w:tc>
         <w:tc>
           <w:tcPr>
-            <w:tcW w:w="7091" w:type="dxa"/>
+            <w:tcW w:w="6385" w:type="dxa"/>
           </w:tcPr>
           <w:p>
             <w:pPr>
@@ -33483,7 +33709,7 @@
       <w:tr>
         <w:tc>
           <w:tcPr>
-            <w:tcW w:w="2259" w:type="dxa"/>
+            <w:tcW w:w="2965" w:type="dxa"/>
           </w:tcPr>
           <w:p>
             <w:pPr>
@@ -33496,7 +33722,7 @@
         </w:tc>
         <w:tc>
           <w:tcPr>
-            <w:tcW w:w="7091" w:type="dxa"/>
+            <w:tcW w:w="6385" w:type="dxa"/>
           </w:tcPr>
           <w:p>
             <w:pPr>
@@ -33519,7 +33745,7 @@
       <w:tr>
         <w:tc>
           <w:tcPr>
-            <w:tcW w:w="2259" w:type="dxa"/>
+            <w:tcW w:w="2965" w:type="dxa"/>
           </w:tcPr>
           <w:p>
             <w:pPr>
@@ -33532,7 +33758,7 @@
         </w:tc>
         <w:tc>
           <w:tcPr>
-            <w:tcW w:w="7091" w:type="dxa"/>
+            <w:tcW w:w="6385" w:type="dxa"/>
           </w:tcPr>
           <w:p>
             <w:pPr>
@@ -33574,7 +33800,7 @@
       <w:tr>
         <w:tc>
           <w:tcPr>
-            <w:tcW w:w="2259" w:type="dxa"/>
+            <w:tcW w:w="2965" w:type="dxa"/>
           </w:tcPr>
           <w:p>
             <w:pPr>
@@ -33587,7 +33813,7 @@
         </w:tc>
         <w:tc>
           <w:tcPr>
-            <w:tcW w:w="7091" w:type="dxa"/>
+            <w:tcW w:w="6385" w:type="dxa"/>
           </w:tcPr>
           <w:p>
             <w:pPr>
@@ -33626,7 +33852,7 @@
       <w:tr>
         <w:tc>
           <w:tcPr>
-            <w:tcW w:w="2259" w:type="dxa"/>
+            <w:tcW w:w="2965" w:type="dxa"/>
           </w:tcPr>
           <w:p>
             <w:pPr>
@@ -33639,7 +33865,7 @@
         </w:tc>
         <w:tc>
           <w:tcPr>
-            <w:tcW w:w="7091" w:type="dxa"/>
+            <w:tcW w:w="6385" w:type="dxa"/>
           </w:tcPr>
           <w:p>
             <w:pPr>
@@ -33666,7 +33892,7 @@
       <w:tr>
         <w:tc>
           <w:tcPr>
-            <w:tcW w:w="2259" w:type="dxa"/>
+            <w:tcW w:w="2965" w:type="dxa"/>
           </w:tcPr>
           <w:p>
             <w:pPr>
@@ -33679,7 +33905,7 @@
         </w:tc>
         <w:tc>
           <w:tcPr>
-            <w:tcW w:w="7091" w:type="dxa"/>
+            <w:tcW w:w="6385" w:type="dxa"/>
           </w:tcPr>
           <w:p>
             <w:pPr>
@@ -33699,6 +33925,91 @@
             </w:r>
             <w:r>
               <w:t xml:space="preserve"> the value from the [SERVER] section</w:t>
+            </w:r>
+          </w:p>
+        </w:tc>
+      </w:tr>
+      <w:tr>
+        <w:tc>
+          <w:tcPr>
+            <w:tcW w:w="2965" w:type="dxa"/>
+          </w:tcPr>
+          <w:p>
+            <w:pPr>
+              <w:jc w:val="both"/>
+            </w:pPr>
+            <w:r>
+              <w:lastRenderedPageBreak/>
+              <w:t>log_timing_threshold</w:t>
+            </w:r>
+          </w:p>
+        </w:tc>
+        <w:tc>
+          <w:tcPr>
+            <w:tcW w:w="6385" w:type="dxa"/>
+          </w:tcPr>
+          <w:p>
+            <w:pPr>
+              <w:jc w:val="both"/>
+            </w:pPr>
+            <w:r>
+              <w:t>if the operation takes longer than</w:t>
+            </w:r>
+            <w:r>
+              <w:t xml:space="preserve"> </w:t>
+            </w:r>
+            <w:r>
+              <w:t>the provided threshold</w:t>
+            </w:r>
+            <w:r>
+              <w:t>:</w:t>
+            </w:r>
+          </w:p>
+          <w:p>
+            <w:pPr>
+              <w:jc w:val="both"/>
+            </w:pPr>
+            <w:r>
+              <w:t xml:space="preserve">- </w:t>
+            </w:r>
+            <w:r>
+              <w:t xml:space="preserve">yield applog extra for an operation </w:t>
+            </w:r>
+            <w:r>
+              <w:t>if</w:t>
+            </w:r>
+            <w:r>
+              <w:t xml:space="preserve"> the log is set to true</w:t>
+            </w:r>
+          </w:p>
+          <w:p>
+            <w:pPr>
+              <w:jc w:val="both"/>
+            </w:pPr>
+            <w:r>
+              <w:t>- collects too long operation statistics</w:t>
+            </w:r>
+          </w:p>
+          <w:p>
+            <w:pPr>
+              <w:jc w:val="both"/>
+            </w:pPr>
+            <w:r>
+              <w:t>0 means the feature is switched off</w:t>
+            </w:r>
+          </w:p>
+          <w:p>
+            <w:pPr>
+              <w:jc w:val="both"/>
+            </w:pPr>
+            <w:r>
+              <w:t xml:space="preserve">default: </w:t>
+            </w:r>
+            <w:r>
+              <w:t>[SERVER]/</w:t>
+            </w:r>
+            <w:r>
+              <w:t>log_timing_threshold</w:t>
             </w:r>
           </w:p>
         </w:tc>
@@ -33729,7 +34040,7 @@
       <w:tr>
         <w:tc>
           <w:tcPr>
-            <w:tcW w:w="2607" w:type="dxa"/>
+            <w:tcW w:w="2860" w:type="dxa"/>
           </w:tcPr>
           <w:p>
             <w:pPr>
@@ -33742,7 +34053,7 @@
         </w:tc>
         <w:tc>
           <w:tcPr>
-            <w:tcW w:w="6743" w:type="dxa"/>
+            <w:tcW w:w="6490" w:type="dxa"/>
           </w:tcPr>
           <w:p>
             <w:pPr>
@@ -33757,7 +34068,7 @@
       <w:tr>
         <w:tc>
           <w:tcPr>
-            <w:tcW w:w="2607" w:type="dxa"/>
+            <w:tcW w:w="2860" w:type="dxa"/>
           </w:tcPr>
           <w:p>
             <w:pPr>
@@ -33770,7 +34081,7 @@
         </w:tc>
         <w:tc>
           <w:tcPr>
-            <w:tcW w:w="6743" w:type="dxa"/>
+            <w:tcW w:w="6490" w:type="dxa"/>
           </w:tcPr>
           <w:p>
             <w:pPr>
@@ -33793,7 +34104,7 @@
       <w:tr>
         <w:tc>
           <w:tcPr>
-            <w:tcW w:w="2607" w:type="dxa"/>
+            <w:tcW w:w="2860" w:type="dxa"/>
           </w:tcPr>
           <w:p>
             <w:pPr>
@@ -33806,7 +34117,7 @@
         </w:tc>
         <w:tc>
           <w:tcPr>
-            <w:tcW w:w="6743" w:type="dxa"/>
+            <w:tcW w:w="6490" w:type="dxa"/>
           </w:tcPr>
           <w:p>
             <w:pPr>
@@ -33829,21 +34140,20 @@
       <w:tr>
         <w:tc>
           <w:tcPr>
-            <w:tcW w:w="2607" w:type="dxa"/>
+            <w:tcW w:w="2860" w:type="dxa"/>
           </w:tcPr>
           <w:p>
             <w:pPr>
               <w:jc w:val="both"/>
             </w:pPr>
             <w:r>
-              <w:lastRenderedPageBreak/>
               <w:t>error_rate</w:t>
             </w:r>
           </w:p>
         </w:tc>
         <w:tc>
           <w:tcPr>
-            <w:tcW w:w="6743" w:type="dxa"/>
+            <w:tcW w:w="6490" w:type="dxa"/>
           </w:tcPr>
           <w:p>
             <w:pPr>
@@ -33866,7 +34176,7 @@
       <w:tr>
         <w:tc>
           <w:tcPr>
-            <w:tcW w:w="2607" w:type="dxa"/>
+            <w:tcW w:w="2860" w:type="dxa"/>
           </w:tcPr>
           <w:p>
             <w:pPr>
@@ -33879,7 +34189,7 @@
         </w:tc>
         <w:tc>
           <w:tcPr>
-            <w:tcW w:w="6743" w:type="dxa"/>
+            <w:tcW w:w="6490" w:type="dxa"/>
           </w:tcPr>
           <w:p>
             <w:pPr>
@@ -33918,7 +34228,7 @@
       <w:tr>
         <w:tc>
           <w:tcPr>
-            <w:tcW w:w="2607" w:type="dxa"/>
+            <w:tcW w:w="2860" w:type="dxa"/>
           </w:tcPr>
           <w:p>
             <w:pPr>
@@ -33931,7 +34241,7 @@
         </w:tc>
         <w:tc>
           <w:tcPr>
-            <w:tcW w:w="6743" w:type="dxa"/>
+            <w:tcW w:w="6490" w:type="dxa"/>
           </w:tcPr>
           <w:p>
             <w:pPr>
@@ -33970,7 +34280,7 @@
       <w:tr>
         <w:tc>
           <w:tcPr>
-            <w:tcW w:w="2607" w:type="dxa"/>
+            <w:tcW w:w="2860" w:type="dxa"/>
           </w:tcPr>
           <w:p>
             <w:pPr>
@@ -33983,7 +34293,7 @@
         </w:tc>
         <w:tc>
           <w:tcPr>
-            <w:tcW w:w="6743" w:type="dxa"/>
+            <w:tcW w:w="6490" w:type="dxa"/>
           </w:tcPr>
           <w:p>
             <w:pPr>
@@ -34010,7 +34320,7 @@
       <w:tr>
         <w:tc>
           <w:tcPr>
-            <w:tcW w:w="2607" w:type="dxa"/>
+            <w:tcW w:w="2860" w:type="dxa"/>
           </w:tcPr>
           <w:p>
             <w:pPr>
@@ -34023,7 +34333,7 @@
         </w:tc>
         <w:tc>
           <w:tcPr>
-            <w:tcW w:w="6743" w:type="dxa"/>
+            <w:tcW w:w="6490" w:type="dxa"/>
           </w:tcPr>
           <w:p>
             <w:pPr>
@@ -34043,6 +34353,90 @@
             </w:r>
             <w:r>
               <w:t xml:space="preserve"> the value from the [SERVER] section</w:t>
+            </w:r>
+          </w:p>
+        </w:tc>
+      </w:tr>
+      <w:tr>
+        <w:tc>
+          <w:tcPr>
+            <w:tcW w:w="2860" w:type="dxa"/>
+          </w:tcPr>
+          <w:p>
+            <w:pPr>
+              <w:jc w:val="both"/>
+            </w:pPr>
+            <w:r>
+              <w:t>log_timing_threshold</w:t>
+            </w:r>
+          </w:p>
+        </w:tc>
+        <w:tc>
+          <w:tcPr>
+            <w:tcW w:w="6490" w:type="dxa"/>
+          </w:tcPr>
+          <w:p>
+            <w:pPr>
+              <w:jc w:val="both"/>
+            </w:pPr>
+            <w:r>
+              <w:t>if the operation takes longer than</w:t>
+            </w:r>
+            <w:r>
+              <w:t xml:space="preserve"> </w:t>
+            </w:r>
+            <w:r>
+              <w:t>the provided threshold</w:t>
+            </w:r>
+            <w:r>
+              <w:t>:</w:t>
+            </w:r>
+          </w:p>
+          <w:p>
+            <w:pPr>
+              <w:jc w:val="both"/>
+            </w:pPr>
+            <w:r>
+              <w:t xml:space="preserve">- </w:t>
+            </w:r>
+            <w:r>
+              <w:t xml:space="preserve">yield applog extra for an operation </w:t>
+            </w:r>
+            <w:r>
+              <w:t>if</w:t>
+            </w:r>
+            <w:r>
+              <w:t xml:space="preserve"> the log is set to true</w:t>
+            </w:r>
+          </w:p>
+          <w:p>
+            <w:pPr>
+              <w:jc w:val="both"/>
+            </w:pPr>
+            <w:r>
+              <w:t>- collects too long operation statistics</w:t>
+            </w:r>
+          </w:p>
+          <w:p>
+            <w:pPr>
+              <w:jc w:val="both"/>
+            </w:pPr>
+            <w:r>
+              <w:t>0 means the feature is switched off</w:t>
+            </w:r>
+          </w:p>
+          <w:p>
+            <w:pPr>
+              <w:jc w:val="both"/>
+            </w:pPr>
+            <w:r>
+              <w:t xml:space="preserve">default: </w:t>
+            </w:r>
+            <w:r>
+              <w:t>[SERVER]/</w:t>
+            </w:r>
+            <w:r>
+              <w:t>log_timing_threshold</w:t>
             </w:r>
           </w:p>
         </w:tc>
@@ -34087,6 +34481,7 @@
         <w:rPr>
           <w:rFonts w:ascii="Courier New" w:hAnsi="Courier New" w:cs="Courier New"/>
         </w:rPr>
+        <w:lastRenderedPageBreak/>
         <w:t>&lt;Item ID&gt; = &lt;Name&gt;:::&lt;Description&gt;</w:t>
       </w:r>
     </w:p>
@@ -34265,7 +34660,6 @@
               <w:jc w:val="both"/>
             </w:pPr>
             <w:r>
-              <w:lastRenderedPageBreak/>
               <w:t>test_seq_id_ignore_error</w:t>
             </w:r>
           </w:p>
@@ -34446,6 +34840,7 @@
         <w:jc w:val="both"/>
       </w:pPr>
       <w:r>
+        <w:lastRenderedPageBreak/>
         <w:t>The section configures the server https configuration.</w:t>
       </w:r>
     </w:p>
@@ -34716,7 +35111,6 @@
           </w:tcPr>
           <w:p>
             <w:r>
-              <w:lastRenderedPageBreak/>
               <w:t>url</w:t>
             </w:r>
           </w:p>
@@ -34985,6 +35379,7 @@
           </w:p>
           <w:p>
             <w:r>
+              <w:lastRenderedPageBreak/>
               <w:t>Default: 3600</w:t>
             </w:r>
           </w:p>
@@ -34997,6 +35392,7 @@
           </w:tcPr>
           <w:p>
             <w:r>
+              <w:lastRenderedPageBreak/>
               <w:t>error_cache_size</w:t>
             </w:r>
           </w:p>
@@ -35185,7 +35581,6 @@
           </w:p>
           <w:p>
             <w:r>
-              <w:lastRenderedPageBreak/>
               <w:t>Default: 10</w:t>
             </w:r>
           </w:p>
@@ -35198,7 +35593,6 @@
           </w:tcPr>
           <w:p>
             <w:r>
-              <w:lastRenderedPageBreak/>
               <w:t>test_web_cubby_user</w:t>
             </w:r>
           </w:p>
@@ -35392,6 +35786,7 @@
       </w:pPr>
       <w:bookmarkStart w:id="80" w:name="_Toc209173029"/>
       <w:r>
+        <w:lastRenderedPageBreak/>
         <w:t>[APDATA] Section</w:t>
       </w:r>
       <w:bookmarkEnd w:id="80"/>
@@ -41816,7 +42211,7 @@
           <v:shape id="_x0000_i1027" type="#_x0000_t75" style="width:468pt;height:334.5pt" o:ole="">
             <v:imagedata r:id="rId54" o:title=""/>
           </v:shape>
-          <o:OLEObject Type="Embed" ProgID="Visio.Drawing.15" ShapeID="_x0000_i1027" DrawAspect="Content" ObjectID="_1821252505" r:id="rId55"/>
+          <o:OLEObject Type="Embed" ProgID="Visio.Drawing.15" ShapeID="_x0000_i1027" DrawAspect="Content" ObjectID="_1830594582" r:id="rId55"/>
         </w:object>
       </w:r>
     </w:p>
@@ -41839,7 +42234,7 @@
           <v:shape id="_x0000_i1028" type="#_x0000_t75" style="width:468pt;height:396pt" o:ole="">
             <v:imagedata r:id="rId56" o:title=""/>
           </v:shape>
-          <o:OLEObject Type="Embed" ProgID="Visio.Drawing.15" ShapeID="_x0000_i1028" DrawAspect="Content" ObjectID="_1821252506" r:id="rId57"/>
+          <o:OLEObject Type="Embed" ProgID="Visio.Drawing.15" ShapeID="_x0000_i1028" DrawAspect="Content" ObjectID="_1830594583" r:id="rId57"/>
         </w:object>
       </w:r>
     </w:p>
@@ -41866,7 +42261,7 @@
           <v:shape id="_x0000_i1029" type="#_x0000_t75" style="width:468pt;height:211pt" o:ole="">
             <v:imagedata r:id="rId58" o:title=""/>
           </v:shape>
-          <o:OLEObject Type="Embed" ProgID="Visio.Drawing.15" ShapeID="_x0000_i1029" DrawAspect="Content" ObjectID="_1821252507" r:id="rId59"/>
+          <o:OLEObject Type="Embed" ProgID="Visio.Drawing.15" ShapeID="_x0000_i1029" DrawAspect="Content" ObjectID="_1830594584" r:id="rId59"/>
         </w:object>
       </w:r>
     </w:p>
@@ -41893,7 +42288,7 @@
           <v:shape id="_x0000_i1030" type="#_x0000_t75" style="width:467.5pt;height:535pt" o:ole="">
             <v:imagedata r:id="rId60" o:title=""/>
           </v:shape>
-          <o:OLEObject Type="Embed" ProgID="Visio.Drawing.15" ShapeID="_x0000_i1030" DrawAspect="Content" ObjectID="_1821252508" r:id="rId61"/>
+          <o:OLEObject Type="Embed" ProgID="Visio.Drawing.15" ShapeID="_x0000_i1030" DrawAspect="Content" ObjectID="_1830594585" r:id="rId61"/>
         </w:object>
       </w:r>
     </w:p>
@@ -47188,6 +47583,7 @@
   <w:style w:type="character" w:default="1" w:styleId="DefaultParagraphFont">
     <w:name w:val="Default Paragraph Font"/>
     <w:uiPriority w:val="1"/>
+    <w:semiHidden/>
     <w:unhideWhenUsed/>
   </w:style>
   <w:style w:type="table" w:default="1" w:styleId="TableNormal">
@@ -47993,7 +48389,7 @@
 <file path=customXml/item1.xml><?xml version="1.0" encoding="utf-8"?>
 <CoverPageProperties xmlns="http://schemas.microsoft.com/office/2006/coverPageProps">
   <PublishDate>2018-01-24T00:00:00</PublishDate>
-  <Abstract>Document version: 2.84</Abstract>
+  <Abstract>Document version: 2.85</Abstract>
   <CompanyAddress/>
   <CompanyPhone/>
   <CompanyFax/>
@@ -48147,10 +48543,27 @@
 </file>
 
 <file path=customXml/item3.xml><?xml version="1.0" encoding="utf-8"?>
-<b:Sources xmlns:b="http://schemas.openxmlformats.org/officeDocument/2006/bibliography" xmlns="http://schemas.openxmlformats.org/officeDocument/2006/bibliography" SelectedStyle="\APA.XSL" StyleName="APA"/>
+<?mso-contentType ?>
+<FormTemplates xmlns="http://schemas.microsoft.com/sharepoint/v3/contenttype/forms">
+  <Display>DocumentLibraryForm</Display>
+  <Edit>DocumentLibraryForm</Edit>
+  <New>DocumentLibraryForm</New>
+</FormTemplates>
 </file>
 
 <file path=customXml/item4.xml><?xml version="1.0" encoding="utf-8"?>
+<p:properties xmlns:p="http://schemas.microsoft.com/office/2006/metadata/properties" xmlns:xsi="http://www.w3.org/2001/XMLSchema-instance">
+  <documentManagement>
+    <_dlc_DocId xmlns="bebfb516-47c3-42bf-8695-c627e02fd07c">RP5EP2USD5DN-418-13</_dlc_DocId>
+    <_dlc_DocIdUrl xmlns="bebfb516-47c3-42bf-8695-c627e02fd07c">
+      <Url>https://sp.ncbi.nlm.nih.gov/IEB/ISS/_layouts/15/DocIdRedir.aspx?ID=RP5EP2USD5DN-418-13</Url>
+      <Description>RP5EP2USD5DN-418-13</Description>
+    </_dlc_DocIdUrl>
+  </documentManagement>
+</p:properties>
+</file>
+
+<file path=customXml/item5.xml><?xml version="1.0" encoding="utf-8"?>
 <?mso-contentType ?>
 <spe:Receivers xmlns:spe="http://schemas.microsoft.com/sharepoint/events">
   <Receiver>
@@ -48200,25 +48613,8 @@
 </spe:Receivers>
 </file>
 
-<file path=customXml/item5.xml><?xml version="1.0" encoding="utf-8"?>
-<p:properties xmlns:p="http://schemas.microsoft.com/office/2006/metadata/properties" xmlns:xsi="http://www.w3.org/2001/XMLSchema-instance">
-  <documentManagement>
-    <_dlc_DocId xmlns="bebfb516-47c3-42bf-8695-c627e02fd07c">RP5EP2USD5DN-418-13</_dlc_DocId>
-    <_dlc_DocIdUrl xmlns="bebfb516-47c3-42bf-8695-c627e02fd07c">
-      <Url>https://sp.ncbi.nlm.nih.gov/IEB/ISS/_layouts/15/DocIdRedir.aspx?ID=RP5EP2USD5DN-418-13</Url>
-      <Description>RP5EP2USD5DN-418-13</Description>
-    </_dlc_DocIdUrl>
-  </documentManagement>
-</p:properties>
-</file>
-
 <file path=customXml/item6.xml><?xml version="1.0" encoding="utf-8"?>
-<?mso-contentType ?>
-<FormTemplates xmlns="http://schemas.microsoft.com/sharepoint/v3/contenttype/forms">
-  <Display>DocumentLibraryForm</Display>
-  <Edit>DocumentLibraryForm</Edit>
-  <New>DocumentLibraryForm</New>
-</FormTemplates>
+<b:Sources xmlns:b="http://schemas.openxmlformats.org/officeDocument/2006/bibliography" xmlns="http://schemas.openxmlformats.org/officeDocument/2006/bibliography" SelectedStyle="\APA.XSL" StyleName="APA"/>
 </file>
 
 <file path=customXml/itemProps1.xml><?xml version="1.0" encoding="utf-8"?>
@@ -48248,22 +48644,14 @@
 </file>
 
 <file path=customXml/itemProps3.xml><?xml version="1.0" encoding="utf-8"?>
-<ds:datastoreItem xmlns:ds="http://schemas.openxmlformats.org/officeDocument/2006/customXml" ds:itemID="{CFFBBBB2-ADC5-4CE0-A9B5-8D3026204BDD}">
+<ds:datastoreItem xmlns:ds="http://schemas.openxmlformats.org/officeDocument/2006/customXml" ds:itemID="{910EA325-BFD3-40A7-B49F-A40A5596D5CE}">
   <ds:schemaRefs>
-    <ds:schemaRef ds:uri="http://schemas.openxmlformats.org/officeDocument/2006/bibliography"/>
+    <ds:schemaRef ds:uri="http://schemas.microsoft.com/sharepoint/v3/contenttype/forms"/>
   </ds:schemaRefs>
 </ds:datastoreItem>
 </file>
 
 <file path=customXml/itemProps4.xml><?xml version="1.0" encoding="utf-8"?>
-<ds:datastoreItem xmlns:ds="http://schemas.openxmlformats.org/officeDocument/2006/customXml" ds:itemID="{4BDF85BA-E69F-4D6A-AE92-E7CF998321DD}">
-  <ds:schemaRefs>
-    <ds:schemaRef ds:uri="http://schemas.microsoft.com/sharepoint/events"/>
-  </ds:schemaRefs>
-</ds:datastoreItem>
-</file>
-
-<file path=customXml/itemProps5.xml><?xml version="1.0" encoding="utf-8"?>
 <ds:datastoreItem xmlns:ds="http://schemas.openxmlformats.org/officeDocument/2006/customXml" ds:itemID="{AED05E43-12FF-4C22-A572-6E3D13391423}">
   <ds:schemaRefs>
     <ds:schemaRef ds:uri="http://purl.org/dc/elements/1.1/"/>
@@ -48279,10 +48667,18 @@
 </ds:datastoreItem>
 </file>
 
+<file path=customXml/itemProps5.xml><?xml version="1.0" encoding="utf-8"?>
+<ds:datastoreItem xmlns:ds="http://schemas.openxmlformats.org/officeDocument/2006/customXml" ds:itemID="{4BDF85BA-E69F-4D6A-AE92-E7CF998321DD}">
+  <ds:schemaRefs>
+    <ds:schemaRef ds:uri="http://schemas.microsoft.com/sharepoint/events"/>
+  </ds:schemaRefs>
+</ds:datastoreItem>
+</file>
+
 <file path=customXml/itemProps6.xml><?xml version="1.0" encoding="utf-8"?>
-<ds:datastoreItem xmlns:ds="http://schemas.openxmlformats.org/officeDocument/2006/customXml" ds:itemID="{910EA325-BFD3-40A7-B49F-A40A5596D5CE}">
+<ds:datastoreItem xmlns:ds="http://schemas.openxmlformats.org/officeDocument/2006/customXml" ds:itemID="{CFFBBBB2-ADC5-4CE0-A9B5-8D3026204BDD}">
   <ds:schemaRefs>
-    <ds:schemaRef ds:uri="http://schemas.microsoft.com/sharepoint/v3/contenttype/forms"/>
+    <ds:schemaRef ds:uri="http://schemas.openxmlformats.org/officeDocument/2006/bibliography"/>
   </ds:schemaRefs>
 </ds:datastoreItem>
 </file>
</xml_diff>